<commit_message>
docs: update technical documentation to v2.0
- Version bump to 2.0 · 18 March 2026
- File structure table: add tracker.js, unit_overrides.json, CHANGELOG.md, ImportScript
- Column schema: add Role (col 6), Suicides (29), Time Played (30); fix all indices
- Global state: document selectedUnit and playerUnits variables
- Award cards: add Best K/D Ratio, Always On Duty, Spray & Pray, Most Teamkills, Most Hits Taken
- Player object schema: add timePlayed field
- New section 13: Unit Classification (algorithm, seeds, overrides, filter, extension guide)
- New section 14: ImportScript (prerequisites, entry points, pipeline, schema, GAS trigger setup)

https://claude.ai/code/session_01LeCW8ZtNT8f2MnVa6wEGBx
</commit_message>
<xml_diff>
--- a/TFP_KillTracker_Technical_Documentation.docx
+++ b/TFP_KillTracker_Technical_Documentation.docx
@@ -39,7 +39,7 @@
         <w:rPr>
           <w:sz w:val="22"/>
         </w:rPr>
-        <w:t>Version 1.0  ·  17 March 2026</w:t>
+        <w:t>Version 2.0  ·  18 March 2026</w:t>
       </w:r>
     </w:p>
     <w:p>
@@ -399,7 +399,7 @@
         <w:rPr>
           <w:sz w:val="20"/>
         </w:rPr>
-        <w:t>Single file — the entire application lives in index.html (CSS + JS inlined).</w:t>
+        <w:t>Modular files — HTML structure in index.html; JavaScript in tracker.js; unit corrections in unit_overrides.json.</w:t>
       </w:r>
     </w:p>
     <w:p>
@@ -504,11 +504,13 @@
         <w:tc>
           <w:tcPr>
             <w:tcW w:type="dxa" w:w="4703"/>
-            <w:shd w:val="clear" w:color="auto" w:fill="FFFFFF"/>
-          </w:tcPr>
-          <w:p>
-            <w:r>
-              <w:rPr>
+          </w:tcPr>
+          <w:p>
+            <w:r/>
+            <w:r>
+              <w:rPr>
+                <w:rFonts w:ascii="Courier New" w:hAnsi="Courier New"/>
+                <w:b w:val="0"/>
                 <w:sz w:val="18"/>
               </w:rPr>
               <w:t>index.html</w:t>
@@ -518,14 +520,14 @@
         <w:tc>
           <w:tcPr>
             <w:tcW w:type="dxa" w:w="4703"/>
-            <w:shd w:val="clear" w:color="auto" w:fill="FFFFFF"/>
-          </w:tcPr>
-          <w:p>
-            <w:r>
-              <w:rPr>
-                <w:sz w:val="18"/>
-              </w:rPr>
-              <w:t>Entire application — HTML structure, inline CSS, inline JavaScript</w:t>
+          </w:tcPr>
+          <w:p>
+            <w:r/>
+            <w:r>
+              <w:rPr>
+                <w:b w:val="0"/>
+              </w:rPr>
+              <w:t>Application entry point — HTML structure and inline CSS.</w:t>
             </w:r>
           </w:p>
         </w:tc>
@@ -534,28 +536,30 @@
         <w:tc>
           <w:tcPr>
             <w:tcW w:type="dxa" w:w="4703"/>
-            <w:shd w:val="clear" w:color="auto" w:fill="F0F4FA"/>
-          </w:tcPr>
-          <w:p>
-            <w:r>
-              <w:rPr>
-                <w:sz w:val="18"/>
-              </w:rPr>
-              <w:t>favicon.svg</w:t>
+          </w:tcPr>
+          <w:p>
+            <w:r/>
+            <w:r>
+              <w:rPr>
+                <w:rFonts w:ascii="Courier New" w:hAnsi="Courier New"/>
+                <w:b w:val="0"/>
+                <w:sz w:val="18"/>
+              </w:rPr>
+              <w:t>tracker.js</w:t>
             </w:r>
           </w:p>
         </w:tc>
         <w:tc>
           <w:tcPr>
             <w:tcW w:type="dxa" w:w="4703"/>
-            <w:shd w:val="clear" w:color="auto" w:fill="F0F4FA"/>
-          </w:tcPr>
-          <w:p>
-            <w:r>
-              <w:rPr>
-                <w:sz w:val="18"/>
-              </w:rPr>
-              <w:t>Browser tab icon (SVG crosshair graphic)</w:t>
+          </w:tcPr>
+          <w:p>
+            <w:r/>
+            <w:r>
+              <w:rPr>
+                <w:b w:val="0"/>
+              </w:rPr>
+              <w:t>All application JavaScript (aggregation, filtering, rendering). Loaded as external script to comply with GitHub Pages CSP.</w:t>
             </w:r>
           </w:p>
         </w:tc>
@@ -564,28 +568,30 @@
         <w:tc>
           <w:tcPr>
             <w:tcW w:type="dxa" w:w="4703"/>
-            <w:shd w:val="clear" w:color="auto" w:fill="FFFFFF"/>
-          </w:tcPr>
-          <w:p>
-            <w:r>
-              <w:rPr>
-                <w:sz w:val="18"/>
-              </w:rPr>
-              <w:t>README.md</w:t>
+          </w:tcPr>
+          <w:p>
+            <w:r/>
+            <w:r>
+              <w:rPr>
+                <w:rFonts w:ascii="Courier New" w:hAnsi="Courier New"/>
+                <w:b w:val="0"/>
+                <w:sz w:val="18"/>
+              </w:rPr>
+              <w:t>unit_overrides.json</w:t>
             </w:r>
           </w:p>
         </w:tc>
         <w:tc>
           <w:tcPr>
             <w:tcW w:type="dxa" w:w="4703"/>
-            <w:shd w:val="clear" w:color="auto" w:fill="FFFFFF"/>
-          </w:tcPr>
-          <w:p>
-            <w:r>
-              <w:rPr>
-                <w:sz w:val="18"/>
-              </w:rPr>
-              <w:t>User-facing feature overview and deployment guide</w:t>
+          </w:tcPr>
+          <w:p>
+            <w:r/>
+            <w:r>
+              <w:rPr>
+                <w:b w:val="0"/>
+              </w:rPr>
+              <w:t>Manual unit assignment overrides. Key = player name, value = unit string ("2nd USC" | "CNTO" | "PXG" | "TFP"). Loaded at startup and applied after auto-classification.</w:t>
             </w:r>
           </w:p>
         </w:tc>
@@ -594,11 +600,141 @@
         <w:tc>
           <w:tcPr>
             <w:tcW w:type="dxa" w:w="4703"/>
-            <w:shd w:val="clear" w:color="auto" w:fill="F0F4FA"/>
-          </w:tcPr>
-          <w:p>
-            <w:r>
-              <w:rPr>
+          </w:tcPr>
+          <w:p>
+            <w:r/>
+            <w:r>
+              <w:rPr>
+                <w:rFonts w:ascii="Courier New" w:hAnsi="Courier New"/>
+                <w:b w:val="0"/>
+                <w:sz w:val="18"/>
+              </w:rPr>
+              <w:t>ImportScript</w:t>
+            </w:r>
+          </w:p>
+        </w:tc>
+        <w:tc>
+          <w:tcPr>
+            <w:tcW w:type="dxa" w:w="4703"/>
+          </w:tcPr>
+          <w:p>
+            <w:r/>
+            <w:r>
+              <w:rPr>
+                <w:b w:val="0"/>
+              </w:rPr>
+              <w:t>Google Apps Script (GAS) for importing OCAP .json.gz replay files from Google Drive into the player_stats Google Sheet.</w:t>
+            </w:r>
+          </w:p>
+        </w:tc>
+      </w:tr>
+      <w:tr>
+        <w:tc>
+          <w:tcPr>
+            <w:tcW w:type="dxa" w:w="4703"/>
+          </w:tcPr>
+          <w:p>
+            <w:r/>
+            <w:r>
+              <w:rPr>
+                <w:rFonts w:ascii="Courier New" w:hAnsi="Courier New"/>
+                <w:b w:val="0"/>
+                <w:sz w:val="18"/>
+              </w:rPr>
+              <w:t>favicon.svg</w:t>
+            </w:r>
+          </w:p>
+        </w:tc>
+        <w:tc>
+          <w:tcPr>
+            <w:tcW w:type="dxa" w:w="4703"/>
+          </w:tcPr>
+          <w:p>
+            <w:r/>
+            <w:r>
+              <w:rPr>
+                <w:b w:val="0"/>
+              </w:rPr>
+              <w:t>Browser tab icon (SVG crosshair graphic).</w:t>
+            </w:r>
+          </w:p>
+        </w:tc>
+      </w:tr>
+      <w:tr>
+        <w:tc>
+          <w:tcPr>
+            <w:tcW w:type="dxa" w:w="4703"/>
+          </w:tcPr>
+          <w:p>
+            <w:r/>
+            <w:r>
+              <w:rPr>
+                <w:rFonts w:ascii="Courier New" w:hAnsi="Courier New"/>
+                <w:b w:val="0"/>
+                <w:sz w:val="18"/>
+              </w:rPr>
+              <w:t>CHANGELOG.md</w:t>
+            </w:r>
+          </w:p>
+        </w:tc>
+        <w:tc>
+          <w:tcPr>
+            <w:tcW w:type="dxa" w:w="4703"/>
+          </w:tcPr>
+          <w:p>
+            <w:r/>
+            <w:r>
+              <w:rPr>
+                <w:b w:val="0"/>
+              </w:rPr>
+              <w:t>Per-feature changelog organised by date.</w:t>
+            </w:r>
+          </w:p>
+        </w:tc>
+      </w:tr>
+      <w:tr>
+        <w:tc>
+          <w:tcPr>
+            <w:tcW w:type="dxa" w:w="4703"/>
+          </w:tcPr>
+          <w:p>
+            <w:r/>
+            <w:r>
+              <w:rPr>
+                <w:rFonts w:ascii="Courier New" w:hAnsi="Courier New"/>
+                <w:b w:val="0"/>
+                <w:sz w:val="18"/>
+              </w:rPr>
+              <w:t>README.md</w:t>
+            </w:r>
+          </w:p>
+        </w:tc>
+        <w:tc>
+          <w:tcPr>
+            <w:tcW w:type="dxa" w:w="4703"/>
+          </w:tcPr>
+          <w:p>
+            <w:r/>
+            <w:r>
+              <w:rPr>
+                <w:b w:val="0"/>
+              </w:rPr>
+              <w:t>User-facing feature overview and deployment guide.</w:t>
+            </w:r>
+          </w:p>
+        </w:tc>
+      </w:tr>
+      <w:tr>
+        <w:tc>
+          <w:tcPr>
+            <w:tcW w:type="dxa" w:w="4703"/>
+          </w:tcPr>
+          <w:p>
+            <w:r/>
+            <w:r>
+              <w:rPr>
+                <w:rFonts w:ascii="Courier New" w:hAnsi="Courier New"/>
+                <w:b w:val="0"/>
                 <w:sz w:val="18"/>
               </w:rPr>
               <w:t>.github/workflows/</w:t>
@@ -608,14 +744,14 @@
         <w:tc>
           <w:tcPr>
             <w:tcW w:type="dxa" w:w="4703"/>
-            <w:shd w:val="clear" w:color="auto" w:fill="F0F4FA"/>
-          </w:tcPr>
-          <w:p>
-            <w:r>
-              <w:rPr>
-                <w:sz w:val="18"/>
-              </w:rPr>
-              <w:t>GitHub Actions CI/CD pipeline for GitHub Pages deployment</w:t>
+          </w:tcPr>
+          <w:p>
+            <w:r/>
+            <w:r>
+              <w:rPr>
+                <w:b w:val="0"/>
+              </w:rPr>
+              <w:t>GitHub Actions CI/CD pipeline for GitHub Pages deployment.</w:t>
             </w:r>
           </w:p>
         </w:tc>
@@ -1573,6 +1709,186 @@
           </w:p>
         </w:tc>
       </w:tr>
+      <w:tr>
+        <w:tc>
+          <w:tcPr>
+            <w:tcW w:type="dxa" w:w="2351"/>
+          </w:tcPr>
+          <w:p>
+            <w:r/>
+            <w:r>
+              <w:rPr>
+                <w:rFonts w:ascii="Courier New" w:hAnsi="Courier New"/>
+                <w:b w:val="0"/>
+                <w:sz w:val="18"/>
+              </w:rPr>
+              <w:t>selectedUnit</w:t>
+            </w:r>
+          </w:p>
+        </w:tc>
+        <w:tc>
+          <w:tcPr>
+            <w:tcW w:type="dxa" w:w="2351"/>
+          </w:tcPr>
+          <w:p>
+            <w:r/>
+            <w:r>
+              <w:rPr>
+                <w:b w:val="0"/>
+              </w:rPr>
+              <w:t>string | null</w:t>
+            </w:r>
+          </w:p>
+        </w:tc>
+        <w:tc>
+          <w:tcPr>
+            <w:tcW w:type="dxa" w:w="2351"/>
+          </w:tcPr>
+          <w:p>
+            <w:r/>
+            <w:r>
+              <w:rPr>
+                <w:b w:val="0"/>
+              </w:rPr>
+              <w:t>null</w:t>
+            </w:r>
+          </w:p>
+        </w:tc>
+        <w:tc>
+          <w:tcPr>
+            <w:tcW w:type="dxa" w:w="2351"/>
+          </w:tcPr>
+          <w:p>
+            <w:r/>
+            <w:r>
+              <w:rPr>
+                <w:b w:val="0"/>
+              </w:rPr>
+              <w:t>null = all units; else "2nd USC" | "CNTO" | "PXG" | "TFP"</w:t>
+            </w:r>
+          </w:p>
+        </w:tc>
+      </w:tr>
+      <w:tr>
+        <w:tc>
+          <w:tcPr>
+            <w:tcW w:type="dxa" w:w="2351"/>
+          </w:tcPr>
+          <w:p>
+            <w:r/>
+            <w:r>
+              <w:rPr>
+                <w:rFonts w:ascii="Courier New" w:hAnsi="Courier New"/>
+                <w:b w:val="0"/>
+                <w:sz w:val="18"/>
+              </w:rPr>
+              <w:t>playerUnits</w:t>
+            </w:r>
+          </w:p>
+        </w:tc>
+        <w:tc>
+          <w:tcPr>
+            <w:tcW w:type="dxa" w:w="2351"/>
+          </w:tcPr>
+          <w:p>
+            <w:r/>
+            <w:r>
+              <w:rPr>
+                <w:b w:val="0"/>
+              </w:rPr>
+              <w:t>Object</w:t>
+            </w:r>
+          </w:p>
+        </w:tc>
+        <w:tc>
+          <w:tcPr>
+            <w:tcW w:type="dxa" w:w="2351"/>
+          </w:tcPr>
+          <w:p>
+            <w:r/>
+            <w:r>
+              <w:rPr>
+                <w:b w:val="0"/>
+              </w:rPr>
+              <w:t>{}</w:t>
+            </w:r>
+          </w:p>
+        </w:tc>
+        <w:tc>
+          <w:tcPr>
+            <w:tcW w:type="dxa" w:w="2351"/>
+          </w:tcPr>
+          <w:p>
+            <w:r/>
+            <w:r>
+              <w:rPr>
+                <w:b w:val="0"/>
+              </w:rPr>
+              <w:t>Keyed by player name; value = classified unit string. Built by classifyUnits() after aggregation.</w:t>
+            </w:r>
+          </w:p>
+        </w:tc>
+      </w:tr>
+      <w:tr>
+        <w:tc>
+          <w:tcPr>
+            <w:tcW w:type="dxa" w:w="2351"/>
+          </w:tcPr>
+          <w:p>
+            <w:r/>
+            <w:r>
+              <w:rPr>
+                <w:rFonts w:ascii="Courier New" w:hAnsi="Courier New"/>
+                <w:b w:val="0"/>
+                <w:sz w:val="18"/>
+              </w:rPr>
+              <w:t>timePlayed</w:t>
+            </w:r>
+          </w:p>
+        </w:tc>
+        <w:tc>
+          <w:tcPr>
+            <w:tcW w:type="dxa" w:w="2351"/>
+          </w:tcPr>
+          <w:p>
+            <w:r/>
+            <w:r>
+              <w:rPr>
+                <w:b w:val="0"/>
+              </w:rPr>
+              <w:t>number</w:t>
+            </w:r>
+          </w:p>
+        </w:tc>
+        <w:tc>
+          <w:tcPr>
+            <w:tcW w:type="dxa" w:w="2351"/>
+          </w:tcPr>
+          <w:p>
+            <w:r/>
+            <w:r>
+              <w:rPr>
+                <w:b w:val="0"/>
+              </w:rPr>
+              <w:t>0</w:t>
+            </w:r>
+          </w:p>
+        </w:tc>
+        <w:tc>
+          <w:tcPr>
+            <w:tcW w:type="dxa" w:w="2351"/>
+          </w:tcPr>
+          <w:p>
+            <w:r/>
+            <w:r>
+              <w:rPr>
+                <w:b w:val="0"/>
+              </w:rPr>
+              <w:t>Accumulated seconds present per player per mission (in player aggregate object)</w:t>
+            </w:r>
+          </w:p>
+        </w:tc>
+      </w:tr>
     </w:tbl>
     <w:p>
       <w:r>
@@ -1702,12 +2018,12 @@
         <w:tc>
           <w:tcPr>
             <w:tcW w:type="dxa" w:w="3135"/>
-            <w:shd w:val="clear" w:color="auto" w:fill="FFFFFF"/>
-          </w:tcPr>
-          <w:p>
-            <w:r>
-              <w:rPr>
-                <w:sz w:val="18"/>
+          </w:tcPr>
+          <w:p>
+            <w:r/>
+            <w:r>
+              <w:rPr>
+                <w:b w:val="0"/>
               </w:rPr>
               <w:t>0</w:t>
             </w:r>
@@ -1716,12 +2032,12 @@
         <w:tc>
           <w:tcPr>
             <w:tcW w:type="dxa" w:w="3135"/>
-            <w:shd w:val="clear" w:color="auto" w:fill="FFFFFF"/>
-          </w:tcPr>
-          <w:p>
-            <w:r>
-              <w:rPr>
-                <w:sz w:val="18"/>
+          </w:tcPr>
+          <w:p>
+            <w:r/>
+            <w:r>
+              <w:rPr>
+                <w:b w:val="0"/>
               </w:rPr>
               <w:t>Source File</w:t>
             </w:r>
@@ -1730,12 +2046,12 @@
         <w:tc>
           <w:tcPr>
             <w:tcW w:type="dxa" w:w="3135"/>
-            <w:shd w:val="clear" w:color="auto" w:fill="FFFFFF"/>
-          </w:tcPr>
-          <w:p>
-            <w:r>
-              <w:rPr>
-                <w:sz w:val="18"/>
+          </w:tcPr>
+          <w:p>
+            <w:r/>
+            <w:r>
+              <w:rPr>
+                <w:b w:val="0"/>
               </w:rPr>
               <w:t>Filename encoding date (YYYY_MM_DD__...) and mission name</w:t>
             </w:r>
@@ -1746,12 +2062,12 @@
         <w:tc>
           <w:tcPr>
             <w:tcW w:type="dxa" w:w="3135"/>
-            <w:shd w:val="clear" w:color="auto" w:fill="F0F4FA"/>
-          </w:tcPr>
-          <w:p>
-            <w:r>
-              <w:rPr>
-                <w:sz w:val="18"/>
+          </w:tcPr>
+          <w:p>
+            <w:r/>
+            <w:r>
+              <w:rPr>
+                <w:b w:val="0"/>
               </w:rPr>
               <w:t>1</w:t>
             </w:r>
@@ -1760,12 +2076,12 @@
         <w:tc>
           <w:tcPr>
             <w:tcW w:type="dxa" w:w="3135"/>
-            <w:shd w:val="clear" w:color="auto" w:fill="F0F4FA"/>
-          </w:tcPr>
-          <w:p>
-            <w:r>
-              <w:rPr>
-                <w:sz w:val="18"/>
+          </w:tcPr>
+          <w:p>
+            <w:r/>
+            <w:r>
+              <w:rPr>
+                <w:b w:val="0"/>
               </w:rPr>
               <w:t>Mission</w:t>
             </w:r>
@@ -1774,12 +2090,12 @@
         <w:tc>
           <w:tcPr>
             <w:tcW w:type="dxa" w:w="3135"/>
-            <w:shd w:val="clear" w:color="auto" w:fill="F0F4FA"/>
-          </w:tcPr>
-          <w:p>
-            <w:r>
-              <w:rPr>
-                <w:sz w:val="18"/>
+          </w:tcPr>
+          <w:p>
+            <w:r/>
+            <w:r>
+              <w:rPr>
+                <w:b w:val="0"/>
               </w:rPr>
               <w:t>Human-readable mission name, expected to contain "(YYYY-MM-DD)"</w:t>
             </w:r>
@@ -1790,12 +2106,12 @@
         <w:tc>
           <w:tcPr>
             <w:tcW w:type="dxa" w:w="3135"/>
-            <w:shd w:val="clear" w:color="auto" w:fill="FFFFFF"/>
-          </w:tcPr>
-          <w:p>
-            <w:r>
-              <w:rPr>
-                <w:sz w:val="18"/>
+          </w:tcPr>
+          <w:p>
+            <w:r/>
+            <w:r>
+              <w:rPr>
+                <w:b w:val="0"/>
               </w:rPr>
               <w:t>2</w:t>
             </w:r>
@@ -1804,12 +2120,12 @@
         <w:tc>
           <w:tcPr>
             <w:tcW w:type="dxa" w:w="3135"/>
-            <w:shd w:val="clear" w:color="auto" w:fill="FFFFFF"/>
-          </w:tcPr>
-          <w:p>
-            <w:r>
-              <w:rPr>
-                <w:sz w:val="18"/>
+          </w:tcPr>
+          <w:p>
+            <w:r/>
+            <w:r>
+              <w:rPr>
+                <w:b w:val="0"/>
               </w:rPr>
               <w:t>World</w:t>
             </w:r>
@@ -1818,12 +2134,12 @@
         <w:tc>
           <w:tcPr>
             <w:tcW w:type="dxa" w:w="3135"/>
-            <w:shd w:val="clear" w:color="auto" w:fill="FFFFFF"/>
-          </w:tcPr>
-          <w:p>
-            <w:r>
-              <w:rPr>
-                <w:sz w:val="18"/>
+          </w:tcPr>
+          <w:p>
+            <w:r/>
+            <w:r>
+              <w:rPr>
+                <w:b w:val="0"/>
               </w:rPr>
               <w:t>Map/terrain name</w:t>
             </w:r>
@@ -1834,12 +2150,12 @@
         <w:tc>
           <w:tcPr>
             <w:tcW w:type="dxa" w:w="3135"/>
-            <w:shd w:val="clear" w:color="auto" w:fill="F0F4FA"/>
-          </w:tcPr>
-          <w:p>
-            <w:r>
-              <w:rPr>
-                <w:sz w:val="18"/>
+          </w:tcPr>
+          <w:p>
+            <w:r/>
+            <w:r>
+              <w:rPr>
+                <w:b w:val="0"/>
               </w:rPr>
               <w:t>3</w:t>
             </w:r>
@@ -1848,12 +2164,12 @@
         <w:tc>
           <w:tcPr>
             <w:tcW w:type="dxa" w:w="3135"/>
-            <w:shd w:val="clear" w:color="auto" w:fill="F0F4FA"/>
-          </w:tcPr>
-          <w:p>
-            <w:r>
-              <w:rPr>
-                <w:sz w:val="18"/>
+          </w:tcPr>
+          <w:p>
+            <w:r/>
+            <w:r>
+              <w:rPr>
+                <w:b w:val="0"/>
               </w:rPr>
               <w:t>Username</w:t>
             </w:r>
@@ -1862,12 +2178,12 @@
         <w:tc>
           <w:tcPr>
             <w:tcW w:type="dxa" w:w="3135"/>
-            <w:shd w:val="clear" w:color="auto" w:fill="F0F4FA"/>
-          </w:tcPr>
-          <w:p>
-            <w:r>
-              <w:rPr>
-                <w:sz w:val="18"/>
+          </w:tcPr>
+          <w:p>
+            <w:r/>
+            <w:r>
+              <w:rPr>
+                <w:b w:val="0"/>
               </w:rPr>
               <w:t>Player name (used as aggregate key)</w:t>
             </w:r>
@@ -1878,12 +2194,12 @@
         <w:tc>
           <w:tcPr>
             <w:tcW w:type="dxa" w:w="3135"/>
-            <w:shd w:val="clear" w:color="auto" w:fill="FFFFFF"/>
-          </w:tcPr>
-          <w:p>
-            <w:r>
-              <w:rPr>
-                <w:sz w:val="18"/>
+          </w:tcPr>
+          <w:p>
+            <w:r/>
+            <w:r>
+              <w:rPr>
+                <w:b w:val="0"/>
               </w:rPr>
               <w:t>4</w:t>
             </w:r>
@@ -1892,12 +2208,12 @@
         <w:tc>
           <w:tcPr>
             <w:tcW w:type="dxa" w:w="3135"/>
-            <w:shd w:val="clear" w:color="auto" w:fill="FFFFFF"/>
-          </w:tcPr>
-          <w:p>
-            <w:r>
-              <w:rPr>
-                <w:sz w:val="18"/>
+          </w:tcPr>
+          <w:p>
+            <w:r/>
+            <w:r>
+              <w:rPr>
+                <w:b w:val="0"/>
               </w:rPr>
               <w:t>Side</w:t>
             </w:r>
@@ -1906,12 +2222,12 @@
         <w:tc>
           <w:tcPr>
             <w:tcW w:type="dxa" w:w="3135"/>
-            <w:shd w:val="clear" w:color="auto" w:fill="FFFFFF"/>
-          </w:tcPr>
-          <w:p>
-            <w:r>
-              <w:rPr>
-                <w:sz w:val="18"/>
+          </w:tcPr>
+          <w:p>
+            <w:r/>
+            <w:r>
+              <w:rPr>
+                <w:b w:val="0"/>
               </w:rPr>
               <w:t>Faction (e.g. BLUFOR, OPFOR)</w:t>
             </w:r>
@@ -1922,12 +2238,12 @@
         <w:tc>
           <w:tcPr>
             <w:tcW w:type="dxa" w:w="3135"/>
-            <w:shd w:val="clear" w:color="auto" w:fill="F0F4FA"/>
-          </w:tcPr>
-          <w:p>
-            <w:r>
-              <w:rPr>
-                <w:sz w:val="18"/>
+          </w:tcPr>
+          <w:p>
+            <w:r/>
+            <w:r>
+              <w:rPr>
+                <w:b w:val="0"/>
               </w:rPr>
               <w:t>5</w:t>
             </w:r>
@@ -1936,12 +2252,12 @@
         <w:tc>
           <w:tcPr>
             <w:tcW w:type="dxa" w:w="3135"/>
-            <w:shd w:val="clear" w:color="auto" w:fill="F0F4FA"/>
-          </w:tcPr>
-          <w:p>
-            <w:r>
-              <w:rPr>
-                <w:sz w:val="18"/>
+          </w:tcPr>
+          <w:p>
+            <w:r/>
+            <w:r>
+              <w:rPr>
+                <w:b w:val="0"/>
               </w:rPr>
               <w:t>Group</w:t>
             </w:r>
@@ -1950,14 +2266,14 @@
         <w:tc>
           <w:tcPr>
             <w:tcW w:type="dxa" w:w="3135"/>
-            <w:shd w:val="clear" w:color="auto" w:fill="F0F4FA"/>
-          </w:tcPr>
-          <w:p>
-            <w:r>
-              <w:rPr>
-                <w:sz w:val="18"/>
-              </w:rPr>
-              <w:t>Role/squad; "zeus" group triggers Zeus classification</w:t>
+          </w:tcPr>
+          <w:p>
+            <w:r/>
+            <w:r>
+              <w:rPr>
+                <w:b w:val="0"/>
+              </w:rPr>
+              <w:t>Squad/group name; "zeus" group triggers Zeus classification</w:t>
             </w:r>
           </w:p>
         </w:tc>
@@ -1966,12 +2282,12 @@
         <w:tc>
           <w:tcPr>
             <w:tcW w:type="dxa" w:w="3135"/>
-            <w:shd w:val="clear" w:color="auto" w:fill="FFFFFF"/>
-          </w:tcPr>
-          <w:p>
-            <w:r>
-              <w:rPr>
-                <w:sz w:val="18"/>
+          </w:tcPr>
+          <w:p>
+            <w:r/>
+            <w:r>
+              <w:rPr>
+                <w:b w:val="0"/>
               </w:rPr>
               <w:t>6</w:t>
             </w:r>
@@ -1980,28 +2296,28 @@
         <w:tc>
           <w:tcPr>
             <w:tcW w:type="dxa" w:w="3135"/>
-            <w:shd w:val="clear" w:color="auto" w:fill="FFFFFF"/>
-          </w:tcPr>
-          <w:p>
-            <w:r>
-              <w:rPr>
-                <w:sz w:val="18"/>
-              </w:rPr>
-              <w:t>Kills (On Foot)</w:t>
-            </w:r>
-          </w:p>
-        </w:tc>
-        <w:tc>
-          <w:tcPr>
-            <w:tcW w:type="dxa" w:w="3135"/>
-            <w:shd w:val="clear" w:color="auto" w:fill="FFFFFF"/>
-          </w:tcPr>
-          <w:p>
-            <w:r>
-              <w:rPr>
-                <w:sz w:val="18"/>
-              </w:rPr>
-              <w:t>Infantry kills</w:t>
+          </w:tcPr>
+          <w:p>
+            <w:r/>
+            <w:r>
+              <w:rPr>
+                <w:b w:val="0"/>
+              </w:rPr>
+              <w:t>Role</w:t>
+            </w:r>
+          </w:p>
+        </w:tc>
+        <w:tc>
+          <w:tcPr>
+            <w:tcW w:type="dxa" w:w="3135"/>
+          </w:tcPr>
+          <w:p>
+            <w:r/>
+            <w:r>
+              <w:rPr>
+                <w:b w:val="0"/>
+              </w:rPr>
+              <w:t>Role string as reported by OCAP (may include @username suffix — stripped during aggregation)</w:t>
             </w:r>
           </w:p>
         </w:tc>
@@ -2010,12 +2326,12 @@
         <w:tc>
           <w:tcPr>
             <w:tcW w:type="dxa" w:w="3135"/>
-            <w:shd w:val="clear" w:color="auto" w:fill="F0F4FA"/>
-          </w:tcPr>
-          <w:p>
-            <w:r>
-              <w:rPr>
-                <w:sz w:val="18"/>
+          </w:tcPr>
+          <w:p>
+            <w:r/>
+            <w:r>
+              <w:rPr>
+                <w:b w:val="0"/>
               </w:rPr>
               <w:t>7</w:t>
             </w:r>
@@ -2024,28 +2340,28 @@
         <w:tc>
           <w:tcPr>
             <w:tcW w:type="dxa" w:w="3135"/>
-            <w:shd w:val="clear" w:color="auto" w:fill="F0F4FA"/>
-          </w:tcPr>
-          <w:p>
-            <w:r>
-              <w:rPr>
-                <w:sz w:val="18"/>
-              </w:rPr>
-              <w:t>Deaths (On Foot)</w:t>
-            </w:r>
-          </w:p>
-        </w:tc>
-        <w:tc>
-          <w:tcPr>
-            <w:tcW w:type="dxa" w:w="3135"/>
-            <w:shd w:val="clear" w:color="auto" w:fill="F0F4FA"/>
-          </w:tcPr>
-          <w:p>
-            <w:r>
-              <w:rPr>
-                <w:sz w:val="18"/>
-              </w:rPr>
-              <w:t>Infantry deaths</w:t>
+          </w:tcPr>
+          <w:p>
+            <w:r/>
+            <w:r>
+              <w:rPr>
+                <w:b w:val="0"/>
+              </w:rPr>
+              <w:t>Kills (On Foot)</w:t>
+            </w:r>
+          </w:p>
+        </w:tc>
+        <w:tc>
+          <w:tcPr>
+            <w:tcW w:type="dxa" w:w="3135"/>
+          </w:tcPr>
+          <w:p>
+            <w:r/>
+            <w:r>
+              <w:rPr>
+                <w:b w:val="0"/>
+              </w:rPr>
+              <w:t>Infantry kills</w:t>
             </w:r>
           </w:p>
         </w:tc>
@@ -2054,12 +2370,12 @@
         <w:tc>
           <w:tcPr>
             <w:tcW w:type="dxa" w:w="3135"/>
-            <w:shd w:val="clear" w:color="auto" w:fill="FFFFFF"/>
-          </w:tcPr>
-          <w:p>
-            <w:r>
-              <w:rPr>
-                <w:sz w:val="18"/>
+          </w:tcPr>
+          <w:p>
+            <w:r/>
+            <w:r>
+              <w:rPr>
+                <w:b w:val="0"/>
               </w:rPr>
               <w:t>8</w:t>
             </w:r>
@@ -2068,28 +2384,28 @@
         <w:tc>
           <w:tcPr>
             <w:tcW w:type="dxa" w:w="3135"/>
-            <w:shd w:val="clear" w:color="auto" w:fill="FFFFFF"/>
-          </w:tcPr>
-          <w:p>
-            <w:r>
-              <w:rPr>
-                <w:sz w:val="18"/>
-              </w:rPr>
-              <w:t>K/D (On Foot)</w:t>
-            </w:r>
-          </w:p>
-        </w:tc>
-        <w:tc>
-          <w:tcPr>
-            <w:tcW w:type="dxa" w:w="3135"/>
-            <w:shd w:val="clear" w:color="auto" w:fill="FFFFFF"/>
-          </w:tcPr>
-          <w:p>
-            <w:r>
-              <w:rPr>
-                <w:sz w:val="18"/>
-              </w:rPr>
-              <w:t>Ignored — recomputed from kills/deaths</w:t>
+          </w:tcPr>
+          <w:p>
+            <w:r/>
+            <w:r>
+              <w:rPr>
+                <w:b w:val="0"/>
+              </w:rPr>
+              <w:t>Deaths (On Foot)</w:t>
+            </w:r>
+          </w:p>
+        </w:tc>
+        <w:tc>
+          <w:tcPr>
+            <w:tcW w:type="dxa" w:w="3135"/>
+          </w:tcPr>
+          <w:p>
+            <w:r/>
+            <w:r>
+              <w:rPr>
+                <w:b w:val="0"/>
+              </w:rPr>
+              <w:t>Infantry deaths</w:t>
             </w:r>
           </w:p>
         </w:tc>
@@ -2098,12 +2414,12 @@
         <w:tc>
           <w:tcPr>
             <w:tcW w:type="dxa" w:w="3135"/>
-            <w:shd w:val="clear" w:color="auto" w:fill="F0F4FA"/>
-          </w:tcPr>
-          <w:p>
-            <w:r>
-              <w:rPr>
-                <w:sz w:val="18"/>
+          </w:tcPr>
+          <w:p>
+            <w:r/>
+            <w:r>
+              <w:rPr>
+                <w:b w:val="0"/>
               </w:rPr>
               <w:t>9</w:t>
             </w:r>
@@ -2112,28 +2428,28 @@
         <w:tc>
           <w:tcPr>
             <w:tcW w:type="dxa" w:w="3135"/>
-            <w:shd w:val="clear" w:color="auto" w:fill="F0F4FA"/>
-          </w:tcPr>
-          <w:p>
-            <w:r>
-              <w:rPr>
-                <w:sz w:val="18"/>
-              </w:rPr>
-              <w:t>Teamkills (On Foot)</w:t>
-            </w:r>
-          </w:p>
-        </w:tc>
-        <w:tc>
-          <w:tcPr>
-            <w:tcW w:type="dxa" w:w="3135"/>
-            <w:shd w:val="clear" w:color="auto" w:fill="F0F4FA"/>
-          </w:tcPr>
-          <w:p>
-            <w:r>
-              <w:rPr>
-                <w:sz w:val="18"/>
-              </w:rPr>
-              <w:t>Friendly fire kills (infantry)</w:t>
+          </w:tcPr>
+          <w:p>
+            <w:r/>
+            <w:r>
+              <w:rPr>
+                <w:b w:val="0"/>
+              </w:rPr>
+              <w:t>K/D (On Foot)</w:t>
+            </w:r>
+          </w:p>
+        </w:tc>
+        <w:tc>
+          <w:tcPr>
+            <w:tcW w:type="dxa" w:w="3135"/>
+          </w:tcPr>
+          <w:p>
+            <w:r/>
+            <w:r>
+              <w:rPr>
+                <w:b w:val="0"/>
+              </w:rPr>
+              <w:t>Ignored — recomputed from kills/deaths</w:t>
             </w:r>
           </w:p>
         </w:tc>
@@ -2142,12 +2458,12 @@
         <w:tc>
           <w:tcPr>
             <w:tcW w:type="dxa" w:w="3135"/>
-            <w:shd w:val="clear" w:color="auto" w:fill="FFFFFF"/>
-          </w:tcPr>
-          <w:p>
-            <w:r>
-              <w:rPr>
-                <w:sz w:val="18"/>
+          </w:tcPr>
+          <w:p>
+            <w:r/>
+            <w:r>
+              <w:rPr>
+                <w:b w:val="0"/>
               </w:rPr>
               <w:t>10</w:t>
             </w:r>
@@ -2156,28 +2472,28 @@
         <w:tc>
           <w:tcPr>
             <w:tcW w:type="dxa" w:w="3135"/>
-            <w:shd w:val="clear" w:color="auto" w:fill="FFFFFF"/>
-          </w:tcPr>
-          <w:p>
-            <w:r>
-              <w:rPr>
-                <w:sz w:val="18"/>
-              </w:rPr>
-              <w:t>Shots (On Foot)</w:t>
-            </w:r>
-          </w:p>
-        </w:tc>
-        <w:tc>
-          <w:tcPr>
-            <w:tcW w:type="dxa" w:w="3135"/>
-            <w:shd w:val="clear" w:color="auto" w:fill="FFFFFF"/>
-          </w:tcPr>
-          <w:p>
-            <w:r>
-              <w:rPr>
-                <w:sz w:val="18"/>
-              </w:rPr>
-              <w:t>Rounds fired on foot</w:t>
+          </w:tcPr>
+          <w:p>
+            <w:r/>
+            <w:r>
+              <w:rPr>
+                <w:b w:val="0"/>
+              </w:rPr>
+              <w:t>Teamkills (On Foot)</w:t>
+            </w:r>
+          </w:p>
+        </w:tc>
+        <w:tc>
+          <w:tcPr>
+            <w:tcW w:type="dxa" w:w="3135"/>
+          </w:tcPr>
+          <w:p>
+            <w:r/>
+            <w:r>
+              <w:rPr>
+                <w:b w:val="0"/>
+              </w:rPr>
+              <w:t>Friendly fire kills (infantry)</w:t>
             </w:r>
           </w:p>
         </w:tc>
@@ -2186,12 +2502,12 @@
         <w:tc>
           <w:tcPr>
             <w:tcW w:type="dxa" w:w="3135"/>
-            <w:shd w:val="clear" w:color="auto" w:fill="F0F4FA"/>
-          </w:tcPr>
-          <w:p>
-            <w:r>
-              <w:rPr>
-                <w:sz w:val="18"/>
+          </w:tcPr>
+          <w:p>
+            <w:r/>
+            <w:r>
+              <w:rPr>
+                <w:b w:val="0"/>
               </w:rPr>
               <w:t>11</w:t>
             </w:r>
@@ -2200,28 +2516,28 @@
         <w:tc>
           <w:tcPr>
             <w:tcW w:type="dxa" w:w="3135"/>
-            <w:shd w:val="clear" w:color="auto" w:fill="F0F4FA"/>
-          </w:tcPr>
-          <w:p>
-            <w:r>
-              <w:rPr>
-                <w:sz w:val="18"/>
-              </w:rPr>
-              <w:t>Hits Taken (On Foot)</w:t>
-            </w:r>
-          </w:p>
-        </w:tc>
-        <w:tc>
-          <w:tcPr>
-            <w:tcW w:type="dxa" w:w="3135"/>
-            <w:shd w:val="clear" w:color="auto" w:fill="F0F4FA"/>
-          </w:tcPr>
-          <w:p>
-            <w:r>
-              <w:rPr>
-                <w:sz w:val="18"/>
-              </w:rPr>
-              <w:t>Times hit while on foot</w:t>
+          </w:tcPr>
+          <w:p>
+            <w:r/>
+            <w:r>
+              <w:rPr>
+                <w:b w:val="0"/>
+              </w:rPr>
+              <w:t>Shots (On Foot)</w:t>
+            </w:r>
+          </w:p>
+        </w:tc>
+        <w:tc>
+          <w:tcPr>
+            <w:tcW w:type="dxa" w:w="3135"/>
+          </w:tcPr>
+          <w:p>
+            <w:r/>
+            <w:r>
+              <w:rPr>
+                <w:b w:val="0"/>
+              </w:rPr>
+              <w:t>Rounds fired on foot</w:t>
             </w:r>
           </w:p>
         </w:tc>
@@ -2230,12 +2546,12 @@
         <w:tc>
           <w:tcPr>
             <w:tcW w:type="dxa" w:w="3135"/>
-            <w:shd w:val="clear" w:color="auto" w:fill="FFFFFF"/>
-          </w:tcPr>
-          <w:p>
-            <w:r>
-              <w:rPr>
-                <w:sz w:val="18"/>
+          </w:tcPr>
+          <w:p>
+            <w:r/>
+            <w:r>
+              <w:rPr>
+                <w:b w:val="0"/>
               </w:rPr>
               <w:t>12</w:t>
             </w:r>
@@ -2244,28 +2560,28 @@
         <w:tc>
           <w:tcPr>
             <w:tcW w:type="dxa" w:w="3135"/>
-            <w:shd w:val="clear" w:color="auto" w:fill="FFFFFF"/>
-          </w:tcPr>
-          <w:p>
-            <w:r>
-              <w:rPr>
-                <w:sz w:val="18"/>
-              </w:rPr>
-              <w:t>Shots/Kill (On Foot)</w:t>
-            </w:r>
-          </w:p>
-        </w:tc>
-        <w:tc>
-          <w:tcPr>
-            <w:tcW w:type="dxa" w:w="3135"/>
-            <w:shd w:val="clear" w:color="auto" w:fill="FFFFFF"/>
-          </w:tcPr>
-          <w:p>
-            <w:r>
-              <w:rPr>
-                <w:sz w:val="18"/>
-              </w:rPr>
-              <w:t>Ignored — recomputed</w:t>
+          </w:tcPr>
+          <w:p>
+            <w:r/>
+            <w:r>
+              <w:rPr>
+                <w:b w:val="0"/>
+              </w:rPr>
+              <w:t>Hits Taken (On Foot)</w:t>
+            </w:r>
+          </w:p>
+        </w:tc>
+        <w:tc>
+          <w:tcPr>
+            <w:tcW w:type="dxa" w:w="3135"/>
+          </w:tcPr>
+          <w:p>
+            <w:r/>
+            <w:r>
+              <w:rPr>
+                <w:b w:val="0"/>
+              </w:rPr>
+              <w:t>Times hit while on foot</w:t>
             </w:r>
           </w:p>
         </w:tc>
@@ -2274,12 +2590,12 @@
         <w:tc>
           <w:tcPr>
             <w:tcW w:type="dxa" w:w="3135"/>
-            <w:shd w:val="clear" w:color="auto" w:fill="F0F4FA"/>
-          </w:tcPr>
-          <w:p>
-            <w:r>
-              <w:rPr>
-                <w:sz w:val="18"/>
+          </w:tcPr>
+          <w:p>
+            <w:r/>
+            <w:r>
+              <w:rPr>
+                <w:b w:val="0"/>
               </w:rPr>
               <w:t>13</w:t>
             </w:r>
@@ -2288,28 +2604,28 @@
         <w:tc>
           <w:tcPr>
             <w:tcW w:type="dxa" w:w="3135"/>
-            <w:shd w:val="clear" w:color="auto" w:fill="F0F4FA"/>
-          </w:tcPr>
-          <w:p>
-            <w:r>
-              <w:rPr>
-                <w:sz w:val="18"/>
-              </w:rPr>
-              <w:t>Avg Kill Dist On Foot (m)</w:t>
-            </w:r>
-          </w:p>
-        </w:tc>
-        <w:tc>
-          <w:tcPr>
-            <w:tcW w:type="dxa" w:w="3135"/>
-            <w:shd w:val="clear" w:color="auto" w:fill="F0F4FA"/>
-          </w:tcPr>
-          <w:p>
-            <w:r>
-              <w:rPr>
-                <w:sz w:val="18"/>
-              </w:rPr>
-              <w:t>Average kill distance (on foot)</w:t>
+          </w:tcPr>
+          <w:p>
+            <w:r/>
+            <w:r>
+              <w:rPr>
+                <w:b w:val="0"/>
+              </w:rPr>
+              <w:t>Shots/Kill (On Foot)</w:t>
+            </w:r>
+          </w:p>
+        </w:tc>
+        <w:tc>
+          <w:tcPr>
+            <w:tcW w:type="dxa" w:w="3135"/>
+          </w:tcPr>
+          <w:p>
+            <w:r/>
+            <w:r>
+              <w:rPr>
+                <w:b w:val="0"/>
+              </w:rPr>
+              <w:t>Ignored — recomputed</w:t>
             </w:r>
           </w:p>
         </w:tc>
@@ -2318,12 +2634,12 @@
         <w:tc>
           <w:tcPr>
             <w:tcW w:type="dxa" w:w="3135"/>
-            <w:shd w:val="clear" w:color="auto" w:fill="FFFFFF"/>
-          </w:tcPr>
-          <w:p>
-            <w:r>
-              <w:rPr>
-                <w:sz w:val="18"/>
+          </w:tcPr>
+          <w:p>
+            <w:r/>
+            <w:r>
+              <w:rPr>
+                <w:b w:val="0"/>
               </w:rPr>
               <w:t>14</w:t>
             </w:r>
@@ -2332,28 +2648,28 @@
         <w:tc>
           <w:tcPr>
             <w:tcW w:type="dxa" w:w="3135"/>
-            <w:shd w:val="clear" w:color="auto" w:fill="FFFFFF"/>
-          </w:tcPr>
-          <w:p>
-            <w:r>
-              <w:rPr>
-                <w:sz w:val="18"/>
-              </w:rPr>
-              <w:t>Longest Kill On Foot (m)</w:t>
-            </w:r>
-          </w:p>
-        </w:tc>
-        <w:tc>
-          <w:tcPr>
-            <w:tcW w:type="dxa" w:w="3135"/>
-            <w:shd w:val="clear" w:color="auto" w:fill="FFFFFF"/>
-          </w:tcPr>
-          <w:p>
-            <w:r>
-              <w:rPr>
-                <w:sz w:val="18"/>
-              </w:rPr>
-              <w:t>Longest single kill distance (on foot)</w:t>
+          </w:tcPr>
+          <w:p>
+            <w:r/>
+            <w:r>
+              <w:rPr>
+                <w:b w:val="0"/>
+              </w:rPr>
+              <w:t>Avg Kill Dist On Foot (m)</w:t>
+            </w:r>
+          </w:p>
+        </w:tc>
+        <w:tc>
+          <w:tcPr>
+            <w:tcW w:type="dxa" w:w="3135"/>
+          </w:tcPr>
+          <w:p>
+            <w:r/>
+            <w:r>
+              <w:rPr>
+                <w:b w:val="0"/>
+              </w:rPr>
+              <w:t>Average kill distance (on foot)</w:t>
             </w:r>
           </w:p>
         </w:tc>
@@ -2362,12 +2678,12 @@
         <w:tc>
           <w:tcPr>
             <w:tcW w:type="dxa" w:w="3135"/>
-            <w:shd w:val="clear" w:color="auto" w:fill="F0F4FA"/>
-          </w:tcPr>
-          <w:p>
-            <w:r>
-              <w:rPr>
-                <w:sz w:val="18"/>
+          </w:tcPr>
+          <w:p>
+            <w:r/>
+            <w:r>
+              <w:rPr>
+                <w:b w:val="0"/>
               </w:rPr>
               <w:t>15</w:t>
             </w:r>
@@ -2376,28 +2692,28 @@
         <w:tc>
           <w:tcPr>
             <w:tcW w:type="dxa" w:w="3135"/>
-            <w:shd w:val="clear" w:color="auto" w:fill="F0F4FA"/>
-          </w:tcPr>
-          <w:p>
-            <w:r>
-              <w:rPr>
-                <w:sz w:val="18"/>
-              </w:rPr>
-              <w:t>Kills (In Vehicle)</w:t>
-            </w:r>
-          </w:p>
-        </w:tc>
-        <w:tc>
-          <w:tcPr>
-            <w:tcW w:type="dxa" w:w="3135"/>
-            <w:shd w:val="clear" w:color="auto" w:fill="F0F4FA"/>
-          </w:tcPr>
-          <w:p>
-            <w:r>
-              <w:rPr>
-                <w:sz w:val="18"/>
-              </w:rPr>
-              <w:t>Vehicle kills</w:t>
+          </w:tcPr>
+          <w:p>
+            <w:r/>
+            <w:r>
+              <w:rPr>
+                <w:b w:val="0"/>
+              </w:rPr>
+              <w:t>Longest Kill On Foot (m)</w:t>
+            </w:r>
+          </w:p>
+        </w:tc>
+        <w:tc>
+          <w:tcPr>
+            <w:tcW w:type="dxa" w:w="3135"/>
+          </w:tcPr>
+          <w:p>
+            <w:r/>
+            <w:r>
+              <w:rPr>
+                <w:b w:val="0"/>
+              </w:rPr>
+              <w:t>Longest single kill distance (on foot)</w:t>
             </w:r>
           </w:p>
         </w:tc>
@@ -2406,12 +2722,12 @@
         <w:tc>
           <w:tcPr>
             <w:tcW w:type="dxa" w:w="3135"/>
-            <w:shd w:val="clear" w:color="auto" w:fill="FFFFFF"/>
-          </w:tcPr>
-          <w:p>
-            <w:r>
-              <w:rPr>
-                <w:sz w:val="18"/>
+          </w:tcPr>
+          <w:p>
+            <w:r/>
+            <w:r>
+              <w:rPr>
+                <w:b w:val="0"/>
               </w:rPr>
               <w:t>16</w:t>
             </w:r>
@@ -2420,28 +2736,28 @@
         <w:tc>
           <w:tcPr>
             <w:tcW w:type="dxa" w:w="3135"/>
-            <w:shd w:val="clear" w:color="auto" w:fill="FFFFFF"/>
-          </w:tcPr>
-          <w:p>
-            <w:r>
-              <w:rPr>
-                <w:sz w:val="18"/>
-              </w:rPr>
-              <w:t>Deaths (In Vehicle)</w:t>
-            </w:r>
-          </w:p>
-        </w:tc>
-        <w:tc>
-          <w:tcPr>
-            <w:tcW w:type="dxa" w:w="3135"/>
-            <w:shd w:val="clear" w:color="auto" w:fill="FFFFFF"/>
-          </w:tcPr>
-          <w:p>
-            <w:r>
-              <w:rPr>
-                <w:sz w:val="18"/>
-              </w:rPr>
-              <w:t>Deaths while in vehicle</w:t>
+          </w:tcPr>
+          <w:p>
+            <w:r/>
+            <w:r>
+              <w:rPr>
+                <w:b w:val="0"/>
+              </w:rPr>
+              <w:t>Kills (In Vehicle)</w:t>
+            </w:r>
+          </w:p>
+        </w:tc>
+        <w:tc>
+          <w:tcPr>
+            <w:tcW w:type="dxa" w:w="3135"/>
+          </w:tcPr>
+          <w:p>
+            <w:r/>
+            <w:r>
+              <w:rPr>
+                <w:b w:val="0"/>
+              </w:rPr>
+              <w:t>Kills scored while in a vehicle</w:t>
             </w:r>
           </w:p>
         </w:tc>
@@ -2450,12 +2766,12 @@
         <w:tc>
           <w:tcPr>
             <w:tcW w:type="dxa" w:w="3135"/>
-            <w:shd w:val="clear" w:color="auto" w:fill="F0F4FA"/>
-          </w:tcPr>
-          <w:p>
-            <w:r>
-              <w:rPr>
-                <w:sz w:val="18"/>
+          </w:tcPr>
+          <w:p>
+            <w:r/>
+            <w:r>
+              <w:rPr>
+                <w:b w:val="0"/>
               </w:rPr>
               <w:t>17</w:t>
             </w:r>
@@ -2464,28 +2780,28 @@
         <w:tc>
           <w:tcPr>
             <w:tcW w:type="dxa" w:w="3135"/>
-            <w:shd w:val="clear" w:color="auto" w:fill="F0F4FA"/>
-          </w:tcPr>
-          <w:p>
-            <w:r>
-              <w:rPr>
-                <w:sz w:val="18"/>
-              </w:rPr>
-              <w:t>K/D (In Vehicle)</w:t>
-            </w:r>
-          </w:p>
-        </w:tc>
-        <w:tc>
-          <w:tcPr>
-            <w:tcW w:type="dxa" w:w="3135"/>
-            <w:shd w:val="clear" w:color="auto" w:fill="F0F4FA"/>
-          </w:tcPr>
-          <w:p>
-            <w:r>
-              <w:rPr>
-                <w:sz w:val="18"/>
-              </w:rPr>
-              <w:t>Ignored — recomputed</w:t>
+          </w:tcPr>
+          <w:p>
+            <w:r/>
+            <w:r>
+              <w:rPr>
+                <w:b w:val="0"/>
+              </w:rPr>
+              <w:t>Deaths (In Vehicle)</w:t>
+            </w:r>
+          </w:p>
+        </w:tc>
+        <w:tc>
+          <w:tcPr>
+            <w:tcW w:type="dxa" w:w="3135"/>
+          </w:tcPr>
+          <w:p>
+            <w:r/>
+            <w:r>
+              <w:rPr>
+                <w:b w:val="0"/>
+              </w:rPr>
+              <w:t>Deaths while in vehicle</w:t>
             </w:r>
           </w:p>
         </w:tc>
@@ -2494,12 +2810,12 @@
         <w:tc>
           <w:tcPr>
             <w:tcW w:type="dxa" w:w="3135"/>
-            <w:shd w:val="clear" w:color="auto" w:fill="FFFFFF"/>
-          </w:tcPr>
-          <w:p>
-            <w:r>
-              <w:rPr>
-                <w:sz w:val="18"/>
+          </w:tcPr>
+          <w:p>
+            <w:r/>
+            <w:r>
+              <w:rPr>
+                <w:b w:val="0"/>
               </w:rPr>
               <w:t>18</w:t>
             </w:r>
@@ -2508,28 +2824,28 @@
         <w:tc>
           <w:tcPr>
             <w:tcW w:type="dxa" w:w="3135"/>
-            <w:shd w:val="clear" w:color="auto" w:fill="FFFFFF"/>
-          </w:tcPr>
-          <w:p>
-            <w:r>
-              <w:rPr>
-                <w:sz w:val="18"/>
-              </w:rPr>
-              <w:t>Teamkills (In Vehicle)</w:t>
-            </w:r>
-          </w:p>
-        </w:tc>
-        <w:tc>
-          <w:tcPr>
-            <w:tcW w:type="dxa" w:w="3135"/>
-            <w:shd w:val="clear" w:color="auto" w:fill="FFFFFF"/>
-          </w:tcPr>
-          <w:p>
-            <w:r>
-              <w:rPr>
-                <w:sz w:val="18"/>
-              </w:rPr>
-              <w:t>Friendly fire from vehicle</w:t>
+          </w:tcPr>
+          <w:p>
+            <w:r/>
+            <w:r>
+              <w:rPr>
+                <w:b w:val="0"/>
+              </w:rPr>
+              <w:t>K/D (In Vehicle)</w:t>
+            </w:r>
+          </w:p>
+        </w:tc>
+        <w:tc>
+          <w:tcPr>
+            <w:tcW w:type="dxa" w:w="3135"/>
+          </w:tcPr>
+          <w:p>
+            <w:r/>
+            <w:r>
+              <w:rPr>
+                <w:b w:val="0"/>
+              </w:rPr>
+              <w:t>Ignored — recomputed</w:t>
             </w:r>
           </w:p>
         </w:tc>
@@ -2538,12 +2854,12 @@
         <w:tc>
           <w:tcPr>
             <w:tcW w:type="dxa" w:w="3135"/>
-            <w:shd w:val="clear" w:color="auto" w:fill="F0F4FA"/>
-          </w:tcPr>
-          <w:p>
-            <w:r>
-              <w:rPr>
-                <w:sz w:val="18"/>
+          </w:tcPr>
+          <w:p>
+            <w:r/>
+            <w:r>
+              <w:rPr>
+                <w:b w:val="0"/>
               </w:rPr>
               <w:t>19</w:t>
             </w:r>
@@ -2552,28 +2868,28 @@
         <w:tc>
           <w:tcPr>
             <w:tcW w:type="dxa" w:w="3135"/>
-            <w:shd w:val="clear" w:color="auto" w:fill="F0F4FA"/>
-          </w:tcPr>
-          <w:p>
-            <w:r>
-              <w:rPr>
-                <w:sz w:val="18"/>
-              </w:rPr>
-              <w:t>Vehicle Kills (On Foot)</w:t>
-            </w:r>
-          </w:p>
-        </w:tc>
-        <w:tc>
-          <w:tcPr>
-            <w:tcW w:type="dxa" w:w="3135"/>
-            <w:shd w:val="clear" w:color="auto" w:fill="F0F4FA"/>
-          </w:tcPr>
-          <w:p>
-            <w:r>
-              <w:rPr>
-                <w:sz w:val="18"/>
-              </w:rPr>
-              <w:t>Vehicles destroyed while on foot</w:t>
+          </w:tcPr>
+          <w:p>
+            <w:r/>
+            <w:r>
+              <w:rPr>
+                <w:b w:val="0"/>
+              </w:rPr>
+              <w:t>Teamkills (In Vehicle)</w:t>
+            </w:r>
+          </w:p>
+        </w:tc>
+        <w:tc>
+          <w:tcPr>
+            <w:tcW w:type="dxa" w:w="3135"/>
+          </w:tcPr>
+          <w:p>
+            <w:r/>
+            <w:r>
+              <w:rPr>
+                <w:b w:val="0"/>
+              </w:rPr>
+              <w:t>Friendly fire from vehicle</w:t>
             </w:r>
           </w:p>
         </w:tc>
@@ -2582,12 +2898,12 @@
         <w:tc>
           <w:tcPr>
             <w:tcW w:type="dxa" w:w="3135"/>
-            <w:shd w:val="clear" w:color="auto" w:fill="FFFFFF"/>
-          </w:tcPr>
-          <w:p>
-            <w:r>
-              <w:rPr>
-                <w:sz w:val="18"/>
+          </w:tcPr>
+          <w:p>
+            <w:r/>
+            <w:r>
+              <w:rPr>
+                <w:b w:val="0"/>
               </w:rPr>
               <w:t>20</w:t>
             </w:r>
@@ -2596,28 +2912,28 @@
         <w:tc>
           <w:tcPr>
             <w:tcW w:type="dxa" w:w="3135"/>
-            <w:shd w:val="clear" w:color="auto" w:fill="FFFFFF"/>
-          </w:tcPr>
-          <w:p>
-            <w:r>
-              <w:rPr>
-                <w:sz w:val="18"/>
-              </w:rPr>
-              <w:t>Vehicle Kills (In Vehicle)</w:t>
-            </w:r>
-          </w:p>
-        </w:tc>
-        <w:tc>
-          <w:tcPr>
-            <w:tcW w:type="dxa" w:w="3135"/>
-            <w:shd w:val="clear" w:color="auto" w:fill="FFFFFF"/>
-          </w:tcPr>
-          <w:p>
-            <w:r>
-              <w:rPr>
-                <w:sz w:val="18"/>
-              </w:rPr>
-              <w:t>Vehicles destroyed while in vehicle</w:t>
+          </w:tcPr>
+          <w:p>
+            <w:r/>
+            <w:r>
+              <w:rPr>
+                <w:b w:val="0"/>
+              </w:rPr>
+              <w:t>Vehicle Kills (On Foot)</w:t>
+            </w:r>
+          </w:p>
+        </w:tc>
+        <w:tc>
+          <w:tcPr>
+            <w:tcW w:type="dxa" w:w="3135"/>
+          </w:tcPr>
+          <w:p>
+            <w:r/>
+            <w:r>
+              <w:rPr>
+                <w:b w:val="0"/>
+              </w:rPr>
+              <w:t>Vehicles destroyed while on foot</w:t>
             </w:r>
           </w:p>
         </w:tc>
@@ -2626,12 +2942,12 @@
         <w:tc>
           <w:tcPr>
             <w:tcW w:type="dxa" w:w="3135"/>
-            <w:shd w:val="clear" w:color="auto" w:fill="F0F4FA"/>
-          </w:tcPr>
-          <w:p>
-            <w:r>
-              <w:rPr>
-                <w:sz w:val="18"/>
+          </w:tcPr>
+          <w:p>
+            <w:r/>
+            <w:r>
+              <w:rPr>
+                <w:b w:val="0"/>
               </w:rPr>
               <w:t>21</w:t>
             </w:r>
@@ -2640,28 +2956,28 @@
         <w:tc>
           <w:tcPr>
             <w:tcW w:type="dxa" w:w="3135"/>
-            <w:shd w:val="clear" w:color="auto" w:fill="F0F4FA"/>
-          </w:tcPr>
-          <w:p>
-            <w:r>
-              <w:rPr>
-                <w:sz w:val="18"/>
-              </w:rPr>
-              <w:t>Shots (In Vehicle)</w:t>
-            </w:r>
-          </w:p>
-        </w:tc>
-        <w:tc>
-          <w:tcPr>
-            <w:tcW w:type="dxa" w:w="3135"/>
-            <w:shd w:val="clear" w:color="auto" w:fill="F0F4FA"/>
-          </w:tcPr>
-          <w:p>
-            <w:r>
-              <w:rPr>
-                <w:sz w:val="18"/>
-              </w:rPr>
-              <w:t>Rounds fired from vehicle</w:t>
+          </w:tcPr>
+          <w:p>
+            <w:r/>
+            <w:r>
+              <w:rPr>
+                <w:b w:val="0"/>
+              </w:rPr>
+              <w:t>Vehicle Kills (In Vehicle)</w:t>
+            </w:r>
+          </w:p>
+        </w:tc>
+        <w:tc>
+          <w:tcPr>
+            <w:tcW w:type="dxa" w:w="3135"/>
+          </w:tcPr>
+          <w:p>
+            <w:r/>
+            <w:r>
+              <w:rPr>
+                <w:b w:val="0"/>
+              </w:rPr>
+              <w:t>Vehicles destroyed while in vehicle</w:t>
             </w:r>
           </w:p>
         </w:tc>
@@ -2670,12 +2986,12 @@
         <w:tc>
           <w:tcPr>
             <w:tcW w:type="dxa" w:w="3135"/>
-            <w:shd w:val="clear" w:color="auto" w:fill="FFFFFF"/>
-          </w:tcPr>
-          <w:p>
-            <w:r>
-              <w:rPr>
-                <w:sz w:val="18"/>
+          </w:tcPr>
+          <w:p>
+            <w:r/>
+            <w:r>
+              <w:rPr>
+                <w:b w:val="0"/>
               </w:rPr>
               <w:t>22</w:t>
             </w:r>
@@ -2684,28 +3000,28 @@
         <w:tc>
           <w:tcPr>
             <w:tcW w:type="dxa" w:w="3135"/>
-            <w:shd w:val="clear" w:color="auto" w:fill="FFFFFF"/>
-          </w:tcPr>
-          <w:p>
-            <w:r>
-              <w:rPr>
-                <w:sz w:val="18"/>
-              </w:rPr>
-              <w:t>Hits Taken (In Vehicle)</w:t>
-            </w:r>
-          </w:p>
-        </w:tc>
-        <w:tc>
-          <w:tcPr>
-            <w:tcW w:type="dxa" w:w="3135"/>
-            <w:shd w:val="clear" w:color="auto" w:fill="FFFFFF"/>
-          </w:tcPr>
-          <w:p>
-            <w:r>
-              <w:rPr>
-                <w:sz w:val="18"/>
-              </w:rPr>
-              <w:t>Times vehicle was hit</w:t>
+          </w:tcPr>
+          <w:p>
+            <w:r/>
+            <w:r>
+              <w:rPr>
+                <w:b w:val="0"/>
+              </w:rPr>
+              <w:t>Shots (In Vehicle)</w:t>
+            </w:r>
+          </w:p>
+        </w:tc>
+        <w:tc>
+          <w:tcPr>
+            <w:tcW w:type="dxa" w:w="3135"/>
+          </w:tcPr>
+          <w:p>
+            <w:r/>
+            <w:r>
+              <w:rPr>
+                <w:b w:val="0"/>
+              </w:rPr>
+              <w:t>Rounds fired from vehicle</w:t>
             </w:r>
           </w:p>
         </w:tc>
@@ -2714,12 +3030,12 @@
         <w:tc>
           <w:tcPr>
             <w:tcW w:type="dxa" w:w="3135"/>
-            <w:shd w:val="clear" w:color="auto" w:fill="F0F4FA"/>
-          </w:tcPr>
-          <w:p>
-            <w:r>
-              <w:rPr>
-                <w:sz w:val="18"/>
+          </w:tcPr>
+          <w:p>
+            <w:r/>
+            <w:r>
+              <w:rPr>
+                <w:b w:val="0"/>
               </w:rPr>
               <w:t>23</w:t>
             </w:r>
@@ -2728,28 +3044,28 @@
         <w:tc>
           <w:tcPr>
             <w:tcW w:type="dxa" w:w="3135"/>
-            <w:shd w:val="clear" w:color="auto" w:fill="F0F4FA"/>
-          </w:tcPr>
-          <w:p>
-            <w:r>
-              <w:rPr>
-                <w:sz w:val="18"/>
-              </w:rPr>
-              <w:t>Shots/Kill (In Vehicle)</w:t>
-            </w:r>
-          </w:p>
-        </w:tc>
-        <w:tc>
-          <w:tcPr>
-            <w:tcW w:type="dxa" w:w="3135"/>
-            <w:shd w:val="clear" w:color="auto" w:fill="F0F4FA"/>
-          </w:tcPr>
-          <w:p>
-            <w:r>
-              <w:rPr>
-                <w:sz w:val="18"/>
-              </w:rPr>
-              <w:t>Ignored — recomputed</w:t>
+          </w:tcPr>
+          <w:p>
+            <w:r/>
+            <w:r>
+              <w:rPr>
+                <w:b w:val="0"/>
+              </w:rPr>
+              <w:t>Hits Taken (In Vehicle)</w:t>
+            </w:r>
+          </w:p>
+        </w:tc>
+        <w:tc>
+          <w:tcPr>
+            <w:tcW w:type="dxa" w:w="3135"/>
+          </w:tcPr>
+          <w:p>
+            <w:r/>
+            <w:r>
+              <w:rPr>
+                <w:b w:val="0"/>
+              </w:rPr>
+              <w:t>Times vehicle was hit</w:t>
             </w:r>
           </w:p>
         </w:tc>
@@ -2758,12 +3074,12 @@
         <w:tc>
           <w:tcPr>
             <w:tcW w:type="dxa" w:w="3135"/>
-            <w:shd w:val="clear" w:color="auto" w:fill="FFFFFF"/>
-          </w:tcPr>
-          <w:p>
-            <w:r>
-              <w:rPr>
-                <w:sz w:val="18"/>
+          </w:tcPr>
+          <w:p>
+            <w:r/>
+            <w:r>
+              <w:rPr>
+                <w:b w:val="0"/>
               </w:rPr>
               <w:t>24</w:t>
             </w:r>
@@ -2772,28 +3088,28 @@
         <w:tc>
           <w:tcPr>
             <w:tcW w:type="dxa" w:w="3135"/>
-            <w:shd w:val="clear" w:color="auto" w:fill="FFFFFF"/>
-          </w:tcPr>
-          <w:p>
-            <w:r>
-              <w:rPr>
-                <w:sz w:val="18"/>
-              </w:rPr>
-              <w:t>Avg Kill Dist In Vehicle (m)</w:t>
-            </w:r>
-          </w:p>
-        </w:tc>
-        <w:tc>
-          <w:tcPr>
-            <w:tcW w:type="dxa" w:w="3135"/>
-            <w:shd w:val="clear" w:color="auto" w:fill="FFFFFF"/>
-          </w:tcPr>
-          <w:p>
-            <w:r>
-              <w:rPr>
-                <w:sz w:val="18"/>
-              </w:rPr>
-              <w:t>Average kill distance (vehicle)</w:t>
+          </w:tcPr>
+          <w:p>
+            <w:r/>
+            <w:r>
+              <w:rPr>
+                <w:b w:val="0"/>
+              </w:rPr>
+              <w:t>Shots/Kill (In Vehicle)</w:t>
+            </w:r>
+          </w:p>
+        </w:tc>
+        <w:tc>
+          <w:tcPr>
+            <w:tcW w:type="dxa" w:w="3135"/>
+          </w:tcPr>
+          <w:p>
+            <w:r/>
+            <w:r>
+              <w:rPr>
+                <w:b w:val="0"/>
+              </w:rPr>
+              <w:t>Ignored — recomputed</w:t>
             </w:r>
           </w:p>
         </w:tc>
@@ -2802,12 +3118,12 @@
         <w:tc>
           <w:tcPr>
             <w:tcW w:type="dxa" w:w="3135"/>
-            <w:shd w:val="clear" w:color="auto" w:fill="F0F4FA"/>
-          </w:tcPr>
-          <w:p>
-            <w:r>
-              <w:rPr>
-                <w:sz w:val="18"/>
+          </w:tcPr>
+          <w:p>
+            <w:r/>
+            <w:r>
+              <w:rPr>
+                <w:b w:val="0"/>
               </w:rPr>
               <w:t>25</w:t>
             </w:r>
@@ -2816,28 +3132,28 @@
         <w:tc>
           <w:tcPr>
             <w:tcW w:type="dxa" w:w="3135"/>
-            <w:shd w:val="clear" w:color="auto" w:fill="F0F4FA"/>
-          </w:tcPr>
-          <w:p>
-            <w:r>
-              <w:rPr>
-                <w:sz w:val="18"/>
-              </w:rPr>
-              <w:t>Longest Kill In Vehicle (m)</w:t>
-            </w:r>
-          </w:p>
-        </w:tc>
-        <w:tc>
-          <w:tcPr>
-            <w:tcW w:type="dxa" w:w="3135"/>
-            <w:shd w:val="clear" w:color="auto" w:fill="F0F4FA"/>
-          </w:tcPr>
-          <w:p>
-            <w:r>
-              <w:rPr>
-                <w:sz w:val="18"/>
-              </w:rPr>
-              <w:t>Longest single kill distance (vehicle)</w:t>
+          </w:tcPr>
+          <w:p>
+            <w:r/>
+            <w:r>
+              <w:rPr>
+                <w:b w:val="0"/>
+              </w:rPr>
+              <w:t>Avg Kill Dist In Vehicle (m)</w:t>
+            </w:r>
+          </w:p>
+        </w:tc>
+        <w:tc>
+          <w:tcPr>
+            <w:tcW w:type="dxa" w:w="3135"/>
+          </w:tcPr>
+          <w:p>
+            <w:r/>
+            <w:r>
+              <w:rPr>
+                <w:b w:val="0"/>
+              </w:rPr>
+              <w:t>Average kill distance (vehicle)</w:t>
             </w:r>
           </w:p>
         </w:tc>
@@ -2846,12 +3162,12 @@
         <w:tc>
           <w:tcPr>
             <w:tcW w:type="dxa" w:w="3135"/>
-            <w:shd w:val="clear" w:color="auto" w:fill="FFFFFF"/>
-          </w:tcPr>
-          <w:p>
-            <w:r>
-              <w:rPr>
-                <w:sz w:val="18"/>
+          </w:tcPr>
+          <w:p>
+            <w:r/>
+            <w:r>
+              <w:rPr>
+                <w:b w:val="0"/>
               </w:rPr>
               <w:t>26</w:t>
             </w:r>
@@ -2860,28 +3176,28 @@
         <w:tc>
           <w:tcPr>
             <w:tcW w:type="dxa" w:w="3135"/>
-            <w:shd w:val="clear" w:color="auto" w:fill="FFFFFF"/>
-          </w:tcPr>
-          <w:p>
-            <w:r>
-              <w:rPr>
-                <w:sz w:val="18"/>
-              </w:rPr>
-              <w:t>Weapon Kills (JSON)</w:t>
-            </w:r>
-          </w:p>
-        </w:tc>
-        <w:tc>
-          <w:tcPr>
-            <w:tcW w:type="dxa" w:w="3135"/>
-            <w:shd w:val="clear" w:color="auto" w:fill="FFFFFF"/>
-          </w:tcPr>
-          <w:p>
-            <w:r>
-              <w:rPr>
-                <w:sz w:val="18"/>
-              </w:rPr>
-              <w:t>JSON object: {"WeaponName": killCount, ...}</w:t>
+          </w:tcPr>
+          <w:p>
+            <w:r/>
+            <w:r>
+              <w:rPr>
+                <w:b w:val="0"/>
+              </w:rPr>
+              <w:t>Longest Kill In Vehicle (m)</w:t>
+            </w:r>
+          </w:p>
+        </w:tc>
+        <w:tc>
+          <w:tcPr>
+            <w:tcW w:type="dxa" w:w="3135"/>
+          </w:tcPr>
+          <w:p>
+            <w:r/>
+            <w:r>
+              <w:rPr>
+                <w:b w:val="0"/>
+              </w:rPr>
+              <w:t>Longest single kill distance (vehicle)</w:t>
             </w:r>
           </w:p>
         </w:tc>
@@ -2890,12 +3206,12 @@
         <w:tc>
           <w:tcPr>
             <w:tcW w:type="dxa" w:w="3135"/>
-            <w:shd w:val="clear" w:color="auto" w:fill="F0F4FA"/>
-          </w:tcPr>
-          <w:p>
-            <w:r>
-              <w:rPr>
-                <w:sz w:val="18"/>
+          </w:tcPr>
+          <w:p>
+            <w:r/>
+            <w:r>
+              <w:rPr>
+                <w:b w:val="0"/>
               </w:rPr>
               <w:t>27</w:t>
             </w:r>
@@ -2904,12 +3220,12 @@
         <w:tc>
           <w:tcPr>
             <w:tcW w:type="dxa" w:w="3135"/>
-            <w:shd w:val="clear" w:color="auto" w:fill="F0F4FA"/>
-          </w:tcPr>
-          <w:p>
-            <w:r>
-              <w:rPr>
-                <w:sz w:val="18"/>
+          </w:tcPr>
+          <w:p>
+            <w:r/>
+            <w:r>
+              <w:rPr>
+                <w:b w:val="0"/>
               </w:rPr>
               <w:t>Top Weapon</w:t>
             </w:r>
@@ -2918,14 +3234,146 @@
         <w:tc>
           <w:tcPr>
             <w:tcW w:type="dxa" w:w="3135"/>
-            <w:shd w:val="clear" w:color="auto" w:fill="F0F4FA"/>
-          </w:tcPr>
-          <w:p>
-            <w:r>
-              <w:rPr>
-                <w:sz w:val="18"/>
-              </w:rPr>
-              <w:t>Weapon used for longest kill (used in award card)</w:t>
+          </w:tcPr>
+          <w:p>
+            <w:r/>
+            <w:r>
+              <w:rPr>
+                <w:b w:val="0"/>
+              </w:rPr>
+              <w:t>Weapon with the most on-foot kills for this player in this mission</w:t>
+            </w:r>
+          </w:p>
+        </w:tc>
+      </w:tr>
+      <w:tr>
+        <w:tc>
+          <w:tcPr>
+            <w:tcW w:type="dxa" w:w="3135"/>
+          </w:tcPr>
+          <w:p>
+            <w:r/>
+            <w:r>
+              <w:rPr>
+                <w:b w:val="0"/>
+              </w:rPr>
+              <w:t>28</w:t>
+            </w:r>
+          </w:p>
+        </w:tc>
+        <w:tc>
+          <w:tcPr>
+            <w:tcW w:type="dxa" w:w="3135"/>
+          </w:tcPr>
+          <w:p>
+            <w:r/>
+            <w:r>
+              <w:rPr>
+                <w:b w:val="0"/>
+              </w:rPr>
+              <w:t>Weapon Kills (JSON)</w:t>
+            </w:r>
+          </w:p>
+        </w:tc>
+        <w:tc>
+          <w:tcPr>
+            <w:tcW w:type="dxa" w:w="3135"/>
+          </w:tcPr>
+          <w:p>
+            <w:r/>
+            <w:r>
+              <w:rPr>
+                <w:b w:val="0"/>
+              </w:rPr>
+              <w:t>JSON object: {"WeaponName": killCount, ...}</w:t>
+            </w:r>
+          </w:p>
+        </w:tc>
+      </w:tr>
+      <w:tr>
+        <w:tc>
+          <w:tcPr>
+            <w:tcW w:type="dxa" w:w="3135"/>
+          </w:tcPr>
+          <w:p>
+            <w:r/>
+            <w:r>
+              <w:rPr>
+                <w:b w:val="0"/>
+              </w:rPr>
+              <w:t>29</w:t>
+            </w:r>
+          </w:p>
+        </w:tc>
+        <w:tc>
+          <w:tcPr>
+            <w:tcW w:type="dxa" w:w="3135"/>
+          </w:tcPr>
+          <w:p>
+            <w:r/>
+            <w:r>
+              <w:rPr>
+                <w:b w:val="0"/>
+              </w:rPr>
+              <w:t>Suicides</w:t>
+            </w:r>
+          </w:p>
+        </w:tc>
+        <w:tc>
+          <w:tcPr>
+            <w:tcW w:type="dxa" w:w="3135"/>
+          </w:tcPr>
+          <w:p>
+            <w:r/>
+            <w:r>
+              <w:rPr>
+                <w:b w:val="0"/>
+              </w:rPr>
+              <w:t>Self-kills recorded by OCAP</w:t>
+            </w:r>
+          </w:p>
+        </w:tc>
+      </w:tr>
+      <w:tr>
+        <w:tc>
+          <w:tcPr>
+            <w:tcW w:type="dxa" w:w="3135"/>
+          </w:tcPr>
+          <w:p>
+            <w:r/>
+            <w:r>
+              <w:rPr>
+                <w:b w:val="0"/>
+              </w:rPr>
+              <w:t>30</w:t>
+            </w:r>
+          </w:p>
+        </w:tc>
+        <w:tc>
+          <w:tcPr>
+            <w:tcW w:type="dxa" w:w="3135"/>
+          </w:tcPr>
+          <w:p>
+            <w:r/>
+            <w:r>
+              <w:rPr>
+                <w:b w:val="0"/>
+              </w:rPr>
+              <w:t>Time Played (s)</w:t>
+            </w:r>
+          </w:p>
+        </w:tc>
+        <w:tc>
+          <w:tcPr>
+            <w:tcW w:type="dxa" w:w="3135"/>
+          </w:tcPr>
+          <w:p>
+            <w:r/>
+            <w:r>
+              <w:rPr>
+                <w:b w:val="0"/>
+              </w:rPr>
+              <w:t>Seconds the player was present in the mission (position frames × captureDelay)</w:t>
             </w:r>
           </w:p>
         </w:tc>
@@ -3795,6 +4243,18 @@
     <w:p>
       <w:pPr>
         <w:pStyle w:val="NoSpacing"/>
+      </w:pPr>
+      <w:r>
+        <w:rPr>
+          <w:rFonts w:ascii="Courier New" w:hAnsi="Courier New"/>
+          <w:sz w:val="18"/>
+        </w:rPr>
+        <w:t xml:space="preserve">  timePlayed:     number,       // seconds present in mission (sum across missions in career view)</w:t>
+      </w:r>
+    </w:p>
+    <w:p>
+      <w:pPr>
+        <w:pStyle w:val="NoSpacing"/>
         <w:spacing w:before="40" w:after="40"/>
         <w:ind w:left="576"/>
         <w:shd w:val="clear" w:color="auto" w:fill="F3F3F3"/>
@@ -5639,6 +6099,366 @@
                 <w:sz w:val="18"/>
               </w:rPr>
               <w:t>Name · K/D · kills/deaths</w:t>
+            </w:r>
+          </w:p>
+        </w:tc>
+      </w:tr>
+      <w:tr>
+        <w:tc>
+          <w:tcPr>
+            <w:tcW w:type="dxa" w:w="1881"/>
+          </w:tcPr>
+          <w:p>
+            <w:r/>
+            <w:r>
+              <w:rPr>
+                <w:b w:val="0"/>
+              </w:rPr>
+              <w:t>Best K/D Ratio</w:t>
+            </w:r>
+          </w:p>
+        </w:tc>
+        <w:tc>
+          <w:tcPr>
+            <w:tcW w:type="dxa" w:w="1881"/>
+          </w:tcPr>
+          <w:p>
+            <w:r/>
+            <w:r>
+              <w:rPr>
+                <w:b w:val="0"/>
+              </w:rPr>
+              <w:t>🏆</w:t>
+            </w:r>
+          </w:p>
+        </w:tc>
+        <w:tc>
+          <w:tcPr>
+            <w:tcW w:type="dxa" w:w="1881"/>
+          </w:tcPr>
+          <w:p>
+            <w:r/>
+            <w:r>
+              <w:rPr>
+                <w:b w:val="0"/>
+              </w:rPr>
+              <w:t>Highest kdFoot</w:t>
+            </w:r>
+          </w:p>
+        </w:tc>
+        <w:tc>
+          <w:tcPr>
+            <w:tcW w:type="dxa" w:w="1881"/>
+          </w:tcPr>
+          <w:p>
+            <w:r/>
+            <w:r>
+              <w:rPr>
+                <w:b w:val="0"/>
+              </w:rPr>
+              <w:t>Min 3 kills on foot</w:t>
+            </w:r>
+          </w:p>
+        </w:tc>
+        <w:tc>
+          <w:tcPr>
+            <w:tcW w:type="dxa" w:w="1881"/>
+          </w:tcPr>
+          <w:p>
+            <w:r/>
+            <w:r>
+              <w:rPr>
+                <w:b w:val="0"/>
+              </w:rPr>
+              <w:t>Name · K/D · kills/deaths</w:t>
+            </w:r>
+          </w:p>
+        </w:tc>
+      </w:tr>
+      <w:tr>
+        <w:tc>
+          <w:tcPr>
+            <w:tcW w:type="dxa" w:w="1881"/>
+          </w:tcPr>
+          <w:p>
+            <w:r/>
+            <w:r>
+              <w:rPr>
+                <w:b w:val="0"/>
+              </w:rPr>
+              <w:t>Always On Duty</w:t>
+            </w:r>
+          </w:p>
+        </w:tc>
+        <w:tc>
+          <w:tcPr>
+            <w:tcW w:type="dxa" w:w="1881"/>
+          </w:tcPr>
+          <w:p>
+            <w:r/>
+            <w:r>
+              <w:rPr>
+                <w:b w:val="0"/>
+              </w:rPr>
+              <w:t>⏱️</w:t>
+            </w:r>
+          </w:p>
+        </w:tc>
+        <w:tc>
+          <w:tcPr>
+            <w:tcW w:type="dxa" w:w="1881"/>
+          </w:tcPr>
+          <w:p>
+            <w:r/>
+            <w:r>
+              <w:rPr>
+                <w:b w:val="0"/>
+              </w:rPr>
+              <w:t>Highest total timePlayed</w:t>
+            </w:r>
+          </w:p>
+        </w:tc>
+        <w:tc>
+          <w:tcPr>
+            <w:tcW w:type="dxa" w:w="1881"/>
+          </w:tcPr>
+          <w:p>
+            <w:r/>
+            <w:r>
+              <w:rPr>
+                <w:b w:val="0"/>
+              </w:rPr>
+              <w:t>timePlayed &gt; 0</w:t>
+            </w:r>
+          </w:p>
+        </w:tc>
+        <w:tc>
+          <w:tcPr>
+            <w:tcW w:type="dxa" w:w="1881"/>
+          </w:tcPr>
+          <w:p>
+            <w:r/>
+            <w:r>
+              <w:rPr>
+                <w:b w:val="0"/>
+              </w:rPr>
+              <w:t>Name · total hours played · mission count</w:t>
+            </w:r>
+          </w:p>
+        </w:tc>
+      </w:tr>
+      <w:tr>
+        <w:tc>
+          <w:tcPr>
+            <w:tcW w:type="dxa" w:w="1881"/>
+          </w:tcPr>
+          <w:p>
+            <w:r/>
+            <w:r>
+              <w:rPr>
+                <w:b w:val="0"/>
+              </w:rPr>
+              <w:t>Spray &amp; Pray</w:t>
+            </w:r>
+          </w:p>
+        </w:tc>
+        <w:tc>
+          <w:tcPr>
+            <w:tcW w:type="dxa" w:w="1881"/>
+          </w:tcPr>
+          <w:p>
+            <w:r/>
+            <w:r>
+              <w:rPr>
+                <w:b w:val="0"/>
+              </w:rPr>
+              <w:t>💩</w:t>
+            </w:r>
+          </w:p>
+        </w:tc>
+        <w:tc>
+          <w:tcPr>
+            <w:tcW w:type="dxa" w:w="1881"/>
+          </w:tcPr>
+          <w:p>
+            <w:r/>
+            <w:r>
+              <w:rPr>
+                <w:b w:val="0"/>
+              </w:rPr>
+              <w:t>Highest spkFoot (shots/kill)</w:t>
+            </w:r>
+          </w:p>
+        </w:tc>
+        <w:tc>
+          <w:tcPr>
+            <w:tcW w:type="dxa" w:w="1881"/>
+          </w:tcPr>
+          <w:p>
+            <w:r/>
+            <w:r>
+              <w:rPr>
+                <w:b w:val="0"/>
+              </w:rPr>
+              <w:t>Min 3 kills, spkFoot &gt; 1</w:t>
+            </w:r>
+          </w:p>
+        </w:tc>
+        <w:tc>
+          <w:tcPr>
+            <w:tcW w:type="dxa" w:w="1881"/>
+          </w:tcPr>
+          <w:p>
+            <w:r/>
+            <w:r>
+              <w:rPr>
+                <w:b w:val="0"/>
+              </w:rPr>
+              <w:t>Name · SPK · kill count (Hall of Shame)</w:t>
+            </w:r>
+          </w:p>
+        </w:tc>
+      </w:tr>
+      <w:tr>
+        <w:tc>
+          <w:tcPr>
+            <w:tcW w:type="dxa" w:w="1881"/>
+          </w:tcPr>
+          <w:p>
+            <w:r/>
+            <w:r>
+              <w:rPr>
+                <w:b w:val="0"/>
+              </w:rPr>
+              <w:t>Most Teamkills</w:t>
+            </w:r>
+          </w:p>
+        </w:tc>
+        <w:tc>
+          <w:tcPr>
+            <w:tcW w:type="dxa" w:w="1881"/>
+          </w:tcPr>
+          <w:p>
+            <w:r/>
+            <w:r>
+              <w:rPr>
+                <w:b w:val="0"/>
+              </w:rPr>
+              <w:t>🤡</w:t>
+            </w:r>
+          </w:p>
+        </w:tc>
+        <w:tc>
+          <w:tcPr>
+            <w:tcW w:type="dxa" w:w="1881"/>
+          </w:tcPr>
+          <w:p>
+            <w:r/>
+            <w:r>
+              <w:rPr>
+                <w:b w:val="0"/>
+              </w:rPr>
+              <w:t>Highest tkOnFoot + tkInVeh</w:t>
+            </w:r>
+          </w:p>
+        </w:tc>
+        <w:tc>
+          <w:tcPr>
+            <w:tcW w:type="dxa" w:w="1881"/>
+          </w:tcPr>
+          <w:p>
+            <w:r/>
+            <w:r>
+              <w:rPr>
+                <w:b w:val="0"/>
+              </w:rPr>
+              <w:t>tkOnFoot + tkInVeh &gt; 0</w:t>
+            </w:r>
+          </w:p>
+        </w:tc>
+        <w:tc>
+          <w:tcPr>
+            <w:tcW w:type="dxa" w:w="1881"/>
+          </w:tcPr>
+          <w:p>
+            <w:r/>
+            <w:r>
+              <w:rPr>
+                <w:b w:val="0"/>
+              </w:rPr>
+              <w:t>Name · teamkill count (Hall of Shame)</w:t>
+            </w:r>
+          </w:p>
+        </w:tc>
+      </w:tr>
+      <w:tr>
+        <w:tc>
+          <w:tcPr>
+            <w:tcW w:type="dxa" w:w="1881"/>
+          </w:tcPr>
+          <w:p>
+            <w:r/>
+            <w:r>
+              <w:rPr>
+                <w:b w:val="0"/>
+              </w:rPr>
+              <w:t>Most Hits Taken</w:t>
+            </w:r>
+          </w:p>
+        </w:tc>
+        <w:tc>
+          <w:tcPr>
+            <w:tcW w:type="dxa" w:w="1881"/>
+          </w:tcPr>
+          <w:p>
+            <w:r/>
+            <w:r>
+              <w:rPr>
+                <w:b w:val="0"/>
+              </w:rPr>
+              <w:t>🎯</w:t>
+            </w:r>
+          </w:p>
+        </w:tc>
+        <w:tc>
+          <w:tcPr>
+            <w:tcW w:type="dxa" w:w="1881"/>
+          </w:tcPr>
+          <w:p>
+            <w:r/>
+            <w:r>
+              <w:rPr>
+                <w:b w:val="0"/>
+              </w:rPr>
+              <w:t>Highest hitsOnFoot</w:t>
+            </w:r>
+          </w:p>
+        </w:tc>
+        <w:tc>
+          <w:tcPr>
+            <w:tcW w:type="dxa" w:w="1881"/>
+          </w:tcPr>
+          <w:p>
+            <w:r/>
+            <w:r>
+              <w:rPr>
+                <w:b w:val="0"/>
+              </w:rPr>
+              <w:t>hitsOnFoot &gt; 0</w:t>
+            </w:r>
+          </w:p>
+        </w:tc>
+        <w:tc>
+          <w:tcPr>
+            <w:tcW w:type="dxa" w:w="1881"/>
+          </w:tcPr>
+          <w:p>
+            <w:r/>
+            <w:r>
+              <w:rPr>
+                <w:b w:val="0"/>
+              </w:rPr>
+              <w:t>Name · hits taken · mission count (Hall of Shame)</w:t>
             </w:r>
           </w:p>
         </w:tc>
@@ -13103,6 +13923,632 @@
     <w:p>
       <w:r>
         <w:br w:type="page"/>
+      </w:r>
+    </w:p>
+    <w:p>
+      <w:pPr>
+        <w:pStyle w:val="Heading1"/>
+      </w:pPr>
+      <w:r>
+        <w:t>13. Unit Classification</w:t>
+      </w:r>
+    </w:p>
+    <w:p>
+      <w:pPr/>
+      <w:r>
+        <w:t>Players are automatically assigned to one of four units — 2nd USC, CNTO, PXG, or TFP — based on who they play alongside most frequently. The classification runs once after buildAggregates() and populates the playerUnits{} map.</w:t>
+      </w:r>
+    </w:p>
+    <w:p>
+      <w:pPr>
+        <w:pStyle w:val="Heading2"/>
+      </w:pPr>
+      <w:r>
+        <w:t>13.1 Algorithm Overview</w:t>
+      </w:r>
+    </w:p>
+    <w:p>
+      <w:pPr/>
+      <w:r>
+        <w:t>The classifier uses squad co-occurrence: for each mission row, every player is compared against every other player in the same mission. If the other player is already confidently assigned to a known unit, their unit gains a weight increment for the subject player. A player is classified to the unit with the highest accumulated weight, but only if that weight represents ≥ 99% of all weight (UNIT_THRESHOLD = 0.99). Players who guest in foreign squads are left unclassified (null) because their dominant signal does not clear the threshold.</w:t>
+      </w:r>
+    </w:p>
+    <w:p>
+      <w:pPr>
+        <w:pStyle w:val="Heading2"/>
+      </w:pPr>
+      <w:r>
+        <w:t>13.2 Seed Players</w:t>
+      </w:r>
+    </w:p>
+    <w:p>
+      <w:pPr/>
+      <w:r>
+        <w:t>Classification is bootstrapped from a small set of "seed" players whose unit is known with certainty. These are hard-coded in tracker.js and are never overridden by unit_overrides.json.</w:t>
+      </w:r>
+    </w:p>
+    <w:p>
+      <w:pPr>
+        <w:pStyle w:val="Heading2"/>
+      </w:pPr>
+      <w:r>
+        <w:t>13.3 unit_overrides.json</w:t>
+      </w:r>
+    </w:p>
+    <w:p>
+      <w:pPr/>
+      <w:r>
+        <w:t>Loaded at startup via fetch(). Keys are player names (case-sensitive); values are the target unit string. Overrides are applied after auto-classification and take precedence over both seeds and the algorithm. This allows correcting edge cases (e.g. a player who permanently transferred units).</w:t>
+      </w:r>
+    </w:p>
+    <w:p>
+      <w:pPr>
+        <w:pStyle w:val="NoSpacing"/>
+      </w:pPr>
+      <w:r>
+        <w:rPr>
+          <w:rFonts w:ascii="Courier New" w:hAnsi="Courier New"/>
+          <w:sz w:val="18"/>
+        </w:rPr>
+        <w:t>// unit_overrides.json format</w:t>
+      </w:r>
+    </w:p>
+    <w:p>
+      <w:pPr>
+        <w:pStyle w:val="NoSpacing"/>
+      </w:pPr>
+      <w:r>
+        <w:rPr>
+          <w:rFonts w:ascii="Courier New" w:hAnsi="Courier New"/>
+          <w:sz w:val="18"/>
+        </w:rPr>
+        <w:t>{</w:t>
+      </w:r>
+    </w:p>
+    <w:p>
+      <w:pPr>
+        <w:pStyle w:val="NoSpacing"/>
+      </w:pPr>
+      <w:r>
+        <w:rPr>
+          <w:rFonts w:ascii="Courier New" w:hAnsi="Courier New"/>
+          <w:sz w:val="18"/>
+        </w:rPr>
+        <w:t xml:space="preserve">  "PlayerName": "2nd USC",</w:t>
+      </w:r>
+    </w:p>
+    <w:p>
+      <w:pPr>
+        <w:pStyle w:val="NoSpacing"/>
+      </w:pPr>
+      <w:r>
+        <w:rPr>
+          <w:rFonts w:ascii="Courier New" w:hAnsi="Courier New"/>
+          <w:sz w:val="18"/>
+        </w:rPr>
+        <w:t xml:space="preserve">  "AnotherPlayer": "CNTO"</w:t>
+      </w:r>
+    </w:p>
+    <w:p>
+      <w:pPr>
+        <w:pStyle w:val="NoSpacing"/>
+      </w:pPr>
+      <w:r>
+        <w:rPr>
+          <w:rFonts w:ascii="Courier New" w:hAnsi="Courier New"/>
+          <w:sz w:val="18"/>
+        </w:rPr>
+        <w:t>}</w:t>
+      </w:r>
+    </w:p>
+    <w:p>
+      <w:pPr>
+        <w:pStyle w:val="Heading2"/>
+      </w:pPr>
+      <w:r>
+        <w:t>13.4 Unit Filter</w:t>
+      </w:r>
+    </w:p>
+    <w:p>
+      <w:pPr/>
+      <w:r>
+        <w:t>A row of unit filter pills (2nd USC / CNTO / PXG / TFP) sits above the player pill list. Selecting a unit pill sets selectedUnit and calls filterChanged(). applyFilters() then restricts the player list to members of that unit. The pill uses the same colour scheme as player pills. Deselecting resets selectedUnit to null (show all).</w:t>
+      </w:r>
+    </w:p>
+    <w:p>
+      <w:pPr>
+        <w:pStyle w:val="Heading2"/>
+      </w:pPr>
+      <w:r>
+        <w:t>13.5 Adding a New Unit</w:t>
+      </w:r>
+    </w:p>
+    <w:p>
+      <w:pPr>
+        <w:pStyle w:val="ListNumber"/>
+      </w:pPr>
+      <w:r>
+        <w:t>Add at least two seed player names for the new unit in the UNIT_SEEDS constant in tracker.js.</w:t>
+      </w:r>
+    </w:p>
+    <w:p>
+      <w:pPr>
+        <w:pStyle w:val="ListNumber"/>
+      </w:pPr>
+      <w:r>
+        <w:t>Add the unit label to the UNITS array in tracker.js.</w:t>
+      </w:r>
+    </w:p>
+    <w:p>
+      <w:pPr>
+        <w:pStyle w:val="ListNumber"/>
+      </w:pPr>
+      <w:r>
+        <w:t>Add a unit pill button in the #unitFilter div in index.html.</w:t>
+      </w:r>
+    </w:p>
+    <w:p>
+      <w:pPr>
+        <w:pStyle w:val="ListNumber"/>
+      </w:pPr>
+      <w:r>
+        <w:t>Add the unit's CSS colour class in the &lt;style&gt; block of index.html (mirrors the player pill colour system).</w:t>
+      </w:r>
+    </w:p>
+    <w:p>
+      <w:pPr>
+        <w:pStyle w:val="Heading1"/>
+      </w:pPr>
+      <w:r>
+        <w:t>14. ImportScript (Google Apps Script)</w:t>
+      </w:r>
+    </w:p>
+    <w:p>
+      <w:pPr/>
+      <w:r>
+        <w:t>ImportScript is a Google Apps Script (GAS) file that reads OCAP .json.gz replay files from Google Drive and writes normalised player statistics into a Google Sheet. The web application then publishes that sheet as a CSV and the tracker reads it.</w:t>
+      </w:r>
+    </w:p>
+    <w:p>
+      <w:pPr>
+        <w:pStyle w:val="Heading2"/>
+      </w:pPr>
+      <w:r>
+        <w:t>14.1 Prerequisites</w:t>
+      </w:r>
+    </w:p>
+    <w:p>
+      <w:pPr>
+        <w:pStyle w:val="ListBullet"/>
+      </w:pPr>
+      <w:r>
+        <w:t>A Google Drive folder named Kill Tracker containing two sub-folders: OCAP_Logs (drop zone) and OCAP_Logs_Archive (processed files moved here automatically).</w:t>
+      </w:r>
+    </w:p>
+    <w:p>
+      <w:pPr>
+        <w:pStyle w:val="ListBullet"/>
+      </w:pPr>
+      <w:r>
+        <w:t>A Google Sheet linked to the Apps Script project. The script uses SpreadsheetApp.getActiveSpreadsheet().</w:t>
+      </w:r>
+    </w:p>
+    <w:p>
+      <w:pPr>
+        <w:pStyle w:val="ListBullet"/>
+      </w:pPr>
+      <w:r>
+        <w:t>OCAP recording files in .json.gz format, named with the pattern YYYY_MM_DD__MissionName.json.gz.</w:t>
+      </w:r>
+    </w:p>
+    <w:p>
+      <w:pPr>
+        <w:pStyle w:val="Heading2"/>
+      </w:pPr>
+      <w:r>
+        <w:t>14.2 Entry Points</w:t>
+      </w:r>
+    </w:p>
+    <w:tbl>
+      <w:tblPr>
+        <w:tblStyle w:val="TableGrid"/>
+        <w:tblW w:type="auto" w:w="0"/>
+        <w:tblLook w:firstColumn="1" w:firstRow="1" w:lastColumn="0" w:lastRow="0" w:noHBand="0" w:noVBand="1" w:val="04A0"/>
+      </w:tblPr>
+      <w:tblGrid>
+        <w:gridCol w:w="3135"/>
+        <w:gridCol w:w="3135"/>
+        <w:gridCol w:w="3135"/>
+      </w:tblGrid>
+      <w:tr>
+        <w:tc>
+          <w:tcPr>
+            <w:tcW w:type="dxa" w:w="3135"/>
+          </w:tcPr>
+          <w:p>
+            <w:r/>
+            <w:r>
+              <w:rPr>
+                <w:b/>
+              </w:rPr>
+              <w:t>Function</w:t>
+            </w:r>
+          </w:p>
+        </w:tc>
+        <w:tc>
+          <w:tcPr>
+            <w:tcW w:type="dxa" w:w="3135"/>
+          </w:tcPr>
+          <w:p>
+            <w:r/>
+            <w:r>
+              <w:rPr>
+                <w:b/>
+              </w:rPr>
+              <w:t>Usage</w:t>
+            </w:r>
+          </w:p>
+        </w:tc>
+        <w:tc>
+          <w:tcPr>
+            <w:tcW w:type="dxa" w:w="3135"/>
+          </w:tcPr>
+          <w:p>
+            <w:r/>
+            <w:r>
+              <w:rPr>
+                <w:b/>
+              </w:rPr>
+              <w:t>Description</w:t>
+            </w:r>
+          </w:p>
+        </w:tc>
+      </w:tr>
+      <w:tr>
+        <w:tc>
+          <w:tcPr>
+            <w:tcW w:type="dxa" w:w="3135"/>
+          </w:tcPr>
+          <w:p>
+            <w:r/>
+            <w:r>
+              <w:rPr>
+                <w:b w:val="0"/>
+              </w:rPr>
+              <w:t>importOCAP()</w:t>
+            </w:r>
+          </w:p>
+        </w:tc>
+        <w:tc>
+          <w:tcPr>
+            <w:tcW w:type="dxa" w:w="3135"/>
+          </w:tcPr>
+          <w:p>
+            <w:r/>
+            <w:r>
+              <w:rPr>
+                <w:b w:val="0"/>
+              </w:rPr>
+              <w:t>Run manually or via trigger</w:t>
+            </w:r>
+          </w:p>
+        </w:tc>
+        <w:tc>
+          <w:tcPr>
+            <w:tcW w:type="dxa" w:w="3135"/>
+          </w:tcPr>
+          <w:p>
+            <w:r/>
+            <w:r>
+              <w:rPr>
+                <w:b w:val="0"/>
+              </w:rPr>
+              <w:t>Imports the next unprocessed .json.gz file from OCAP_Logs. Skips files already present in the sheet (by Source File column). Archives the file to OCAP_Logs_Archive after successful import.</w:t>
+            </w:r>
+          </w:p>
+        </w:tc>
+      </w:tr>
+      <w:tr>
+        <w:tc>
+          <w:tcPr>
+            <w:tcW w:type="dxa" w:w="3135"/>
+          </w:tcPr>
+          <w:p>
+            <w:r/>
+            <w:r>
+              <w:rPr>
+                <w:b w:val="0"/>
+              </w:rPr>
+              <w:t>reimportOCAP()</w:t>
+            </w:r>
+          </w:p>
+        </w:tc>
+        <w:tc>
+          <w:tcPr>
+            <w:tcW w:type="dxa" w:w="3135"/>
+          </w:tcPr>
+          <w:p>
+            <w:r/>
+            <w:r>
+              <w:rPr>
+                <w:b w:val="0"/>
+              </w:rPr>
+              <w:t>Run manually to re-process a file</w:t>
+            </w:r>
+          </w:p>
+        </w:tc>
+        <w:tc>
+          <w:tcPr>
+            <w:tcW w:type="dxa" w:w="3135"/>
+          </w:tcPr>
+          <w:p>
+            <w:r/>
+            <w:r>
+              <w:rPr>
+                <w:b w:val="0"/>
+              </w:rPr>
+              <w:t>Calls importOCAP(true). Deletes all existing rows for the file from the sheet first, then re-imports. Use this after correcting a raw file or fixing a bug in the parser.</w:t>
+            </w:r>
+          </w:p>
+        </w:tc>
+      </w:tr>
+    </w:tbl>
+    <w:p>
+      <w:pPr>
+        <w:pStyle w:val="Heading2"/>
+      </w:pPr>
+      <w:r>
+        <w:t>14.3 Import Pipeline</w:t>
+      </w:r>
+    </w:p>
+    <w:p>
+      <w:pPr/>
+      <w:r>
+        <w:t>Each call to importOCAP() processes exactly one file (the first file found in OCAP_Logs). The pipeline per file is:</w:t>
+      </w:r>
+    </w:p>
+    <w:p>
+      <w:pPr>
+        <w:pStyle w:val="ListNumber"/>
+      </w:pPr>
+      <w:r>
+        <w:t>Locate OCAP_Logs and OCAP_Logs_Archive folders inside the Kill Tracker Drive folder.</w:t>
+      </w:r>
+    </w:p>
+    <w:p>
+      <w:pPr>
+        <w:pStyle w:val="ListNumber"/>
+      </w:pPr>
+      <w:r>
+        <w:t>Build a Set of already-imported filenames from column A of the player_stats sheet.</w:t>
+      </w:r>
+    </w:p>
+    <w:p>
+      <w:pPr>
+        <w:pStyle w:val="ListNumber"/>
+      </w:pPr>
+      <w:r>
+        <w:t>Fetch the first .json.gz file. Skip if already imported (unless forceReimport = true).</w:t>
+      </w:r>
+    </w:p>
+    <w:p>
+      <w:pPr>
+        <w:pStyle w:val="ListNumber"/>
+      </w:pPr>
+      <w:r>
+        <w:t>Decompress the gzip blob using Utilities.ungzip() and parse the JSON.</w:t>
+      </w:r>
+    </w:p>
+    <w:p>
+      <w:pPr>
+        <w:pStyle w:val="ListNumber"/>
+      </w:pPr>
+      <w:r>
+        <w:t>Build an entity lookup map from data.entities.</w:t>
+      </w:r>
+    </w:p>
+    <w:p>
+      <w:pPr>
+        <w:pStyle w:val="ListNumber"/>
+      </w:pPr>
+      <w:r>
+        <w:t>Build per-player stat accumulators (one entry per isPlayer === 1 entity).</w:t>
+      </w:r>
+    </w:p>
+    <w:p>
+      <w:pPr>
+        <w:pStyle w:val="ListNumber"/>
+      </w:pPr>
+      <w:r>
+        <w:t>Pre-compute shots on-foot vs in-vehicle by replaying the framesFired array and calling isInVehicleAtFrame() for each shot.</w:t>
+      </w:r>
+    </w:p>
+    <w:p>
+      <w:pPr>
+        <w:pStyle w:val="ListNumber"/>
+      </w:pPr>
+      <w:r>
+        <w:t>Process data.events: killed events increment kills/deaths/teamkills/vehicle kills; hit events increment hits taken. Context (on-foot vs in-vehicle) is determined per-frame.</w:t>
+      </w:r>
+    </w:p>
+    <w:p>
+      <w:pPr>
+        <w:pStyle w:val="ListNumber"/>
+      </w:pPr>
+      <w:r>
+        <w:t>Derive K/D, shots/kill, average distance, longest kill, top weapon per player.</w:t>
+      </w:r>
+    </w:p>
+    <w:p>
+      <w:pPr>
+        <w:pStyle w:val="ListNumber"/>
+      </w:pPr>
+      <w:r>
+        <w:t>Write all rows to player_stats in one batch setValues() call.</w:t>
+      </w:r>
+    </w:p>
+    <w:p>
+      <w:pPr>
+        <w:pStyle w:val="ListNumber"/>
+      </w:pPr>
+      <w:r>
+        <w:t>Move the file to OCAP_Logs_Archive.</w:t>
+      </w:r>
+    </w:p>
+    <w:p>
+      <w:pPr>
+        <w:pStyle w:val="Heading2"/>
+      </w:pPr>
+      <w:r>
+        <w:t>14.4 Sheet Schema</w:t>
+      </w:r>
+    </w:p>
+    <w:p>
+      <w:pPr/>
+      <w:r>
+        <w:t>The script creates the player_stats sheet automatically on first run and writes the header row. On subsequent runs it migrates any missing header columns (e.g. Time Played added in a later version) without disturbing existing data. Column order matches Section 3.2 of this document exactly.</w:t>
+      </w:r>
+    </w:p>
+    <w:p>
+      <w:pPr>
+        <w:pStyle w:val="Heading2"/>
+      </w:pPr>
+      <w:r>
+        <w:t>14.5 isInVehicleAtFrame(entity, frame)</w:t>
+      </w:r>
+    </w:p>
+    <w:p>
+      <w:pPr/>
+      <w:r>
+        <w:t>Determines the in-vehicle state of an entity at a specific replay frame by indexing into entity.positions. The positions array starts at entity.startFrameNum; index = frame − startFrameNum. Position entry format:</w:t>
+      </w:r>
+    </w:p>
+    <w:p>
+      <w:pPr>
+        <w:pStyle w:val="NoSpacing"/>
+      </w:pPr>
+      <w:r>
+        <w:rPr>
+          <w:rFonts w:ascii="Courier New" w:hAnsi="Courier New"/>
+          <w:sz w:val="18"/>
+        </w:rPr>
+        <w:t>[ [x, y, z], bearing, alive, inVehicle, name, framesFired, role ]</w:t>
+      </w:r>
+    </w:p>
+    <w:p>
+      <w:pPr/>
+      <w:r>
+        <w:t>inVehicle is 1 when the entity is riding in a vehicle, 0 otherwise. Returns false if the frame is out of range.</w:t>
+      </w:r>
+    </w:p>
+    <w:p>
+      <w:pPr>
+        <w:pStyle w:val="Heading2"/>
+      </w:pPr>
+      <w:r>
+        <w:t>14.6 Zeus Handling</w:t>
+      </w:r>
+    </w:p>
+    <w:p>
+      <w:pPr/>
+      <w:r>
+        <w:t>Entities whose group is "zeus" (case-insensitive) or whose role starts with "zeus" are flagged as Zeus. All combat stats (kills, deaths, teamkills, shots, hits, distances) are zeroed out before writing to the sheet so Zeus game masters do not pollute leaderboard rankings.</w:t>
+      </w:r>
+    </w:p>
+    <w:p>
+      <w:pPr>
+        <w:pStyle w:val="Heading2"/>
+      </w:pPr>
+      <w:r>
+        <w:t>14.7 Time Played Calculation</w:t>
+      </w:r>
+    </w:p>
+    <w:p>
+      <w:pPr/>
+      <w:r>
+        <w:t>Time played is computed as:</w:t>
+      </w:r>
+    </w:p>
+    <w:p>
+      <w:pPr>
+        <w:pStyle w:val="NoSpacing"/>
+      </w:pPr>
+      <w:r>
+        <w:rPr>
+          <w:rFonts w:ascii="Courier New" w:hAnsi="Courier New"/>
+          <w:sz w:val="18"/>
+        </w:rPr>
+        <w:t>timePlayed = entity.positions.length × data.captureDelay</w:t>
+      </w:r>
+    </w:p>
+    <w:p>
+      <w:pPr/>
+      <w:r>
+        <w:t>captureDelay is the OCAP recording interval in seconds (typically 1). The value is rounded to the nearest second before writing to the sheet.</w:t>
+      </w:r>
+    </w:p>
+    <w:p>
+      <w:pPr>
+        <w:pStyle w:val="Heading2"/>
+      </w:pPr>
+      <w:r>
+        <w:t>14.8 forceReimport Mode</w:t>
+      </w:r>
+    </w:p>
+    <w:p>
+      <w:pPr/>
+      <w:r>
+        <w:t>When forceReimport = true (triggered by reimportOCAP()), the script calls deleteExistingRowsForFile() before inserting new rows. This function reads column A, collects all row numbers matching the source filename, then deletes them bottom-up (to prevent row index shifting). This ensures a clean re-import with no duplicate data.</w:t>
+      </w:r>
+    </w:p>
+    <w:p>
+      <w:pPr>
+        <w:pStyle w:val="Heading2"/>
+      </w:pPr>
+      <w:r>
+        <w:t>14.9 Setting Up a Trigger</w:t>
+      </w:r>
+    </w:p>
+    <w:p>
+      <w:pPr/>
+      <w:r>
+        <w:t>To run importOCAP() automatically whenever a new file is added to OCAP_Logs, create a time-driven trigger in the Apps Script editor:</w:t>
+      </w:r>
+    </w:p>
+    <w:p>
+      <w:pPr>
+        <w:pStyle w:val="ListNumber"/>
+      </w:pPr>
+      <w:r>
+        <w:t>Open the script project → Triggers (clock icon).</w:t>
+      </w:r>
+    </w:p>
+    <w:p>
+      <w:pPr>
+        <w:pStyle w:val="ListNumber"/>
+      </w:pPr>
+      <w:r>
+        <w:t>Add Trigger → Function: importOCAP → Event source: Time-driven → Type: Minutes timer → Every 5 minutes (or as needed).</w:t>
+      </w:r>
+    </w:p>
+    <w:p>
+      <w:pPr/>
+      <w:r>
+        <w:t>Because importOCAP() processes one file per invocation, running it on a short interval ensures new missions are imported promptly without any single run timing out. GAS has a 6-minute execution limit; a single large file typically completes well within 1–2 minutes.</w:t>
+      </w:r>
+    </w:p>
+    <w:p>
+      <w:pPr>
+        <w:pStyle w:val="Heading2"/>
+      </w:pPr>
+      <w:r>
+        <w:t>14.10 Error Handling</w:t>
+      </w:r>
+    </w:p>
+    <w:p>
+      <w:pPr/>
+      <w:r>
+        <w:t>If an exception occurs during processing, the script logs the error via Logger.log() and re-throws it (so the trigger failure appears in the Apps Script execution log). The file is not moved to the archive on failure, so it will be retried on the next trigger invocation.</w:t>
       </w:r>
     </w:p>
     <w:p>

</xml_diff>

<commit_message>
Deploying to gh-pages from @ loltorres9/TFP_KillTracker@a82bc3e49c29a2f9d3cef4386cd91c56f71c6288 🚀
</commit_message>
<xml_diff>
--- a/TFP_KillTracker_Technical_Documentation.docx
+++ b/TFP_KillTracker_Technical_Documentation.docx
@@ -39,7 +39,7 @@
         <w:rPr>
           <w:sz w:val="22"/>
         </w:rPr>
-        <w:t>Version 1.0  ·  17 March 2026</w:t>
+        <w:t>Version 2.0  ·  18 March 2026</w:t>
       </w:r>
     </w:p>
     <w:p>
@@ -399,7 +399,7 @@
         <w:rPr>
           <w:sz w:val="20"/>
         </w:rPr>
-        <w:t>Single file — the entire application lives in index.html (CSS + JS inlined).</w:t>
+        <w:t>Modular files — HTML structure in index.html; JavaScript in tracker.js; unit corrections in unit_overrides.json.</w:t>
       </w:r>
     </w:p>
     <w:p>
@@ -504,11 +504,13 @@
         <w:tc>
           <w:tcPr>
             <w:tcW w:type="dxa" w:w="4703"/>
-            <w:shd w:val="clear" w:color="auto" w:fill="FFFFFF"/>
-          </w:tcPr>
-          <w:p>
-            <w:r>
-              <w:rPr>
+          </w:tcPr>
+          <w:p>
+            <w:r/>
+            <w:r>
+              <w:rPr>
+                <w:rFonts w:ascii="Courier New" w:hAnsi="Courier New"/>
+                <w:b w:val="0"/>
                 <w:sz w:val="18"/>
               </w:rPr>
               <w:t>index.html</w:t>
@@ -518,14 +520,14 @@
         <w:tc>
           <w:tcPr>
             <w:tcW w:type="dxa" w:w="4703"/>
-            <w:shd w:val="clear" w:color="auto" w:fill="FFFFFF"/>
-          </w:tcPr>
-          <w:p>
-            <w:r>
-              <w:rPr>
-                <w:sz w:val="18"/>
-              </w:rPr>
-              <w:t>Entire application — HTML structure, inline CSS, inline JavaScript</w:t>
+          </w:tcPr>
+          <w:p>
+            <w:r/>
+            <w:r>
+              <w:rPr>
+                <w:b w:val="0"/>
+              </w:rPr>
+              <w:t>Application entry point — HTML structure and inline CSS.</w:t>
             </w:r>
           </w:p>
         </w:tc>
@@ -534,28 +536,30 @@
         <w:tc>
           <w:tcPr>
             <w:tcW w:type="dxa" w:w="4703"/>
-            <w:shd w:val="clear" w:color="auto" w:fill="F0F4FA"/>
-          </w:tcPr>
-          <w:p>
-            <w:r>
-              <w:rPr>
-                <w:sz w:val="18"/>
-              </w:rPr>
-              <w:t>favicon.svg</w:t>
+          </w:tcPr>
+          <w:p>
+            <w:r/>
+            <w:r>
+              <w:rPr>
+                <w:rFonts w:ascii="Courier New" w:hAnsi="Courier New"/>
+                <w:b w:val="0"/>
+                <w:sz w:val="18"/>
+              </w:rPr>
+              <w:t>tracker.js</w:t>
             </w:r>
           </w:p>
         </w:tc>
         <w:tc>
           <w:tcPr>
             <w:tcW w:type="dxa" w:w="4703"/>
-            <w:shd w:val="clear" w:color="auto" w:fill="F0F4FA"/>
-          </w:tcPr>
-          <w:p>
-            <w:r>
-              <w:rPr>
-                <w:sz w:val="18"/>
-              </w:rPr>
-              <w:t>Browser tab icon (SVG crosshair graphic)</w:t>
+          </w:tcPr>
+          <w:p>
+            <w:r/>
+            <w:r>
+              <w:rPr>
+                <w:b w:val="0"/>
+              </w:rPr>
+              <w:t>All application JavaScript (aggregation, filtering, rendering). Loaded as external script to comply with GitHub Pages CSP.</w:t>
             </w:r>
           </w:p>
         </w:tc>
@@ -564,28 +568,30 @@
         <w:tc>
           <w:tcPr>
             <w:tcW w:type="dxa" w:w="4703"/>
-            <w:shd w:val="clear" w:color="auto" w:fill="FFFFFF"/>
-          </w:tcPr>
-          <w:p>
-            <w:r>
-              <w:rPr>
-                <w:sz w:val="18"/>
-              </w:rPr>
-              <w:t>README.md</w:t>
+          </w:tcPr>
+          <w:p>
+            <w:r/>
+            <w:r>
+              <w:rPr>
+                <w:rFonts w:ascii="Courier New" w:hAnsi="Courier New"/>
+                <w:b w:val="0"/>
+                <w:sz w:val="18"/>
+              </w:rPr>
+              <w:t>unit_overrides.json</w:t>
             </w:r>
           </w:p>
         </w:tc>
         <w:tc>
           <w:tcPr>
             <w:tcW w:type="dxa" w:w="4703"/>
-            <w:shd w:val="clear" w:color="auto" w:fill="FFFFFF"/>
-          </w:tcPr>
-          <w:p>
-            <w:r>
-              <w:rPr>
-                <w:sz w:val="18"/>
-              </w:rPr>
-              <w:t>User-facing feature overview and deployment guide</w:t>
+          </w:tcPr>
+          <w:p>
+            <w:r/>
+            <w:r>
+              <w:rPr>
+                <w:b w:val="0"/>
+              </w:rPr>
+              <w:t>Manual unit assignment overrides. Key = player name, value = unit string ("2nd USC" | "CNTO" | "PXG" | "TFP"). Loaded at startup and applied after auto-classification.</w:t>
             </w:r>
           </w:p>
         </w:tc>
@@ -594,11 +600,141 @@
         <w:tc>
           <w:tcPr>
             <w:tcW w:type="dxa" w:w="4703"/>
-            <w:shd w:val="clear" w:color="auto" w:fill="F0F4FA"/>
-          </w:tcPr>
-          <w:p>
-            <w:r>
-              <w:rPr>
+          </w:tcPr>
+          <w:p>
+            <w:r/>
+            <w:r>
+              <w:rPr>
+                <w:rFonts w:ascii="Courier New" w:hAnsi="Courier New"/>
+                <w:b w:val="0"/>
+                <w:sz w:val="18"/>
+              </w:rPr>
+              <w:t>ImportScript</w:t>
+            </w:r>
+          </w:p>
+        </w:tc>
+        <w:tc>
+          <w:tcPr>
+            <w:tcW w:type="dxa" w:w="4703"/>
+          </w:tcPr>
+          <w:p>
+            <w:r/>
+            <w:r>
+              <w:rPr>
+                <w:b w:val="0"/>
+              </w:rPr>
+              <w:t>Google Apps Script (GAS) for importing OCAP .json.gz replay files from Google Drive into the player_stats Google Sheet.</w:t>
+            </w:r>
+          </w:p>
+        </w:tc>
+      </w:tr>
+      <w:tr>
+        <w:tc>
+          <w:tcPr>
+            <w:tcW w:type="dxa" w:w="4703"/>
+          </w:tcPr>
+          <w:p>
+            <w:r/>
+            <w:r>
+              <w:rPr>
+                <w:rFonts w:ascii="Courier New" w:hAnsi="Courier New"/>
+                <w:b w:val="0"/>
+                <w:sz w:val="18"/>
+              </w:rPr>
+              <w:t>favicon.svg</w:t>
+            </w:r>
+          </w:p>
+        </w:tc>
+        <w:tc>
+          <w:tcPr>
+            <w:tcW w:type="dxa" w:w="4703"/>
+          </w:tcPr>
+          <w:p>
+            <w:r/>
+            <w:r>
+              <w:rPr>
+                <w:b w:val="0"/>
+              </w:rPr>
+              <w:t>Browser tab icon (SVG crosshair graphic).</w:t>
+            </w:r>
+          </w:p>
+        </w:tc>
+      </w:tr>
+      <w:tr>
+        <w:tc>
+          <w:tcPr>
+            <w:tcW w:type="dxa" w:w="4703"/>
+          </w:tcPr>
+          <w:p>
+            <w:r/>
+            <w:r>
+              <w:rPr>
+                <w:rFonts w:ascii="Courier New" w:hAnsi="Courier New"/>
+                <w:b w:val="0"/>
+                <w:sz w:val="18"/>
+              </w:rPr>
+              <w:t>CHANGELOG.md</w:t>
+            </w:r>
+          </w:p>
+        </w:tc>
+        <w:tc>
+          <w:tcPr>
+            <w:tcW w:type="dxa" w:w="4703"/>
+          </w:tcPr>
+          <w:p>
+            <w:r/>
+            <w:r>
+              <w:rPr>
+                <w:b w:val="0"/>
+              </w:rPr>
+              <w:t>Per-feature changelog organised by date.</w:t>
+            </w:r>
+          </w:p>
+        </w:tc>
+      </w:tr>
+      <w:tr>
+        <w:tc>
+          <w:tcPr>
+            <w:tcW w:type="dxa" w:w="4703"/>
+          </w:tcPr>
+          <w:p>
+            <w:r/>
+            <w:r>
+              <w:rPr>
+                <w:rFonts w:ascii="Courier New" w:hAnsi="Courier New"/>
+                <w:b w:val="0"/>
+                <w:sz w:val="18"/>
+              </w:rPr>
+              <w:t>README.md</w:t>
+            </w:r>
+          </w:p>
+        </w:tc>
+        <w:tc>
+          <w:tcPr>
+            <w:tcW w:type="dxa" w:w="4703"/>
+          </w:tcPr>
+          <w:p>
+            <w:r/>
+            <w:r>
+              <w:rPr>
+                <w:b w:val="0"/>
+              </w:rPr>
+              <w:t>User-facing feature overview and deployment guide.</w:t>
+            </w:r>
+          </w:p>
+        </w:tc>
+      </w:tr>
+      <w:tr>
+        <w:tc>
+          <w:tcPr>
+            <w:tcW w:type="dxa" w:w="4703"/>
+          </w:tcPr>
+          <w:p>
+            <w:r/>
+            <w:r>
+              <w:rPr>
+                <w:rFonts w:ascii="Courier New" w:hAnsi="Courier New"/>
+                <w:b w:val="0"/>
                 <w:sz w:val="18"/>
               </w:rPr>
               <w:t>.github/workflows/</w:t>
@@ -608,14 +744,14 @@
         <w:tc>
           <w:tcPr>
             <w:tcW w:type="dxa" w:w="4703"/>
-            <w:shd w:val="clear" w:color="auto" w:fill="F0F4FA"/>
-          </w:tcPr>
-          <w:p>
-            <w:r>
-              <w:rPr>
-                <w:sz w:val="18"/>
-              </w:rPr>
-              <w:t>GitHub Actions CI/CD pipeline for GitHub Pages deployment</w:t>
+          </w:tcPr>
+          <w:p>
+            <w:r/>
+            <w:r>
+              <w:rPr>
+                <w:b w:val="0"/>
+              </w:rPr>
+              <w:t>GitHub Actions CI/CD pipeline for GitHub Pages deployment.</w:t>
             </w:r>
           </w:p>
         </w:tc>
@@ -1573,6 +1709,186 @@
           </w:p>
         </w:tc>
       </w:tr>
+      <w:tr>
+        <w:tc>
+          <w:tcPr>
+            <w:tcW w:type="dxa" w:w="2351"/>
+          </w:tcPr>
+          <w:p>
+            <w:r/>
+            <w:r>
+              <w:rPr>
+                <w:rFonts w:ascii="Courier New" w:hAnsi="Courier New"/>
+                <w:b w:val="0"/>
+                <w:sz w:val="18"/>
+              </w:rPr>
+              <w:t>selectedUnit</w:t>
+            </w:r>
+          </w:p>
+        </w:tc>
+        <w:tc>
+          <w:tcPr>
+            <w:tcW w:type="dxa" w:w="2351"/>
+          </w:tcPr>
+          <w:p>
+            <w:r/>
+            <w:r>
+              <w:rPr>
+                <w:b w:val="0"/>
+              </w:rPr>
+              <w:t>string | null</w:t>
+            </w:r>
+          </w:p>
+        </w:tc>
+        <w:tc>
+          <w:tcPr>
+            <w:tcW w:type="dxa" w:w="2351"/>
+          </w:tcPr>
+          <w:p>
+            <w:r/>
+            <w:r>
+              <w:rPr>
+                <w:b w:val="0"/>
+              </w:rPr>
+              <w:t>null</w:t>
+            </w:r>
+          </w:p>
+        </w:tc>
+        <w:tc>
+          <w:tcPr>
+            <w:tcW w:type="dxa" w:w="2351"/>
+          </w:tcPr>
+          <w:p>
+            <w:r/>
+            <w:r>
+              <w:rPr>
+                <w:b w:val="0"/>
+              </w:rPr>
+              <w:t>null = all units; else "2nd USC" | "CNTO" | "PXG" | "TFP"</w:t>
+            </w:r>
+          </w:p>
+        </w:tc>
+      </w:tr>
+      <w:tr>
+        <w:tc>
+          <w:tcPr>
+            <w:tcW w:type="dxa" w:w="2351"/>
+          </w:tcPr>
+          <w:p>
+            <w:r/>
+            <w:r>
+              <w:rPr>
+                <w:rFonts w:ascii="Courier New" w:hAnsi="Courier New"/>
+                <w:b w:val="0"/>
+                <w:sz w:val="18"/>
+              </w:rPr>
+              <w:t>playerUnits</w:t>
+            </w:r>
+          </w:p>
+        </w:tc>
+        <w:tc>
+          <w:tcPr>
+            <w:tcW w:type="dxa" w:w="2351"/>
+          </w:tcPr>
+          <w:p>
+            <w:r/>
+            <w:r>
+              <w:rPr>
+                <w:b w:val="0"/>
+              </w:rPr>
+              <w:t>Object</w:t>
+            </w:r>
+          </w:p>
+        </w:tc>
+        <w:tc>
+          <w:tcPr>
+            <w:tcW w:type="dxa" w:w="2351"/>
+          </w:tcPr>
+          <w:p>
+            <w:r/>
+            <w:r>
+              <w:rPr>
+                <w:b w:val="0"/>
+              </w:rPr>
+              <w:t>{}</w:t>
+            </w:r>
+          </w:p>
+        </w:tc>
+        <w:tc>
+          <w:tcPr>
+            <w:tcW w:type="dxa" w:w="2351"/>
+          </w:tcPr>
+          <w:p>
+            <w:r/>
+            <w:r>
+              <w:rPr>
+                <w:b w:val="0"/>
+              </w:rPr>
+              <w:t>Keyed by player name; value = classified unit string. Built by classifyUnits() after aggregation.</w:t>
+            </w:r>
+          </w:p>
+        </w:tc>
+      </w:tr>
+      <w:tr>
+        <w:tc>
+          <w:tcPr>
+            <w:tcW w:type="dxa" w:w="2351"/>
+          </w:tcPr>
+          <w:p>
+            <w:r/>
+            <w:r>
+              <w:rPr>
+                <w:rFonts w:ascii="Courier New" w:hAnsi="Courier New"/>
+                <w:b w:val="0"/>
+                <w:sz w:val="18"/>
+              </w:rPr>
+              <w:t>timePlayed</w:t>
+            </w:r>
+          </w:p>
+        </w:tc>
+        <w:tc>
+          <w:tcPr>
+            <w:tcW w:type="dxa" w:w="2351"/>
+          </w:tcPr>
+          <w:p>
+            <w:r/>
+            <w:r>
+              <w:rPr>
+                <w:b w:val="0"/>
+              </w:rPr>
+              <w:t>number</w:t>
+            </w:r>
+          </w:p>
+        </w:tc>
+        <w:tc>
+          <w:tcPr>
+            <w:tcW w:type="dxa" w:w="2351"/>
+          </w:tcPr>
+          <w:p>
+            <w:r/>
+            <w:r>
+              <w:rPr>
+                <w:b w:val="0"/>
+              </w:rPr>
+              <w:t>0</w:t>
+            </w:r>
+          </w:p>
+        </w:tc>
+        <w:tc>
+          <w:tcPr>
+            <w:tcW w:type="dxa" w:w="2351"/>
+          </w:tcPr>
+          <w:p>
+            <w:r/>
+            <w:r>
+              <w:rPr>
+                <w:b w:val="0"/>
+              </w:rPr>
+              <w:t>Accumulated seconds present per player per mission (in player aggregate object)</w:t>
+            </w:r>
+          </w:p>
+        </w:tc>
+      </w:tr>
     </w:tbl>
     <w:p>
       <w:r>
@@ -1702,12 +2018,12 @@
         <w:tc>
           <w:tcPr>
             <w:tcW w:type="dxa" w:w="3135"/>
-            <w:shd w:val="clear" w:color="auto" w:fill="FFFFFF"/>
-          </w:tcPr>
-          <w:p>
-            <w:r>
-              <w:rPr>
-                <w:sz w:val="18"/>
+          </w:tcPr>
+          <w:p>
+            <w:r/>
+            <w:r>
+              <w:rPr>
+                <w:b w:val="0"/>
               </w:rPr>
               <w:t>0</w:t>
             </w:r>
@@ -1716,12 +2032,12 @@
         <w:tc>
           <w:tcPr>
             <w:tcW w:type="dxa" w:w="3135"/>
-            <w:shd w:val="clear" w:color="auto" w:fill="FFFFFF"/>
-          </w:tcPr>
-          <w:p>
-            <w:r>
-              <w:rPr>
-                <w:sz w:val="18"/>
+          </w:tcPr>
+          <w:p>
+            <w:r/>
+            <w:r>
+              <w:rPr>
+                <w:b w:val="0"/>
               </w:rPr>
               <w:t>Source File</w:t>
             </w:r>
@@ -1730,12 +2046,12 @@
         <w:tc>
           <w:tcPr>
             <w:tcW w:type="dxa" w:w="3135"/>
-            <w:shd w:val="clear" w:color="auto" w:fill="FFFFFF"/>
-          </w:tcPr>
-          <w:p>
-            <w:r>
-              <w:rPr>
-                <w:sz w:val="18"/>
+          </w:tcPr>
+          <w:p>
+            <w:r/>
+            <w:r>
+              <w:rPr>
+                <w:b w:val="0"/>
               </w:rPr>
               <w:t>Filename encoding date (YYYY_MM_DD__...) and mission name</w:t>
             </w:r>
@@ -1746,12 +2062,12 @@
         <w:tc>
           <w:tcPr>
             <w:tcW w:type="dxa" w:w="3135"/>
-            <w:shd w:val="clear" w:color="auto" w:fill="F0F4FA"/>
-          </w:tcPr>
-          <w:p>
-            <w:r>
-              <w:rPr>
-                <w:sz w:val="18"/>
+          </w:tcPr>
+          <w:p>
+            <w:r/>
+            <w:r>
+              <w:rPr>
+                <w:b w:val="0"/>
               </w:rPr>
               <w:t>1</w:t>
             </w:r>
@@ -1760,12 +2076,12 @@
         <w:tc>
           <w:tcPr>
             <w:tcW w:type="dxa" w:w="3135"/>
-            <w:shd w:val="clear" w:color="auto" w:fill="F0F4FA"/>
-          </w:tcPr>
-          <w:p>
-            <w:r>
-              <w:rPr>
-                <w:sz w:val="18"/>
+          </w:tcPr>
+          <w:p>
+            <w:r/>
+            <w:r>
+              <w:rPr>
+                <w:b w:val="0"/>
               </w:rPr>
               <w:t>Mission</w:t>
             </w:r>
@@ -1774,12 +2090,12 @@
         <w:tc>
           <w:tcPr>
             <w:tcW w:type="dxa" w:w="3135"/>
-            <w:shd w:val="clear" w:color="auto" w:fill="F0F4FA"/>
-          </w:tcPr>
-          <w:p>
-            <w:r>
-              <w:rPr>
-                <w:sz w:val="18"/>
+          </w:tcPr>
+          <w:p>
+            <w:r/>
+            <w:r>
+              <w:rPr>
+                <w:b w:val="0"/>
               </w:rPr>
               <w:t>Human-readable mission name, expected to contain "(YYYY-MM-DD)"</w:t>
             </w:r>
@@ -1790,12 +2106,12 @@
         <w:tc>
           <w:tcPr>
             <w:tcW w:type="dxa" w:w="3135"/>
-            <w:shd w:val="clear" w:color="auto" w:fill="FFFFFF"/>
-          </w:tcPr>
-          <w:p>
-            <w:r>
-              <w:rPr>
-                <w:sz w:val="18"/>
+          </w:tcPr>
+          <w:p>
+            <w:r/>
+            <w:r>
+              <w:rPr>
+                <w:b w:val="0"/>
               </w:rPr>
               <w:t>2</w:t>
             </w:r>
@@ -1804,12 +2120,12 @@
         <w:tc>
           <w:tcPr>
             <w:tcW w:type="dxa" w:w="3135"/>
-            <w:shd w:val="clear" w:color="auto" w:fill="FFFFFF"/>
-          </w:tcPr>
-          <w:p>
-            <w:r>
-              <w:rPr>
-                <w:sz w:val="18"/>
+          </w:tcPr>
+          <w:p>
+            <w:r/>
+            <w:r>
+              <w:rPr>
+                <w:b w:val="0"/>
               </w:rPr>
               <w:t>World</w:t>
             </w:r>
@@ -1818,12 +2134,12 @@
         <w:tc>
           <w:tcPr>
             <w:tcW w:type="dxa" w:w="3135"/>
-            <w:shd w:val="clear" w:color="auto" w:fill="FFFFFF"/>
-          </w:tcPr>
-          <w:p>
-            <w:r>
-              <w:rPr>
-                <w:sz w:val="18"/>
+          </w:tcPr>
+          <w:p>
+            <w:r/>
+            <w:r>
+              <w:rPr>
+                <w:b w:val="0"/>
               </w:rPr>
               <w:t>Map/terrain name</w:t>
             </w:r>
@@ -1834,12 +2150,12 @@
         <w:tc>
           <w:tcPr>
             <w:tcW w:type="dxa" w:w="3135"/>
-            <w:shd w:val="clear" w:color="auto" w:fill="F0F4FA"/>
-          </w:tcPr>
-          <w:p>
-            <w:r>
-              <w:rPr>
-                <w:sz w:val="18"/>
+          </w:tcPr>
+          <w:p>
+            <w:r/>
+            <w:r>
+              <w:rPr>
+                <w:b w:val="0"/>
               </w:rPr>
               <w:t>3</w:t>
             </w:r>
@@ -1848,12 +2164,12 @@
         <w:tc>
           <w:tcPr>
             <w:tcW w:type="dxa" w:w="3135"/>
-            <w:shd w:val="clear" w:color="auto" w:fill="F0F4FA"/>
-          </w:tcPr>
-          <w:p>
-            <w:r>
-              <w:rPr>
-                <w:sz w:val="18"/>
+          </w:tcPr>
+          <w:p>
+            <w:r/>
+            <w:r>
+              <w:rPr>
+                <w:b w:val="0"/>
               </w:rPr>
               <w:t>Username</w:t>
             </w:r>
@@ -1862,12 +2178,12 @@
         <w:tc>
           <w:tcPr>
             <w:tcW w:type="dxa" w:w="3135"/>
-            <w:shd w:val="clear" w:color="auto" w:fill="F0F4FA"/>
-          </w:tcPr>
-          <w:p>
-            <w:r>
-              <w:rPr>
-                <w:sz w:val="18"/>
+          </w:tcPr>
+          <w:p>
+            <w:r/>
+            <w:r>
+              <w:rPr>
+                <w:b w:val="0"/>
               </w:rPr>
               <w:t>Player name (used as aggregate key)</w:t>
             </w:r>
@@ -1878,12 +2194,12 @@
         <w:tc>
           <w:tcPr>
             <w:tcW w:type="dxa" w:w="3135"/>
-            <w:shd w:val="clear" w:color="auto" w:fill="FFFFFF"/>
-          </w:tcPr>
-          <w:p>
-            <w:r>
-              <w:rPr>
-                <w:sz w:val="18"/>
+          </w:tcPr>
+          <w:p>
+            <w:r/>
+            <w:r>
+              <w:rPr>
+                <w:b w:val="0"/>
               </w:rPr>
               <w:t>4</w:t>
             </w:r>
@@ -1892,12 +2208,12 @@
         <w:tc>
           <w:tcPr>
             <w:tcW w:type="dxa" w:w="3135"/>
-            <w:shd w:val="clear" w:color="auto" w:fill="FFFFFF"/>
-          </w:tcPr>
-          <w:p>
-            <w:r>
-              <w:rPr>
-                <w:sz w:val="18"/>
+          </w:tcPr>
+          <w:p>
+            <w:r/>
+            <w:r>
+              <w:rPr>
+                <w:b w:val="0"/>
               </w:rPr>
               <w:t>Side</w:t>
             </w:r>
@@ -1906,12 +2222,12 @@
         <w:tc>
           <w:tcPr>
             <w:tcW w:type="dxa" w:w="3135"/>
-            <w:shd w:val="clear" w:color="auto" w:fill="FFFFFF"/>
-          </w:tcPr>
-          <w:p>
-            <w:r>
-              <w:rPr>
-                <w:sz w:val="18"/>
+          </w:tcPr>
+          <w:p>
+            <w:r/>
+            <w:r>
+              <w:rPr>
+                <w:b w:val="0"/>
               </w:rPr>
               <w:t>Faction (e.g. BLUFOR, OPFOR)</w:t>
             </w:r>
@@ -1922,12 +2238,12 @@
         <w:tc>
           <w:tcPr>
             <w:tcW w:type="dxa" w:w="3135"/>
-            <w:shd w:val="clear" w:color="auto" w:fill="F0F4FA"/>
-          </w:tcPr>
-          <w:p>
-            <w:r>
-              <w:rPr>
-                <w:sz w:val="18"/>
+          </w:tcPr>
+          <w:p>
+            <w:r/>
+            <w:r>
+              <w:rPr>
+                <w:b w:val="0"/>
               </w:rPr>
               <w:t>5</w:t>
             </w:r>
@@ -1936,12 +2252,12 @@
         <w:tc>
           <w:tcPr>
             <w:tcW w:type="dxa" w:w="3135"/>
-            <w:shd w:val="clear" w:color="auto" w:fill="F0F4FA"/>
-          </w:tcPr>
-          <w:p>
-            <w:r>
-              <w:rPr>
-                <w:sz w:val="18"/>
+          </w:tcPr>
+          <w:p>
+            <w:r/>
+            <w:r>
+              <w:rPr>
+                <w:b w:val="0"/>
               </w:rPr>
               <w:t>Group</w:t>
             </w:r>
@@ -1950,14 +2266,14 @@
         <w:tc>
           <w:tcPr>
             <w:tcW w:type="dxa" w:w="3135"/>
-            <w:shd w:val="clear" w:color="auto" w:fill="F0F4FA"/>
-          </w:tcPr>
-          <w:p>
-            <w:r>
-              <w:rPr>
-                <w:sz w:val="18"/>
-              </w:rPr>
-              <w:t>Role/squad; "zeus" group triggers Zeus classification</w:t>
+          </w:tcPr>
+          <w:p>
+            <w:r/>
+            <w:r>
+              <w:rPr>
+                <w:b w:val="0"/>
+              </w:rPr>
+              <w:t>Squad/group name; "zeus" group triggers Zeus classification</w:t>
             </w:r>
           </w:p>
         </w:tc>
@@ -1966,12 +2282,12 @@
         <w:tc>
           <w:tcPr>
             <w:tcW w:type="dxa" w:w="3135"/>
-            <w:shd w:val="clear" w:color="auto" w:fill="FFFFFF"/>
-          </w:tcPr>
-          <w:p>
-            <w:r>
-              <w:rPr>
-                <w:sz w:val="18"/>
+          </w:tcPr>
+          <w:p>
+            <w:r/>
+            <w:r>
+              <w:rPr>
+                <w:b w:val="0"/>
               </w:rPr>
               <w:t>6</w:t>
             </w:r>
@@ -1980,28 +2296,28 @@
         <w:tc>
           <w:tcPr>
             <w:tcW w:type="dxa" w:w="3135"/>
-            <w:shd w:val="clear" w:color="auto" w:fill="FFFFFF"/>
-          </w:tcPr>
-          <w:p>
-            <w:r>
-              <w:rPr>
-                <w:sz w:val="18"/>
-              </w:rPr>
-              <w:t>Kills (On Foot)</w:t>
-            </w:r>
-          </w:p>
-        </w:tc>
-        <w:tc>
-          <w:tcPr>
-            <w:tcW w:type="dxa" w:w="3135"/>
-            <w:shd w:val="clear" w:color="auto" w:fill="FFFFFF"/>
-          </w:tcPr>
-          <w:p>
-            <w:r>
-              <w:rPr>
-                <w:sz w:val="18"/>
-              </w:rPr>
-              <w:t>Infantry kills</w:t>
+          </w:tcPr>
+          <w:p>
+            <w:r/>
+            <w:r>
+              <w:rPr>
+                <w:b w:val="0"/>
+              </w:rPr>
+              <w:t>Role</w:t>
+            </w:r>
+          </w:p>
+        </w:tc>
+        <w:tc>
+          <w:tcPr>
+            <w:tcW w:type="dxa" w:w="3135"/>
+          </w:tcPr>
+          <w:p>
+            <w:r/>
+            <w:r>
+              <w:rPr>
+                <w:b w:val="0"/>
+              </w:rPr>
+              <w:t>Role string as reported by OCAP (may include @username suffix — stripped during aggregation)</w:t>
             </w:r>
           </w:p>
         </w:tc>
@@ -2010,12 +2326,12 @@
         <w:tc>
           <w:tcPr>
             <w:tcW w:type="dxa" w:w="3135"/>
-            <w:shd w:val="clear" w:color="auto" w:fill="F0F4FA"/>
-          </w:tcPr>
-          <w:p>
-            <w:r>
-              <w:rPr>
-                <w:sz w:val="18"/>
+          </w:tcPr>
+          <w:p>
+            <w:r/>
+            <w:r>
+              <w:rPr>
+                <w:b w:val="0"/>
               </w:rPr>
               <w:t>7</w:t>
             </w:r>
@@ -2024,28 +2340,28 @@
         <w:tc>
           <w:tcPr>
             <w:tcW w:type="dxa" w:w="3135"/>
-            <w:shd w:val="clear" w:color="auto" w:fill="F0F4FA"/>
-          </w:tcPr>
-          <w:p>
-            <w:r>
-              <w:rPr>
-                <w:sz w:val="18"/>
-              </w:rPr>
-              <w:t>Deaths (On Foot)</w:t>
-            </w:r>
-          </w:p>
-        </w:tc>
-        <w:tc>
-          <w:tcPr>
-            <w:tcW w:type="dxa" w:w="3135"/>
-            <w:shd w:val="clear" w:color="auto" w:fill="F0F4FA"/>
-          </w:tcPr>
-          <w:p>
-            <w:r>
-              <w:rPr>
-                <w:sz w:val="18"/>
-              </w:rPr>
-              <w:t>Infantry deaths</w:t>
+          </w:tcPr>
+          <w:p>
+            <w:r/>
+            <w:r>
+              <w:rPr>
+                <w:b w:val="0"/>
+              </w:rPr>
+              <w:t>Kills (On Foot)</w:t>
+            </w:r>
+          </w:p>
+        </w:tc>
+        <w:tc>
+          <w:tcPr>
+            <w:tcW w:type="dxa" w:w="3135"/>
+          </w:tcPr>
+          <w:p>
+            <w:r/>
+            <w:r>
+              <w:rPr>
+                <w:b w:val="0"/>
+              </w:rPr>
+              <w:t>Infantry kills</w:t>
             </w:r>
           </w:p>
         </w:tc>
@@ -2054,12 +2370,12 @@
         <w:tc>
           <w:tcPr>
             <w:tcW w:type="dxa" w:w="3135"/>
-            <w:shd w:val="clear" w:color="auto" w:fill="FFFFFF"/>
-          </w:tcPr>
-          <w:p>
-            <w:r>
-              <w:rPr>
-                <w:sz w:val="18"/>
+          </w:tcPr>
+          <w:p>
+            <w:r/>
+            <w:r>
+              <w:rPr>
+                <w:b w:val="0"/>
               </w:rPr>
               <w:t>8</w:t>
             </w:r>
@@ -2068,28 +2384,28 @@
         <w:tc>
           <w:tcPr>
             <w:tcW w:type="dxa" w:w="3135"/>
-            <w:shd w:val="clear" w:color="auto" w:fill="FFFFFF"/>
-          </w:tcPr>
-          <w:p>
-            <w:r>
-              <w:rPr>
-                <w:sz w:val="18"/>
-              </w:rPr>
-              <w:t>K/D (On Foot)</w:t>
-            </w:r>
-          </w:p>
-        </w:tc>
-        <w:tc>
-          <w:tcPr>
-            <w:tcW w:type="dxa" w:w="3135"/>
-            <w:shd w:val="clear" w:color="auto" w:fill="FFFFFF"/>
-          </w:tcPr>
-          <w:p>
-            <w:r>
-              <w:rPr>
-                <w:sz w:val="18"/>
-              </w:rPr>
-              <w:t>Ignored — recomputed from kills/deaths</w:t>
+          </w:tcPr>
+          <w:p>
+            <w:r/>
+            <w:r>
+              <w:rPr>
+                <w:b w:val="0"/>
+              </w:rPr>
+              <w:t>Deaths (On Foot)</w:t>
+            </w:r>
+          </w:p>
+        </w:tc>
+        <w:tc>
+          <w:tcPr>
+            <w:tcW w:type="dxa" w:w="3135"/>
+          </w:tcPr>
+          <w:p>
+            <w:r/>
+            <w:r>
+              <w:rPr>
+                <w:b w:val="0"/>
+              </w:rPr>
+              <w:t>Infantry deaths</w:t>
             </w:r>
           </w:p>
         </w:tc>
@@ -2098,12 +2414,12 @@
         <w:tc>
           <w:tcPr>
             <w:tcW w:type="dxa" w:w="3135"/>
-            <w:shd w:val="clear" w:color="auto" w:fill="F0F4FA"/>
-          </w:tcPr>
-          <w:p>
-            <w:r>
-              <w:rPr>
-                <w:sz w:val="18"/>
+          </w:tcPr>
+          <w:p>
+            <w:r/>
+            <w:r>
+              <w:rPr>
+                <w:b w:val="0"/>
               </w:rPr>
               <w:t>9</w:t>
             </w:r>
@@ -2112,28 +2428,28 @@
         <w:tc>
           <w:tcPr>
             <w:tcW w:type="dxa" w:w="3135"/>
-            <w:shd w:val="clear" w:color="auto" w:fill="F0F4FA"/>
-          </w:tcPr>
-          <w:p>
-            <w:r>
-              <w:rPr>
-                <w:sz w:val="18"/>
-              </w:rPr>
-              <w:t>Teamkills (On Foot)</w:t>
-            </w:r>
-          </w:p>
-        </w:tc>
-        <w:tc>
-          <w:tcPr>
-            <w:tcW w:type="dxa" w:w="3135"/>
-            <w:shd w:val="clear" w:color="auto" w:fill="F0F4FA"/>
-          </w:tcPr>
-          <w:p>
-            <w:r>
-              <w:rPr>
-                <w:sz w:val="18"/>
-              </w:rPr>
-              <w:t>Friendly fire kills (infantry)</w:t>
+          </w:tcPr>
+          <w:p>
+            <w:r/>
+            <w:r>
+              <w:rPr>
+                <w:b w:val="0"/>
+              </w:rPr>
+              <w:t>K/D (On Foot)</w:t>
+            </w:r>
+          </w:p>
+        </w:tc>
+        <w:tc>
+          <w:tcPr>
+            <w:tcW w:type="dxa" w:w="3135"/>
+          </w:tcPr>
+          <w:p>
+            <w:r/>
+            <w:r>
+              <w:rPr>
+                <w:b w:val="0"/>
+              </w:rPr>
+              <w:t>Ignored — recomputed from kills/deaths</w:t>
             </w:r>
           </w:p>
         </w:tc>
@@ -2142,12 +2458,12 @@
         <w:tc>
           <w:tcPr>
             <w:tcW w:type="dxa" w:w="3135"/>
-            <w:shd w:val="clear" w:color="auto" w:fill="FFFFFF"/>
-          </w:tcPr>
-          <w:p>
-            <w:r>
-              <w:rPr>
-                <w:sz w:val="18"/>
+          </w:tcPr>
+          <w:p>
+            <w:r/>
+            <w:r>
+              <w:rPr>
+                <w:b w:val="0"/>
               </w:rPr>
               <w:t>10</w:t>
             </w:r>
@@ -2156,28 +2472,28 @@
         <w:tc>
           <w:tcPr>
             <w:tcW w:type="dxa" w:w="3135"/>
-            <w:shd w:val="clear" w:color="auto" w:fill="FFFFFF"/>
-          </w:tcPr>
-          <w:p>
-            <w:r>
-              <w:rPr>
-                <w:sz w:val="18"/>
-              </w:rPr>
-              <w:t>Shots (On Foot)</w:t>
-            </w:r>
-          </w:p>
-        </w:tc>
-        <w:tc>
-          <w:tcPr>
-            <w:tcW w:type="dxa" w:w="3135"/>
-            <w:shd w:val="clear" w:color="auto" w:fill="FFFFFF"/>
-          </w:tcPr>
-          <w:p>
-            <w:r>
-              <w:rPr>
-                <w:sz w:val="18"/>
-              </w:rPr>
-              <w:t>Rounds fired on foot</w:t>
+          </w:tcPr>
+          <w:p>
+            <w:r/>
+            <w:r>
+              <w:rPr>
+                <w:b w:val="0"/>
+              </w:rPr>
+              <w:t>Teamkills (On Foot)</w:t>
+            </w:r>
+          </w:p>
+        </w:tc>
+        <w:tc>
+          <w:tcPr>
+            <w:tcW w:type="dxa" w:w="3135"/>
+          </w:tcPr>
+          <w:p>
+            <w:r/>
+            <w:r>
+              <w:rPr>
+                <w:b w:val="0"/>
+              </w:rPr>
+              <w:t>Friendly fire kills (infantry)</w:t>
             </w:r>
           </w:p>
         </w:tc>
@@ -2186,12 +2502,12 @@
         <w:tc>
           <w:tcPr>
             <w:tcW w:type="dxa" w:w="3135"/>
-            <w:shd w:val="clear" w:color="auto" w:fill="F0F4FA"/>
-          </w:tcPr>
-          <w:p>
-            <w:r>
-              <w:rPr>
-                <w:sz w:val="18"/>
+          </w:tcPr>
+          <w:p>
+            <w:r/>
+            <w:r>
+              <w:rPr>
+                <w:b w:val="0"/>
               </w:rPr>
               <w:t>11</w:t>
             </w:r>
@@ -2200,28 +2516,28 @@
         <w:tc>
           <w:tcPr>
             <w:tcW w:type="dxa" w:w="3135"/>
-            <w:shd w:val="clear" w:color="auto" w:fill="F0F4FA"/>
-          </w:tcPr>
-          <w:p>
-            <w:r>
-              <w:rPr>
-                <w:sz w:val="18"/>
-              </w:rPr>
-              <w:t>Hits Taken (On Foot)</w:t>
-            </w:r>
-          </w:p>
-        </w:tc>
-        <w:tc>
-          <w:tcPr>
-            <w:tcW w:type="dxa" w:w="3135"/>
-            <w:shd w:val="clear" w:color="auto" w:fill="F0F4FA"/>
-          </w:tcPr>
-          <w:p>
-            <w:r>
-              <w:rPr>
-                <w:sz w:val="18"/>
-              </w:rPr>
-              <w:t>Times hit while on foot</w:t>
+          </w:tcPr>
+          <w:p>
+            <w:r/>
+            <w:r>
+              <w:rPr>
+                <w:b w:val="0"/>
+              </w:rPr>
+              <w:t>Shots (On Foot)</w:t>
+            </w:r>
+          </w:p>
+        </w:tc>
+        <w:tc>
+          <w:tcPr>
+            <w:tcW w:type="dxa" w:w="3135"/>
+          </w:tcPr>
+          <w:p>
+            <w:r/>
+            <w:r>
+              <w:rPr>
+                <w:b w:val="0"/>
+              </w:rPr>
+              <w:t>Rounds fired on foot</w:t>
             </w:r>
           </w:p>
         </w:tc>
@@ -2230,12 +2546,12 @@
         <w:tc>
           <w:tcPr>
             <w:tcW w:type="dxa" w:w="3135"/>
-            <w:shd w:val="clear" w:color="auto" w:fill="FFFFFF"/>
-          </w:tcPr>
-          <w:p>
-            <w:r>
-              <w:rPr>
-                <w:sz w:val="18"/>
+          </w:tcPr>
+          <w:p>
+            <w:r/>
+            <w:r>
+              <w:rPr>
+                <w:b w:val="0"/>
               </w:rPr>
               <w:t>12</w:t>
             </w:r>
@@ -2244,28 +2560,28 @@
         <w:tc>
           <w:tcPr>
             <w:tcW w:type="dxa" w:w="3135"/>
-            <w:shd w:val="clear" w:color="auto" w:fill="FFFFFF"/>
-          </w:tcPr>
-          <w:p>
-            <w:r>
-              <w:rPr>
-                <w:sz w:val="18"/>
-              </w:rPr>
-              <w:t>Shots/Kill (On Foot)</w:t>
-            </w:r>
-          </w:p>
-        </w:tc>
-        <w:tc>
-          <w:tcPr>
-            <w:tcW w:type="dxa" w:w="3135"/>
-            <w:shd w:val="clear" w:color="auto" w:fill="FFFFFF"/>
-          </w:tcPr>
-          <w:p>
-            <w:r>
-              <w:rPr>
-                <w:sz w:val="18"/>
-              </w:rPr>
-              <w:t>Ignored — recomputed</w:t>
+          </w:tcPr>
+          <w:p>
+            <w:r/>
+            <w:r>
+              <w:rPr>
+                <w:b w:val="0"/>
+              </w:rPr>
+              <w:t>Hits Taken (On Foot)</w:t>
+            </w:r>
+          </w:p>
+        </w:tc>
+        <w:tc>
+          <w:tcPr>
+            <w:tcW w:type="dxa" w:w="3135"/>
+          </w:tcPr>
+          <w:p>
+            <w:r/>
+            <w:r>
+              <w:rPr>
+                <w:b w:val="0"/>
+              </w:rPr>
+              <w:t>Times hit while on foot</w:t>
             </w:r>
           </w:p>
         </w:tc>
@@ -2274,12 +2590,12 @@
         <w:tc>
           <w:tcPr>
             <w:tcW w:type="dxa" w:w="3135"/>
-            <w:shd w:val="clear" w:color="auto" w:fill="F0F4FA"/>
-          </w:tcPr>
-          <w:p>
-            <w:r>
-              <w:rPr>
-                <w:sz w:val="18"/>
+          </w:tcPr>
+          <w:p>
+            <w:r/>
+            <w:r>
+              <w:rPr>
+                <w:b w:val="0"/>
               </w:rPr>
               <w:t>13</w:t>
             </w:r>
@@ -2288,28 +2604,28 @@
         <w:tc>
           <w:tcPr>
             <w:tcW w:type="dxa" w:w="3135"/>
-            <w:shd w:val="clear" w:color="auto" w:fill="F0F4FA"/>
-          </w:tcPr>
-          <w:p>
-            <w:r>
-              <w:rPr>
-                <w:sz w:val="18"/>
-              </w:rPr>
-              <w:t>Avg Kill Dist On Foot (m)</w:t>
-            </w:r>
-          </w:p>
-        </w:tc>
-        <w:tc>
-          <w:tcPr>
-            <w:tcW w:type="dxa" w:w="3135"/>
-            <w:shd w:val="clear" w:color="auto" w:fill="F0F4FA"/>
-          </w:tcPr>
-          <w:p>
-            <w:r>
-              <w:rPr>
-                <w:sz w:val="18"/>
-              </w:rPr>
-              <w:t>Average kill distance (on foot)</w:t>
+          </w:tcPr>
+          <w:p>
+            <w:r/>
+            <w:r>
+              <w:rPr>
+                <w:b w:val="0"/>
+              </w:rPr>
+              <w:t>Shots/Kill (On Foot)</w:t>
+            </w:r>
+          </w:p>
+        </w:tc>
+        <w:tc>
+          <w:tcPr>
+            <w:tcW w:type="dxa" w:w="3135"/>
+          </w:tcPr>
+          <w:p>
+            <w:r/>
+            <w:r>
+              <w:rPr>
+                <w:b w:val="0"/>
+              </w:rPr>
+              <w:t>Ignored — recomputed</w:t>
             </w:r>
           </w:p>
         </w:tc>
@@ -2318,12 +2634,12 @@
         <w:tc>
           <w:tcPr>
             <w:tcW w:type="dxa" w:w="3135"/>
-            <w:shd w:val="clear" w:color="auto" w:fill="FFFFFF"/>
-          </w:tcPr>
-          <w:p>
-            <w:r>
-              <w:rPr>
-                <w:sz w:val="18"/>
+          </w:tcPr>
+          <w:p>
+            <w:r/>
+            <w:r>
+              <w:rPr>
+                <w:b w:val="0"/>
               </w:rPr>
               <w:t>14</w:t>
             </w:r>
@@ -2332,28 +2648,28 @@
         <w:tc>
           <w:tcPr>
             <w:tcW w:type="dxa" w:w="3135"/>
-            <w:shd w:val="clear" w:color="auto" w:fill="FFFFFF"/>
-          </w:tcPr>
-          <w:p>
-            <w:r>
-              <w:rPr>
-                <w:sz w:val="18"/>
-              </w:rPr>
-              <w:t>Longest Kill On Foot (m)</w:t>
-            </w:r>
-          </w:p>
-        </w:tc>
-        <w:tc>
-          <w:tcPr>
-            <w:tcW w:type="dxa" w:w="3135"/>
-            <w:shd w:val="clear" w:color="auto" w:fill="FFFFFF"/>
-          </w:tcPr>
-          <w:p>
-            <w:r>
-              <w:rPr>
-                <w:sz w:val="18"/>
-              </w:rPr>
-              <w:t>Longest single kill distance (on foot)</w:t>
+          </w:tcPr>
+          <w:p>
+            <w:r/>
+            <w:r>
+              <w:rPr>
+                <w:b w:val="0"/>
+              </w:rPr>
+              <w:t>Avg Kill Dist On Foot (m)</w:t>
+            </w:r>
+          </w:p>
+        </w:tc>
+        <w:tc>
+          <w:tcPr>
+            <w:tcW w:type="dxa" w:w="3135"/>
+          </w:tcPr>
+          <w:p>
+            <w:r/>
+            <w:r>
+              <w:rPr>
+                <w:b w:val="0"/>
+              </w:rPr>
+              <w:t>Average kill distance (on foot)</w:t>
             </w:r>
           </w:p>
         </w:tc>
@@ -2362,12 +2678,12 @@
         <w:tc>
           <w:tcPr>
             <w:tcW w:type="dxa" w:w="3135"/>
-            <w:shd w:val="clear" w:color="auto" w:fill="F0F4FA"/>
-          </w:tcPr>
-          <w:p>
-            <w:r>
-              <w:rPr>
-                <w:sz w:val="18"/>
+          </w:tcPr>
+          <w:p>
+            <w:r/>
+            <w:r>
+              <w:rPr>
+                <w:b w:val="0"/>
               </w:rPr>
               <w:t>15</w:t>
             </w:r>
@@ -2376,28 +2692,28 @@
         <w:tc>
           <w:tcPr>
             <w:tcW w:type="dxa" w:w="3135"/>
-            <w:shd w:val="clear" w:color="auto" w:fill="F0F4FA"/>
-          </w:tcPr>
-          <w:p>
-            <w:r>
-              <w:rPr>
-                <w:sz w:val="18"/>
-              </w:rPr>
-              <w:t>Kills (In Vehicle)</w:t>
-            </w:r>
-          </w:p>
-        </w:tc>
-        <w:tc>
-          <w:tcPr>
-            <w:tcW w:type="dxa" w:w="3135"/>
-            <w:shd w:val="clear" w:color="auto" w:fill="F0F4FA"/>
-          </w:tcPr>
-          <w:p>
-            <w:r>
-              <w:rPr>
-                <w:sz w:val="18"/>
-              </w:rPr>
-              <w:t>Vehicle kills</w:t>
+          </w:tcPr>
+          <w:p>
+            <w:r/>
+            <w:r>
+              <w:rPr>
+                <w:b w:val="0"/>
+              </w:rPr>
+              <w:t>Longest Kill On Foot (m)</w:t>
+            </w:r>
+          </w:p>
+        </w:tc>
+        <w:tc>
+          <w:tcPr>
+            <w:tcW w:type="dxa" w:w="3135"/>
+          </w:tcPr>
+          <w:p>
+            <w:r/>
+            <w:r>
+              <w:rPr>
+                <w:b w:val="0"/>
+              </w:rPr>
+              <w:t>Longest single kill distance (on foot)</w:t>
             </w:r>
           </w:p>
         </w:tc>
@@ -2406,12 +2722,12 @@
         <w:tc>
           <w:tcPr>
             <w:tcW w:type="dxa" w:w="3135"/>
-            <w:shd w:val="clear" w:color="auto" w:fill="FFFFFF"/>
-          </w:tcPr>
-          <w:p>
-            <w:r>
-              <w:rPr>
-                <w:sz w:val="18"/>
+          </w:tcPr>
+          <w:p>
+            <w:r/>
+            <w:r>
+              <w:rPr>
+                <w:b w:val="0"/>
               </w:rPr>
               <w:t>16</w:t>
             </w:r>
@@ -2420,28 +2736,28 @@
         <w:tc>
           <w:tcPr>
             <w:tcW w:type="dxa" w:w="3135"/>
-            <w:shd w:val="clear" w:color="auto" w:fill="FFFFFF"/>
-          </w:tcPr>
-          <w:p>
-            <w:r>
-              <w:rPr>
-                <w:sz w:val="18"/>
-              </w:rPr>
-              <w:t>Deaths (In Vehicle)</w:t>
-            </w:r>
-          </w:p>
-        </w:tc>
-        <w:tc>
-          <w:tcPr>
-            <w:tcW w:type="dxa" w:w="3135"/>
-            <w:shd w:val="clear" w:color="auto" w:fill="FFFFFF"/>
-          </w:tcPr>
-          <w:p>
-            <w:r>
-              <w:rPr>
-                <w:sz w:val="18"/>
-              </w:rPr>
-              <w:t>Deaths while in vehicle</w:t>
+          </w:tcPr>
+          <w:p>
+            <w:r/>
+            <w:r>
+              <w:rPr>
+                <w:b w:val="0"/>
+              </w:rPr>
+              <w:t>Kills (In Vehicle)</w:t>
+            </w:r>
+          </w:p>
+        </w:tc>
+        <w:tc>
+          <w:tcPr>
+            <w:tcW w:type="dxa" w:w="3135"/>
+          </w:tcPr>
+          <w:p>
+            <w:r/>
+            <w:r>
+              <w:rPr>
+                <w:b w:val="0"/>
+              </w:rPr>
+              <w:t>Kills scored while in a vehicle</w:t>
             </w:r>
           </w:p>
         </w:tc>
@@ -2450,12 +2766,12 @@
         <w:tc>
           <w:tcPr>
             <w:tcW w:type="dxa" w:w="3135"/>
-            <w:shd w:val="clear" w:color="auto" w:fill="F0F4FA"/>
-          </w:tcPr>
-          <w:p>
-            <w:r>
-              <w:rPr>
-                <w:sz w:val="18"/>
+          </w:tcPr>
+          <w:p>
+            <w:r/>
+            <w:r>
+              <w:rPr>
+                <w:b w:val="0"/>
               </w:rPr>
               <w:t>17</w:t>
             </w:r>
@@ -2464,28 +2780,28 @@
         <w:tc>
           <w:tcPr>
             <w:tcW w:type="dxa" w:w="3135"/>
-            <w:shd w:val="clear" w:color="auto" w:fill="F0F4FA"/>
-          </w:tcPr>
-          <w:p>
-            <w:r>
-              <w:rPr>
-                <w:sz w:val="18"/>
-              </w:rPr>
-              <w:t>K/D (In Vehicle)</w:t>
-            </w:r>
-          </w:p>
-        </w:tc>
-        <w:tc>
-          <w:tcPr>
-            <w:tcW w:type="dxa" w:w="3135"/>
-            <w:shd w:val="clear" w:color="auto" w:fill="F0F4FA"/>
-          </w:tcPr>
-          <w:p>
-            <w:r>
-              <w:rPr>
-                <w:sz w:val="18"/>
-              </w:rPr>
-              <w:t>Ignored — recomputed</w:t>
+          </w:tcPr>
+          <w:p>
+            <w:r/>
+            <w:r>
+              <w:rPr>
+                <w:b w:val="0"/>
+              </w:rPr>
+              <w:t>Deaths (In Vehicle)</w:t>
+            </w:r>
+          </w:p>
+        </w:tc>
+        <w:tc>
+          <w:tcPr>
+            <w:tcW w:type="dxa" w:w="3135"/>
+          </w:tcPr>
+          <w:p>
+            <w:r/>
+            <w:r>
+              <w:rPr>
+                <w:b w:val="0"/>
+              </w:rPr>
+              <w:t>Deaths while in vehicle</w:t>
             </w:r>
           </w:p>
         </w:tc>
@@ -2494,12 +2810,12 @@
         <w:tc>
           <w:tcPr>
             <w:tcW w:type="dxa" w:w="3135"/>
-            <w:shd w:val="clear" w:color="auto" w:fill="FFFFFF"/>
-          </w:tcPr>
-          <w:p>
-            <w:r>
-              <w:rPr>
-                <w:sz w:val="18"/>
+          </w:tcPr>
+          <w:p>
+            <w:r/>
+            <w:r>
+              <w:rPr>
+                <w:b w:val="0"/>
               </w:rPr>
               <w:t>18</w:t>
             </w:r>
@@ -2508,28 +2824,28 @@
         <w:tc>
           <w:tcPr>
             <w:tcW w:type="dxa" w:w="3135"/>
-            <w:shd w:val="clear" w:color="auto" w:fill="FFFFFF"/>
-          </w:tcPr>
-          <w:p>
-            <w:r>
-              <w:rPr>
-                <w:sz w:val="18"/>
-              </w:rPr>
-              <w:t>Teamkills (In Vehicle)</w:t>
-            </w:r>
-          </w:p>
-        </w:tc>
-        <w:tc>
-          <w:tcPr>
-            <w:tcW w:type="dxa" w:w="3135"/>
-            <w:shd w:val="clear" w:color="auto" w:fill="FFFFFF"/>
-          </w:tcPr>
-          <w:p>
-            <w:r>
-              <w:rPr>
-                <w:sz w:val="18"/>
-              </w:rPr>
-              <w:t>Friendly fire from vehicle</w:t>
+          </w:tcPr>
+          <w:p>
+            <w:r/>
+            <w:r>
+              <w:rPr>
+                <w:b w:val="0"/>
+              </w:rPr>
+              <w:t>K/D (In Vehicle)</w:t>
+            </w:r>
+          </w:p>
+        </w:tc>
+        <w:tc>
+          <w:tcPr>
+            <w:tcW w:type="dxa" w:w="3135"/>
+          </w:tcPr>
+          <w:p>
+            <w:r/>
+            <w:r>
+              <w:rPr>
+                <w:b w:val="0"/>
+              </w:rPr>
+              <w:t>Ignored — recomputed</w:t>
             </w:r>
           </w:p>
         </w:tc>
@@ -2538,12 +2854,12 @@
         <w:tc>
           <w:tcPr>
             <w:tcW w:type="dxa" w:w="3135"/>
-            <w:shd w:val="clear" w:color="auto" w:fill="F0F4FA"/>
-          </w:tcPr>
-          <w:p>
-            <w:r>
-              <w:rPr>
-                <w:sz w:val="18"/>
+          </w:tcPr>
+          <w:p>
+            <w:r/>
+            <w:r>
+              <w:rPr>
+                <w:b w:val="0"/>
               </w:rPr>
               <w:t>19</w:t>
             </w:r>
@@ -2552,28 +2868,28 @@
         <w:tc>
           <w:tcPr>
             <w:tcW w:type="dxa" w:w="3135"/>
-            <w:shd w:val="clear" w:color="auto" w:fill="F0F4FA"/>
-          </w:tcPr>
-          <w:p>
-            <w:r>
-              <w:rPr>
-                <w:sz w:val="18"/>
-              </w:rPr>
-              <w:t>Vehicle Kills (On Foot)</w:t>
-            </w:r>
-          </w:p>
-        </w:tc>
-        <w:tc>
-          <w:tcPr>
-            <w:tcW w:type="dxa" w:w="3135"/>
-            <w:shd w:val="clear" w:color="auto" w:fill="F0F4FA"/>
-          </w:tcPr>
-          <w:p>
-            <w:r>
-              <w:rPr>
-                <w:sz w:val="18"/>
-              </w:rPr>
-              <w:t>Vehicles destroyed while on foot</w:t>
+          </w:tcPr>
+          <w:p>
+            <w:r/>
+            <w:r>
+              <w:rPr>
+                <w:b w:val="0"/>
+              </w:rPr>
+              <w:t>Teamkills (In Vehicle)</w:t>
+            </w:r>
+          </w:p>
+        </w:tc>
+        <w:tc>
+          <w:tcPr>
+            <w:tcW w:type="dxa" w:w="3135"/>
+          </w:tcPr>
+          <w:p>
+            <w:r/>
+            <w:r>
+              <w:rPr>
+                <w:b w:val="0"/>
+              </w:rPr>
+              <w:t>Friendly fire from vehicle</w:t>
             </w:r>
           </w:p>
         </w:tc>
@@ -2582,12 +2898,12 @@
         <w:tc>
           <w:tcPr>
             <w:tcW w:type="dxa" w:w="3135"/>
-            <w:shd w:val="clear" w:color="auto" w:fill="FFFFFF"/>
-          </w:tcPr>
-          <w:p>
-            <w:r>
-              <w:rPr>
-                <w:sz w:val="18"/>
+          </w:tcPr>
+          <w:p>
+            <w:r/>
+            <w:r>
+              <w:rPr>
+                <w:b w:val="0"/>
               </w:rPr>
               <w:t>20</w:t>
             </w:r>
@@ -2596,28 +2912,28 @@
         <w:tc>
           <w:tcPr>
             <w:tcW w:type="dxa" w:w="3135"/>
-            <w:shd w:val="clear" w:color="auto" w:fill="FFFFFF"/>
-          </w:tcPr>
-          <w:p>
-            <w:r>
-              <w:rPr>
-                <w:sz w:val="18"/>
-              </w:rPr>
-              <w:t>Vehicle Kills (In Vehicle)</w:t>
-            </w:r>
-          </w:p>
-        </w:tc>
-        <w:tc>
-          <w:tcPr>
-            <w:tcW w:type="dxa" w:w="3135"/>
-            <w:shd w:val="clear" w:color="auto" w:fill="FFFFFF"/>
-          </w:tcPr>
-          <w:p>
-            <w:r>
-              <w:rPr>
-                <w:sz w:val="18"/>
-              </w:rPr>
-              <w:t>Vehicles destroyed while in vehicle</w:t>
+          </w:tcPr>
+          <w:p>
+            <w:r/>
+            <w:r>
+              <w:rPr>
+                <w:b w:val="0"/>
+              </w:rPr>
+              <w:t>Vehicle Kills (On Foot)</w:t>
+            </w:r>
+          </w:p>
+        </w:tc>
+        <w:tc>
+          <w:tcPr>
+            <w:tcW w:type="dxa" w:w="3135"/>
+          </w:tcPr>
+          <w:p>
+            <w:r/>
+            <w:r>
+              <w:rPr>
+                <w:b w:val="0"/>
+              </w:rPr>
+              <w:t>Vehicles destroyed while on foot</w:t>
             </w:r>
           </w:p>
         </w:tc>
@@ -2626,12 +2942,12 @@
         <w:tc>
           <w:tcPr>
             <w:tcW w:type="dxa" w:w="3135"/>
-            <w:shd w:val="clear" w:color="auto" w:fill="F0F4FA"/>
-          </w:tcPr>
-          <w:p>
-            <w:r>
-              <w:rPr>
-                <w:sz w:val="18"/>
+          </w:tcPr>
+          <w:p>
+            <w:r/>
+            <w:r>
+              <w:rPr>
+                <w:b w:val="0"/>
               </w:rPr>
               <w:t>21</w:t>
             </w:r>
@@ -2640,28 +2956,28 @@
         <w:tc>
           <w:tcPr>
             <w:tcW w:type="dxa" w:w="3135"/>
-            <w:shd w:val="clear" w:color="auto" w:fill="F0F4FA"/>
-          </w:tcPr>
-          <w:p>
-            <w:r>
-              <w:rPr>
-                <w:sz w:val="18"/>
-              </w:rPr>
-              <w:t>Shots (In Vehicle)</w:t>
-            </w:r>
-          </w:p>
-        </w:tc>
-        <w:tc>
-          <w:tcPr>
-            <w:tcW w:type="dxa" w:w="3135"/>
-            <w:shd w:val="clear" w:color="auto" w:fill="F0F4FA"/>
-          </w:tcPr>
-          <w:p>
-            <w:r>
-              <w:rPr>
-                <w:sz w:val="18"/>
-              </w:rPr>
-              <w:t>Rounds fired from vehicle</w:t>
+          </w:tcPr>
+          <w:p>
+            <w:r/>
+            <w:r>
+              <w:rPr>
+                <w:b w:val="0"/>
+              </w:rPr>
+              <w:t>Vehicle Kills (In Vehicle)</w:t>
+            </w:r>
+          </w:p>
+        </w:tc>
+        <w:tc>
+          <w:tcPr>
+            <w:tcW w:type="dxa" w:w="3135"/>
+          </w:tcPr>
+          <w:p>
+            <w:r/>
+            <w:r>
+              <w:rPr>
+                <w:b w:val="0"/>
+              </w:rPr>
+              <w:t>Vehicles destroyed while in vehicle</w:t>
             </w:r>
           </w:p>
         </w:tc>
@@ -2670,12 +2986,12 @@
         <w:tc>
           <w:tcPr>
             <w:tcW w:type="dxa" w:w="3135"/>
-            <w:shd w:val="clear" w:color="auto" w:fill="FFFFFF"/>
-          </w:tcPr>
-          <w:p>
-            <w:r>
-              <w:rPr>
-                <w:sz w:val="18"/>
+          </w:tcPr>
+          <w:p>
+            <w:r/>
+            <w:r>
+              <w:rPr>
+                <w:b w:val="0"/>
               </w:rPr>
               <w:t>22</w:t>
             </w:r>
@@ -2684,28 +3000,28 @@
         <w:tc>
           <w:tcPr>
             <w:tcW w:type="dxa" w:w="3135"/>
-            <w:shd w:val="clear" w:color="auto" w:fill="FFFFFF"/>
-          </w:tcPr>
-          <w:p>
-            <w:r>
-              <w:rPr>
-                <w:sz w:val="18"/>
-              </w:rPr>
-              <w:t>Hits Taken (In Vehicle)</w:t>
-            </w:r>
-          </w:p>
-        </w:tc>
-        <w:tc>
-          <w:tcPr>
-            <w:tcW w:type="dxa" w:w="3135"/>
-            <w:shd w:val="clear" w:color="auto" w:fill="FFFFFF"/>
-          </w:tcPr>
-          <w:p>
-            <w:r>
-              <w:rPr>
-                <w:sz w:val="18"/>
-              </w:rPr>
-              <w:t>Times vehicle was hit</w:t>
+          </w:tcPr>
+          <w:p>
+            <w:r/>
+            <w:r>
+              <w:rPr>
+                <w:b w:val="0"/>
+              </w:rPr>
+              <w:t>Shots (In Vehicle)</w:t>
+            </w:r>
+          </w:p>
+        </w:tc>
+        <w:tc>
+          <w:tcPr>
+            <w:tcW w:type="dxa" w:w="3135"/>
+          </w:tcPr>
+          <w:p>
+            <w:r/>
+            <w:r>
+              <w:rPr>
+                <w:b w:val="0"/>
+              </w:rPr>
+              <w:t>Rounds fired from vehicle</w:t>
             </w:r>
           </w:p>
         </w:tc>
@@ -2714,12 +3030,12 @@
         <w:tc>
           <w:tcPr>
             <w:tcW w:type="dxa" w:w="3135"/>
-            <w:shd w:val="clear" w:color="auto" w:fill="F0F4FA"/>
-          </w:tcPr>
-          <w:p>
-            <w:r>
-              <w:rPr>
-                <w:sz w:val="18"/>
+          </w:tcPr>
+          <w:p>
+            <w:r/>
+            <w:r>
+              <w:rPr>
+                <w:b w:val="0"/>
               </w:rPr>
               <w:t>23</w:t>
             </w:r>
@@ -2728,28 +3044,28 @@
         <w:tc>
           <w:tcPr>
             <w:tcW w:type="dxa" w:w="3135"/>
-            <w:shd w:val="clear" w:color="auto" w:fill="F0F4FA"/>
-          </w:tcPr>
-          <w:p>
-            <w:r>
-              <w:rPr>
-                <w:sz w:val="18"/>
-              </w:rPr>
-              <w:t>Shots/Kill (In Vehicle)</w:t>
-            </w:r>
-          </w:p>
-        </w:tc>
-        <w:tc>
-          <w:tcPr>
-            <w:tcW w:type="dxa" w:w="3135"/>
-            <w:shd w:val="clear" w:color="auto" w:fill="F0F4FA"/>
-          </w:tcPr>
-          <w:p>
-            <w:r>
-              <w:rPr>
-                <w:sz w:val="18"/>
-              </w:rPr>
-              <w:t>Ignored — recomputed</w:t>
+          </w:tcPr>
+          <w:p>
+            <w:r/>
+            <w:r>
+              <w:rPr>
+                <w:b w:val="0"/>
+              </w:rPr>
+              <w:t>Hits Taken (In Vehicle)</w:t>
+            </w:r>
+          </w:p>
+        </w:tc>
+        <w:tc>
+          <w:tcPr>
+            <w:tcW w:type="dxa" w:w="3135"/>
+          </w:tcPr>
+          <w:p>
+            <w:r/>
+            <w:r>
+              <w:rPr>
+                <w:b w:val="0"/>
+              </w:rPr>
+              <w:t>Times vehicle was hit</w:t>
             </w:r>
           </w:p>
         </w:tc>
@@ -2758,12 +3074,12 @@
         <w:tc>
           <w:tcPr>
             <w:tcW w:type="dxa" w:w="3135"/>
-            <w:shd w:val="clear" w:color="auto" w:fill="FFFFFF"/>
-          </w:tcPr>
-          <w:p>
-            <w:r>
-              <w:rPr>
-                <w:sz w:val="18"/>
+          </w:tcPr>
+          <w:p>
+            <w:r/>
+            <w:r>
+              <w:rPr>
+                <w:b w:val="0"/>
               </w:rPr>
               <w:t>24</w:t>
             </w:r>
@@ -2772,28 +3088,28 @@
         <w:tc>
           <w:tcPr>
             <w:tcW w:type="dxa" w:w="3135"/>
-            <w:shd w:val="clear" w:color="auto" w:fill="FFFFFF"/>
-          </w:tcPr>
-          <w:p>
-            <w:r>
-              <w:rPr>
-                <w:sz w:val="18"/>
-              </w:rPr>
-              <w:t>Avg Kill Dist In Vehicle (m)</w:t>
-            </w:r>
-          </w:p>
-        </w:tc>
-        <w:tc>
-          <w:tcPr>
-            <w:tcW w:type="dxa" w:w="3135"/>
-            <w:shd w:val="clear" w:color="auto" w:fill="FFFFFF"/>
-          </w:tcPr>
-          <w:p>
-            <w:r>
-              <w:rPr>
-                <w:sz w:val="18"/>
-              </w:rPr>
-              <w:t>Average kill distance (vehicle)</w:t>
+          </w:tcPr>
+          <w:p>
+            <w:r/>
+            <w:r>
+              <w:rPr>
+                <w:b w:val="0"/>
+              </w:rPr>
+              <w:t>Shots/Kill (In Vehicle)</w:t>
+            </w:r>
+          </w:p>
+        </w:tc>
+        <w:tc>
+          <w:tcPr>
+            <w:tcW w:type="dxa" w:w="3135"/>
+          </w:tcPr>
+          <w:p>
+            <w:r/>
+            <w:r>
+              <w:rPr>
+                <w:b w:val="0"/>
+              </w:rPr>
+              <w:t>Ignored — recomputed</w:t>
             </w:r>
           </w:p>
         </w:tc>
@@ -2802,12 +3118,12 @@
         <w:tc>
           <w:tcPr>
             <w:tcW w:type="dxa" w:w="3135"/>
-            <w:shd w:val="clear" w:color="auto" w:fill="F0F4FA"/>
-          </w:tcPr>
-          <w:p>
-            <w:r>
-              <w:rPr>
-                <w:sz w:val="18"/>
+          </w:tcPr>
+          <w:p>
+            <w:r/>
+            <w:r>
+              <w:rPr>
+                <w:b w:val="0"/>
               </w:rPr>
               <w:t>25</w:t>
             </w:r>
@@ -2816,28 +3132,28 @@
         <w:tc>
           <w:tcPr>
             <w:tcW w:type="dxa" w:w="3135"/>
-            <w:shd w:val="clear" w:color="auto" w:fill="F0F4FA"/>
-          </w:tcPr>
-          <w:p>
-            <w:r>
-              <w:rPr>
-                <w:sz w:val="18"/>
-              </w:rPr>
-              <w:t>Longest Kill In Vehicle (m)</w:t>
-            </w:r>
-          </w:p>
-        </w:tc>
-        <w:tc>
-          <w:tcPr>
-            <w:tcW w:type="dxa" w:w="3135"/>
-            <w:shd w:val="clear" w:color="auto" w:fill="F0F4FA"/>
-          </w:tcPr>
-          <w:p>
-            <w:r>
-              <w:rPr>
-                <w:sz w:val="18"/>
-              </w:rPr>
-              <w:t>Longest single kill distance (vehicle)</w:t>
+          </w:tcPr>
+          <w:p>
+            <w:r/>
+            <w:r>
+              <w:rPr>
+                <w:b w:val="0"/>
+              </w:rPr>
+              <w:t>Avg Kill Dist In Vehicle (m)</w:t>
+            </w:r>
+          </w:p>
+        </w:tc>
+        <w:tc>
+          <w:tcPr>
+            <w:tcW w:type="dxa" w:w="3135"/>
+          </w:tcPr>
+          <w:p>
+            <w:r/>
+            <w:r>
+              <w:rPr>
+                <w:b w:val="0"/>
+              </w:rPr>
+              <w:t>Average kill distance (vehicle)</w:t>
             </w:r>
           </w:p>
         </w:tc>
@@ -2846,12 +3162,12 @@
         <w:tc>
           <w:tcPr>
             <w:tcW w:type="dxa" w:w="3135"/>
-            <w:shd w:val="clear" w:color="auto" w:fill="FFFFFF"/>
-          </w:tcPr>
-          <w:p>
-            <w:r>
-              <w:rPr>
-                <w:sz w:val="18"/>
+          </w:tcPr>
+          <w:p>
+            <w:r/>
+            <w:r>
+              <w:rPr>
+                <w:b w:val="0"/>
               </w:rPr>
               <w:t>26</w:t>
             </w:r>
@@ -2860,28 +3176,28 @@
         <w:tc>
           <w:tcPr>
             <w:tcW w:type="dxa" w:w="3135"/>
-            <w:shd w:val="clear" w:color="auto" w:fill="FFFFFF"/>
-          </w:tcPr>
-          <w:p>
-            <w:r>
-              <w:rPr>
-                <w:sz w:val="18"/>
-              </w:rPr>
-              <w:t>Weapon Kills (JSON)</w:t>
-            </w:r>
-          </w:p>
-        </w:tc>
-        <w:tc>
-          <w:tcPr>
-            <w:tcW w:type="dxa" w:w="3135"/>
-            <w:shd w:val="clear" w:color="auto" w:fill="FFFFFF"/>
-          </w:tcPr>
-          <w:p>
-            <w:r>
-              <w:rPr>
-                <w:sz w:val="18"/>
-              </w:rPr>
-              <w:t>JSON object: {"WeaponName": killCount, ...}</w:t>
+          </w:tcPr>
+          <w:p>
+            <w:r/>
+            <w:r>
+              <w:rPr>
+                <w:b w:val="0"/>
+              </w:rPr>
+              <w:t>Longest Kill In Vehicle (m)</w:t>
+            </w:r>
+          </w:p>
+        </w:tc>
+        <w:tc>
+          <w:tcPr>
+            <w:tcW w:type="dxa" w:w="3135"/>
+          </w:tcPr>
+          <w:p>
+            <w:r/>
+            <w:r>
+              <w:rPr>
+                <w:b w:val="0"/>
+              </w:rPr>
+              <w:t>Longest single kill distance (vehicle)</w:t>
             </w:r>
           </w:p>
         </w:tc>
@@ -2890,12 +3206,12 @@
         <w:tc>
           <w:tcPr>
             <w:tcW w:type="dxa" w:w="3135"/>
-            <w:shd w:val="clear" w:color="auto" w:fill="F0F4FA"/>
-          </w:tcPr>
-          <w:p>
-            <w:r>
-              <w:rPr>
-                <w:sz w:val="18"/>
+          </w:tcPr>
+          <w:p>
+            <w:r/>
+            <w:r>
+              <w:rPr>
+                <w:b w:val="0"/>
               </w:rPr>
               <w:t>27</w:t>
             </w:r>
@@ -2904,12 +3220,12 @@
         <w:tc>
           <w:tcPr>
             <w:tcW w:type="dxa" w:w="3135"/>
-            <w:shd w:val="clear" w:color="auto" w:fill="F0F4FA"/>
-          </w:tcPr>
-          <w:p>
-            <w:r>
-              <w:rPr>
-                <w:sz w:val="18"/>
+          </w:tcPr>
+          <w:p>
+            <w:r/>
+            <w:r>
+              <w:rPr>
+                <w:b w:val="0"/>
               </w:rPr>
               <w:t>Top Weapon</w:t>
             </w:r>
@@ -2918,14 +3234,146 @@
         <w:tc>
           <w:tcPr>
             <w:tcW w:type="dxa" w:w="3135"/>
-            <w:shd w:val="clear" w:color="auto" w:fill="F0F4FA"/>
-          </w:tcPr>
-          <w:p>
-            <w:r>
-              <w:rPr>
-                <w:sz w:val="18"/>
-              </w:rPr>
-              <w:t>Weapon used for longest kill (used in award card)</w:t>
+          </w:tcPr>
+          <w:p>
+            <w:r/>
+            <w:r>
+              <w:rPr>
+                <w:b w:val="0"/>
+              </w:rPr>
+              <w:t>Weapon with the most on-foot kills for this player in this mission</w:t>
+            </w:r>
+          </w:p>
+        </w:tc>
+      </w:tr>
+      <w:tr>
+        <w:tc>
+          <w:tcPr>
+            <w:tcW w:type="dxa" w:w="3135"/>
+          </w:tcPr>
+          <w:p>
+            <w:r/>
+            <w:r>
+              <w:rPr>
+                <w:b w:val="0"/>
+              </w:rPr>
+              <w:t>28</w:t>
+            </w:r>
+          </w:p>
+        </w:tc>
+        <w:tc>
+          <w:tcPr>
+            <w:tcW w:type="dxa" w:w="3135"/>
+          </w:tcPr>
+          <w:p>
+            <w:r/>
+            <w:r>
+              <w:rPr>
+                <w:b w:val="0"/>
+              </w:rPr>
+              <w:t>Weapon Kills (JSON)</w:t>
+            </w:r>
+          </w:p>
+        </w:tc>
+        <w:tc>
+          <w:tcPr>
+            <w:tcW w:type="dxa" w:w="3135"/>
+          </w:tcPr>
+          <w:p>
+            <w:r/>
+            <w:r>
+              <w:rPr>
+                <w:b w:val="0"/>
+              </w:rPr>
+              <w:t>JSON object: {"WeaponName": killCount, ...}</w:t>
+            </w:r>
+          </w:p>
+        </w:tc>
+      </w:tr>
+      <w:tr>
+        <w:tc>
+          <w:tcPr>
+            <w:tcW w:type="dxa" w:w="3135"/>
+          </w:tcPr>
+          <w:p>
+            <w:r/>
+            <w:r>
+              <w:rPr>
+                <w:b w:val="0"/>
+              </w:rPr>
+              <w:t>29</w:t>
+            </w:r>
+          </w:p>
+        </w:tc>
+        <w:tc>
+          <w:tcPr>
+            <w:tcW w:type="dxa" w:w="3135"/>
+          </w:tcPr>
+          <w:p>
+            <w:r/>
+            <w:r>
+              <w:rPr>
+                <w:b w:val="0"/>
+              </w:rPr>
+              <w:t>Suicides</w:t>
+            </w:r>
+          </w:p>
+        </w:tc>
+        <w:tc>
+          <w:tcPr>
+            <w:tcW w:type="dxa" w:w="3135"/>
+          </w:tcPr>
+          <w:p>
+            <w:r/>
+            <w:r>
+              <w:rPr>
+                <w:b w:val="0"/>
+              </w:rPr>
+              <w:t>Self-kills recorded by OCAP</w:t>
+            </w:r>
+          </w:p>
+        </w:tc>
+      </w:tr>
+      <w:tr>
+        <w:tc>
+          <w:tcPr>
+            <w:tcW w:type="dxa" w:w="3135"/>
+          </w:tcPr>
+          <w:p>
+            <w:r/>
+            <w:r>
+              <w:rPr>
+                <w:b w:val="0"/>
+              </w:rPr>
+              <w:t>30</w:t>
+            </w:r>
+          </w:p>
+        </w:tc>
+        <w:tc>
+          <w:tcPr>
+            <w:tcW w:type="dxa" w:w="3135"/>
+          </w:tcPr>
+          <w:p>
+            <w:r/>
+            <w:r>
+              <w:rPr>
+                <w:b w:val="0"/>
+              </w:rPr>
+              <w:t>Time Played (s)</w:t>
+            </w:r>
+          </w:p>
+        </w:tc>
+        <w:tc>
+          <w:tcPr>
+            <w:tcW w:type="dxa" w:w="3135"/>
+          </w:tcPr>
+          <w:p>
+            <w:r/>
+            <w:r>
+              <w:rPr>
+                <w:b w:val="0"/>
+              </w:rPr>
+              <w:t>Seconds the player was present in the mission (position frames × captureDelay)</w:t>
             </w:r>
           </w:p>
         </w:tc>
@@ -3795,6 +4243,18 @@
     <w:p>
       <w:pPr>
         <w:pStyle w:val="NoSpacing"/>
+      </w:pPr>
+      <w:r>
+        <w:rPr>
+          <w:rFonts w:ascii="Courier New" w:hAnsi="Courier New"/>
+          <w:sz w:val="18"/>
+        </w:rPr>
+        <w:t xml:space="preserve">  timePlayed:     number,       // seconds present in mission (sum across missions in career view)</w:t>
+      </w:r>
+    </w:p>
+    <w:p>
+      <w:pPr>
+        <w:pStyle w:val="NoSpacing"/>
         <w:spacing w:before="40" w:after="40"/>
         <w:ind w:left="576"/>
         <w:shd w:val="clear" w:color="auto" w:fill="F3F3F3"/>
@@ -5639,6 +6099,366 @@
                 <w:sz w:val="18"/>
               </w:rPr>
               <w:t>Name · K/D · kills/deaths</w:t>
+            </w:r>
+          </w:p>
+        </w:tc>
+      </w:tr>
+      <w:tr>
+        <w:tc>
+          <w:tcPr>
+            <w:tcW w:type="dxa" w:w="1881"/>
+          </w:tcPr>
+          <w:p>
+            <w:r/>
+            <w:r>
+              <w:rPr>
+                <w:b w:val="0"/>
+              </w:rPr>
+              <w:t>Best K/D Ratio</w:t>
+            </w:r>
+          </w:p>
+        </w:tc>
+        <w:tc>
+          <w:tcPr>
+            <w:tcW w:type="dxa" w:w="1881"/>
+          </w:tcPr>
+          <w:p>
+            <w:r/>
+            <w:r>
+              <w:rPr>
+                <w:b w:val="0"/>
+              </w:rPr>
+              <w:t>🏆</w:t>
+            </w:r>
+          </w:p>
+        </w:tc>
+        <w:tc>
+          <w:tcPr>
+            <w:tcW w:type="dxa" w:w="1881"/>
+          </w:tcPr>
+          <w:p>
+            <w:r/>
+            <w:r>
+              <w:rPr>
+                <w:b w:val="0"/>
+              </w:rPr>
+              <w:t>Highest kdFoot</w:t>
+            </w:r>
+          </w:p>
+        </w:tc>
+        <w:tc>
+          <w:tcPr>
+            <w:tcW w:type="dxa" w:w="1881"/>
+          </w:tcPr>
+          <w:p>
+            <w:r/>
+            <w:r>
+              <w:rPr>
+                <w:b w:val="0"/>
+              </w:rPr>
+              <w:t>Min 3 kills on foot</w:t>
+            </w:r>
+          </w:p>
+        </w:tc>
+        <w:tc>
+          <w:tcPr>
+            <w:tcW w:type="dxa" w:w="1881"/>
+          </w:tcPr>
+          <w:p>
+            <w:r/>
+            <w:r>
+              <w:rPr>
+                <w:b w:val="0"/>
+              </w:rPr>
+              <w:t>Name · K/D · kills/deaths</w:t>
+            </w:r>
+          </w:p>
+        </w:tc>
+      </w:tr>
+      <w:tr>
+        <w:tc>
+          <w:tcPr>
+            <w:tcW w:type="dxa" w:w="1881"/>
+          </w:tcPr>
+          <w:p>
+            <w:r/>
+            <w:r>
+              <w:rPr>
+                <w:b w:val="0"/>
+              </w:rPr>
+              <w:t>Always On Duty</w:t>
+            </w:r>
+          </w:p>
+        </w:tc>
+        <w:tc>
+          <w:tcPr>
+            <w:tcW w:type="dxa" w:w="1881"/>
+          </w:tcPr>
+          <w:p>
+            <w:r/>
+            <w:r>
+              <w:rPr>
+                <w:b w:val="0"/>
+              </w:rPr>
+              <w:t>⏱️</w:t>
+            </w:r>
+          </w:p>
+        </w:tc>
+        <w:tc>
+          <w:tcPr>
+            <w:tcW w:type="dxa" w:w="1881"/>
+          </w:tcPr>
+          <w:p>
+            <w:r/>
+            <w:r>
+              <w:rPr>
+                <w:b w:val="0"/>
+              </w:rPr>
+              <w:t>Highest total timePlayed</w:t>
+            </w:r>
+          </w:p>
+        </w:tc>
+        <w:tc>
+          <w:tcPr>
+            <w:tcW w:type="dxa" w:w="1881"/>
+          </w:tcPr>
+          <w:p>
+            <w:r/>
+            <w:r>
+              <w:rPr>
+                <w:b w:val="0"/>
+              </w:rPr>
+              <w:t>timePlayed &gt; 0</w:t>
+            </w:r>
+          </w:p>
+        </w:tc>
+        <w:tc>
+          <w:tcPr>
+            <w:tcW w:type="dxa" w:w="1881"/>
+          </w:tcPr>
+          <w:p>
+            <w:r/>
+            <w:r>
+              <w:rPr>
+                <w:b w:val="0"/>
+              </w:rPr>
+              <w:t>Name · total hours played · mission count</w:t>
+            </w:r>
+          </w:p>
+        </w:tc>
+      </w:tr>
+      <w:tr>
+        <w:tc>
+          <w:tcPr>
+            <w:tcW w:type="dxa" w:w="1881"/>
+          </w:tcPr>
+          <w:p>
+            <w:r/>
+            <w:r>
+              <w:rPr>
+                <w:b w:val="0"/>
+              </w:rPr>
+              <w:t>Spray &amp; Pray</w:t>
+            </w:r>
+          </w:p>
+        </w:tc>
+        <w:tc>
+          <w:tcPr>
+            <w:tcW w:type="dxa" w:w="1881"/>
+          </w:tcPr>
+          <w:p>
+            <w:r/>
+            <w:r>
+              <w:rPr>
+                <w:b w:val="0"/>
+              </w:rPr>
+              <w:t>💩</w:t>
+            </w:r>
+          </w:p>
+        </w:tc>
+        <w:tc>
+          <w:tcPr>
+            <w:tcW w:type="dxa" w:w="1881"/>
+          </w:tcPr>
+          <w:p>
+            <w:r/>
+            <w:r>
+              <w:rPr>
+                <w:b w:val="0"/>
+              </w:rPr>
+              <w:t>Highest spkFoot (shots/kill)</w:t>
+            </w:r>
+          </w:p>
+        </w:tc>
+        <w:tc>
+          <w:tcPr>
+            <w:tcW w:type="dxa" w:w="1881"/>
+          </w:tcPr>
+          <w:p>
+            <w:r/>
+            <w:r>
+              <w:rPr>
+                <w:b w:val="0"/>
+              </w:rPr>
+              <w:t>Min 3 kills, spkFoot &gt; 1</w:t>
+            </w:r>
+          </w:p>
+        </w:tc>
+        <w:tc>
+          <w:tcPr>
+            <w:tcW w:type="dxa" w:w="1881"/>
+          </w:tcPr>
+          <w:p>
+            <w:r/>
+            <w:r>
+              <w:rPr>
+                <w:b w:val="0"/>
+              </w:rPr>
+              <w:t>Name · SPK · kill count (Hall of Shame)</w:t>
+            </w:r>
+          </w:p>
+        </w:tc>
+      </w:tr>
+      <w:tr>
+        <w:tc>
+          <w:tcPr>
+            <w:tcW w:type="dxa" w:w="1881"/>
+          </w:tcPr>
+          <w:p>
+            <w:r/>
+            <w:r>
+              <w:rPr>
+                <w:b w:val="0"/>
+              </w:rPr>
+              <w:t>Most Teamkills</w:t>
+            </w:r>
+          </w:p>
+        </w:tc>
+        <w:tc>
+          <w:tcPr>
+            <w:tcW w:type="dxa" w:w="1881"/>
+          </w:tcPr>
+          <w:p>
+            <w:r/>
+            <w:r>
+              <w:rPr>
+                <w:b w:val="0"/>
+              </w:rPr>
+              <w:t>🤡</w:t>
+            </w:r>
+          </w:p>
+        </w:tc>
+        <w:tc>
+          <w:tcPr>
+            <w:tcW w:type="dxa" w:w="1881"/>
+          </w:tcPr>
+          <w:p>
+            <w:r/>
+            <w:r>
+              <w:rPr>
+                <w:b w:val="0"/>
+              </w:rPr>
+              <w:t>Highest tkOnFoot + tkInVeh</w:t>
+            </w:r>
+          </w:p>
+        </w:tc>
+        <w:tc>
+          <w:tcPr>
+            <w:tcW w:type="dxa" w:w="1881"/>
+          </w:tcPr>
+          <w:p>
+            <w:r/>
+            <w:r>
+              <w:rPr>
+                <w:b w:val="0"/>
+              </w:rPr>
+              <w:t>tkOnFoot + tkInVeh &gt; 0</w:t>
+            </w:r>
+          </w:p>
+        </w:tc>
+        <w:tc>
+          <w:tcPr>
+            <w:tcW w:type="dxa" w:w="1881"/>
+          </w:tcPr>
+          <w:p>
+            <w:r/>
+            <w:r>
+              <w:rPr>
+                <w:b w:val="0"/>
+              </w:rPr>
+              <w:t>Name · teamkill count (Hall of Shame)</w:t>
+            </w:r>
+          </w:p>
+        </w:tc>
+      </w:tr>
+      <w:tr>
+        <w:tc>
+          <w:tcPr>
+            <w:tcW w:type="dxa" w:w="1881"/>
+          </w:tcPr>
+          <w:p>
+            <w:r/>
+            <w:r>
+              <w:rPr>
+                <w:b w:val="0"/>
+              </w:rPr>
+              <w:t>Most Hits Taken</w:t>
+            </w:r>
+          </w:p>
+        </w:tc>
+        <w:tc>
+          <w:tcPr>
+            <w:tcW w:type="dxa" w:w="1881"/>
+          </w:tcPr>
+          <w:p>
+            <w:r/>
+            <w:r>
+              <w:rPr>
+                <w:b w:val="0"/>
+              </w:rPr>
+              <w:t>🎯</w:t>
+            </w:r>
+          </w:p>
+        </w:tc>
+        <w:tc>
+          <w:tcPr>
+            <w:tcW w:type="dxa" w:w="1881"/>
+          </w:tcPr>
+          <w:p>
+            <w:r/>
+            <w:r>
+              <w:rPr>
+                <w:b w:val="0"/>
+              </w:rPr>
+              <w:t>Highest hitsOnFoot</w:t>
+            </w:r>
+          </w:p>
+        </w:tc>
+        <w:tc>
+          <w:tcPr>
+            <w:tcW w:type="dxa" w:w="1881"/>
+          </w:tcPr>
+          <w:p>
+            <w:r/>
+            <w:r>
+              <w:rPr>
+                <w:b w:val="0"/>
+              </w:rPr>
+              <w:t>hitsOnFoot &gt; 0</w:t>
+            </w:r>
+          </w:p>
+        </w:tc>
+        <w:tc>
+          <w:tcPr>
+            <w:tcW w:type="dxa" w:w="1881"/>
+          </w:tcPr>
+          <w:p>
+            <w:r/>
+            <w:r>
+              <w:rPr>
+                <w:b w:val="0"/>
+              </w:rPr>
+              <w:t>Name · hits taken · mission count (Hall of Shame)</w:t>
             </w:r>
           </w:p>
         </w:tc>
@@ -13103,6 +13923,632 @@
     <w:p>
       <w:r>
         <w:br w:type="page"/>
+      </w:r>
+    </w:p>
+    <w:p>
+      <w:pPr>
+        <w:pStyle w:val="Heading1"/>
+      </w:pPr>
+      <w:r>
+        <w:t>13. Unit Classification</w:t>
+      </w:r>
+    </w:p>
+    <w:p>
+      <w:pPr/>
+      <w:r>
+        <w:t>Players are automatically assigned to one of four units — 2nd USC, CNTO, PXG, or TFP — based on who they play alongside most frequently. The classification runs once after buildAggregates() and populates the playerUnits{} map.</w:t>
+      </w:r>
+    </w:p>
+    <w:p>
+      <w:pPr>
+        <w:pStyle w:val="Heading2"/>
+      </w:pPr>
+      <w:r>
+        <w:t>13.1 Algorithm Overview</w:t>
+      </w:r>
+    </w:p>
+    <w:p>
+      <w:pPr/>
+      <w:r>
+        <w:t>The classifier uses squad co-occurrence: for each mission row, every player is compared against every other player in the same mission. If the other player is already confidently assigned to a known unit, their unit gains a weight increment for the subject player. A player is classified to the unit with the highest accumulated weight, but only if that weight represents ≥ 99% of all weight (UNIT_THRESHOLD = 0.99). Players who guest in foreign squads are left unclassified (null) because their dominant signal does not clear the threshold.</w:t>
+      </w:r>
+    </w:p>
+    <w:p>
+      <w:pPr>
+        <w:pStyle w:val="Heading2"/>
+      </w:pPr>
+      <w:r>
+        <w:t>13.2 Seed Players</w:t>
+      </w:r>
+    </w:p>
+    <w:p>
+      <w:pPr/>
+      <w:r>
+        <w:t>Classification is bootstrapped from a small set of "seed" players whose unit is known with certainty. These are hard-coded in tracker.js and are never overridden by unit_overrides.json.</w:t>
+      </w:r>
+    </w:p>
+    <w:p>
+      <w:pPr>
+        <w:pStyle w:val="Heading2"/>
+      </w:pPr>
+      <w:r>
+        <w:t>13.3 unit_overrides.json</w:t>
+      </w:r>
+    </w:p>
+    <w:p>
+      <w:pPr/>
+      <w:r>
+        <w:t>Loaded at startup via fetch(). Keys are player names (case-sensitive); values are the target unit string. Overrides are applied after auto-classification and take precedence over both seeds and the algorithm. This allows correcting edge cases (e.g. a player who permanently transferred units).</w:t>
+      </w:r>
+    </w:p>
+    <w:p>
+      <w:pPr>
+        <w:pStyle w:val="NoSpacing"/>
+      </w:pPr>
+      <w:r>
+        <w:rPr>
+          <w:rFonts w:ascii="Courier New" w:hAnsi="Courier New"/>
+          <w:sz w:val="18"/>
+        </w:rPr>
+        <w:t>// unit_overrides.json format</w:t>
+      </w:r>
+    </w:p>
+    <w:p>
+      <w:pPr>
+        <w:pStyle w:val="NoSpacing"/>
+      </w:pPr>
+      <w:r>
+        <w:rPr>
+          <w:rFonts w:ascii="Courier New" w:hAnsi="Courier New"/>
+          <w:sz w:val="18"/>
+        </w:rPr>
+        <w:t>{</w:t>
+      </w:r>
+    </w:p>
+    <w:p>
+      <w:pPr>
+        <w:pStyle w:val="NoSpacing"/>
+      </w:pPr>
+      <w:r>
+        <w:rPr>
+          <w:rFonts w:ascii="Courier New" w:hAnsi="Courier New"/>
+          <w:sz w:val="18"/>
+        </w:rPr>
+        <w:t xml:space="preserve">  "PlayerName": "2nd USC",</w:t>
+      </w:r>
+    </w:p>
+    <w:p>
+      <w:pPr>
+        <w:pStyle w:val="NoSpacing"/>
+      </w:pPr>
+      <w:r>
+        <w:rPr>
+          <w:rFonts w:ascii="Courier New" w:hAnsi="Courier New"/>
+          <w:sz w:val="18"/>
+        </w:rPr>
+        <w:t xml:space="preserve">  "AnotherPlayer": "CNTO"</w:t>
+      </w:r>
+    </w:p>
+    <w:p>
+      <w:pPr>
+        <w:pStyle w:val="NoSpacing"/>
+      </w:pPr>
+      <w:r>
+        <w:rPr>
+          <w:rFonts w:ascii="Courier New" w:hAnsi="Courier New"/>
+          <w:sz w:val="18"/>
+        </w:rPr>
+        <w:t>}</w:t>
+      </w:r>
+    </w:p>
+    <w:p>
+      <w:pPr>
+        <w:pStyle w:val="Heading2"/>
+      </w:pPr>
+      <w:r>
+        <w:t>13.4 Unit Filter</w:t>
+      </w:r>
+    </w:p>
+    <w:p>
+      <w:pPr/>
+      <w:r>
+        <w:t>A row of unit filter pills (2nd USC / CNTO / PXG / TFP) sits above the player pill list. Selecting a unit pill sets selectedUnit and calls filterChanged(). applyFilters() then restricts the player list to members of that unit. The pill uses the same colour scheme as player pills. Deselecting resets selectedUnit to null (show all).</w:t>
+      </w:r>
+    </w:p>
+    <w:p>
+      <w:pPr>
+        <w:pStyle w:val="Heading2"/>
+      </w:pPr>
+      <w:r>
+        <w:t>13.5 Adding a New Unit</w:t>
+      </w:r>
+    </w:p>
+    <w:p>
+      <w:pPr>
+        <w:pStyle w:val="ListNumber"/>
+      </w:pPr>
+      <w:r>
+        <w:t>Add at least two seed player names for the new unit in the UNIT_SEEDS constant in tracker.js.</w:t>
+      </w:r>
+    </w:p>
+    <w:p>
+      <w:pPr>
+        <w:pStyle w:val="ListNumber"/>
+      </w:pPr>
+      <w:r>
+        <w:t>Add the unit label to the UNITS array in tracker.js.</w:t>
+      </w:r>
+    </w:p>
+    <w:p>
+      <w:pPr>
+        <w:pStyle w:val="ListNumber"/>
+      </w:pPr>
+      <w:r>
+        <w:t>Add a unit pill button in the #unitFilter div in index.html.</w:t>
+      </w:r>
+    </w:p>
+    <w:p>
+      <w:pPr>
+        <w:pStyle w:val="ListNumber"/>
+      </w:pPr>
+      <w:r>
+        <w:t>Add the unit's CSS colour class in the &lt;style&gt; block of index.html (mirrors the player pill colour system).</w:t>
+      </w:r>
+    </w:p>
+    <w:p>
+      <w:pPr>
+        <w:pStyle w:val="Heading1"/>
+      </w:pPr>
+      <w:r>
+        <w:t>14. ImportScript (Google Apps Script)</w:t>
+      </w:r>
+    </w:p>
+    <w:p>
+      <w:pPr/>
+      <w:r>
+        <w:t>ImportScript is a Google Apps Script (GAS) file that reads OCAP .json.gz replay files from Google Drive and writes normalised player statistics into a Google Sheet. The web application then publishes that sheet as a CSV and the tracker reads it.</w:t>
+      </w:r>
+    </w:p>
+    <w:p>
+      <w:pPr>
+        <w:pStyle w:val="Heading2"/>
+      </w:pPr>
+      <w:r>
+        <w:t>14.1 Prerequisites</w:t>
+      </w:r>
+    </w:p>
+    <w:p>
+      <w:pPr>
+        <w:pStyle w:val="ListBullet"/>
+      </w:pPr>
+      <w:r>
+        <w:t>A Google Drive folder named Kill Tracker containing two sub-folders: OCAP_Logs (drop zone) and OCAP_Logs_Archive (processed files moved here automatically).</w:t>
+      </w:r>
+    </w:p>
+    <w:p>
+      <w:pPr>
+        <w:pStyle w:val="ListBullet"/>
+      </w:pPr>
+      <w:r>
+        <w:t>A Google Sheet linked to the Apps Script project. The script uses SpreadsheetApp.getActiveSpreadsheet().</w:t>
+      </w:r>
+    </w:p>
+    <w:p>
+      <w:pPr>
+        <w:pStyle w:val="ListBullet"/>
+      </w:pPr>
+      <w:r>
+        <w:t>OCAP recording files in .json.gz format, named with the pattern YYYY_MM_DD__MissionName.json.gz.</w:t>
+      </w:r>
+    </w:p>
+    <w:p>
+      <w:pPr>
+        <w:pStyle w:val="Heading2"/>
+      </w:pPr>
+      <w:r>
+        <w:t>14.2 Entry Points</w:t>
+      </w:r>
+    </w:p>
+    <w:tbl>
+      <w:tblPr>
+        <w:tblStyle w:val="TableGrid"/>
+        <w:tblW w:type="auto" w:w="0"/>
+        <w:tblLook w:firstColumn="1" w:firstRow="1" w:lastColumn="0" w:lastRow="0" w:noHBand="0" w:noVBand="1" w:val="04A0"/>
+      </w:tblPr>
+      <w:tblGrid>
+        <w:gridCol w:w="3135"/>
+        <w:gridCol w:w="3135"/>
+        <w:gridCol w:w="3135"/>
+      </w:tblGrid>
+      <w:tr>
+        <w:tc>
+          <w:tcPr>
+            <w:tcW w:type="dxa" w:w="3135"/>
+          </w:tcPr>
+          <w:p>
+            <w:r/>
+            <w:r>
+              <w:rPr>
+                <w:b/>
+              </w:rPr>
+              <w:t>Function</w:t>
+            </w:r>
+          </w:p>
+        </w:tc>
+        <w:tc>
+          <w:tcPr>
+            <w:tcW w:type="dxa" w:w="3135"/>
+          </w:tcPr>
+          <w:p>
+            <w:r/>
+            <w:r>
+              <w:rPr>
+                <w:b/>
+              </w:rPr>
+              <w:t>Usage</w:t>
+            </w:r>
+          </w:p>
+        </w:tc>
+        <w:tc>
+          <w:tcPr>
+            <w:tcW w:type="dxa" w:w="3135"/>
+          </w:tcPr>
+          <w:p>
+            <w:r/>
+            <w:r>
+              <w:rPr>
+                <w:b/>
+              </w:rPr>
+              <w:t>Description</w:t>
+            </w:r>
+          </w:p>
+        </w:tc>
+      </w:tr>
+      <w:tr>
+        <w:tc>
+          <w:tcPr>
+            <w:tcW w:type="dxa" w:w="3135"/>
+          </w:tcPr>
+          <w:p>
+            <w:r/>
+            <w:r>
+              <w:rPr>
+                <w:b w:val="0"/>
+              </w:rPr>
+              <w:t>importOCAP()</w:t>
+            </w:r>
+          </w:p>
+        </w:tc>
+        <w:tc>
+          <w:tcPr>
+            <w:tcW w:type="dxa" w:w="3135"/>
+          </w:tcPr>
+          <w:p>
+            <w:r/>
+            <w:r>
+              <w:rPr>
+                <w:b w:val="0"/>
+              </w:rPr>
+              <w:t>Run manually or via trigger</w:t>
+            </w:r>
+          </w:p>
+        </w:tc>
+        <w:tc>
+          <w:tcPr>
+            <w:tcW w:type="dxa" w:w="3135"/>
+          </w:tcPr>
+          <w:p>
+            <w:r/>
+            <w:r>
+              <w:rPr>
+                <w:b w:val="0"/>
+              </w:rPr>
+              <w:t>Imports the next unprocessed .json.gz file from OCAP_Logs. Skips files already present in the sheet (by Source File column). Archives the file to OCAP_Logs_Archive after successful import.</w:t>
+            </w:r>
+          </w:p>
+        </w:tc>
+      </w:tr>
+      <w:tr>
+        <w:tc>
+          <w:tcPr>
+            <w:tcW w:type="dxa" w:w="3135"/>
+          </w:tcPr>
+          <w:p>
+            <w:r/>
+            <w:r>
+              <w:rPr>
+                <w:b w:val="0"/>
+              </w:rPr>
+              <w:t>reimportOCAP()</w:t>
+            </w:r>
+          </w:p>
+        </w:tc>
+        <w:tc>
+          <w:tcPr>
+            <w:tcW w:type="dxa" w:w="3135"/>
+          </w:tcPr>
+          <w:p>
+            <w:r/>
+            <w:r>
+              <w:rPr>
+                <w:b w:val="0"/>
+              </w:rPr>
+              <w:t>Run manually to re-process a file</w:t>
+            </w:r>
+          </w:p>
+        </w:tc>
+        <w:tc>
+          <w:tcPr>
+            <w:tcW w:type="dxa" w:w="3135"/>
+          </w:tcPr>
+          <w:p>
+            <w:r/>
+            <w:r>
+              <w:rPr>
+                <w:b w:val="0"/>
+              </w:rPr>
+              <w:t>Calls importOCAP(true). Deletes all existing rows for the file from the sheet first, then re-imports. Use this after correcting a raw file or fixing a bug in the parser.</w:t>
+            </w:r>
+          </w:p>
+        </w:tc>
+      </w:tr>
+    </w:tbl>
+    <w:p>
+      <w:pPr>
+        <w:pStyle w:val="Heading2"/>
+      </w:pPr>
+      <w:r>
+        <w:t>14.3 Import Pipeline</w:t>
+      </w:r>
+    </w:p>
+    <w:p>
+      <w:pPr/>
+      <w:r>
+        <w:t>Each call to importOCAP() processes exactly one file (the first file found in OCAP_Logs). The pipeline per file is:</w:t>
+      </w:r>
+    </w:p>
+    <w:p>
+      <w:pPr>
+        <w:pStyle w:val="ListNumber"/>
+      </w:pPr>
+      <w:r>
+        <w:t>Locate OCAP_Logs and OCAP_Logs_Archive folders inside the Kill Tracker Drive folder.</w:t>
+      </w:r>
+    </w:p>
+    <w:p>
+      <w:pPr>
+        <w:pStyle w:val="ListNumber"/>
+      </w:pPr>
+      <w:r>
+        <w:t>Build a Set of already-imported filenames from column A of the player_stats sheet.</w:t>
+      </w:r>
+    </w:p>
+    <w:p>
+      <w:pPr>
+        <w:pStyle w:val="ListNumber"/>
+      </w:pPr>
+      <w:r>
+        <w:t>Fetch the first .json.gz file. Skip if already imported (unless forceReimport = true).</w:t>
+      </w:r>
+    </w:p>
+    <w:p>
+      <w:pPr>
+        <w:pStyle w:val="ListNumber"/>
+      </w:pPr>
+      <w:r>
+        <w:t>Decompress the gzip blob using Utilities.ungzip() and parse the JSON.</w:t>
+      </w:r>
+    </w:p>
+    <w:p>
+      <w:pPr>
+        <w:pStyle w:val="ListNumber"/>
+      </w:pPr>
+      <w:r>
+        <w:t>Build an entity lookup map from data.entities.</w:t>
+      </w:r>
+    </w:p>
+    <w:p>
+      <w:pPr>
+        <w:pStyle w:val="ListNumber"/>
+      </w:pPr>
+      <w:r>
+        <w:t>Build per-player stat accumulators (one entry per isPlayer === 1 entity).</w:t>
+      </w:r>
+    </w:p>
+    <w:p>
+      <w:pPr>
+        <w:pStyle w:val="ListNumber"/>
+      </w:pPr>
+      <w:r>
+        <w:t>Pre-compute shots on-foot vs in-vehicle by replaying the framesFired array and calling isInVehicleAtFrame() for each shot.</w:t>
+      </w:r>
+    </w:p>
+    <w:p>
+      <w:pPr>
+        <w:pStyle w:val="ListNumber"/>
+      </w:pPr>
+      <w:r>
+        <w:t>Process data.events: killed events increment kills/deaths/teamkills/vehicle kills; hit events increment hits taken. Context (on-foot vs in-vehicle) is determined per-frame.</w:t>
+      </w:r>
+    </w:p>
+    <w:p>
+      <w:pPr>
+        <w:pStyle w:val="ListNumber"/>
+      </w:pPr>
+      <w:r>
+        <w:t>Derive K/D, shots/kill, average distance, longest kill, top weapon per player.</w:t>
+      </w:r>
+    </w:p>
+    <w:p>
+      <w:pPr>
+        <w:pStyle w:val="ListNumber"/>
+      </w:pPr>
+      <w:r>
+        <w:t>Write all rows to player_stats in one batch setValues() call.</w:t>
+      </w:r>
+    </w:p>
+    <w:p>
+      <w:pPr>
+        <w:pStyle w:val="ListNumber"/>
+      </w:pPr>
+      <w:r>
+        <w:t>Move the file to OCAP_Logs_Archive.</w:t>
+      </w:r>
+    </w:p>
+    <w:p>
+      <w:pPr>
+        <w:pStyle w:val="Heading2"/>
+      </w:pPr>
+      <w:r>
+        <w:t>14.4 Sheet Schema</w:t>
+      </w:r>
+    </w:p>
+    <w:p>
+      <w:pPr/>
+      <w:r>
+        <w:t>The script creates the player_stats sheet automatically on first run and writes the header row. On subsequent runs it migrates any missing header columns (e.g. Time Played added in a later version) without disturbing existing data. Column order matches Section 3.2 of this document exactly.</w:t>
+      </w:r>
+    </w:p>
+    <w:p>
+      <w:pPr>
+        <w:pStyle w:val="Heading2"/>
+      </w:pPr>
+      <w:r>
+        <w:t>14.5 isInVehicleAtFrame(entity, frame)</w:t>
+      </w:r>
+    </w:p>
+    <w:p>
+      <w:pPr/>
+      <w:r>
+        <w:t>Determines the in-vehicle state of an entity at a specific replay frame by indexing into entity.positions. The positions array starts at entity.startFrameNum; index = frame − startFrameNum. Position entry format:</w:t>
+      </w:r>
+    </w:p>
+    <w:p>
+      <w:pPr>
+        <w:pStyle w:val="NoSpacing"/>
+      </w:pPr>
+      <w:r>
+        <w:rPr>
+          <w:rFonts w:ascii="Courier New" w:hAnsi="Courier New"/>
+          <w:sz w:val="18"/>
+        </w:rPr>
+        <w:t>[ [x, y, z], bearing, alive, inVehicle, name, framesFired, role ]</w:t>
+      </w:r>
+    </w:p>
+    <w:p>
+      <w:pPr/>
+      <w:r>
+        <w:t>inVehicle is 1 when the entity is riding in a vehicle, 0 otherwise. Returns false if the frame is out of range.</w:t>
+      </w:r>
+    </w:p>
+    <w:p>
+      <w:pPr>
+        <w:pStyle w:val="Heading2"/>
+      </w:pPr>
+      <w:r>
+        <w:t>14.6 Zeus Handling</w:t>
+      </w:r>
+    </w:p>
+    <w:p>
+      <w:pPr/>
+      <w:r>
+        <w:t>Entities whose group is "zeus" (case-insensitive) or whose role starts with "zeus" are flagged as Zeus. All combat stats (kills, deaths, teamkills, shots, hits, distances) are zeroed out before writing to the sheet so Zeus game masters do not pollute leaderboard rankings.</w:t>
+      </w:r>
+    </w:p>
+    <w:p>
+      <w:pPr>
+        <w:pStyle w:val="Heading2"/>
+      </w:pPr>
+      <w:r>
+        <w:t>14.7 Time Played Calculation</w:t>
+      </w:r>
+    </w:p>
+    <w:p>
+      <w:pPr/>
+      <w:r>
+        <w:t>Time played is computed as:</w:t>
+      </w:r>
+    </w:p>
+    <w:p>
+      <w:pPr>
+        <w:pStyle w:val="NoSpacing"/>
+      </w:pPr>
+      <w:r>
+        <w:rPr>
+          <w:rFonts w:ascii="Courier New" w:hAnsi="Courier New"/>
+          <w:sz w:val="18"/>
+        </w:rPr>
+        <w:t>timePlayed = entity.positions.length × data.captureDelay</w:t>
+      </w:r>
+    </w:p>
+    <w:p>
+      <w:pPr/>
+      <w:r>
+        <w:t>captureDelay is the OCAP recording interval in seconds (typically 1). The value is rounded to the nearest second before writing to the sheet.</w:t>
+      </w:r>
+    </w:p>
+    <w:p>
+      <w:pPr>
+        <w:pStyle w:val="Heading2"/>
+      </w:pPr>
+      <w:r>
+        <w:t>14.8 forceReimport Mode</w:t>
+      </w:r>
+    </w:p>
+    <w:p>
+      <w:pPr/>
+      <w:r>
+        <w:t>When forceReimport = true (triggered by reimportOCAP()), the script calls deleteExistingRowsForFile() before inserting new rows. This function reads column A, collects all row numbers matching the source filename, then deletes them bottom-up (to prevent row index shifting). This ensures a clean re-import with no duplicate data.</w:t>
+      </w:r>
+    </w:p>
+    <w:p>
+      <w:pPr>
+        <w:pStyle w:val="Heading2"/>
+      </w:pPr>
+      <w:r>
+        <w:t>14.9 Setting Up a Trigger</w:t>
+      </w:r>
+    </w:p>
+    <w:p>
+      <w:pPr/>
+      <w:r>
+        <w:t>To run importOCAP() automatically whenever a new file is added to OCAP_Logs, create a time-driven trigger in the Apps Script editor:</w:t>
+      </w:r>
+    </w:p>
+    <w:p>
+      <w:pPr>
+        <w:pStyle w:val="ListNumber"/>
+      </w:pPr>
+      <w:r>
+        <w:t>Open the script project → Triggers (clock icon).</w:t>
+      </w:r>
+    </w:p>
+    <w:p>
+      <w:pPr>
+        <w:pStyle w:val="ListNumber"/>
+      </w:pPr>
+      <w:r>
+        <w:t>Add Trigger → Function: importOCAP → Event source: Time-driven → Type: Minutes timer → Every 5 minutes (or as needed).</w:t>
+      </w:r>
+    </w:p>
+    <w:p>
+      <w:pPr/>
+      <w:r>
+        <w:t>Because importOCAP() processes one file per invocation, running it on a short interval ensures new missions are imported promptly without any single run timing out. GAS has a 6-minute execution limit; a single large file typically completes well within 1–2 minutes.</w:t>
+      </w:r>
+    </w:p>
+    <w:p>
+      <w:pPr>
+        <w:pStyle w:val="Heading2"/>
+      </w:pPr>
+      <w:r>
+        <w:t>14.10 Error Handling</w:t>
+      </w:r>
+    </w:p>
+    <w:p>
+      <w:pPr/>
+      <w:r>
+        <w:t>If an exception occurs during processing, the script logs the error via Logger.log() and re-throws it (so the trigger failure appears in the Apps Script execution log). The file is not moved to the archive on failure, so it will be retried on the next trigger invocation.</w:t>
       </w:r>
     </w:p>
     <w:p>

</xml_diff>

<commit_message>
Update technical documentation to v1.1 (2026-03-21)
- Version bumped to 1.1
- Section count corrected to 11 (Vehicle Kills added)
- New §6.9 renderVehicleKillsSection(); existing §6.9-6.15 renumbered to 6.10-6.16
- renderMissionHistory description updated to include vehicle kills column
- Global state table: added vkSortCol / vkSortAsc
- Function reference: added renderVehicleKillsSection() and window._sortVK()
- Initialization sequence: added renderVehicleKillsSection() step
- New Appendix D — ImportScript Reference (setup, entry point, unknown resolution, friendly fire, schema)
- Changelog section added at end linking to CHANGELOG.md

https://claude.ai/code/session_01LeCW8ZtNT8f2MnVa6wEGBx
</commit_message>
<xml_diff>
--- a/TFP_KillTracker_Technical_Documentation.docx
+++ b/TFP_KillTracker_Technical_Documentation.docx
@@ -39,7 +39,7 @@
         <w:rPr>
           <w:sz w:val="22"/>
         </w:rPr>
-        <w:t>Version 1.0  ·  20 March 2026</w:t>
+        <w:t>Version 1.1  ·  21 March 2026</w:t>
       </w:r>
     </w:p>
     <w:p>
@@ -438,7 +438,7 @@
         <w:rPr>
           <w:sz w:val="20"/>
         </w:rPr>
-        <w:t>Collapsible sections — each of the 10 content sections can be independently collapsed; state persists in localStorage.</w:t>
+        <w:t>Collapsible sections — each of the 11 content sections can be independently collapsed; state persists in localStorage.</w:t>
       </w:r>
     </w:p>
     <w:p>
@@ -1947,6 +1947,122 @@
                 <w:sz w:val="18"/>
               </w:rPr>
               <w:t>Sort direction for unit leaderboard</w:t>
+            </w:r>
+          </w:p>
+        </w:tc>
+      </w:tr>
+      <w:tr>
+        <w:tc>
+          <w:tcPr>
+            <w:tcW w:type="dxa" w:w="2351"/>
+            <w:shd w:val="clear" w:color="auto" w:fill="F0F4FA"/>
+          </w:tcPr>
+          <w:p>
+            <w:r>
+              <w:rPr>
+                <w:sz w:val="18"/>
+              </w:rPr>
+              <w:t>vkSortCol</w:t>
+            </w:r>
+          </w:p>
+        </w:tc>
+        <w:tc>
+          <w:tcPr>
+            <w:tcW w:type="dxa" w:w="2351"/>
+            <w:shd w:val="clear" w:color="auto" w:fill="F0F4FA"/>
+          </w:tcPr>
+          <w:p>
+            <w:r>
+              <w:rPr>
+                <w:sz w:val="18"/>
+              </w:rPr>
+              <w:t>number</w:t>
+            </w:r>
+          </w:p>
+        </w:tc>
+        <w:tc>
+          <w:tcPr>
+            <w:tcW w:type="dxa" w:w="2351"/>
+            <w:shd w:val="clear" w:color="auto" w:fill="F0F4FA"/>
+          </w:tcPr>
+          <w:p>
+            <w:r>
+              <w:rPr>
+                <w:sz w:val="18"/>
+              </w:rPr>
+              <w:t>0</w:t>
+            </w:r>
+          </w:p>
+        </w:tc>
+        <w:tc>
+          <w:tcPr>
+            <w:tcW w:type="dxa" w:w="2351"/>
+            <w:shd w:val="clear" w:color="auto" w:fill="F0F4FA"/>
+          </w:tcPr>
+          <w:p>
+            <w:r>
+              <w:rPr>
+                <w:sz w:val="18"/>
+              </w:rPr>
+              <w:t>Active sort column index for vehicle kills section</w:t>
+            </w:r>
+          </w:p>
+        </w:tc>
+      </w:tr>
+      <w:tr>
+        <w:tc>
+          <w:tcPr>
+            <w:tcW w:type="dxa" w:w="2351"/>
+            <w:shd w:val="clear" w:color="auto" w:fill="FFFFFF"/>
+          </w:tcPr>
+          <w:p>
+            <w:r>
+              <w:rPr>
+                <w:sz w:val="18"/>
+              </w:rPr>
+              <w:t>vkSortAsc</w:t>
+            </w:r>
+          </w:p>
+        </w:tc>
+        <w:tc>
+          <w:tcPr>
+            <w:tcW w:type="dxa" w:w="2351"/>
+            <w:shd w:val="clear" w:color="auto" w:fill="FFFFFF"/>
+          </w:tcPr>
+          <w:p>
+            <w:r>
+              <w:rPr>
+                <w:sz w:val="18"/>
+              </w:rPr>
+              <w:t>boolean</w:t>
+            </w:r>
+          </w:p>
+        </w:tc>
+        <w:tc>
+          <w:tcPr>
+            <w:tcW w:type="dxa" w:w="2351"/>
+            <w:shd w:val="clear" w:color="auto" w:fill="FFFFFF"/>
+          </w:tcPr>
+          <w:p>
+            <w:r>
+              <w:rPr>
+                <w:sz w:val="18"/>
+              </w:rPr>
+              <w:t>false</w:t>
+            </w:r>
+          </w:p>
+        </w:tc>
+        <w:tc>
+          <w:tcPr>
+            <w:tcW w:type="dxa" w:w="2351"/>
+            <w:shd w:val="clear" w:color="auto" w:fill="FFFFFF"/>
+          </w:tcPr>
+          <w:p>
+            <w:r>
+              <w:rPr>
+                <w:sz w:val="18"/>
+              </w:rPr>
+              <w:t>Sort direction for vehicle kills section</w:t>
             </w:r>
           </w:p>
         </w:tc>
@@ -7493,7 +7609,7 @@
           <w:b w:val="0"/>
           <w:i w:val="0"/>
         </w:rPr>
-        <w:t>Builds a chronological table of every unique mission in filteredRows. Per-mission totals: date, world, player count, kills, deaths, K/D, TK, and top killer (player with highest kills in that mission). Sorted by date descending.</w:t>
+        <w:t>Builds a chronological table of every unique mission in filteredRows. Per-mission totals: date, world, player count, kills, deaths, K/D, TK, vehicle kills, and top killer (player with highest kills in that mission). Sorted by date descending.</w:t>
       </w:r>
     </w:p>
     <w:p>
@@ -7501,7 +7617,27 @@
         <w:pStyle w:val="Heading2"/>
       </w:pPr>
       <w:r>
-        <w:t>6.9 renderWeaponLeaderboard()</w:t>
+        <w:t>6.9 renderVehicleKillsSection()</w:t>
+      </w:r>
+    </w:p>
+    <w:p>
+      <w:pPr>
+        <w:spacing w:after="120"/>
+      </w:pPr>
+      <w:r>
+        <w:rPr>
+          <w:b w:val="0"/>
+          <w:i w:val="0"/>
+        </w:rPr>
+        <w:t>Renders a flat list of every vehicle destruction across all filteredRows. Parses the Vehicle Kills (JSON) column (an array of {v: vehicle, w: weapon} objects) for each player row and expands them into individual records. Columns: date, mission, vehicle, killer, weapon. All columns are sortable via window._sortVK(). If no vehicle kill data exists (missions imported before the JSON column was added), a prompt is shown to reimport with the updated script.</w:t>
+      </w:r>
+    </w:p>
+    <w:p>
+      <w:pPr>
+        <w:pStyle w:val="Heading2"/>
+      </w:pPr>
+      <w:r>
+        <w:t>6.10 renderWeaponLeaderboard()</w:t>
       </w:r>
     </w:p>
     <w:p>
@@ -7521,7 +7657,7 @@
         <w:pStyle w:val="Heading2"/>
       </w:pPr>
       <w:r>
-        <w:t>6.10 renderMapStats()</w:t>
+        <w:t>6.11 renderMapStats()</w:t>
       </w:r>
     </w:p>
     <w:p>
@@ -7541,7 +7677,7 @@
         <w:pStyle w:val="Heading2"/>
       </w:pPr>
       <w:r>
-        <w:t>6.11 renderRoleLeaderboard()</w:t>
+        <w:t>6.12 renderRoleLeaderboard()</w:t>
       </w:r>
     </w:p>
     <w:p>
@@ -7561,7 +7697,7 @@
         <w:pStyle w:val="Heading2"/>
       </w:pPr>
       <w:r>
-        <w:t>6.12 renderAttendance()</w:t>
+        <w:t>6.13 renderAttendance()</w:t>
       </w:r>
     </w:p>
     <w:p>
@@ -7581,7 +7717,7 @@
         <w:pStyle w:val="Heading2"/>
       </w:pPr>
       <w:r>
-        <w:t>6.13 renderKdTrend()</w:t>
+        <w:t>6.14 renderKdTrend()</w:t>
       </w:r>
     </w:p>
     <w:p>
@@ -7601,7 +7737,7 @@
         <w:pStyle w:val="Heading2"/>
       </w:pPr>
       <w:r>
-        <w:t>6.14 renderComparison()</w:t>
+        <w:t>6.15 renderComparison()</w:t>
       </w:r>
     </w:p>
     <w:p>
@@ -7621,7 +7757,7 @@
         <w:pStyle w:val="Heading2"/>
       </w:pPr>
       <w:r>
-        <w:t>6.15 Section Nav Bar &amp; toggleSection()</w:t>
+        <w:t>6.16 Section Nav Bar &amp; toggleSection()</w:t>
       </w:r>
     </w:p>
     <w:p>
@@ -10162,7 +10298,7 @@
               <w:rPr>
                 <w:sz w:val="18"/>
               </w:rPr>
-              <w:t>Renders chronological mission history table from filteredRows.</w:t>
+              <w:t>Renders chronological mission history table from filteredRows; includes vehicle kill count per mission.</w:t>
             </w:r>
           </w:p>
         </w:tc>
@@ -10178,7 +10314,7 @@
               <w:rPr>
                 <w:sz w:val="18"/>
               </w:rPr>
-              <w:t>renderWeaponLeaderboard()</w:t>
+              <w:t>renderVehicleKillsSection()</w:t>
             </w:r>
           </w:p>
         </w:tc>
@@ -10234,7 +10370,7 @@
               <w:rPr>
                 <w:sz w:val="18"/>
               </w:rPr>
-              <w:t>Merges weapon kill JSON across filteredRows and renders weapon leaderboard.</w:t>
+              <w:t>Expands Vehicle Kills (JSON) rows into a flat sortable table of vehicle destructions (vehicle, killer, weapon).</w:t>
             </w:r>
           </w:p>
         </w:tc>
@@ -10250,7 +10386,7 @@
               <w:rPr>
                 <w:sz w:val="18"/>
               </w:rPr>
-              <w:t>renderMapStats()</w:t>
+              <w:t>renderWeaponLeaderboard()</w:t>
             </w:r>
           </w:p>
         </w:tc>
@@ -10306,7 +10442,7 @@
               <w:rPr>
                 <w:sz w:val="18"/>
               </w:rPr>
-              <w:t>Groups filteredRows by World and renders map stats table.</w:t>
+              <w:t>Merges weapon kill JSON across filteredRows and renders weapon leaderboard.</w:t>
             </w:r>
           </w:p>
         </w:tc>
@@ -10322,7 +10458,7 @@
               <w:rPr>
                 <w:sz w:val="18"/>
               </w:rPr>
-              <w:t>renderRoleLeaderboard()</w:t>
+              <w:t>renderMapStats()</w:t>
             </w:r>
           </w:p>
         </w:tc>
@@ -10378,7 +10514,7 @@
               <w:rPr>
                 <w:sz w:val="18"/>
               </w:rPr>
-              <w:t>Groups filteredPlayers by topRole and renders role leaderboard.</w:t>
+              <w:t>Groups filteredRows by World and renders map stats table.</w:t>
             </w:r>
           </w:p>
         </w:tc>
@@ -10394,7 +10530,7 @@
               <w:rPr>
                 <w:sz w:val="18"/>
               </w:rPr>
-              <w:t>renderAttendance()</w:t>
+              <w:t>renderRoleLeaderboard()</w:t>
             </w:r>
           </w:p>
         </w:tc>
@@ -10450,7 +10586,7 @@
               <w:rPr>
                 <w:sz w:val="18"/>
               </w:rPr>
-              <w:t>Computes per-player attendance metrics from filteredRows and renders table.</w:t>
+              <w:t>Groups filteredPlayers by topRole and renders role leaderboard.</w:t>
             </w:r>
           </w:p>
         </w:tc>
@@ -10466,7 +10602,7 @@
               <w:rPr>
                 <w:sz w:val="18"/>
               </w:rPr>
-              <w:t>renderKdTrend()</w:t>
+              <w:t>renderAttendance()</w:t>
             </w:r>
           </w:p>
         </w:tc>
@@ -10522,7 +10658,7 @@
               <w:rPr>
                 <w:sz w:val="18"/>
               </w:rPr>
-              <w:t>Renders SVG K/D trend line chart; reads subject from #kdTrendSubject dropdown.</w:t>
+              <w:t>Computes per-player attendance metrics from filteredRows and renders table.</w:t>
             </w:r>
           </w:p>
         </w:tc>
@@ -10538,7 +10674,7 @@
               <w:rPr>
                 <w:sz w:val="18"/>
               </w:rPr>
-              <w:t>renderComparison()</w:t>
+              <w:t>renderKdTrend()</w:t>
             </w:r>
           </w:p>
         </w:tc>
@@ -10594,7 +10730,7 @@
               <w:rPr>
                 <w:sz w:val="18"/>
               </w:rPr>
-              <w:t>Renders side-by-side player comparison table; reads names from comparison dropdowns.</w:t>
+              <w:t>Renders SVG K/D trend line chart; reads subject from #kdTrendSubject dropdown.</w:t>
             </w:r>
           </w:p>
         </w:tc>
@@ -10610,7 +10746,7 @@
               <w:rPr>
                 <w:sz w:val="18"/>
               </w:rPr>
-              <w:t>toggleSection(key)</w:t>
+              <w:t>renderComparison()</w:t>
             </w:r>
           </w:p>
         </w:tc>
@@ -10624,7 +10760,7 @@
               <w:rPr>
                 <w:sz w:val="18"/>
               </w:rPr>
-              <w:t>Navigation</w:t>
+              <w:t>Rendering</w:t>
             </w:r>
           </w:p>
         </w:tc>
@@ -10638,7 +10774,7 @@
               <w:rPr>
                 <w:sz w:val="18"/>
               </w:rPr>
-              <w:t>key: string</w:t>
+              <w:t>—</w:t>
             </w:r>
           </w:p>
         </w:tc>
@@ -10666,7 +10802,7 @@
               <w:rPr>
                 <w:sz w:val="18"/>
               </w:rPr>
-              <w:t>Toggles section content div; saves state to localStorage.</w:t>
+              <w:t>Renders side-by-side player comparison table; reads names from comparison dropdowns.</w:t>
             </w:r>
           </w:p>
         </w:tc>
@@ -10682,7 +10818,7 @@
               <w:rPr>
                 <w:sz w:val="18"/>
               </w:rPr>
-              <w:t>navTo(key)</w:t>
+              <w:t>toggleSection(key)</w:t>
             </w:r>
           </w:p>
         </w:tc>
@@ -10738,7 +10874,7 @@
               <w:rPr>
                 <w:sz w:val="18"/>
               </w:rPr>
-              <w:t>Expands section, re-renders chart if needed, smooth-scrolls to header.</w:t>
+              <w:t>Toggles section content div; saves state to localStorage.</w:t>
             </w:r>
           </w:p>
         </w:tc>
@@ -10754,7 +10890,7 @@
               <w:rPr>
                 <w:sz w:val="18"/>
               </w:rPr>
-              <w:t>openPlayerModal(name)</w:t>
+              <w:t>navTo(key)</w:t>
             </w:r>
           </w:p>
         </w:tc>
@@ -10768,7 +10904,7 @@
               <w:rPr>
                 <w:sz w:val="18"/>
               </w:rPr>
-              <w:t>Modal</w:t>
+              <w:t>Navigation</w:t>
             </w:r>
           </w:p>
         </w:tc>
@@ -10782,7 +10918,7 @@
               <w:rPr>
                 <w:sz w:val="18"/>
               </w:rPr>
-              <w:t>name: string</w:t>
+              <w:t>key: string</w:t>
             </w:r>
           </w:p>
         </w:tc>
@@ -10810,7 +10946,7 @@
               <w:rPr>
                 <w:sz w:val="18"/>
               </w:rPr>
-              <w:t>Opens the detail modal overlay for the given player.</w:t>
+              <w:t>Expands section, re-renders chart if needed, smooth-scrolls to header.</w:t>
             </w:r>
           </w:p>
         </w:tc>
@@ -10826,7 +10962,7 @@
               <w:rPr>
                 <w:sz w:val="18"/>
               </w:rPr>
-              <w:t>closeModal(e)</w:t>
+              <w:t>openPlayerModal(name)</w:t>
             </w:r>
           </w:p>
         </w:tc>
@@ -10854,7 +10990,7 @@
               <w:rPr>
                 <w:sz w:val="18"/>
               </w:rPr>
-              <w:t>event</w:t>
+              <w:t>name: string</w:t>
             </w:r>
           </w:p>
         </w:tc>
@@ -10882,7 +11018,7 @@
               <w:rPr>
                 <w:sz w:val="18"/>
               </w:rPr>
-              <w:t>Closes modal on overlay click or ESC keypress.</w:t>
+              <w:t>Opens the detail modal overlay for the given player.</w:t>
             </w:r>
           </w:p>
         </w:tc>
@@ -10898,7 +11034,7 @@
               <w:rPr>
                 <w:sz w:val="18"/>
               </w:rPr>
-              <w:t>openCareerPage(name)</w:t>
+              <w:t>closeModal(e)</w:t>
             </w:r>
           </w:p>
         </w:tc>
@@ -10912,7 +11048,7 @@
               <w:rPr>
                 <w:sz w:val="18"/>
               </w:rPr>
-              <w:t>Career</w:t>
+              <w:t>Modal</w:t>
             </w:r>
           </w:p>
         </w:tc>
@@ -10926,7 +11062,7 @@
               <w:rPr>
                 <w:sz w:val="18"/>
               </w:rPr>
-              <w:t>name: string</w:t>
+              <w:t>event</w:t>
             </w:r>
           </w:p>
         </w:tc>
@@ -10954,7 +11090,7 @@
               <w:rPr>
                 <w:sz w:val="18"/>
               </w:rPr>
-              <w:t>Switches to full-screen career view; sets selectedPlayers and re-filters.</w:t>
+              <w:t>Closes modal on overlay click or ESC keypress.</w:t>
             </w:r>
           </w:p>
         </w:tc>
@@ -10970,7 +11106,7 @@
               <w:rPr>
                 <w:sz w:val="18"/>
               </w:rPr>
-              <w:t>closeCareerPage()</w:t>
+              <w:t>openCareerPage(name)</w:t>
             </w:r>
           </w:p>
         </w:tc>
@@ -10998,7 +11134,7 @@
               <w:rPr>
                 <w:sz w:val="18"/>
               </w:rPr>
-              <w:t>—</w:t>
+              <w:t>name: string</w:t>
             </w:r>
           </w:p>
         </w:tc>
@@ -11026,7 +11162,7 @@
               <w:rPr>
                 <w:sz w:val="18"/>
               </w:rPr>
-              <w:t>Restores leaderboard view; clears selectedPlayers and re-filters.</w:t>
+              <w:t>Switches to full-screen career view; sets selectedPlayers and re-filters.</w:t>
             </w:r>
           </w:p>
         </w:tc>
@@ -11042,7 +11178,7 @@
               <w:rPr>
                 <w:sz w:val="18"/>
               </w:rPr>
-              <w:t>buildCareerStatsHTML(p)</w:t>
+              <w:t>closeCareerPage()</w:t>
             </w:r>
           </w:p>
         </w:tc>
@@ -11070,7 +11206,7 @@
               <w:rPr>
                 <w:sz w:val="18"/>
               </w:rPr>
-              <w:t>p: PlayerObject</w:t>
+              <w:t>—</w:t>
             </w:r>
           </w:p>
         </w:tc>
@@ -11084,7 +11220,7 @@
               <w:rPr>
                 <w:sz w:val="18"/>
               </w:rPr>
-              <w:t>string</w:t>
+              <w:t>void</w:t>
             </w:r>
           </w:p>
         </w:tc>
@@ -11098,7 +11234,7 @@
               <w:rPr>
                 <w:sz w:val="18"/>
               </w:rPr>
-              <w:t>Generates HTML for 4-section career stats (infantry overview, weapons, best mission, mission table).</w:t>
+              <w:t>Restores leaderboard view; clears selectedPlayers and re-filters.</w:t>
             </w:r>
           </w:p>
         </w:tc>
@@ -11114,7 +11250,7 @@
               <w:rPr>
                 <w:sz w:val="18"/>
               </w:rPr>
-              <w:t>mStat(val, lbl, sub)</w:t>
+              <w:t>buildCareerStatsHTML(p)</w:t>
             </w:r>
           </w:p>
         </w:tc>
@@ -11128,7 +11264,7 @@
               <w:rPr>
                 <w:sz w:val="18"/>
               </w:rPr>
-              <w:t>Helpers</w:t>
+              <w:t>Career</w:t>
             </w:r>
           </w:p>
         </w:tc>
@@ -11142,7 +11278,7 @@
               <w:rPr>
                 <w:sz w:val="18"/>
               </w:rPr>
-              <w:t>val, label, subtitle?</w:t>
+              <w:t>p: PlayerObject</w:t>
             </w:r>
           </w:p>
         </w:tc>
@@ -11170,7 +11306,7 @@
               <w:rPr>
                 <w:sz w:val="18"/>
               </w:rPr>
-              <w:t>Returns HTML for a single stat card element.</w:t>
+              <w:t>Generates HTML for 4-section career stats (infantry overview, weapons, best mission, mission table).</w:t>
             </w:r>
           </w:p>
         </w:tc>
@@ -11186,7 +11322,7 @@
               <w:rPr>
                 <w:sz w:val="18"/>
               </w:rPr>
-              <w:t>kdClass(v)</w:t>
+              <w:t>mStat(val, lbl, sub)</w:t>
             </w:r>
           </w:p>
         </w:tc>
@@ -11214,7 +11350,7 @@
               <w:rPr>
                 <w:sz w:val="18"/>
               </w:rPr>
-              <w:t>v: number</w:t>
+              <w:t>val, label, subtitle?</w:t>
             </w:r>
           </w:p>
         </w:tc>
@@ -11242,7 +11378,7 @@
               <w:rPr>
                 <w:sz w:val="18"/>
               </w:rPr>
-              <w:t>"kd-good" if &gt;=2, "kd-bad" if &lt;0.8, else "".</w:t>
+              <w:t>Returns HTML for a single stat card element.</w:t>
             </w:r>
           </w:p>
         </w:tc>
@@ -11258,7 +11394,7 @@
               <w:rPr>
                 <w:sz w:val="18"/>
               </w:rPr>
-              <w:t>tkClass(v)</w:t>
+              <w:t>kdClass(v)</w:t>
             </w:r>
           </w:p>
         </w:tc>
@@ -11314,7 +11450,7 @@
               <w:rPr>
                 <w:sz w:val="18"/>
               </w:rPr>
-              <w:t>"tk-cell" if &gt;0, else "".</w:t>
+              <w:t>"kd-good" if &gt;=2, "kd-bad" if &lt;0.8, else "".</w:t>
             </w:r>
           </w:p>
         </w:tc>
@@ -11330,7 +11466,7 @@
               <w:rPr>
                 <w:sz w:val="18"/>
               </w:rPr>
-              <w:t>fmtTime(s)</w:t>
+              <w:t>tkClass(v)</w:t>
             </w:r>
           </w:p>
         </w:tc>
@@ -11358,7 +11494,7 @@
               <w:rPr>
                 <w:sz w:val="18"/>
               </w:rPr>
-              <w:t>s: number</w:t>
+              <w:t>v: number</w:t>
             </w:r>
           </w:p>
         </w:tc>
@@ -11386,7 +11522,7 @@
               <w:rPr>
                 <w:sz w:val="18"/>
               </w:rPr>
-              <w:t>Formats seconds as Xh Ym string.</w:t>
+              <w:t>"tk-cell" if &gt;0, else "".</w:t>
             </w:r>
           </w:p>
         </w:tc>
@@ -11402,7 +11538,7 @@
               <w:rPr>
                 <w:sz w:val="18"/>
               </w:rPr>
-              <w:t>window._sortInf(col)</w:t>
+              <w:t>fmtTime(s)</w:t>
             </w:r>
           </w:p>
         </w:tc>
@@ -11416,7 +11552,7 @@
               <w:rPr>
                 <w:sz w:val="18"/>
               </w:rPr>
-              <w:t>Sort</w:t>
+              <w:t>Helpers</w:t>
             </w:r>
           </w:p>
         </w:tc>
@@ -11430,7 +11566,7 @@
               <w:rPr>
                 <w:sz w:val="18"/>
               </w:rPr>
-              <w:t>col: number</w:t>
+              <w:t>s: number</w:t>
             </w:r>
           </w:p>
         </w:tc>
@@ -11444,7 +11580,7 @@
               <w:rPr>
                 <w:sz w:val="18"/>
               </w:rPr>
-              <w:t>void</w:t>
+              <w:t>string</w:t>
             </w:r>
           </w:p>
         </w:tc>
@@ -11458,7 +11594,7 @@
               <w:rPr>
                 <w:sz w:val="18"/>
               </w:rPr>
-              <w:t>Infantry table header click handler; toggles direction if same column.</w:t>
+              <w:t>Formats seconds as Xh Ym string.</w:t>
             </w:r>
           </w:p>
         </w:tc>
@@ -11474,7 +11610,7 @@
               <w:rPr>
                 <w:sz w:val="18"/>
               </w:rPr>
-              <w:t>window._sortVeh(col)</w:t>
+              <w:t>window._sortInf(col)</w:t>
             </w:r>
           </w:p>
         </w:tc>
@@ -11530,7 +11666,7 @@
               <w:rPr>
                 <w:sz w:val="18"/>
               </w:rPr>
-              <w:t>Vehicle table header click handler; toggles direction if same column.</w:t>
+              <w:t>Infantry table header click handler; toggles direction if same column.</w:t>
             </w:r>
           </w:p>
         </w:tc>
@@ -11546,7 +11682,7 @@
               <w:rPr>
                 <w:sz w:val="18"/>
               </w:rPr>
-              <w:t>window._sortUnit(col)</w:t>
+              <w:t>window._sortVeh(col)</w:t>
             </w:r>
           </w:p>
         </w:tc>
@@ -11602,7 +11738,7 @@
               <w:rPr>
                 <w:sz w:val="18"/>
               </w:rPr>
-              <w:t>Unit leaderboard header click handler.</w:t>
+              <w:t>Vehicle table header click handler; toggles direction if same column.</w:t>
             </w:r>
           </w:p>
         </w:tc>
@@ -11618,6 +11754,78 @@
               <w:rPr>
                 <w:sz w:val="18"/>
               </w:rPr>
+              <w:t>window._sortUnit(col)</w:t>
+            </w:r>
+          </w:p>
+        </w:tc>
+        <w:tc>
+          <w:tcPr>
+            <w:tcW w:type="dxa" w:w="1881"/>
+            <w:shd w:val="clear" w:color="auto" w:fill="FFFFFF"/>
+          </w:tcPr>
+          <w:p>
+            <w:r>
+              <w:rPr>
+                <w:sz w:val="18"/>
+              </w:rPr>
+              <w:t>Sort</w:t>
+            </w:r>
+          </w:p>
+        </w:tc>
+        <w:tc>
+          <w:tcPr>
+            <w:tcW w:type="dxa" w:w="1881"/>
+            <w:shd w:val="clear" w:color="auto" w:fill="FFFFFF"/>
+          </w:tcPr>
+          <w:p>
+            <w:r>
+              <w:rPr>
+                <w:sz w:val="18"/>
+              </w:rPr>
+              <w:t>col: number</w:t>
+            </w:r>
+          </w:p>
+        </w:tc>
+        <w:tc>
+          <w:tcPr>
+            <w:tcW w:type="dxa" w:w="1881"/>
+            <w:shd w:val="clear" w:color="auto" w:fill="FFFFFF"/>
+          </w:tcPr>
+          <w:p>
+            <w:r>
+              <w:rPr>
+                <w:sz w:val="18"/>
+              </w:rPr>
+              <w:t>void</w:t>
+            </w:r>
+          </w:p>
+        </w:tc>
+        <w:tc>
+          <w:tcPr>
+            <w:tcW w:type="dxa" w:w="1881"/>
+            <w:shd w:val="clear" w:color="auto" w:fill="FFFFFF"/>
+          </w:tcPr>
+          <w:p>
+            <w:r>
+              <w:rPr>
+                <w:sz w:val="18"/>
+              </w:rPr>
+              <w:t>Unit leaderboard header click handler.</w:t>
+            </w:r>
+          </w:p>
+        </w:tc>
+      </w:tr>
+      <w:tr>
+        <w:tc>
+          <w:tcPr>
+            <w:tcW w:type="dxa" w:w="1881"/>
+            <w:shd w:val="clear" w:color="auto" w:fill="F0F4FA"/>
+          </w:tcPr>
+          <w:p>
+            <w:r>
+              <w:rPr>
+                <w:sz w:val="18"/>
+              </w:rPr>
               <w:t>window._sortWp(col)</w:t>
             </w:r>
           </w:p>
@@ -11625,7 +11833,7 @@
         <w:tc>
           <w:tcPr>
             <w:tcW w:type="dxa" w:w="1881"/>
-            <w:shd w:val="clear" w:color="auto" w:fill="FFFFFF"/>
+            <w:shd w:val="clear" w:color="auto" w:fill="F0F4FA"/>
           </w:tcPr>
           <w:p>
             <w:r>
@@ -11639,7 +11847,7 @@
         <w:tc>
           <w:tcPr>
             <w:tcW w:type="dxa" w:w="1881"/>
-            <w:shd w:val="clear" w:color="auto" w:fill="FFFFFF"/>
+            <w:shd w:val="clear" w:color="auto" w:fill="F0F4FA"/>
           </w:tcPr>
           <w:p>
             <w:r>
@@ -11653,7 +11861,7 @@
         <w:tc>
           <w:tcPr>
             <w:tcW w:type="dxa" w:w="1881"/>
-            <w:shd w:val="clear" w:color="auto" w:fill="FFFFFF"/>
+            <w:shd w:val="clear" w:color="auto" w:fill="F0F4FA"/>
           </w:tcPr>
           <w:p>
             <w:r>
@@ -11667,7 +11875,7 @@
         <w:tc>
           <w:tcPr>
             <w:tcW w:type="dxa" w:w="1881"/>
-            <w:shd w:val="clear" w:color="auto" w:fill="FFFFFF"/>
+            <w:shd w:val="clear" w:color="auto" w:fill="F0F4FA"/>
           </w:tcPr>
           <w:p>
             <w:r>
@@ -11675,6 +11883,78 @@
                 <w:sz w:val="18"/>
               </w:rPr>
               <w:t>Weapon leaderboard header click handler.</w:t>
+            </w:r>
+          </w:p>
+        </w:tc>
+      </w:tr>
+      <w:tr>
+        <w:tc>
+          <w:tcPr>
+            <w:tcW w:type="dxa" w:w="1881"/>
+            <w:shd w:val="clear" w:color="auto" w:fill="FFFFFF"/>
+          </w:tcPr>
+          <w:p>
+            <w:r>
+              <w:rPr>
+                <w:sz w:val="18"/>
+              </w:rPr>
+              <w:t>window._sortVK(col)</w:t>
+            </w:r>
+          </w:p>
+        </w:tc>
+        <w:tc>
+          <w:tcPr>
+            <w:tcW w:type="dxa" w:w="1881"/>
+            <w:shd w:val="clear" w:color="auto" w:fill="FFFFFF"/>
+          </w:tcPr>
+          <w:p>
+            <w:r>
+              <w:rPr>
+                <w:sz w:val="18"/>
+              </w:rPr>
+              <w:t>Sort</w:t>
+            </w:r>
+          </w:p>
+        </w:tc>
+        <w:tc>
+          <w:tcPr>
+            <w:tcW w:type="dxa" w:w="1881"/>
+            <w:shd w:val="clear" w:color="auto" w:fill="FFFFFF"/>
+          </w:tcPr>
+          <w:p>
+            <w:r>
+              <w:rPr>
+                <w:sz w:val="18"/>
+              </w:rPr>
+              <w:t>col: number</w:t>
+            </w:r>
+          </w:p>
+        </w:tc>
+        <w:tc>
+          <w:tcPr>
+            <w:tcW w:type="dxa" w:w="1881"/>
+            <w:shd w:val="clear" w:color="auto" w:fill="FFFFFF"/>
+          </w:tcPr>
+          <w:p>
+            <w:r>
+              <w:rPr>
+                <w:sz w:val="18"/>
+              </w:rPr>
+              <w:t>void</w:t>
+            </w:r>
+          </w:p>
+        </w:tc>
+        <w:tc>
+          <w:tcPr>
+            <w:tcW w:type="dxa" w:w="1881"/>
+            <w:shd w:val="clear" w:color="auto" w:fill="FFFFFF"/>
+          </w:tcPr>
+          <w:p>
+            <w:r>
+              <w:rPr>
+                <w:sz w:val="18"/>
+              </w:rPr>
+              <w:t>Vehicle kills section header click handler; toggles direction if same column.</w:t>
             </w:r>
           </w:p>
         </w:tc>
@@ -15975,21 +16255,21 @@
               <w:rPr>
                 <w:sz w:val="18"/>
               </w:rPr>
-              <w:t>renderWeaponLeaderboard()</w:t>
-            </w:r>
-          </w:p>
-        </w:tc>
-        <w:tc>
-          <w:tcPr>
-            <w:tcW w:type="dxa" w:w="3135"/>
-            <w:shd w:val="clear" w:color="auto" w:fill="F0F4FA"/>
-          </w:tcPr>
-          <w:p>
-            <w:r>
-              <w:rPr>
-                <w:sz w:val="18"/>
-              </w:rPr>
-              <w:t>#wpBody populated (section collapsed by default).</w:t>
+              <w:t>renderVehicleKillsSection()</w:t>
+            </w:r>
+          </w:p>
+        </w:tc>
+        <w:tc>
+          <w:tcPr>
+            <w:tcW w:type="dxa" w:w="3135"/>
+            <w:shd w:val="clear" w:color="auto" w:fill="F0F4FA"/>
+          </w:tcPr>
+          <w:p>
+            <w:r>
+              <w:rPr>
+                <w:sz w:val="18"/>
+              </w:rPr>
+              <w:t>#vehKillsBody populated (section collapsed by default).</w:t>
             </w:r>
           </w:p>
         </w:tc>
@@ -16019,21 +16299,21 @@
               <w:rPr>
                 <w:sz w:val="18"/>
               </w:rPr>
-              <w:t>renderMapStats()</w:t>
-            </w:r>
-          </w:p>
-        </w:tc>
-        <w:tc>
-          <w:tcPr>
-            <w:tcW w:type="dxa" w:w="3135"/>
-            <w:shd w:val="clear" w:color="auto" w:fill="FFFFFF"/>
-          </w:tcPr>
-          <w:p>
-            <w:r>
-              <w:rPr>
-                <w:sz w:val="18"/>
-              </w:rPr>
-              <w:t>#mapBody populated (section collapsed by default).</w:t>
+              <w:t>renderWeaponLeaderboard()</w:t>
+            </w:r>
+          </w:p>
+        </w:tc>
+        <w:tc>
+          <w:tcPr>
+            <w:tcW w:type="dxa" w:w="3135"/>
+            <w:shd w:val="clear" w:color="auto" w:fill="FFFFFF"/>
+          </w:tcPr>
+          <w:p>
+            <w:r>
+              <w:rPr>
+                <w:sz w:val="18"/>
+              </w:rPr>
+              <w:t>#wpBody populated (section collapsed by default).</w:t>
             </w:r>
           </w:p>
         </w:tc>
@@ -16063,21 +16343,21 @@
               <w:rPr>
                 <w:sz w:val="18"/>
               </w:rPr>
-              <w:t>renderRoleLeaderboard()</w:t>
-            </w:r>
-          </w:p>
-        </w:tc>
-        <w:tc>
-          <w:tcPr>
-            <w:tcW w:type="dxa" w:w="3135"/>
-            <w:shd w:val="clear" w:color="auto" w:fill="F0F4FA"/>
-          </w:tcPr>
-          <w:p>
-            <w:r>
-              <w:rPr>
-                <w:sz w:val="18"/>
-              </w:rPr>
-              <w:t>#roleBody populated (section collapsed by default).</w:t>
+              <w:t>renderMapStats()</w:t>
+            </w:r>
+          </w:p>
+        </w:tc>
+        <w:tc>
+          <w:tcPr>
+            <w:tcW w:type="dxa" w:w="3135"/>
+            <w:shd w:val="clear" w:color="auto" w:fill="F0F4FA"/>
+          </w:tcPr>
+          <w:p>
+            <w:r>
+              <w:rPr>
+                <w:sz w:val="18"/>
+              </w:rPr>
+              <w:t>#mapBody populated (section collapsed by default).</w:t>
             </w:r>
           </w:p>
         </w:tc>
@@ -16107,21 +16387,21 @@
               <w:rPr>
                 <w:sz w:val="18"/>
               </w:rPr>
-              <w:t>renderAttendance()</w:t>
-            </w:r>
-          </w:p>
-        </w:tc>
-        <w:tc>
-          <w:tcPr>
-            <w:tcW w:type="dxa" w:w="3135"/>
-            <w:shd w:val="clear" w:color="auto" w:fill="FFFFFF"/>
-          </w:tcPr>
-          <w:p>
-            <w:r>
-              <w:rPr>
-                <w:sz w:val="18"/>
-              </w:rPr>
-              <w:t>#attendBody populated (section collapsed by default).</w:t>
+              <w:t>renderRoleLeaderboard()</w:t>
+            </w:r>
+          </w:p>
+        </w:tc>
+        <w:tc>
+          <w:tcPr>
+            <w:tcW w:type="dxa" w:w="3135"/>
+            <w:shd w:val="clear" w:color="auto" w:fill="FFFFFF"/>
+          </w:tcPr>
+          <w:p>
+            <w:r>
+              <w:rPr>
+                <w:sz w:val="18"/>
+              </w:rPr>
+              <w:t>#roleBody populated (section collapsed by default).</w:t>
             </w:r>
           </w:p>
         </w:tc>
@@ -16151,21 +16431,21 @@
               <w:rPr>
                 <w:sz w:val="18"/>
               </w:rPr>
-              <w:t>renderKdTrend()</w:t>
-            </w:r>
-          </w:p>
-        </w:tc>
-        <w:tc>
-          <w:tcPr>
-            <w:tcW w:type="dxa" w:w="3135"/>
-            <w:shd w:val="clear" w:color="auto" w:fill="F0F4FA"/>
-          </w:tcPr>
-          <w:p>
-            <w:r>
-              <w:rPr>
-                <w:sz w:val="18"/>
-              </w:rPr>
-              <w:t>#kdTrendChart populated (section collapsed by default).</w:t>
+              <w:t>renderAttendance()</w:t>
+            </w:r>
+          </w:p>
+        </w:tc>
+        <w:tc>
+          <w:tcPr>
+            <w:tcW w:type="dxa" w:w="3135"/>
+            <w:shd w:val="clear" w:color="auto" w:fill="F0F4FA"/>
+          </w:tcPr>
+          <w:p>
+            <w:r>
+              <w:rPr>
+                <w:sz w:val="18"/>
+              </w:rPr>
+              <w:t>#attendBody populated (section collapsed by default).</w:t>
             </w:r>
           </w:p>
         </w:tc>
@@ -16195,21 +16475,21 @@
               <w:rPr>
                 <w:sz w:val="18"/>
               </w:rPr>
-              <w:t>renderComparison()</w:t>
-            </w:r>
-          </w:p>
-        </w:tc>
-        <w:tc>
-          <w:tcPr>
-            <w:tcW w:type="dxa" w:w="3135"/>
-            <w:shd w:val="clear" w:color="auto" w:fill="FFFFFF"/>
-          </w:tcPr>
-          <w:p>
-            <w:r>
-              <w:rPr>
-                <w:sz w:val="18"/>
-              </w:rPr>
-              <w:t>Comparison dropdowns populated (section collapsed by default).</w:t>
+              <w:t>renderKdTrend()</w:t>
+            </w:r>
+          </w:p>
+        </w:tc>
+        <w:tc>
+          <w:tcPr>
+            <w:tcW w:type="dxa" w:w="3135"/>
+            <w:shd w:val="clear" w:color="auto" w:fill="FFFFFF"/>
+          </w:tcPr>
+          <w:p>
+            <w:r>
+              <w:rPr>
+                <w:sz w:val="18"/>
+              </w:rPr>
+              <w:t>#kdTrendChart populated (section collapsed by default).</w:t>
             </w:r>
           </w:p>
         </w:tc>
@@ -16239,6 +16519,50 @@
               <w:rPr>
                 <w:sz w:val="18"/>
               </w:rPr>
+              <w:t>renderComparison()</w:t>
+            </w:r>
+          </w:p>
+        </w:tc>
+        <w:tc>
+          <w:tcPr>
+            <w:tcW w:type="dxa" w:w="3135"/>
+            <w:shd w:val="clear" w:color="auto" w:fill="F0F4FA"/>
+          </w:tcPr>
+          <w:p>
+            <w:r>
+              <w:rPr>
+                <w:sz w:val="18"/>
+              </w:rPr>
+              <w:t>Comparison dropdowns populated (section collapsed by default).</w:t>
+            </w:r>
+          </w:p>
+        </w:tc>
+      </w:tr>
+      <w:tr>
+        <w:tc>
+          <w:tcPr>
+            <w:tcW w:type="dxa" w:w="3135"/>
+            <w:shd w:val="clear" w:color="auto" w:fill="FFFFFF"/>
+          </w:tcPr>
+          <w:p>
+            <w:r>
+              <w:rPr>
+                <w:sz w:val="18"/>
+              </w:rPr>
+              <w:t>23</w:t>
+            </w:r>
+          </w:p>
+        </w:tc>
+        <w:tc>
+          <w:tcPr>
+            <w:tcW w:type="dxa" w:w="3135"/>
+            <w:shd w:val="clear" w:color="auto" w:fill="FFFFFF"/>
+          </w:tcPr>
+          <w:p>
+            <w:r>
+              <w:rPr>
+                <w:sz w:val="18"/>
+              </w:rPr>
               <w:t>UI Ready</w:t>
             </w:r>
           </w:p>
@@ -16246,7 +16570,7 @@
         <w:tc>
           <w:tcPr>
             <w:tcW w:type="dxa" w:w="3135"/>
-            <w:shd w:val="clear" w:color="auto" w:fill="F0F4FA"/>
+            <w:shd w:val="clear" w:color="auto" w:fill="FFFFFF"/>
           </w:tcPr>
           <w:p>
             <w:r>
@@ -16447,6 +16771,386 @@
           <w:i w:val="0"/>
         </w:rPr>
         <w:t>The application uses standard ES6+ features: arrow functions, template literals, destructuring, Set, Map, fetch(), and async/await. It is compatible with all modern browsers (Chrome 80+, Firefox 75+, Safari 13+, Edge 80+). Internet Explorer is not supported.</w:t>
+      </w:r>
+    </w:p>
+    <w:p/>
+    <w:p>
+      <w:pPr>
+        <w:pStyle w:val="Heading1"/>
+      </w:pPr>
+      <w:r>
+        <w:t>Appendix D — ImportScript Reference</w:t>
+      </w:r>
+    </w:p>
+    <w:p>
+      <w:pPr>
+        <w:spacing w:after="120"/>
+      </w:pPr>
+      <w:r>
+        <w:rPr>
+          <w:b w:val="0"/>
+          <w:i w:val="0"/>
+        </w:rPr>
+        <w:t>ImportScript is a Google Apps Script that reads OCAP .json.gz mission logs from Google Drive and writes one row per player per mission into the player_stats Google Sheet.</w:t>
+      </w:r>
+    </w:p>
+    <w:p>
+      <w:pPr>
+        <w:pStyle w:val="Heading2"/>
+      </w:pPr>
+      <w:r>
+        <w:t>D.1 Required Google Drive Folder Structure</w:t>
+      </w:r>
+    </w:p>
+    <w:p>
+      <w:pPr>
+        <w:pStyle w:val="NoSpacing"/>
+        <w:spacing w:before="40" w:after="40"/>
+        <w:ind w:left="576"/>
+        <w:shd w:val="clear" w:color="auto" w:fill="F3F3F3"/>
+      </w:pPr>
+      <w:r>
+        <w:rPr>
+          <w:rFonts w:ascii="Courier New" w:hAnsi="Courier New"/>
+          <w:color w:val="222222"/>
+          <w:sz w:val="18"/>
+        </w:rPr>
+        <w:t>Kill Tracker/</w:t>
+      </w:r>
+    </w:p>
+    <w:p>
+      <w:pPr>
+        <w:pStyle w:val="NoSpacing"/>
+        <w:spacing w:before="40" w:after="40"/>
+        <w:ind w:left="576"/>
+        <w:shd w:val="clear" w:color="auto" w:fill="F3F3F3"/>
+      </w:pPr>
+      <w:r>
+        <w:rPr>
+          <w:rFonts w:ascii="Courier New" w:hAnsi="Courier New"/>
+          <w:color w:val="222222"/>
+          <w:sz w:val="18"/>
+        </w:rPr>
+        <w:t>├── OCAP_Logs/          ← drop .json.gz files here before running</w:t>
+      </w:r>
+    </w:p>
+    <w:p>
+      <w:pPr>
+        <w:pStyle w:val="NoSpacing"/>
+        <w:spacing w:before="40" w:after="40"/>
+        <w:ind w:left="576"/>
+        <w:shd w:val="clear" w:color="auto" w:fill="F3F3F3"/>
+      </w:pPr>
+      <w:r>
+        <w:rPr>
+          <w:rFonts w:ascii="Courier New" w:hAnsi="Courier New"/>
+          <w:color w:val="222222"/>
+          <w:sz w:val="18"/>
+        </w:rPr>
+        <w:t>└── OCAP_Logs_Archive/  ← processed files are moved here automatically</w:t>
+      </w:r>
+    </w:p>
+    <w:p/>
+    <w:p>
+      <w:pPr>
+        <w:pStyle w:val="Heading2"/>
+      </w:pPr>
+      <w:r>
+        <w:t>D.2 Installation</w:t>
+      </w:r>
+    </w:p>
+    <w:p>
+      <w:pPr>
+        <w:pStyle w:val="ListNumber"/>
+        <w:spacing w:after="40"/>
+        <w:ind w:left="360"/>
+      </w:pPr>
+      <w:r>
+        <w:rPr>
+          <w:sz w:val="20"/>
+        </w:rPr>
+        <w:t>Open your Google Sheet.</w:t>
+      </w:r>
+    </w:p>
+    <w:p>
+      <w:pPr>
+        <w:pStyle w:val="ListNumber"/>
+        <w:spacing w:after="40"/>
+        <w:ind w:left="360"/>
+      </w:pPr>
+      <w:r>
+        <w:rPr>
+          <w:sz w:val="20"/>
+        </w:rPr>
+        <w:t>Go to Extensions → Apps Script.</w:t>
+      </w:r>
+    </w:p>
+    <w:p>
+      <w:pPr>
+        <w:pStyle w:val="ListNumber"/>
+        <w:spacing w:after="40"/>
+        <w:ind w:left="360"/>
+      </w:pPr>
+      <w:r>
+        <w:rPr>
+          <w:sz w:val="20"/>
+        </w:rPr>
+        <w:t>Paste the contents of ImportScript into the editor and save.</w:t>
+      </w:r>
+    </w:p>
+    <w:p>
+      <w:pPr>
+        <w:pStyle w:val="ListNumber"/>
+        <w:spacing w:after="40"/>
+        <w:ind w:left="360"/>
+      </w:pPr>
+      <w:r>
+        <w:rPr>
+          <w:sz w:val="20"/>
+        </w:rPr>
+        <w:t>Run reimportOCAP to process one file from OCAP_Logs.</w:t>
+      </w:r>
+    </w:p>
+    <w:p/>
+    <w:p>
+      <w:pPr>
+        <w:pStyle w:val="Heading2"/>
+      </w:pPr>
+      <w:r>
+        <w:t>D.3 Entry Point</w:t>
+      </w:r>
+    </w:p>
+    <w:tbl>
+      <w:tblPr>
+        <w:tblStyle w:val="TableGrid"/>
+        <w:tblW w:type="auto" w:w="0"/>
+        <w:jc w:val="left"/>
+        <w:tblLook w:firstColumn="1" w:firstRow="1" w:lastColumn="0" w:lastRow="0" w:noHBand="0" w:noVBand="1" w:val="04A0"/>
+      </w:tblPr>
+      <w:tblGrid>
+        <w:gridCol w:w="4703"/>
+        <w:gridCol w:w="4703"/>
+      </w:tblGrid>
+      <w:tr>
+        <w:tc>
+          <w:tcPr>
+            <w:tcW w:type="dxa" w:w="4703"/>
+            <w:shd w:val="clear" w:color="auto" w:fill="2E4057"/>
+          </w:tcPr>
+          <w:p>
+            <w:pPr>
+              <w:jc w:val="center"/>
+            </w:pPr>
+            <w:r>
+              <w:rPr>
+                <w:b/>
+                <w:color w:val="FFFFFF"/>
+                <w:sz w:val="18"/>
+              </w:rPr>
+              <w:t>Function</w:t>
+            </w:r>
+          </w:p>
+        </w:tc>
+        <w:tc>
+          <w:tcPr>
+            <w:tcW w:type="dxa" w:w="4703"/>
+            <w:shd w:val="clear" w:color="auto" w:fill="2E4057"/>
+          </w:tcPr>
+          <w:p>
+            <w:pPr>
+              <w:jc w:val="center"/>
+            </w:pPr>
+            <w:r>
+              <w:rPr>
+                <w:b/>
+                <w:color w:val="FFFFFF"/>
+                <w:sz w:val="18"/>
+              </w:rPr>
+              <w:t>Description</w:t>
+            </w:r>
+          </w:p>
+        </w:tc>
+      </w:tr>
+      <w:tr>
+        <w:tc>
+          <w:tcPr>
+            <w:tcW w:type="dxa" w:w="4703"/>
+            <w:shd w:val="clear" w:color="auto" w:fill="FFFFFF"/>
+          </w:tcPr>
+          <w:p>
+            <w:r>
+              <w:rPr>
+                <w:sz w:val="18"/>
+              </w:rPr>
+              <w:t>reimportOCAP()</w:t>
+            </w:r>
+          </w:p>
+        </w:tc>
+        <w:tc>
+          <w:tcPr>
+            <w:tcW w:type="dxa" w:w="4703"/>
+            <w:shd w:val="clear" w:color="auto" w:fill="FFFFFF"/>
+          </w:tcPr>
+          <w:p>
+            <w:r>
+              <w:rPr>
+                <w:sz w:val="18"/>
+              </w:rPr>
+              <w:t>Process (or re-process) the next file from OCAP_Logs; deletes any existing rows for that file before writing, making every run idempotent; archives the file to OCAP_Logs_Archive on completion</w:t>
+            </w:r>
+          </w:p>
+        </w:tc>
+      </w:tr>
+    </w:tbl>
+    <w:p/>
+    <w:p>
+      <w:pPr>
+        <w:pStyle w:val="Heading2"/>
+      </w:pPr>
+      <w:r>
+        <w:t>D.4 Unknown Entity Resolution</w:t>
+      </w:r>
+    </w:p>
+    <w:p>
+      <w:pPr>
+        <w:spacing w:after="80"/>
+      </w:pPr>
+      <w:r>
+        <w:rPr>
+          <w:b w:val="0"/>
+          <w:i w:val="0"/>
+        </w:rPr>
+        <w:t>OCAP sometimes records entities without a name (e.g. players who disconnect before their name is synced). The script attempts to resolve these automatically:</w:t>
+      </w:r>
+    </w:p>
+    <w:p>
+      <w:pPr>
+        <w:pStyle w:val="ListBullet"/>
+        <w:spacing w:after="40"/>
+        <w:ind w:left="360"/>
+      </w:pPr>
+      <w:r>
+        <w:rPr>
+          <w:sz w:val="20"/>
+        </w:rPr>
+        <w:t>Unnamed entities with &lt; 1 hour playtime are skipped entirely (reconnect ghosts, JIP artefacts).</w:t>
+      </w:r>
+    </w:p>
+    <w:p>
+      <w:pPr>
+        <w:pStyle w:val="ListBullet"/>
+        <w:spacing w:after="40"/>
+        <w:ind w:left="360"/>
+      </w:pPr>
+      <w:r>
+        <w:rPr>
+          <w:sz w:val="20"/>
+        </w:rPr>
+        <w:t>Remaining unknown entities are matched against named players who share the same group and role in the same mission.</w:t>
+      </w:r>
+    </w:p>
+    <w:p>
+      <w:pPr>
+        <w:pStyle w:val="ListBullet"/>
+        <w:spacing w:after="40"/>
+        <w:ind w:left="360"/>
+      </w:pPr>
+      <w:r>
+        <w:rPr>
+          <w:sz w:val="20"/>
+        </w:rPr>
+        <w:t>If exactly one named player maps to that group+role (after deduplicating candidates from reconnects), the unknown entity is renamed to that player.</w:t>
+      </w:r>
+    </w:p>
+    <w:p>
+      <w:pPr>
+        <w:pStyle w:val="ListBullet"/>
+        <w:spacing w:after="40"/>
+        <w:ind w:left="360"/>
+      </w:pPr>
+      <w:r>
+        <w:rPr>
+          <w:sz w:val="20"/>
+        </w:rPr>
+        <w:t>If a role string contains "@username" (e.g. "Rifleman@Zeus"), the script correctly detects it as a Zeus role.</w:t>
+      </w:r>
+    </w:p>
+    <w:p/>
+    <w:p>
+      <w:pPr>
+        <w:pStyle w:val="Heading2"/>
+      </w:pPr>
+      <w:r>
+        <w:t>D.5 Friendly Fire Counting</w:t>
+      </w:r>
+    </w:p>
+    <w:p>
+      <w:pPr>
+        <w:spacing w:after="120"/>
+      </w:pPr>
+      <w:r>
+        <w:rPr>
+          <w:b w:val="0"/>
+          <w:i w:val="0"/>
+        </w:rPr>
+        <w:t>A kill is counted as a teamkill when victim.side === killer.side on a unit-kill event. It is never counted as a regular kill or weapon kill. Vehicle destructions are never counted as teamkills regardless of side.</w:t>
+      </w:r>
+    </w:p>
+    <w:p>
+      <w:pPr>
+        <w:pStyle w:val="Heading2"/>
+      </w:pPr>
+      <w:r>
+        <w:t>D.6 Sheet Schema</w:t>
+      </w:r>
+    </w:p>
+    <w:p>
+      <w:pPr>
+        <w:spacing w:after="120"/>
+      </w:pPr>
+      <w:r>
+        <w:rPr>
+          <w:b w:val="0"/>
+          <w:i w:val="0"/>
+        </w:rPr>
+        <w:t>The script writes one row per player per mission. See §3.2 Expected Column Schema for the full column list. The sheet and header row are created automatically on first run; missing columns are migrated when the script is run against an existing sheet.</w:t>
+      </w:r>
+    </w:p>
+    <w:p>
+      <w:r>
+        <w:br w:type="page"/>
+      </w:r>
+    </w:p>
+    <w:p>
+      <w:pPr>
+        <w:pStyle w:val="Heading1"/>
+      </w:pPr>
+      <w:r>
+        <w:t>Changelog</w:t>
+      </w:r>
+    </w:p>
+    <w:p>
+      <w:pPr>
+        <w:spacing w:after="80"/>
+      </w:pPr>
+      <w:r>
+        <w:rPr>
+          <w:b w:val="0"/>
+          <w:i w:val="0"/>
+        </w:rPr>
+        <w:t>A full history of changes — new features, fixes, and breaking changes — is maintained in CHANGELOG.md at the root of the repository.</w:t>
+      </w:r>
+    </w:p>
+    <w:p>
+      <w:pPr>
+        <w:spacing w:after="120"/>
+      </w:pPr>
+      <w:r>
+        <w:rPr>
+          <w:b w:val="0"/>
+          <w:i/>
+        </w:rPr>
+        <w:t>GitHub: https://github.com/loltorres9/TFP_KillTracker/blob/main/CHANGELOG.md</w:t>
       </w:r>
     </w:p>
     <w:sectPr>

</xml_diff>

<commit_message>
Deploying to gh-pages from @ loltorres9/TFP_KillTracker@fb8905597b6022fd3fa3907e778d52cb79b2b8f1 🚀
</commit_message>
<xml_diff>
--- a/TFP_KillTracker_Technical_Documentation.docx
+++ b/TFP_KillTracker_Technical_Documentation.docx
@@ -39,7 +39,7 @@
         <w:rPr>
           <w:sz w:val="22"/>
         </w:rPr>
-        <w:t>Version 1.0  ·  20 March 2026</w:t>
+        <w:t>Version 1.1  ·  21 March 2026</w:t>
       </w:r>
     </w:p>
     <w:p>
@@ -438,7 +438,7 @@
         <w:rPr>
           <w:sz w:val="20"/>
         </w:rPr>
-        <w:t>Collapsible sections — each of the 10 content sections can be independently collapsed; state persists in localStorage.</w:t>
+        <w:t>Collapsible sections — each of the 11 content sections can be independently collapsed; state persists in localStorage.</w:t>
       </w:r>
     </w:p>
     <w:p>
@@ -1947,6 +1947,122 @@
                 <w:sz w:val="18"/>
               </w:rPr>
               <w:t>Sort direction for unit leaderboard</w:t>
+            </w:r>
+          </w:p>
+        </w:tc>
+      </w:tr>
+      <w:tr>
+        <w:tc>
+          <w:tcPr>
+            <w:tcW w:type="dxa" w:w="2351"/>
+            <w:shd w:val="clear" w:color="auto" w:fill="F0F4FA"/>
+          </w:tcPr>
+          <w:p>
+            <w:r>
+              <w:rPr>
+                <w:sz w:val="18"/>
+              </w:rPr>
+              <w:t>vkSortCol</w:t>
+            </w:r>
+          </w:p>
+        </w:tc>
+        <w:tc>
+          <w:tcPr>
+            <w:tcW w:type="dxa" w:w="2351"/>
+            <w:shd w:val="clear" w:color="auto" w:fill="F0F4FA"/>
+          </w:tcPr>
+          <w:p>
+            <w:r>
+              <w:rPr>
+                <w:sz w:val="18"/>
+              </w:rPr>
+              <w:t>number</w:t>
+            </w:r>
+          </w:p>
+        </w:tc>
+        <w:tc>
+          <w:tcPr>
+            <w:tcW w:type="dxa" w:w="2351"/>
+            <w:shd w:val="clear" w:color="auto" w:fill="F0F4FA"/>
+          </w:tcPr>
+          <w:p>
+            <w:r>
+              <w:rPr>
+                <w:sz w:val="18"/>
+              </w:rPr>
+              <w:t>0</w:t>
+            </w:r>
+          </w:p>
+        </w:tc>
+        <w:tc>
+          <w:tcPr>
+            <w:tcW w:type="dxa" w:w="2351"/>
+            <w:shd w:val="clear" w:color="auto" w:fill="F0F4FA"/>
+          </w:tcPr>
+          <w:p>
+            <w:r>
+              <w:rPr>
+                <w:sz w:val="18"/>
+              </w:rPr>
+              <w:t>Active sort column index for vehicle kills section</w:t>
+            </w:r>
+          </w:p>
+        </w:tc>
+      </w:tr>
+      <w:tr>
+        <w:tc>
+          <w:tcPr>
+            <w:tcW w:type="dxa" w:w="2351"/>
+            <w:shd w:val="clear" w:color="auto" w:fill="FFFFFF"/>
+          </w:tcPr>
+          <w:p>
+            <w:r>
+              <w:rPr>
+                <w:sz w:val="18"/>
+              </w:rPr>
+              <w:t>vkSortAsc</w:t>
+            </w:r>
+          </w:p>
+        </w:tc>
+        <w:tc>
+          <w:tcPr>
+            <w:tcW w:type="dxa" w:w="2351"/>
+            <w:shd w:val="clear" w:color="auto" w:fill="FFFFFF"/>
+          </w:tcPr>
+          <w:p>
+            <w:r>
+              <w:rPr>
+                <w:sz w:val="18"/>
+              </w:rPr>
+              <w:t>boolean</w:t>
+            </w:r>
+          </w:p>
+        </w:tc>
+        <w:tc>
+          <w:tcPr>
+            <w:tcW w:type="dxa" w:w="2351"/>
+            <w:shd w:val="clear" w:color="auto" w:fill="FFFFFF"/>
+          </w:tcPr>
+          <w:p>
+            <w:r>
+              <w:rPr>
+                <w:sz w:val="18"/>
+              </w:rPr>
+              <w:t>false</w:t>
+            </w:r>
+          </w:p>
+        </w:tc>
+        <w:tc>
+          <w:tcPr>
+            <w:tcW w:type="dxa" w:w="2351"/>
+            <w:shd w:val="clear" w:color="auto" w:fill="FFFFFF"/>
+          </w:tcPr>
+          <w:p>
+            <w:r>
+              <w:rPr>
+                <w:sz w:val="18"/>
+              </w:rPr>
+              <w:t>Sort direction for vehicle kills section</w:t>
             </w:r>
           </w:p>
         </w:tc>
@@ -7493,7 +7609,7 @@
           <w:b w:val="0"/>
           <w:i w:val="0"/>
         </w:rPr>
-        <w:t>Builds a chronological table of every unique mission in filteredRows. Per-mission totals: date, world, player count, kills, deaths, K/D, TK, and top killer (player with highest kills in that mission). Sorted by date descending.</w:t>
+        <w:t>Builds a chronological table of every unique mission in filteredRows. Per-mission totals: date, world, player count, kills, deaths, K/D, TK, vehicle kills, and top killer (player with highest kills in that mission). Sorted by date descending.</w:t>
       </w:r>
     </w:p>
     <w:p>
@@ -7501,7 +7617,27 @@
         <w:pStyle w:val="Heading2"/>
       </w:pPr>
       <w:r>
-        <w:t>6.9 renderWeaponLeaderboard()</w:t>
+        <w:t>6.9 renderVehicleKillsSection()</w:t>
+      </w:r>
+    </w:p>
+    <w:p>
+      <w:pPr>
+        <w:spacing w:after="120"/>
+      </w:pPr>
+      <w:r>
+        <w:rPr>
+          <w:b w:val="0"/>
+          <w:i w:val="0"/>
+        </w:rPr>
+        <w:t>Renders a flat list of every vehicle destruction across all filteredRows. Parses the Vehicle Kills (JSON) column (an array of {v: vehicle, w: weapon} objects) for each player row and expands them into individual records. Columns: date, mission, vehicle, killer, weapon. All columns are sortable via window._sortVK(). If no vehicle kill data exists (missions imported before the JSON column was added), a prompt is shown to reimport with the updated script.</w:t>
+      </w:r>
+    </w:p>
+    <w:p>
+      <w:pPr>
+        <w:pStyle w:val="Heading2"/>
+      </w:pPr>
+      <w:r>
+        <w:t>6.10 renderWeaponLeaderboard()</w:t>
       </w:r>
     </w:p>
     <w:p>
@@ -7521,7 +7657,7 @@
         <w:pStyle w:val="Heading2"/>
       </w:pPr>
       <w:r>
-        <w:t>6.10 renderMapStats()</w:t>
+        <w:t>6.11 renderMapStats()</w:t>
       </w:r>
     </w:p>
     <w:p>
@@ -7541,7 +7677,7 @@
         <w:pStyle w:val="Heading2"/>
       </w:pPr>
       <w:r>
-        <w:t>6.11 renderRoleLeaderboard()</w:t>
+        <w:t>6.12 renderRoleLeaderboard()</w:t>
       </w:r>
     </w:p>
     <w:p>
@@ -7561,7 +7697,7 @@
         <w:pStyle w:val="Heading2"/>
       </w:pPr>
       <w:r>
-        <w:t>6.12 renderAttendance()</w:t>
+        <w:t>6.13 renderAttendance()</w:t>
       </w:r>
     </w:p>
     <w:p>
@@ -7581,7 +7717,7 @@
         <w:pStyle w:val="Heading2"/>
       </w:pPr>
       <w:r>
-        <w:t>6.13 renderKdTrend()</w:t>
+        <w:t>6.14 renderKdTrend()</w:t>
       </w:r>
     </w:p>
     <w:p>
@@ -7601,7 +7737,7 @@
         <w:pStyle w:val="Heading2"/>
       </w:pPr>
       <w:r>
-        <w:t>6.14 renderComparison()</w:t>
+        <w:t>6.15 renderComparison()</w:t>
       </w:r>
     </w:p>
     <w:p>
@@ -7621,7 +7757,7 @@
         <w:pStyle w:val="Heading2"/>
       </w:pPr>
       <w:r>
-        <w:t>6.15 Section Nav Bar &amp; toggleSection()</w:t>
+        <w:t>6.16 Section Nav Bar &amp; toggleSection()</w:t>
       </w:r>
     </w:p>
     <w:p>
@@ -10162,7 +10298,7 @@
               <w:rPr>
                 <w:sz w:val="18"/>
               </w:rPr>
-              <w:t>Renders chronological mission history table from filteredRows.</w:t>
+              <w:t>Renders chronological mission history table from filteredRows; includes vehicle kill count per mission.</w:t>
             </w:r>
           </w:p>
         </w:tc>
@@ -10178,7 +10314,7 @@
               <w:rPr>
                 <w:sz w:val="18"/>
               </w:rPr>
-              <w:t>renderWeaponLeaderboard()</w:t>
+              <w:t>renderVehicleKillsSection()</w:t>
             </w:r>
           </w:p>
         </w:tc>
@@ -10234,7 +10370,7 @@
               <w:rPr>
                 <w:sz w:val="18"/>
               </w:rPr>
-              <w:t>Merges weapon kill JSON across filteredRows and renders weapon leaderboard.</w:t>
+              <w:t>Expands Vehicle Kills (JSON) rows into a flat sortable table of vehicle destructions (vehicle, killer, weapon).</w:t>
             </w:r>
           </w:p>
         </w:tc>
@@ -10250,7 +10386,7 @@
               <w:rPr>
                 <w:sz w:val="18"/>
               </w:rPr>
-              <w:t>renderMapStats()</w:t>
+              <w:t>renderWeaponLeaderboard()</w:t>
             </w:r>
           </w:p>
         </w:tc>
@@ -10306,7 +10442,7 @@
               <w:rPr>
                 <w:sz w:val="18"/>
               </w:rPr>
-              <w:t>Groups filteredRows by World and renders map stats table.</w:t>
+              <w:t>Merges weapon kill JSON across filteredRows and renders weapon leaderboard.</w:t>
             </w:r>
           </w:p>
         </w:tc>
@@ -10322,7 +10458,7 @@
               <w:rPr>
                 <w:sz w:val="18"/>
               </w:rPr>
-              <w:t>renderRoleLeaderboard()</w:t>
+              <w:t>renderMapStats()</w:t>
             </w:r>
           </w:p>
         </w:tc>
@@ -10378,7 +10514,7 @@
               <w:rPr>
                 <w:sz w:val="18"/>
               </w:rPr>
-              <w:t>Groups filteredPlayers by topRole and renders role leaderboard.</w:t>
+              <w:t>Groups filteredRows by World and renders map stats table.</w:t>
             </w:r>
           </w:p>
         </w:tc>
@@ -10394,7 +10530,7 @@
               <w:rPr>
                 <w:sz w:val="18"/>
               </w:rPr>
-              <w:t>renderAttendance()</w:t>
+              <w:t>renderRoleLeaderboard()</w:t>
             </w:r>
           </w:p>
         </w:tc>
@@ -10450,7 +10586,7 @@
               <w:rPr>
                 <w:sz w:val="18"/>
               </w:rPr>
-              <w:t>Computes per-player attendance metrics from filteredRows and renders table.</w:t>
+              <w:t>Groups filteredPlayers by topRole and renders role leaderboard.</w:t>
             </w:r>
           </w:p>
         </w:tc>
@@ -10466,7 +10602,7 @@
               <w:rPr>
                 <w:sz w:val="18"/>
               </w:rPr>
-              <w:t>renderKdTrend()</w:t>
+              <w:t>renderAttendance()</w:t>
             </w:r>
           </w:p>
         </w:tc>
@@ -10522,7 +10658,7 @@
               <w:rPr>
                 <w:sz w:val="18"/>
               </w:rPr>
-              <w:t>Renders SVG K/D trend line chart; reads subject from #kdTrendSubject dropdown.</w:t>
+              <w:t>Computes per-player attendance metrics from filteredRows and renders table.</w:t>
             </w:r>
           </w:p>
         </w:tc>
@@ -10538,7 +10674,7 @@
               <w:rPr>
                 <w:sz w:val="18"/>
               </w:rPr>
-              <w:t>renderComparison()</w:t>
+              <w:t>renderKdTrend()</w:t>
             </w:r>
           </w:p>
         </w:tc>
@@ -10594,7 +10730,7 @@
               <w:rPr>
                 <w:sz w:val="18"/>
               </w:rPr>
-              <w:t>Renders side-by-side player comparison table; reads names from comparison dropdowns.</w:t>
+              <w:t>Renders SVG K/D trend line chart; reads subject from #kdTrendSubject dropdown.</w:t>
             </w:r>
           </w:p>
         </w:tc>
@@ -10610,7 +10746,7 @@
               <w:rPr>
                 <w:sz w:val="18"/>
               </w:rPr>
-              <w:t>toggleSection(key)</w:t>
+              <w:t>renderComparison()</w:t>
             </w:r>
           </w:p>
         </w:tc>
@@ -10624,7 +10760,7 @@
               <w:rPr>
                 <w:sz w:val="18"/>
               </w:rPr>
-              <w:t>Navigation</w:t>
+              <w:t>Rendering</w:t>
             </w:r>
           </w:p>
         </w:tc>
@@ -10638,7 +10774,7 @@
               <w:rPr>
                 <w:sz w:val="18"/>
               </w:rPr>
-              <w:t>key: string</w:t>
+              <w:t>—</w:t>
             </w:r>
           </w:p>
         </w:tc>
@@ -10666,7 +10802,7 @@
               <w:rPr>
                 <w:sz w:val="18"/>
               </w:rPr>
-              <w:t>Toggles section content div; saves state to localStorage.</w:t>
+              <w:t>Renders side-by-side player comparison table; reads names from comparison dropdowns.</w:t>
             </w:r>
           </w:p>
         </w:tc>
@@ -10682,7 +10818,7 @@
               <w:rPr>
                 <w:sz w:val="18"/>
               </w:rPr>
-              <w:t>navTo(key)</w:t>
+              <w:t>toggleSection(key)</w:t>
             </w:r>
           </w:p>
         </w:tc>
@@ -10738,7 +10874,7 @@
               <w:rPr>
                 <w:sz w:val="18"/>
               </w:rPr>
-              <w:t>Expands section, re-renders chart if needed, smooth-scrolls to header.</w:t>
+              <w:t>Toggles section content div; saves state to localStorage.</w:t>
             </w:r>
           </w:p>
         </w:tc>
@@ -10754,7 +10890,7 @@
               <w:rPr>
                 <w:sz w:val="18"/>
               </w:rPr>
-              <w:t>openPlayerModal(name)</w:t>
+              <w:t>navTo(key)</w:t>
             </w:r>
           </w:p>
         </w:tc>
@@ -10768,7 +10904,7 @@
               <w:rPr>
                 <w:sz w:val="18"/>
               </w:rPr>
-              <w:t>Modal</w:t>
+              <w:t>Navigation</w:t>
             </w:r>
           </w:p>
         </w:tc>
@@ -10782,7 +10918,7 @@
               <w:rPr>
                 <w:sz w:val="18"/>
               </w:rPr>
-              <w:t>name: string</w:t>
+              <w:t>key: string</w:t>
             </w:r>
           </w:p>
         </w:tc>
@@ -10810,7 +10946,7 @@
               <w:rPr>
                 <w:sz w:val="18"/>
               </w:rPr>
-              <w:t>Opens the detail modal overlay for the given player.</w:t>
+              <w:t>Expands section, re-renders chart if needed, smooth-scrolls to header.</w:t>
             </w:r>
           </w:p>
         </w:tc>
@@ -10826,7 +10962,7 @@
               <w:rPr>
                 <w:sz w:val="18"/>
               </w:rPr>
-              <w:t>closeModal(e)</w:t>
+              <w:t>openPlayerModal(name)</w:t>
             </w:r>
           </w:p>
         </w:tc>
@@ -10854,7 +10990,7 @@
               <w:rPr>
                 <w:sz w:val="18"/>
               </w:rPr>
-              <w:t>event</w:t>
+              <w:t>name: string</w:t>
             </w:r>
           </w:p>
         </w:tc>
@@ -10882,7 +11018,7 @@
               <w:rPr>
                 <w:sz w:val="18"/>
               </w:rPr>
-              <w:t>Closes modal on overlay click or ESC keypress.</w:t>
+              <w:t>Opens the detail modal overlay for the given player.</w:t>
             </w:r>
           </w:p>
         </w:tc>
@@ -10898,7 +11034,7 @@
               <w:rPr>
                 <w:sz w:val="18"/>
               </w:rPr>
-              <w:t>openCareerPage(name)</w:t>
+              <w:t>closeModal(e)</w:t>
             </w:r>
           </w:p>
         </w:tc>
@@ -10912,7 +11048,7 @@
               <w:rPr>
                 <w:sz w:val="18"/>
               </w:rPr>
-              <w:t>Career</w:t>
+              <w:t>Modal</w:t>
             </w:r>
           </w:p>
         </w:tc>
@@ -10926,7 +11062,7 @@
               <w:rPr>
                 <w:sz w:val="18"/>
               </w:rPr>
-              <w:t>name: string</w:t>
+              <w:t>event</w:t>
             </w:r>
           </w:p>
         </w:tc>
@@ -10954,7 +11090,7 @@
               <w:rPr>
                 <w:sz w:val="18"/>
               </w:rPr>
-              <w:t>Switches to full-screen career view; sets selectedPlayers and re-filters.</w:t>
+              <w:t>Closes modal on overlay click or ESC keypress.</w:t>
             </w:r>
           </w:p>
         </w:tc>
@@ -10970,7 +11106,7 @@
               <w:rPr>
                 <w:sz w:val="18"/>
               </w:rPr>
-              <w:t>closeCareerPage()</w:t>
+              <w:t>openCareerPage(name)</w:t>
             </w:r>
           </w:p>
         </w:tc>
@@ -10998,7 +11134,7 @@
               <w:rPr>
                 <w:sz w:val="18"/>
               </w:rPr>
-              <w:t>—</w:t>
+              <w:t>name: string</w:t>
             </w:r>
           </w:p>
         </w:tc>
@@ -11026,7 +11162,7 @@
               <w:rPr>
                 <w:sz w:val="18"/>
               </w:rPr>
-              <w:t>Restores leaderboard view; clears selectedPlayers and re-filters.</w:t>
+              <w:t>Switches to full-screen career view; sets selectedPlayers and re-filters.</w:t>
             </w:r>
           </w:p>
         </w:tc>
@@ -11042,7 +11178,7 @@
               <w:rPr>
                 <w:sz w:val="18"/>
               </w:rPr>
-              <w:t>buildCareerStatsHTML(p)</w:t>
+              <w:t>closeCareerPage()</w:t>
             </w:r>
           </w:p>
         </w:tc>
@@ -11070,7 +11206,7 @@
               <w:rPr>
                 <w:sz w:val="18"/>
               </w:rPr>
-              <w:t>p: PlayerObject</w:t>
+              <w:t>—</w:t>
             </w:r>
           </w:p>
         </w:tc>
@@ -11084,7 +11220,7 @@
               <w:rPr>
                 <w:sz w:val="18"/>
               </w:rPr>
-              <w:t>string</w:t>
+              <w:t>void</w:t>
             </w:r>
           </w:p>
         </w:tc>
@@ -11098,7 +11234,7 @@
               <w:rPr>
                 <w:sz w:val="18"/>
               </w:rPr>
-              <w:t>Generates HTML for 4-section career stats (infantry overview, weapons, best mission, mission table).</w:t>
+              <w:t>Restores leaderboard view; clears selectedPlayers and re-filters.</w:t>
             </w:r>
           </w:p>
         </w:tc>
@@ -11114,7 +11250,7 @@
               <w:rPr>
                 <w:sz w:val="18"/>
               </w:rPr>
-              <w:t>mStat(val, lbl, sub)</w:t>
+              <w:t>buildCareerStatsHTML(p)</w:t>
             </w:r>
           </w:p>
         </w:tc>
@@ -11128,7 +11264,7 @@
               <w:rPr>
                 <w:sz w:val="18"/>
               </w:rPr>
-              <w:t>Helpers</w:t>
+              <w:t>Career</w:t>
             </w:r>
           </w:p>
         </w:tc>
@@ -11142,7 +11278,7 @@
               <w:rPr>
                 <w:sz w:val="18"/>
               </w:rPr>
-              <w:t>val, label, subtitle?</w:t>
+              <w:t>p: PlayerObject</w:t>
             </w:r>
           </w:p>
         </w:tc>
@@ -11170,7 +11306,7 @@
               <w:rPr>
                 <w:sz w:val="18"/>
               </w:rPr>
-              <w:t>Returns HTML for a single stat card element.</w:t>
+              <w:t>Generates HTML for 4-section career stats (infantry overview, weapons, best mission, mission table).</w:t>
             </w:r>
           </w:p>
         </w:tc>
@@ -11186,7 +11322,7 @@
               <w:rPr>
                 <w:sz w:val="18"/>
               </w:rPr>
-              <w:t>kdClass(v)</w:t>
+              <w:t>mStat(val, lbl, sub)</w:t>
             </w:r>
           </w:p>
         </w:tc>
@@ -11214,7 +11350,7 @@
               <w:rPr>
                 <w:sz w:val="18"/>
               </w:rPr>
-              <w:t>v: number</w:t>
+              <w:t>val, label, subtitle?</w:t>
             </w:r>
           </w:p>
         </w:tc>
@@ -11242,7 +11378,7 @@
               <w:rPr>
                 <w:sz w:val="18"/>
               </w:rPr>
-              <w:t>"kd-good" if &gt;=2, "kd-bad" if &lt;0.8, else "".</w:t>
+              <w:t>Returns HTML for a single stat card element.</w:t>
             </w:r>
           </w:p>
         </w:tc>
@@ -11258,7 +11394,7 @@
               <w:rPr>
                 <w:sz w:val="18"/>
               </w:rPr>
-              <w:t>tkClass(v)</w:t>
+              <w:t>kdClass(v)</w:t>
             </w:r>
           </w:p>
         </w:tc>
@@ -11314,7 +11450,7 @@
               <w:rPr>
                 <w:sz w:val="18"/>
               </w:rPr>
-              <w:t>"tk-cell" if &gt;0, else "".</w:t>
+              <w:t>"kd-good" if &gt;=2, "kd-bad" if &lt;0.8, else "".</w:t>
             </w:r>
           </w:p>
         </w:tc>
@@ -11330,7 +11466,7 @@
               <w:rPr>
                 <w:sz w:val="18"/>
               </w:rPr>
-              <w:t>fmtTime(s)</w:t>
+              <w:t>tkClass(v)</w:t>
             </w:r>
           </w:p>
         </w:tc>
@@ -11358,7 +11494,7 @@
               <w:rPr>
                 <w:sz w:val="18"/>
               </w:rPr>
-              <w:t>s: number</w:t>
+              <w:t>v: number</w:t>
             </w:r>
           </w:p>
         </w:tc>
@@ -11386,7 +11522,7 @@
               <w:rPr>
                 <w:sz w:val="18"/>
               </w:rPr>
-              <w:t>Formats seconds as Xh Ym string.</w:t>
+              <w:t>"tk-cell" if &gt;0, else "".</w:t>
             </w:r>
           </w:p>
         </w:tc>
@@ -11402,7 +11538,7 @@
               <w:rPr>
                 <w:sz w:val="18"/>
               </w:rPr>
-              <w:t>window._sortInf(col)</w:t>
+              <w:t>fmtTime(s)</w:t>
             </w:r>
           </w:p>
         </w:tc>
@@ -11416,7 +11552,7 @@
               <w:rPr>
                 <w:sz w:val="18"/>
               </w:rPr>
-              <w:t>Sort</w:t>
+              <w:t>Helpers</w:t>
             </w:r>
           </w:p>
         </w:tc>
@@ -11430,7 +11566,7 @@
               <w:rPr>
                 <w:sz w:val="18"/>
               </w:rPr>
-              <w:t>col: number</w:t>
+              <w:t>s: number</w:t>
             </w:r>
           </w:p>
         </w:tc>
@@ -11444,7 +11580,7 @@
               <w:rPr>
                 <w:sz w:val="18"/>
               </w:rPr>
-              <w:t>void</w:t>
+              <w:t>string</w:t>
             </w:r>
           </w:p>
         </w:tc>
@@ -11458,7 +11594,7 @@
               <w:rPr>
                 <w:sz w:val="18"/>
               </w:rPr>
-              <w:t>Infantry table header click handler; toggles direction if same column.</w:t>
+              <w:t>Formats seconds as Xh Ym string.</w:t>
             </w:r>
           </w:p>
         </w:tc>
@@ -11474,7 +11610,7 @@
               <w:rPr>
                 <w:sz w:val="18"/>
               </w:rPr>
-              <w:t>window._sortVeh(col)</w:t>
+              <w:t>window._sortInf(col)</w:t>
             </w:r>
           </w:p>
         </w:tc>
@@ -11530,7 +11666,7 @@
               <w:rPr>
                 <w:sz w:val="18"/>
               </w:rPr>
-              <w:t>Vehicle table header click handler; toggles direction if same column.</w:t>
+              <w:t>Infantry table header click handler; toggles direction if same column.</w:t>
             </w:r>
           </w:p>
         </w:tc>
@@ -11546,7 +11682,7 @@
               <w:rPr>
                 <w:sz w:val="18"/>
               </w:rPr>
-              <w:t>window._sortUnit(col)</w:t>
+              <w:t>window._sortVeh(col)</w:t>
             </w:r>
           </w:p>
         </w:tc>
@@ -11602,7 +11738,7 @@
               <w:rPr>
                 <w:sz w:val="18"/>
               </w:rPr>
-              <w:t>Unit leaderboard header click handler.</w:t>
+              <w:t>Vehicle table header click handler; toggles direction if same column.</w:t>
             </w:r>
           </w:p>
         </w:tc>
@@ -11618,6 +11754,78 @@
               <w:rPr>
                 <w:sz w:val="18"/>
               </w:rPr>
+              <w:t>window._sortUnit(col)</w:t>
+            </w:r>
+          </w:p>
+        </w:tc>
+        <w:tc>
+          <w:tcPr>
+            <w:tcW w:type="dxa" w:w="1881"/>
+            <w:shd w:val="clear" w:color="auto" w:fill="FFFFFF"/>
+          </w:tcPr>
+          <w:p>
+            <w:r>
+              <w:rPr>
+                <w:sz w:val="18"/>
+              </w:rPr>
+              <w:t>Sort</w:t>
+            </w:r>
+          </w:p>
+        </w:tc>
+        <w:tc>
+          <w:tcPr>
+            <w:tcW w:type="dxa" w:w="1881"/>
+            <w:shd w:val="clear" w:color="auto" w:fill="FFFFFF"/>
+          </w:tcPr>
+          <w:p>
+            <w:r>
+              <w:rPr>
+                <w:sz w:val="18"/>
+              </w:rPr>
+              <w:t>col: number</w:t>
+            </w:r>
+          </w:p>
+        </w:tc>
+        <w:tc>
+          <w:tcPr>
+            <w:tcW w:type="dxa" w:w="1881"/>
+            <w:shd w:val="clear" w:color="auto" w:fill="FFFFFF"/>
+          </w:tcPr>
+          <w:p>
+            <w:r>
+              <w:rPr>
+                <w:sz w:val="18"/>
+              </w:rPr>
+              <w:t>void</w:t>
+            </w:r>
+          </w:p>
+        </w:tc>
+        <w:tc>
+          <w:tcPr>
+            <w:tcW w:type="dxa" w:w="1881"/>
+            <w:shd w:val="clear" w:color="auto" w:fill="FFFFFF"/>
+          </w:tcPr>
+          <w:p>
+            <w:r>
+              <w:rPr>
+                <w:sz w:val="18"/>
+              </w:rPr>
+              <w:t>Unit leaderboard header click handler.</w:t>
+            </w:r>
+          </w:p>
+        </w:tc>
+      </w:tr>
+      <w:tr>
+        <w:tc>
+          <w:tcPr>
+            <w:tcW w:type="dxa" w:w="1881"/>
+            <w:shd w:val="clear" w:color="auto" w:fill="F0F4FA"/>
+          </w:tcPr>
+          <w:p>
+            <w:r>
+              <w:rPr>
+                <w:sz w:val="18"/>
+              </w:rPr>
               <w:t>window._sortWp(col)</w:t>
             </w:r>
           </w:p>
@@ -11625,7 +11833,7 @@
         <w:tc>
           <w:tcPr>
             <w:tcW w:type="dxa" w:w="1881"/>
-            <w:shd w:val="clear" w:color="auto" w:fill="FFFFFF"/>
+            <w:shd w:val="clear" w:color="auto" w:fill="F0F4FA"/>
           </w:tcPr>
           <w:p>
             <w:r>
@@ -11639,7 +11847,7 @@
         <w:tc>
           <w:tcPr>
             <w:tcW w:type="dxa" w:w="1881"/>
-            <w:shd w:val="clear" w:color="auto" w:fill="FFFFFF"/>
+            <w:shd w:val="clear" w:color="auto" w:fill="F0F4FA"/>
           </w:tcPr>
           <w:p>
             <w:r>
@@ -11653,7 +11861,7 @@
         <w:tc>
           <w:tcPr>
             <w:tcW w:type="dxa" w:w="1881"/>
-            <w:shd w:val="clear" w:color="auto" w:fill="FFFFFF"/>
+            <w:shd w:val="clear" w:color="auto" w:fill="F0F4FA"/>
           </w:tcPr>
           <w:p>
             <w:r>
@@ -11667,7 +11875,7 @@
         <w:tc>
           <w:tcPr>
             <w:tcW w:type="dxa" w:w="1881"/>
-            <w:shd w:val="clear" w:color="auto" w:fill="FFFFFF"/>
+            <w:shd w:val="clear" w:color="auto" w:fill="F0F4FA"/>
           </w:tcPr>
           <w:p>
             <w:r>
@@ -11675,6 +11883,78 @@
                 <w:sz w:val="18"/>
               </w:rPr>
               <w:t>Weapon leaderboard header click handler.</w:t>
+            </w:r>
+          </w:p>
+        </w:tc>
+      </w:tr>
+      <w:tr>
+        <w:tc>
+          <w:tcPr>
+            <w:tcW w:type="dxa" w:w="1881"/>
+            <w:shd w:val="clear" w:color="auto" w:fill="FFFFFF"/>
+          </w:tcPr>
+          <w:p>
+            <w:r>
+              <w:rPr>
+                <w:sz w:val="18"/>
+              </w:rPr>
+              <w:t>window._sortVK(col)</w:t>
+            </w:r>
+          </w:p>
+        </w:tc>
+        <w:tc>
+          <w:tcPr>
+            <w:tcW w:type="dxa" w:w="1881"/>
+            <w:shd w:val="clear" w:color="auto" w:fill="FFFFFF"/>
+          </w:tcPr>
+          <w:p>
+            <w:r>
+              <w:rPr>
+                <w:sz w:val="18"/>
+              </w:rPr>
+              <w:t>Sort</w:t>
+            </w:r>
+          </w:p>
+        </w:tc>
+        <w:tc>
+          <w:tcPr>
+            <w:tcW w:type="dxa" w:w="1881"/>
+            <w:shd w:val="clear" w:color="auto" w:fill="FFFFFF"/>
+          </w:tcPr>
+          <w:p>
+            <w:r>
+              <w:rPr>
+                <w:sz w:val="18"/>
+              </w:rPr>
+              <w:t>col: number</w:t>
+            </w:r>
+          </w:p>
+        </w:tc>
+        <w:tc>
+          <w:tcPr>
+            <w:tcW w:type="dxa" w:w="1881"/>
+            <w:shd w:val="clear" w:color="auto" w:fill="FFFFFF"/>
+          </w:tcPr>
+          <w:p>
+            <w:r>
+              <w:rPr>
+                <w:sz w:val="18"/>
+              </w:rPr>
+              <w:t>void</w:t>
+            </w:r>
+          </w:p>
+        </w:tc>
+        <w:tc>
+          <w:tcPr>
+            <w:tcW w:type="dxa" w:w="1881"/>
+            <w:shd w:val="clear" w:color="auto" w:fill="FFFFFF"/>
+          </w:tcPr>
+          <w:p>
+            <w:r>
+              <w:rPr>
+                <w:sz w:val="18"/>
+              </w:rPr>
+              <w:t>Vehicle kills section header click handler; toggles direction if same column.</w:t>
             </w:r>
           </w:p>
         </w:tc>
@@ -15975,21 +16255,21 @@
               <w:rPr>
                 <w:sz w:val="18"/>
               </w:rPr>
-              <w:t>renderWeaponLeaderboard()</w:t>
-            </w:r>
-          </w:p>
-        </w:tc>
-        <w:tc>
-          <w:tcPr>
-            <w:tcW w:type="dxa" w:w="3135"/>
-            <w:shd w:val="clear" w:color="auto" w:fill="F0F4FA"/>
-          </w:tcPr>
-          <w:p>
-            <w:r>
-              <w:rPr>
-                <w:sz w:val="18"/>
-              </w:rPr>
-              <w:t>#wpBody populated (section collapsed by default).</w:t>
+              <w:t>renderVehicleKillsSection()</w:t>
+            </w:r>
+          </w:p>
+        </w:tc>
+        <w:tc>
+          <w:tcPr>
+            <w:tcW w:type="dxa" w:w="3135"/>
+            <w:shd w:val="clear" w:color="auto" w:fill="F0F4FA"/>
+          </w:tcPr>
+          <w:p>
+            <w:r>
+              <w:rPr>
+                <w:sz w:val="18"/>
+              </w:rPr>
+              <w:t>#vehKillsBody populated (section collapsed by default).</w:t>
             </w:r>
           </w:p>
         </w:tc>
@@ -16019,21 +16299,21 @@
               <w:rPr>
                 <w:sz w:val="18"/>
               </w:rPr>
-              <w:t>renderMapStats()</w:t>
-            </w:r>
-          </w:p>
-        </w:tc>
-        <w:tc>
-          <w:tcPr>
-            <w:tcW w:type="dxa" w:w="3135"/>
-            <w:shd w:val="clear" w:color="auto" w:fill="FFFFFF"/>
-          </w:tcPr>
-          <w:p>
-            <w:r>
-              <w:rPr>
-                <w:sz w:val="18"/>
-              </w:rPr>
-              <w:t>#mapBody populated (section collapsed by default).</w:t>
+              <w:t>renderWeaponLeaderboard()</w:t>
+            </w:r>
+          </w:p>
+        </w:tc>
+        <w:tc>
+          <w:tcPr>
+            <w:tcW w:type="dxa" w:w="3135"/>
+            <w:shd w:val="clear" w:color="auto" w:fill="FFFFFF"/>
+          </w:tcPr>
+          <w:p>
+            <w:r>
+              <w:rPr>
+                <w:sz w:val="18"/>
+              </w:rPr>
+              <w:t>#wpBody populated (section collapsed by default).</w:t>
             </w:r>
           </w:p>
         </w:tc>
@@ -16063,21 +16343,21 @@
               <w:rPr>
                 <w:sz w:val="18"/>
               </w:rPr>
-              <w:t>renderRoleLeaderboard()</w:t>
-            </w:r>
-          </w:p>
-        </w:tc>
-        <w:tc>
-          <w:tcPr>
-            <w:tcW w:type="dxa" w:w="3135"/>
-            <w:shd w:val="clear" w:color="auto" w:fill="F0F4FA"/>
-          </w:tcPr>
-          <w:p>
-            <w:r>
-              <w:rPr>
-                <w:sz w:val="18"/>
-              </w:rPr>
-              <w:t>#roleBody populated (section collapsed by default).</w:t>
+              <w:t>renderMapStats()</w:t>
+            </w:r>
+          </w:p>
+        </w:tc>
+        <w:tc>
+          <w:tcPr>
+            <w:tcW w:type="dxa" w:w="3135"/>
+            <w:shd w:val="clear" w:color="auto" w:fill="F0F4FA"/>
+          </w:tcPr>
+          <w:p>
+            <w:r>
+              <w:rPr>
+                <w:sz w:val="18"/>
+              </w:rPr>
+              <w:t>#mapBody populated (section collapsed by default).</w:t>
             </w:r>
           </w:p>
         </w:tc>
@@ -16107,21 +16387,21 @@
               <w:rPr>
                 <w:sz w:val="18"/>
               </w:rPr>
-              <w:t>renderAttendance()</w:t>
-            </w:r>
-          </w:p>
-        </w:tc>
-        <w:tc>
-          <w:tcPr>
-            <w:tcW w:type="dxa" w:w="3135"/>
-            <w:shd w:val="clear" w:color="auto" w:fill="FFFFFF"/>
-          </w:tcPr>
-          <w:p>
-            <w:r>
-              <w:rPr>
-                <w:sz w:val="18"/>
-              </w:rPr>
-              <w:t>#attendBody populated (section collapsed by default).</w:t>
+              <w:t>renderRoleLeaderboard()</w:t>
+            </w:r>
+          </w:p>
+        </w:tc>
+        <w:tc>
+          <w:tcPr>
+            <w:tcW w:type="dxa" w:w="3135"/>
+            <w:shd w:val="clear" w:color="auto" w:fill="FFFFFF"/>
+          </w:tcPr>
+          <w:p>
+            <w:r>
+              <w:rPr>
+                <w:sz w:val="18"/>
+              </w:rPr>
+              <w:t>#roleBody populated (section collapsed by default).</w:t>
             </w:r>
           </w:p>
         </w:tc>
@@ -16151,21 +16431,21 @@
               <w:rPr>
                 <w:sz w:val="18"/>
               </w:rPr>
-              <w:t>renderKdTrend()</w:t>
-            </w:r>
-          </w:p>
-        </w:tc>
-        <w:tc>
-          <w:tcPr>
-            <w:tcW w:type="dxa" w:w="3135"/>
-            <w:shd w:val="clear" w:color="auto" w:fill="F0F4FA"/>
-          </w:tcPr>
-          <w:p>
-            <w:r>
-              <w:rPr>
-                <w:sz w:val="18"/>
-              </w:rPr>
-              <w:t>#kdTrendChart populated (section collapsed by default).</w:t>
+              <w:t>renderAttendance()</w:t>
+            </w:r>
+          </w:p>
+        </w:tc>
+        <w:tc>
+          <w:tcPr>
+            <w:tcW w:type="dxa" w:w="3135"/>
+            <w:shd w:val="clear" w:color="auto" w:fill="F0F4FA"/>
+          </w:tcPr>
+          <w:p>
+            <w:r>
+              <w:rPr>
+                <w:sz w:val="18"/>
+              </w:rPr>
+              <w:t>#attendBody populated (section collapsed by default).</w:t>
             </w:r>
           </w:p>
         </w:tc>
@@ -16195,21 +16475,21 @@
               <w:rPr>
                 <w:sz w:val="18"/>
               </w:rPr>
-              <w:t>renderComparison()</w:t>
-            </w:r>
-          </w:p>
-        </w:tc>
-        <w:tc>
-          <w:tcPr>
-            <w:tcW w:type="dxa" w:w="3135"/>
-            <w:shd w:val="clear" w:color="auto" w:fill="FFFFFF"/>
-          </w:tcPr>
-          <w:p>
-            <w:r>
-              <w:rPr>
-                <w:sz w:val="18"/>
-              </w:rPr>
-              <w:t>Comparison dropdowns populated (section collapsed by default).</w:t>
+              <w:t>renderKdTrend()</w:t>
+            </w:r>
+          </w:p>
+        </w:tc>
+        <w:tc>
+          <w:tcPr>
+            <w:tcW w:type="dxa" w:w="3135"/>
+            <w:shd w:val="clear" w:color="auto" w:fill="FFFFFF"/>
+          </w:tcPr>
+          <w:p>
+            <w:r>
+              <w:rPr>
+                <w:sz w:val="18"/>
+              </w:rPr>
+              <w:t>#kdTrendChart populated (section collapsed by default).</w:t>
             </w:r>
           </w:p>
         </w:tc>
@@ -16239,6 +16519,50 @@
               <w:rPr>
                 <w:sz w:val="18"/>
               </w:rPr>
+              <w:t>renderComparison()</w:t>
+            </w:r>
+          </w:p>
+        </w:tc>
+        <w:tc>
+          <w:tcPr>
+            <w:tcW w:type="dxa" w:w="3135"/>
+            <w:shd w:val="clear" w:color="auto" w:fill="F0F4FA"/>
+          </w:tcPr>
+          <w:p>
+            <w:r>
+              <w:rPr>
+                <w:sz w:val="18"/>
+              </w:rPr>
+              <w:t>Comparison dropdowns populated (section collapsed by default).</w:t>
+            </w:r>
+          </w:p>
+        </w:tc>
+      </w:tr>
+      <w:tr>
+        <w:tc>
+          <w:tcPr>
+            <w:tcW w:type="dxa" w:w="3135"/>
+            <w:shd w:val="clear" w:color="auto" w:fill="FFFFFF"/>
+          </w:tcPr>
+          <w:p>
+            <w:r>
+              <w:rPr>
+                <w:sz w:val="18"/>
+              </w:rPr>
+              <w:t>23</w:t>
+            </w:r>
+          </w:p>
+        </w:tc>
+        <w:tc>
+          <w:tcPr>
+            <w:tcW w:type="dxa" w:w="3135"/>
+            <w:shd w:val="clear" w:color="auto" w:fill="FFFFFF"/>
+          </w:tcPr>
+          <w:p>
+            <w:r>
+              <w:rPr>
+                <w:sz w:val="18"/>
+              </w:rPr>
               <w:t>UI Ready</w:t>
             </w:r>
           </w:p>
@@ -16246,7 +16570,7 @@
         <w:tc>
           <w:tcPr>
             <w:tcW w:type="dxa" w:w="3135"/>
-            <w:shd w:val="clear" w:color="auto" w:fill="F0F4FA"/>
+            <w:shd w:val="clear" w:color="auto" w:fill="FFFFFF"/>
           </w:tcPr>
           <w:p>
             <w:r>
@@ -16447,6 +16771,386 @@
           <w:i w:val="0"/>
         </w:rPr>
         <w:t>The application uses standard ES6+ features: arrow functions, template literals, destructuring, Set, Map, fetch(), and async/await. It is compatible with all modern browsers (Chrome 80+, Firefox 75+, Safari 13+, Edge 80+). Internet Explorer is not supported.</w:t>
+      </w:r>
+    </w:p>
+    <w:p/>
+    <w:p>
+      <w:pPr>
+        <w:pStyle w:val="Heading1"/>
+      </w:pPr>
+      <w:r>
+        <w:t>Appendix D — ImportScript Reference</w:t>
+      </w:r>
+    </w:p>
+    <w:p>
+      <w:pPr>
+        <w:spacing w:after="120"/>
+      </w:pPr>
+      <w:r>
+        <w:rPr>
+          <w:b w:val="0"/>
+          <w:i w:val="0"/>
+        </w:rPr>
+        <w:t>ImportScript is a Google Apps Script that reads OCAP .json.gz mission logs from Google Drive and writes one row per player per mission into the player_stats Google Sheet.</w:t>
+      </w:r>
+    </w:p>
+    <w:p>
+      <w:pPr>
+        <w:pStyle w:val="Heading2"/>
+      </w:pPr>
+      <w:r>
+        <w:t>D.1 Required Google Drive Folder Structure</w:t>
+      </w:r>
+    </w:p>
+    <w:p>
+      <w:pPr>
+        <w:pStyle w:val="NoSpacing"/>
+        <w:spacing w:before="40" w:after="40"/>
+        <w:ind w:left="576"/>
+        <w:shd w:val="clear" w:color="auto" w:fill="F3F3F3"/>
+      </w:pPr>
+      <w:r>
+        <w:rPr>
+          <w:rFonts w:ascii="Courier New" w:hAnsi="Courier New"/>
+          <w:color w:val="222222"/>
+          <w:sz w:val="18"/>
+        </w:rPr>
+        <w:t>Kill Tracker/</w:t>
+      </w:r>
+    </w:p>
+    <w:p>
+      <w:pPr>
+        <w:pStyle w:val="NoSpacing"/>
+        <w:spacing w:before="40" w:after="40"/>
+        <w:ind w:left="576"/>
+        <w:shd w:val="clear" w:color="auto" w:fill="F3F3F3"/>
+      </w:pPr>
+      <w:r>
+        <w:rPr>
+          <w:rFonts w:ascii="Courier New" w:hAnsi="Courier New"/>
+          <w:color w:val="222222"/>
+          <w:sz w:val="18"/>
+        </w:rPr>
+        <w:t>├── OCAP_Logs/          ← drop .json.gz files here before running</w:t>
+      </w:r>
+    </w:p>
+    <w:p>
+      <w:pPr>
+        <w:pStyle w:val="NoSpacing"/>
+        <w:spacing w:before="40" w:after="40"/>
+        <w:ind w:left="576"/>
+        <w:shd w:val="clear" w:color="auto" w:fill="F3F3F3"/>
+      </w:pPr>
+      <w:r>
+        <w:rPr>
+          <w:rFonts w:ascii="Courier New" w:hAnsi="Courier New"/>
+          <w:color w:val="222222"/>
+          <w:sz w:val="18"/>
+        </w:rPr>
+        <w:t>└── OCAP_Logs_Archive/  ← processed files are moved here automatically</w:t>
+      </w:r>
+    </w:p>
+    <w:p/>
+    <w:p>
+      <w:pPr>
+        <w:pStyle w:val="Heading2"/>
+      </w:pPr>
+      <w:r>
+        <w:t>D.2 Installation</w:t>
+      </w:r>
+    </w:p>
+    <w:p>
+      <w:pPr>
+        <w:pStyle w:val="ListNumber"/>
+        <w:spacing w:after="40"/>
+        <w:ind w:left="360"/>
+      </w:pPr>
+      <w:r>
+        <w:rPr>
+          <w:sz w:val="20"/>
+        </w:rPr>
+        <w:t>Open your Google Sheet.</w:t>
+      </w:r>
+    </w:p>
+    <w:p>
+      <w:pPr>
+        <w:pStyle w:val="ListNumber"/>
+        <w:spacing w:after="40"/>
+        <w:ind w:left="360"/>
+      </w:pPr>
+      <w:r>
+        <w:rPr>
+          <w:sz w:val="20"/>
+        </w:rPr>
+        <w:t>Go to Extensions → Apps Script.</w:t>
+      </w:r>
+    </w:p>
+    <w:p>
+      <w:pPr>
+        <w:pStyle w:val="ListNumber"/>
+        <w:spacing w:after="40"/>
+        <w:ind w:left="360"/>
+      </w:pPr>
+      <w:r>
+        <w:rPr>
+          <w:sz w:val="20"/>
+        </w:rPr>
+        <w:t>Paste the contents of ImportScript into the editor and save.</w:t>
+      </w:r>
+    </w:p>
+    <w:p>
+      <w:pPr>
+        <w:pStyle w:val="ListNumber"/>
+        <w:spacing w:after="40"/>
+        <w:ind w:left="360"/>
+      </w:pPr>
+      <w:r>
+        <w:rPr>
+          <w:sz w:val="20"/>
+        </w:rPr>
+        <w:t>Run reimportOCAP to process one file from OCAP_Logs.</w:t>
+      </w:r>
+    </w:p>
+    <w:p/>
+    <w:p>
+      <w:pPr>
+        <w:pStyle w:val="Heading2"/>
+      </w:pPr>
+      <w:r>
+        <w:t>D.3 Entry Point</w:t>
+      </w:r>
+    </w:p>
+    <w:tbl>
+      <w:tblPr>
+        <w:tblStyle w:val="TableGrid"/>
+        <w:tblW w:type="auto" w:w="0"/>
+        <w:jc w:val="left"/>
+        <w:tblLook w:firstColumn="1" w:firstRow="1" w:lastColumn="0" w:lastRow="0" w:noHBand="0" w:noVBand="1" w:val="04A0"/>
+      </w:tblPr>
+      <w:tblGrid>
+        <w:gridCol w:w="4703"/>
+        <w:gridCol w:w="4703"/>
+      </w:tblGrid>
+      <w:tr>
+        <w:tc>
+          <w:tcPr>
+            <w:tcW w:type="dxa" w:w="4703"/>
+            <w:shd w:val="clear" w:color="auto" w:fill="2E4057"/>
+          </w:tcPr>
+          <w:p>
+            <w:pPr>
+              <w:jc w:val="center"/>
+            </w:pPr>
+            <w:r>
+              <w:rPr>
+                <w:b/>
+                <w:color w:val="FFFFFF"/>
+                <w:sz w:val="18"/>
+              </w:rPr>
+              <w:t>Function</w:t>
+            </w:r>
+          </w:p>
+        </w:tc>
+        <w:tc>
+          <w:tcPr>
+            <w:tcW w:type="dxa" w:w="4703"/>
+            <w:shd w:val="clear" w:color="auto" w:fill="2E4057"/>
+          </w:tcPr>
+          <w:p>
+            <w:pPr>
+              <w:jc w:val="center"/>
+            </w:pPr>
+            <w:r>
+              <w:rPr>
+                <w:b/>
+                <w:color w:val="FFFFFF"/>
+                <w:sz w:val="18"/>
+              </w:rPr>
+              <w:t>Description</w:t>
+            </w:r>
+          </w:p>
+        </w:tc>
+      </w:tr>
+      <w:tr>
+        <w:tc>
+          <w:tcPr>
+            <w:tcW w:type="dxa" w:w="4703"/>
+            <w:shd w:val="clear" w:color="auto" w:fill="FFFFFF"/>
+          </w:tcPr>
+          <w:p>
+            <w:r>
+              <w:rPr>
+                <w:sz w:val="18"/>
+              </w:rPr>
+              <w:t>reimportOCAP()</w:t>
+            </w:r>
+          </w:p>
+        </w:tc>
+        <w:tc>
+          <w:tcPr>
+            <w:tcW w:type="dxa" w:w="4703"/>
+            <w:shd w:val="clear" w:color="auto" w:fill="FFFFFF"/>
+          </w:tcPr>
+          <w:p>
+            <w:r>
+              <w:rPr>
+                <w:sz w:val="18"/>
+              </w:rPr>
+              <w:t>Process (or re-process) the next file from OCAP_Logs; deletes any existing rows for that file before writing, making every run idempotent; archives the file to OCAP_Logs_Archive on completion</w:t>
+            </w:r>
+          </w:p>
+        </w:tc>
+      </w:tr>
+    </w:tbl>
+    <w:p/>
+    <w:p>
+      <w:pPr>
+        <w:pStyle w:val="Heading2"/>
+      </w:pPr>
+      <w:r>
+        <w:t>D.4 Unknown Entity Resolution</w:t>
+      </w:r>
+    </w:p>
+    <w:p>
+      <w:pPr>
+        <w:spacing w:after="80"/>
+      </w:pPr>
+      <w:r>
+        <w:rPr>
+          <w:b w:val="0"/>
+          <w:i w:val="0"/>
+        </w:rPr>
+        <w:t>OCAP sometimes records entities without a name (e.g. players who disconnect before their name is synced). The script attempts to resolve these automatically:</w:t>
+      </w:r>
+    </w:p>
+    <w:p>
+      <w:pPr>
+        <w:pStyle w:val="ListBullet"/>
+        <w:spacing w:after="40"/>
+        <w:ind w:left="360"/>
+      </w:pPr>
+      <w:r>
+        <w:rPr>
+          <w:sz w:val="20"/>
+        </w:rPr>
+        <w:t>Unnamed entities with &lt; 1 hour playtime are skipped entirely (reconnect ghosts, JIP artefacts).</w:t>
+      </w:r>
+    </w:p>
+    <w:p>
+      <w:pPr>
+        <w:pStyle w:val="ListBullet"/>
+        <w:spacing w:after="40"/>
+        <w:ind w:left="360"/>
+      </w:pPr>
+      <w:r>
+        <w:rPr>
+          <w:sz w:val="20"/>
+        </w:rPr>
+        <w:t>Remaining unknown entities are matched against named players who share the same group and role in the same mission.</w:t>
+      </w:r>
+    </w:p>
+    <w:p>
+      <w:pPr>
+        <w:pStyle w:val="ListBullet"/>
+        <w:spacing w:after="40"/>
+        <w:ind w:left="360"/>
+      </w:pPr>
+      <w:r>
+        <w:rPr>
+          <w:sz w:val="20"/>
+        </w:rPr>
+        <w:t>If exactly one named player maps to that group+role (after deduplicating candidates from reconnects), the unknown entity is renamed to that player.</w:t>
+      </w:r>
+    </w:p>
+    <w:p>
+      <w:pPr>
+        <w:pStyle w:val="ListBullet"/>
+        <w:spacing w:after="40"/>
+        <w:ind w:left="360"/>
+      </w:pPr>
+      <w:r>
+        <w:rPr>
+          <w:sz w:val="20"/>
+        </w:rPr>
+        <w:t>If a role string contains "@username" (e.g. "Rifleman@Zeus"), the script correctly detects it as a Zeus role.</w:t>
+      </w:r>
+    </w:p>
+    <w:p/>
+    <w:p>
+      <w:pPr>
+        <w:pStyle w:val="Heading2"/>
+      </w:pPr>
+      <w:r>
+        <w:t>D.5 Friendly Fire Counting</w:t>
+      </w:r>
+    </w:p>
+    <w:p>
+      <w:pPr>
+        <w:spacing w:after="120"/>
+      </w:pPr>
+      <w:r>
+        <w:rPr>
+          <w:b w:val="0"/>
+          <w:i w:val="0"/>
+        </w:rPr>
+        <w:t>A kill is counted as a teamkill when victim.side === killer.side on a unit-kill event. It is never counted as a regular kill or weapon kill. Vehicle destructions are never counted as teamkills regardless of side.</w:t>
+      </w:r>
+    </w:p>
+    <w:p>
+      <w:pPr>
+        <w:pStyle w:val="Heading2"/>
+      </w:pPr>
+      <w:r>
+        <w:t>D.6 Sheet Schema</w:t>
+      </w:r>
+    </w:p>
+    <w:p>
+      <w:pPr>
+        <w:spacing w:after="120"/>
+      </w:pPr>
+      <w:r>
+        <w:rPr>
+          <w:b w:val="0"/>
+          <w:i w:val="0"/>
+        </w:rPr>
+        <w:t>The script writes one row per player per mission. See §3.2 Expected Column Schema for the full column list. The sheet and header row are created automatically on first run; missing columns are migrated when the script is run against an existing sheet.</w:t>
+      </w:r>
+    </w:p>
+    <w:p>
+      <w:r>
+        <w:br w:type="page"/>
+      </w:r>
+    </w:p>
+    <w:p>
+      <w:pPr>
+        <w:pStyle w:val="Heading1"/>
+      </w:pPr>
+      <w:r>
+        <w:t>Changelog</w:t>
+      </w:r>
+    </w:p>
+    <w:p>
+      <w:pPr>
+        <w:spacing w:after="80"/>
+      </w:pPr>
+      <w:r>
+        <w:rPr>
+          <w:b w:val="0"/>
+          <w:i w:val="0"/>
+        </w:rPr>
+        <w:t>A full history of changes — new features, fixes, and breaking changes — is maintained in CHANGELOG.md at the root of the repository.</w:t>
+      </w:r>
+    </w:p>
+    <w:p>
+      <w:pPr>
+        <w:spacing w:after="120"/>
+      </w:pPr>
+      <w:r>
+        <w:rPr>
+          <w:b w:val="0"/>
+          <w:i/>
+        </w:rPr>
+        <w:t>GitHub: https://github.com/loltorres9/TFP_KillTracker/blob/main/CHANGELOG.md</w:t>
       </w:r>
     </w:p>
     <w:sectPr>

</xml_diff>

<commit_message>
Deploying to gh-pages from @ loltorres9/TFP_KillTracker@fd4452bafc58436827975e294c2032cebcb13084 🚀
</commit_message>
<xml_diff>
--- a/TFP_KillTracker_Technical_Documentation.docx
+++ b/TFP_KillTracker_Technical_Documentation.docx
@@ -39,7 +39,7 @@
         <w:rPr>
           <w:sz w:val="22"/>
         </w:rPr>
-        <w:t>Version 1.1  ·  21 March 2026</w:t>
+        <w:t>Version 1.2  ·  21 March 2026</w:t>
       </w:r>
     </w:p>
     <w:p>
@@ -17101,7 +17101,244 @@
         <w:pStyle w:val="Heading2"/>
       </w:pPr>
       <w:r>
-        <w:t>D.6 Sheet Schema</w:t>
+        <w:t>D.6 End-of-Mission TK Suppression</w:t>
+      </w:r>
+    </w:p>
+    <w:p>
+      <w:pPr>
+        <w:spacing w:after="80"/>
+      </w:pPr>
+      <w:r>
+        <w:rPr>
+          <w:b w:val="0"/>
+          <w:i w:val="0"/>
+        </w:rPr>
+        <w:t>Teamkills that occur during end-of-mission celebrations (players shooting each other or dropping grenades after the mission is won) are automatically excluded. Three overlapping heuristics are evaluated for each same-side kill event:</w:t>
+      </w:r>
+    </w:p>
+    <w:tbl>
+      <w:tblPr>
+        <w:tblStyle w:val="TableGrid"/>
+        <w:tblW w:type="auto" w:w="0"/>
+        <w:jc w:val="left"/>
+        <w:tblLook w:firstColumn="1" w:firstRow="1" w:lastColumn="0" w:lastRow="0" w:noHBand="0" w:noVBand="1" w:val="04A0"/>
+      </w:tblPr>
+      <w:tblGrid>
+        <w:gridCol w:w="3135"/>
+        <w:gridCol w:w="3135"/>
+        <w:gridCol w:w="3135"/>
+      </w:tblGrid>
+      <w:tr>
+        <w:tc>
+          <w:tcPr>
+            <w:tcW w:type="dxa" w:w="3135"/>
+            <w:shd w:val="clear" w:color="auto" w:fill="2E4057"/>
+          </w:tcPr>
+          <w:p>
+            <w:pPr>
+              <w:jc w:val="center"/>
+            </w:pPr>
+            <w:r>
+              <w:rPr>
+                <w:b/>
+                <w:color w:val="FFFFFF"/>
+                <w:sz w:val="18"/>
+              </w:rPr>
+              <w:t>Heuristic</w:t>
+            </w:r>
+          </w:p>
+        </w:tc>
+        <w:tc>
+          <w:tcPr>
+            <w:tcW w:type="dxa" w:w="3135"/>
+            <w:shd w:val="clear" w:color="auto" w:fill="2E4057"/>
+          </w:tcPr>
+          <w:p>
+            <w:pPr>
+              <w:jc w:val="center"/>
+            </w:pPr>
+            <w:r>
+              <w:rPr>
+                <w:b/>
+                <w:color w:val="FFFFFF"/>
+                <w:sz w:val="18"/>
+              </w:rPr>
+              <w:t>Condition</w:t>
+            </w:r>
+          </w:p>
+        </w:tc>
+        <w:tc>
+          <w:tcPr>
+            <w:tcW w:type="dxa" w:w="3135"/>
+            <w:shd w:val="clear" w:color="auto" w:fill="2E4057"/>
+          </w:tcPr>
+          <w:p>
+            <w:pPr>
+              <w:jc w:val="center"/>
+            </w:pPr>
+            <w:r>
+              <w:rPr>
+                <w:b/>
+                <w:color w:val="FFFFFF"/>
+                <w:sz w:val="18"/>
+              </w:rPr>
+              <w:t>Rationale</w:t>
+            </w:r>
+          </w:p>
+        </w:tc>
+      </w:tr>
+      <w:tr>
+        <w:tc>
+          <w:tcPr>
+            <w:tcW w:type="dxa" w:w="3135"/>
+            <w:shd w:val="clear" w:color="auto" w:fill="FFFFFF"/>
+          </w:tcPr>
+          <w:p>
+            <w:r>
+              <w:rPr>
+                <w:sz w:val="18"/>
+              </w:rPr>
+              <w:t>Time window</w:t>
+            </w:r>
+          </w:p>
+        </w:tc>
+        <w:tc>
+          <w:tcPr>
+            <w:tcW w:type="dxa" w:w="3135"/>
+            <w:shd w:val="clear" w:color="auto" w:fill="FFFFFF"/>
+          </w:tcPr>
+          <w:p>
+            <w:r>
+              <w:rPr>
+                <w:sz w:val="18"/>
+              </w:rPr>
+              <w:t>TK occurs in the last 2 min (120 s) before endMission</w:t>
+            </w:r>
+          </w:p>
+        </w:tc>
+        <w:tc>
+          <w:tcPr>
+            <w:tcW w:type="dxa" w:w="3135"/>
+            <w:shd w:val="clear" w:color="auto" w:fill="FFFFFF"/>
+          </w:tcPr>
+          <w:p>
+            <w:r>
+              <w:rPr>
+                <w:sz w:val="18"/>
+              </w:rPr>
+              <w:t>Hard cutoff — mission is officially over</w:t>
+            </w:r>
+          </w:p>
+        </w:tc>
+      </w:tr>
+      <w:tr>
+        <w:tc>
+          <w:tcPr>
+            <w:tcW w:type="dxa" w:w="3135"/>
+            <w:shd w:val="clear" w:color="auto" w:fill="F0F4FA"/>
+          </w:tcPr>
+          <w:p>
+            <w:r>
+              <w:rPr>
+                <w:sz w:val="18"/>
+              </w:rPr>
+              <w:t>Close-range extended</w:t>
+            </w:r>
+          </w:p>
+        </w:tc>
+        <w:tc>
+          <w:tcPr>
+            <w:tcW w:type="dxa" w:w="3135"/>
+            <w:shd w:val="clear" w:color="auto" w:fill="F0F4FA"/>
+          </w:tcPr>
+          <w:p>
+            <w:r>
+              <w:rPr>
+                <w:sz w:val="18"/>
+              </w:rPr>
+              <w:t>Distance ≤ 15 m AND within last 3 min (180 s) of endMission</w:t>
+            </w:r>
+          </w:p>
+        </w:tc>
+        <w:tc>
+          <w:tcPr>
+            <w:tcW w:type="dxa" w:w="3135"/>
+            <w:shd w:val="clear" w:color="auto" w:fill="F0F4FA"/>
+          </w:tcPr>
+          <w:p>
+            <w:r>
+              <w:rPr>
+                <w:sz w:val="18"/>
+              </w:rPr>
+              <w:t>Grenade drops / pistol shots just before the end event fires</w:t>
+            </w:r>
+          </w:p>
+        </w:tc>
+      </w:tr>
+      <w:tr>
+        <w:tc>
+          <w:tcPr>
+            <w:tcW w:type="dxa" w:w="3135"/>
+            <w:shd w:val="clear" w:color="auto" w:fill="FFFFFF"/>
+          </w:tcPr>
+          <w:p>
+            <w:r>
+              <w:rPr>
+                <w:sz w:val="18"/>
+              </w:rPr>
+              <w:t>Burst detection</w:t>
+            </w:r>
+          </w:p>
+        </w:tc>
+        <w:tc>
+          <w:tcPr>
+            <w:tcW w:type="dxa" w:w="3135"/>
+            <w:shd w:val="clear" w:color="auto" w:fill="FFFFFF"/>
+          </w:tcPr>
+          <w:p>
+            <w:r>
+              <w:rPr>
+                <w:sz w:val="18"/>
+              </w:rPr>
+              <w:t>3 or more TKs fall within any 60-second rolling window</w:t>
+            </w:r>
+          </w:p>
+        </w:tc>
+        <w:tc>
+          <w:tcPr>
+            <w:tcW w:type="dxa" w:w="3135"/>
+            <w:shd w:val="clear" w:color="auto" w:fill="FFFFFF"/>
+          </w:tcPr>
+          <w:p>
+            <w:r>
+              <w:rPr>
+                <w:sz w:val="18"/>
+              </w:rPr>
+              <w:t>Group grenade throw or celebration volley earlier in the timeline</w:t>
+            </w:r>
+          </w:p>
+        </w:tc>
+      </w:tr>
+    </w:tbl>
+    <w:p/>
+    <w:p>
+      <w:pPr>
+        <w:spacing w:after="120"/>
+      </w:pPr>
+      <w:r>
+        <w:rPr>
+          <w:b w:val="0"/>
+          <w:i w:val="0"/>
+        </w:rPr>
+        <w:t>The endMission frame is read from the endMission event in the OCAP event stream; if absent, data.endFrame is used as a fallback. All thresholds are named constants at the top of the suppression block and can be tuned independently.</w:t>
+      </w:r>
+    </w:p>
+    <w:p>
+      <w:pPr>
+        <w:pStyle w:val="Heading2"/>
+      </w:pPr>
+      <w:r>
+        <w:t>D.7 Sheet Schema</w:t>
       </w:r>
     </w:p>
     <w:p>

</xml_diff>

<commit_message>
v1.021 — Version bump and full documentation update
Bump version to 1.021, release date to 2026-03-30.

CHANGELOG: add v1.021 entry (Hits/Kill in Mission History).
README: update Mission History description and column schema
  (cols 13–33 renumbered; Hits Dealt On Foot col 13, In Vehicle col 25).
generate_docs.py: bump doc version to 1.3; update schema table with new
  Hits Dealt columns; add Hits Dealt + Accuracy to infantry stats card
  and leaderboard column list.

https://claude.ai/code/session_01LeCW8ZtNT8f2MnVa6wEGBx
</commit_message>
<xml_diff>
--- a/TFP_KillTracker_Technical_Documentation.docx
+++ b/TFP_KillTracker_Technical_Documentation.docx
@@ -39,7 +39,7 @@
         <w:rPr>
           <w:sz w:val="22"/>
         </w:rPr>
-        <w:t>Version 1.2  ·  30 March 2026</w:t>
+        <w:t>Version 1.3  ·  30 March 2026</w:t>
       </w:r>
     </w:p>
     <w:p>
@@ -3021,21 +3021,21 @@
               <w:rPr>
                 <w:sz w:val="18"/>
               </w:rPr>
-              <w:t>Shots/Kill (On Foot)</w:t>
-            </w:r>
-          </w:p>
-        </w:tc>
-        <w:tc>
-          <w:tcPr>
-            <w:tcW w:type="dxa" w:w="3135"/>
-            <w:shd w:val="clear" w:color="auto" w:fill="F0F4FA"/>
-          </w:tcPr>
-          <w:p>
-            <w:r>
-              <w:rPr>
-                <w:sz w:val="18"/>
-              </w:rPr>
-              <w:t>Ignored — recomputed</w:t>
+              <w:t>Hits Dealt (On Foot)</w:t>
+            </w:r>
+          </w:p>
+        </w:tc>
+        <w:tc>
+          <w:tcPr>
+            <w:tcW w:type="dxa" w:w="3135"/>
+            <w:shd w:val="clear" w:color="auto" w:fill="F0F4FA"/>
+          </w:tcPr>
+          <w:p>
+            <w:r>
+              <w:rPr>
+                <w:sz w:val="18"/>
+              </w:rPr>
+              <w:t>Outgoing hits registered on any target while on foot</w:t>
             </w:r>
           </w:p>
         </w:tc>
@@ -3065,21 +3065,21 @@
               <w:rPr>
                 <w:sz w:val="18"/>
               </w:rPr>
-              <w:t>Avg Kill Dist On Foot (m)</w:t>
-            </w:r>
-          </w:p>
-        </w:tc>
-        <w:tc>
-          <w:tcPr>
-            <w:tcW w:type="dxa" w:w="3135"/>
-            <w:shd w:val="clear" w:color="auto" w:fill="FFFFFF"/>
-          </w:tcPr>
-          <w:p>
-            <w:r>
-              <w:rPr>
-                <w:sz w:val="18"/>
-              </w:rPr>
-              <w:t>Average kill distance (on foot)</w:t>
+              <w:t>Shots/Kill (On Foot)</w:t>
+            </w:r>
+          </w:p>
+        </w:tc>
+        <w:tc>
+          <w:tcPr>
+            <w:tcW w:type="dxa" w:w="3135"/>
+            <w:shd w:val="clear" w:color="auto" w:fill="FFFFFF"/>
+          </w:tcPr>
+          <w:p>
+            <w:r>
+              <w:rPr>
+                <w:sz w:val="18"/>
+              </w:rPr>
+              <w:t>Ignored — recomputed</w:t>
             </w:r>
           </w:p>
         </w:tc>
@@ -3109,21 +3109,21 @@
               <w:rPr>
                 <w:sz w:val="18"/>
               </w:rPr>
-              <w:t>Longest Kill On Foot (m)</w:t>
-            </w:r>
-          </w:p>
-        </w:tc>
-        <w:tc>
-          <w:tcPr>
-            <w:tcW w:type="dxa" w:w="3135"/>
-            <w:shd w:val="clear" w:color="auto" w:fill="F0F4FA"/>
-          </w:tcPr>
-          <w:p>
-            <w:r>
-              <w:rPr>
-                <w:sz w:val="18"/>
-              </w:rPr>
-              <w:t>Longest single kill distance (on foot)</w:t>
+              <w:t>Avg Kill Dist On Foot (m)</w:t>
+            </w:r>
+          </w:p>
+        </w:tc>
+        <w:tc>
+          <w:tcPr>
+            <w:tcW w:type="dxa" w:w="3135"/>
+            <w:shd w:val="clear" w:color="auto" w:fill="F0F4FA"/>
+          </w:tcPr>
+          <w:p>
+            <w:r>
+              <w:rPr>
+                <w:sz w:val="18"/>
+              </w:rPr>
+              <w:t>Average kill distance (on foot)</w:t>
             </w:r>
           </w:p>
         </w:tc>
@@ -3153,21 +3153,21 @@
               <w:rPr>
                 <w:sz w:val="18"/>
               </w:rPr>
-              <w:t>Kills (In Vehicle)</w:t>
-            </w:r>
-          </w:p>
-        </w:tc>
-        <w:tc>
-          <w:tcPr>
-            <w:tcW w:type="dxa" w:w="3135"/>
-            <w:shd w:val="clear" w:color="auto" w:fill="FFFFFF"/>
-          </w:tcPr>
-          <w:p>
-            <w:r>
-              <w:rPr>
-                <w:sz w:val="18"/>
-              </w:rPr>
-              <w:t>Vehicle kills</w:t>
+              <w:t>Longest Kill On Foot (m)</w:t>
+            </w:r>
+          </w:p>
+        </w:tc>
+        <w:tc>
+          <w:tcPr>
+            <w:tcW w:type="dxa" w:w="3135"/>
+            <w:shd w:val="clear" w:color="auto" w:fill="FFFFFF"/>
+          </w:tcPr>
+          <w:p>
+            <w:r>
+              <w:rPr>
+                <w:sz w:val="18"/>
+              </w:rPr>
+              <w:t>Longest single kill distance (on foot)</w:t>
             </w:r>
           </w:p>
         </w:tc>
@@ -3197,21 +3197,21 @@
               <w:rPr>
                 <w:sz w:val="18"/>
               </w:rPr>
-              <w:t>Deaths (In Vehicle)</w:t>
-            </w:r>
-          </w:p>
-        </w:tc>
-        <w:tc>
-          <w:tcPr>
-            <w:tcW w:type="dxa" w:w="3135"/>
-            <w:shd w:val="clear" w:color="auto" w:fill="F0F4FA"/>
-          </w:tcPr>
-          <w:p>
-            <w:r>
-              <w:rPr>
-                <w:sz w:val="18"/>
-              </w:rPr>
-              <w:t>Deaths while in vehicle</w:t>
+              <w:t>Kills (In Vehicle)</w:t>
+            </w:r>
+          </w:p>
+        </w:tc>
+        <w:tc>
+          <w:tcPr>
+            <w:tcW w:type="dxa" w:w="3135"/>
+            <w:shd w:val="clear" w:color="auto" w:fill="F0F4FA"/>
+          </w:tcPr>
+          <w:p>
+            <w:r>
+              <w:rPr>
+                <w:sz w:val="18"/>
+              </w:rPr>
+              <w:t>Vehicle kills</w:t>
             </w:r>
           </w:p>
         </w:tc>
@@ -3241,21 +3241,21 @@
               <w:rPr>
                 <w:sz w:val="18"/>
               </w:rPr>
-              <w:t>K/D (In Vehicle)</w:t>
-            </w:r>
-          </w:p>
-        </w:tc>
-        <w:tc>
-          <w:tcPr>
-            <w:tcW w:type="dxa" w:w="3135"/>
-            <w:shd w:val="clear" w:color="auto" w:fill="FFFFFF"/>
-          </w:tcPr>
-          <w:p>
-            <w:r>
-              <w:rPr>
-                <w:sz w:val="18"/>
-              </w:rPr>
-              <w:t>Ignored — recomputed</w:t>
+              <w:t>Deaths (In Vehicle)</w:t>
+            </w:r>
+          </w:p>
+        </w:tc>
+        <w:tc>
+          <w:tcPr>
+            <w:tcW w:type="dxa" w:w="3135"/>
+            <w:shd w:val="clear" w:color="auto" w:fill="FFFFFF"/>
+          </w:tcPr>
+          <w:p>
+            <w:r>
+              <w:rPr>
+                <w:sz w:val="18"/>
+              </w:rPr>
+              <w:t>Deaths while in vehicle</w:t>
             </w:r>
           </w:p>
         </w:tc>
@@ -3285,21 +3285,21 @@
               <w:rPr>
                 <w:sz w:val="18"/>
               </w:rPr>
-              <w:t>Teamkills (In Vehicle)</w:t>
-            </w:r>
-          </w:p>
-        </w:tc>
-        <w:tc>
-          <w:tcPr>
-            <w:tcW w:type="dxa" w:w="3135"/>
-            <w:shd w:val="clear" w:color="auto" w:fill="F0F4FA"/>
-          </w:tcPr>
-          <w:p>
-            <w:r>
-              <w:rPr>
-                <w:sz w:val="18"/>
-              </w:rPr>
-              <w:t>Friendly fire from vehicle</w:t>
+              <w:t>K/D (In Vehicle)</w:t>
+            </w:r>
+          </w:p>
+        </w:tc>
+        <w:tc>
+          <w:tcPr>
+            <w:tcW w:type="dxa" w:w="3135"/>
+            <w:shd w:val="clear" w:color="auto" w:fill="F0F4FA"/>
+          </w:tcPr>
+          <w:p>
+            <w:r>
+              <w:rPr>
+                <w:sz w:val="18"/>
+              </w:rPr>
+              <w:t>Ignored — recomputed</w:t>
             </w:r>
           </w:p>
         </w:tc>
@@ -3329,21 +3329,21 @@
               <w:rPr>
                 <w:sz w:val="18"/>
               </w:rPr>
-              <w:t>Vehicle Kills (On Foot)</w:t>
-            </w:r>
-          </w:p>
-        </w:tc>
-        <w:tc>
-          <w:tcPr>
-            <w:tcW w:type="dxa" w:w="3135"/>
-            <w:shd w:val="clear" w:color="auto" w:fill="FFFFFF"/>
-          </w:tcPr>
-          <w:p>
-            <w:r>
-              <w:rPr>
-                <w:sz w:val="18"/>
-              </w:rPr>
-              <w:t>Vehicles destroyed while on foot</w:t>
+              <w:t>Teamkills (In Vehicle)</w:t>
+            </w:r>
+          </w:p>
+        </w:tc>
+        <w:tc>
+          <w:tcPr>
+            <w:tcW w:type="dxa" w:w="3135"/>
+            <w:shd w:val="clear" w:color="auto" w:fill="FFFFFF"/>
+          </w:tcPr>
+          <w:p>
+            <w:r>
+              <w:rPr>
+                <w:sz w:val="18"/>
+              </w:rPr>
+              <w:t>Friendly fire from vehicle</w:t>
             </w:r>
           </w:p>
         </w:tc>
@@ -3373,21 +3373,21 @@
               <w:rPr>
                 <w:sz w:val="18"/>
               </w:rPr>
-              <w:t>Vehicle Kills (In Vehicle)</w:t>
-            </w:r>
-          </w:p>
-        </w:tc>
-        <w:tc>
-          <w:tcPr>
-            <w:tcW w:type="dxa" w:w="3135"/>
-            <w:shd w:val="clear" w:color="auto" w:fill="F0F4FA"/>
-          </w:tcPr>
-          <w:p>
-            <w:r>
-              <w:rPr>
-                <w:sz w:val="18"/>
-              </w:rPr>
-              <w:t>Vehicles destroyed while mounted</w:t>
+              <w:t>Vehicle Kills (On Foot)</w:t>
+            </w:r>
+          </w:p>
+        </w:tc>
+        <w:tc>
+          <w:tcPr>
+            <w:tcW w:type="dxa" w:w="3135"/>
+            <w:shd w:val="clear" w:color="auto" w:fill="F0F4FA"/>
+          </w:tcPr>
+          <w:p>
+            <w:r>
+              <w:rPr>
+                <w:sz w:val="18"/>
+              </w:rPr>
+              <w:t>Vehicles destroyed while on foot</w:t>
             </w:r>
           </w:p>
         </w:tc>
@@ -3417,21 +3417,21 @@
               <w:rPr>
                 <w:sz w:val="18"/>
               </w:rPr>
-              <w:t>Shots (In Vehicle)</w:t>
-            </w:r>
-          </w:p>
-        </w:tc>
-        <w:tc>
-          <w:tcPr>
-            <w:tcW w:type="dxa" w:w="3135"/>
-            <w:shd w:val="clear" w:color="auto" w:fill="FFFFFF"/>
-          </w:tcPr>
-          <w:p>
-            <w:r>
-              <w:rPr>
-                <w:sz w:val="18"/>
-              </w:rPr>
-              <w:t>Rounds fired from vehicle</w:t>
+              <w:t>Vehicle Kills (In Vehicle)</w:t>
+            </w:r>
+          </w:p>
+        </w:tc>
+        <w:tc>
+          <w:tcPr>
+            <w:tcW w:type="dxa" w:w="3135"/>
+            <w:shd w:val="clear" w:color="auto" w:fill="FFFFFF"/>
+          </w:tcPr>
+          <w:p>
+            <w:r>
+              <w:rPr>
+                <w:sz w:val="18"/>
+              </w:rPr>
+              <w:t>Vehicles destroyed while mounted</w:t>
             </w:r>
           </w:p>
         </w:tc>
@@ -3461,21 +3461,21 @@
               <w:rPr>
                 <w:sz w:val="18"/>
               </w:rPr>
-              <w:t>Hits Taken (In Vehicle)</w:t>
-            </w:r>
-          </w:p>
-        </w:tc>
-        <w:tc>
-          <w:tcPr>
-            <w:tcW w:type="dxa" w:w="3135"/>
-            <w:shd w:val="clear" w:color="auto" w:fill="F0F4FA"/>
-          </w:tcPr>
-          <w:p>
-            <w:r>
-              <w:rPr>
-                <w:sz w:val="18"/>
-              </w:rPr>
-              <w:t>Times vehicle was hit</w:t>
+              <w:t>Shots (In Vehicle)</w:t>
+            </w:r>
+          </w:p>
+        </w:tc>
+        <w:tc>
+          <w:tcPr>
+            <w:tcW w:type="dxa" w:w="3135"/>
+            <w:shd w:val="clear" w:color="auto" w:fill="F0F4FA"/>
+          </w:tcPr>
+          <w:p>
+            <w:r>
+              <w:rPr>
+                <w:sz w:val="18"/>
+              </w:rPr>
+              <w:t>Rounds fired from vehicle</w:t>
             </w:r>
           </w:p>
         </w:tc>
@@ -3505,21 +3505,21 @@
               <w:rPr>
                 <w:sz w:val="18"/>
               </w:rPr>
-              <w:t>Shots/Kill (In Vehicle)</w:t>
-            </w:r>
-          </w:p>
-        </w:tc>
-        <w:tc>
-          <w:tcPr>
-            <w:tcW w:type="dxa" w:w="3135"/>
-            <w:shd w:val="clear" w:color="auto" w:fill="FFFFFF"/>
-          </w:tcPr>
-          <w:p>
-            <w:r>
-              <w:rPr>
-                <w:sz w:val="18"/>
-              </w:rPr>
-              <w:t>Ignored — recomputed</w:t>
+              <w:t>Hits Taken (In Vehicle)</w:t>
+            </w:r>
+          </w:p>
+        </w:tc>
+        <w:tc>
+          <w:tcPr>
+            <w:tcW w:type="dxa" w:w="3135"/>
+            <w:shd w:val="clear" w:color="auto" w:fill="FFFFFF"/>
+          </w:tcPr>
+          <w:p>
+            <w:r>
+              <w:rPr>
+                <w:sz w:val="18"/>
+              </w:rPr>
+              <w:t>Times vehicle was hit</w:t>
             </w:r>
           </w:p>
         </w:tc>
@@ -3549,21 +3549,21 @@
               <w:rPr>
                 <w:sz w:val="18"/>
               </w:rPr>
-              <w:t>Avg Kill Dist In Vehicle (m)</w:t>
-            </w:r>
-          </w:p>
-        </w:tc>
-        <w:tc>
-          <w:tcPr>
-            <w:tcW w:type="dxa" w:w="3135"/>
-            <w:shd w:val="clear" w:color="auto" w:fill="F0F4FA"/>
-          </w:tcPr>
-          <w:p>
-            <w:r>
-              <w:rPr>
-                <w:sz w:val="18"/>
-              </w:rPr>
-              <w:t>Average kill distance (vehicle)</w:t>
+              <w:t>Hits Dealt (In Vehicle)</w:t>
+            </w:r>
+          </w:p>
+        </w:tc>
+        <w:tc>
+          <w:tcPr>
+            <w:tcW w:type="dxa" w:w="3135"/>
+            <w:shd w:val="clear" w:color="auto" w:fill="F0F4FA"/>
+          </w:tcPr>
+          <w:p>
+            <w:r>
+              <w:rPr>
+                <w:sz w:val="18"/>
+              </w:rPr>
+              <w:t>Outgoing hits registered on any target while mounted</w:t>
             </w:r>
           </w:p>
         </w:tc>
@@ -3593,21 +3593,21 @@
               <w:rPr>
                 <w:sz w:val="18"/>
               </w:rPr>
-              <w:t>Longest Kill In Vehicle (m)</w:t>
-            </w:r>
-          </w:p>
-        </w:tc>
-        <w:tc>
-          <w:tcPr>
-            <w:tcW w:type="dxa" w:w="3135"/>
-            <w:shd w:val="clear" w:color="auto" w:fill="FFFFFF"/>
-          </w:tcPr>
-          <w:p>
-            <w:r>
-              <w:rPr>
-                <w:sz w:val="18"/>
-              </w:rPr>
-              <w:t>Longest single kill distance (vehicle)</w:t>
+              <w:t>Shots/Kill (In Vehicle)</w:t>
+            </w:r>
+          </w:p>
+        </w:tc>
+        <w:tc>
+          <w:tcPr>
+            <w:tcW w:type="dxa" w:w="3135"/>
+            <w:shd w:val="clear" w:color="auto" w:fill="FFFFFF"/>
+          </w:tcPr>
+          <w:p>
+            <w:r>
+              <w:rPr>
+                <w:sz w:val="18"/>
+              </w:rPr>
+              <w:t>Ignored — recomputed</w:t>
             </w:r>
           </w:p>
         </w:tc>
@@ -3637,21 +3637,21 @@
               <w:rPr>
                 <w:sz w:val="18"/>
               </w:rPr>
-              <w:t>Top Weapon</w:t>
-            </w:r>
-          </w:p>
-        </w:tc>
-        <w:tc>
-          <w:tcPr>
-            <w:tcW w:type="dxa" w:w="3135"/>
-            <w:shd w:val="clear" w:color="auto" w:fill="F0F4FA"/>
-          </w:tcPr>
-          <w:p>
-            <w:r>
-              <w:rPr>
-                <w:sz w:val="18"/>
-              </w:rPr>
-              <w:t>Weapon used for the longest kill; shown on award cards</w:t>
+              <w:t>Avg Kill Dist In Vehicle (m)</w:t>
+            </w:r>
+          </w:p>
+        </w:tc>
+        <w:tc>
+          <w:tcPr>
+            <w:tcW w:type="dxa" w:w="3135"/>
+            <w:shd w:val="clear" w:color="auto" w:fill="F0F4FA"/>
+          </w:tcPr>
+          <w:p>
+            <w:r>
+              <w:rPr>
+                <w:sz w:val="18"/>
+              </w:rPr>
+              <w:t>Average kill distance (vehicle)</w:t>
             </w:r>
           </w:p>
         </w:tc>
@@ -3681,21 +3681,21 @@
               <w:rPr>
                 <w:sz w:val="18"/>
               </w:rPr>
-              <w:t>Weapon Kills (JSON)</w:t>
-            </w:r>
-          </w:p>
-        </w:tc>
-        <w:tc>
-          <w:tcPr>
-            <w:tcW w:type="dxa" w:w="3135"/>
-            <w:shd w:val="clear" w:color="auto" w:fill="FFFFFF"/>
-          </w:tcPr>
-          <w:p>
-            <w:r>
-              <w:rPr>
-                <w:sz w:val="18"/>
-              </w:rPr>
-              <w:t>JSON object: {"WeaponName [MagType]": killCount, ...}; quotes preserved during parse</w:t>
+              <w:t>Longest Kill In Vehicle (m)</w:t>
+            </w:r>
+          </w:p>
+        </w:tc>
+        <w:tc>
+          <w:tcPr>
+            <w:tcW w:type="dxa" w:w="3135"/>
+            <w:shd w:val="clear" w:color="auto" w:fill="FFFFFF"/>
+          </w:tcPr>
+          <w:p>
+            <w:r>
+              <w:rPr>
+                <w:sz w:val="18"/>
+              </w:rPr>
+              <w:t>Longest single kill distance (vehicle)</w:t>
             </w:r>
           </w:p>
         </w:tc>
@@ -3725,21 +3725,21 @@
               <w:rPr>
                 <w:sz w:val="18"/>
               </w:rPr>
-              <w:t>Suicides</w:t>
-            </w:r>
-          </w:p>
-        </w:tc>
-        <w:tc>
-          <w:tcPr>
-            <w:tcW w:type="dxa" w:w="3135"/>
-            <w:shd w:val="clear" w:color="auto" w:fill="F0F4FA"/>
-          </w:tcPr>
-          <w:p>
-            <w:r>
-              <w:rPr>
-                <w:sz w:val="18"/>
-              </w:rPr>
-              <w:t>Self-inflicted deaths</w:t>
+              <w:t>Top Weapon</w:t>
+            </w:r>
+          </w:p>
+        </w:tc>
+        <w:tc>
+          <w:tcPr>
+            <w:tcW w:type="dxa" w:w="3135"/>
+            <w:shd w:val="clear" w:color="auto" w:fill="F0F4FA"/>
+          </w:tcPr>
+          <w:p>
+            <w:r>
+              <w:rPr>
+                <w:sz w:val="18"/>
+              </w:rPr>
+              <w:t>Weapon used for the longest kill; shown on award cards</w:t>
             </w:r>
           </w:p>
         </w:tc>
@@ -3769,21 +3769,21 @@
               <w:rPr>
                 <w:sz w:val="18"/>
               </w:rPr>
-              <w:t>Time Played (s)</w:t>
-            </w:r>
-          </w:p>
-        </w:tc>
-        <w:tc>
-          <w:tcPr>
-            <w:tcW w:type="dxa" w:w="3135"/>
-            <w:shd w:val="clear" w:color="auto" w:fill="FFFFFF"/>
-          </w:tcPr>
-          <w:p>
-            <w:r>
-              <w:rPr>
-                <w:sz w:val="18"/>
-              </w:rPr>
-              <w:t>Seconds present in the mission</w:t>
+              <w:t>Weapon Kills (JSON)</w:t>
+            </w:r>
+          </w:p>
+        </w:tc>
+        <w:tc>
+          <w:tcPr>
+            <w:tcW w:type="dxa" w:w="3135"/>
+            <w:shd w:val="clear" w:color="auto" w:fill="FFFFFF"/>
+          </w:tcPr>
+          <w:p>
+            <w:r>
+              <w:rPr>
+                <w:sz w:val="18"/>
+              </w:rPr>
+              <w:t>JSON object: {"WeaponName [MagType]": killCount, ...}; quotes preserved during parse</w:t>
             </w:r>
           </w:p>
         </w:tc>
@@ -3800,6 +3800,94 @@
                 <w:sz w:val="18"/>
               </w:rPr>
               <w:t>31</w:t>
+            </w:r>
+          </w:p>
+        </w:tc>
+        <w:tc>
+          <w:tcPr>
+            <w:tcW w:type="dxa" w:w="3135"/>
+            <w:shd w:val="clear" w:color="auto" w:fill="F0F4FA"/>
+          </w:tcPr>
+          <w:p>
+            <w:r>
+              <w:rPr>
+                <w:sz w:val="18"/>
+              </w:rPr>
+              <w:t>Suicides</w:t>
+            </w:r>
+          </w:p>
+        </w:tc>
+        <w:tc>
+          <w:tcPr>
+            <w:tcW w:type="dxa" w:w="3135"/>
+            <w:shd w:val="clear" w:color="auto" w:fill="F0F4FA"/>
+          </w:tcPr>
+          <w:p>
+            <w:r>
+              <w:rPr>
+                <w:sz w:val="18"/>
+              </w:rPr>
+              <w:t>Self-inflicted deaths</w:t>
+            </w:r>
+          </w:p>
+        </w:tc>
+      </w:tr>
+      <w:tr>
+        <w:tc>
+          <w:tcPr>
+            <w:tcW w:type="dxa" w:w="3135"/>
+            <w:shd w:val="clear" w:color="auto" w:fill="FFFFFF"/>
+          </w:tcPr>
+          <w:p>
+            <w:r>
+              <w:rPr>
+                <w:sz w:val="18"/>
+              </w:rPr>
+              <w:t>32</w:t>
+            </w:r>
+          </w:p>
+        </w:tc>
+        <w:tc>
+          <w:tcPr>
+            <w:tcW w:type="dxa" w:w="3135"/>
+            <w:shd w:val="clear" w:color="auto" w:fill="FFFFFF"/>
+          </w:tcPr>
+          <w:p>
+            <w:r>
+              <w:rPr>
+                <w:sz w:val="18"/>
+              </w:rPr>
+              <w:t>Time Played (s)</w:t>
+            </w:r>
+          </w:p>
+        </w:tc>
+        <w:tc>
+          <w:tcPr>
+            <w:tcW w:type="dxa" w:w="3135"/>
+            <w:shd w:val="clear" w:color="auto" w:fill="FFFFFF"/>
+          </w:tcPr>
+          <w:p>
+            <w:r>
+              <w:rPr>
+                <w:sz w:val="18"/>
+              </w:rPr>
+              <w:t>Seconds present in the mission</w:t>
+            </w:r>
+          </w:p>
+        </w:tc>
+      </w:tr>
+      <w:tr>
+        <w:tc>
+          <w:tcPr>
+            <w:tcW w:type="dxa" w:w="3135"/>
+            <w:shd w:val="clear" w:color="auto" w:fill="F0F4FA"/>
+          </w:tcPr>
+          <w:p>
+            <w:r>
+              <w:rPr>
+                <w:sz w:val="18"/>
+              </w:rPr>
+              <w:t>33</w:t>
             </w:r>
           </w:p>
         </w:tc>
@@ -7311,6 +7399,122 @@
               <w:rPr>
                 <w:sz w:val="18"/>
               </w:rPr>
+              <w:t>Hits Dealt</w:t>
+            </w:r>
+          </w:p>
+        </w:tc>
+        <w:tc>
+          <w:tcPr>
+            <w:tcW w:type="dxa" w:w="2351"/>
+            <w:shd w:val="clear" w:color="auto" w:fill="FFFFFF"/>
+          </w:tcPr>
+          <w:p>
+            <w:r>
+              <w:rPr>
+                <w:sz w:val="18"/>
+              </w:rPr>
+              <w:t>hitsDealtOnFoot</w:t>
+            </w:r>
+          </w:p>
+        </w:tc>
+        <w:tc>
+          <w:tcPr>
+            <w:tcW w:type="dxa" w:w="2351"/>
+            <w:shd w:val="clear" w:color="auto" w:fill="FFFFFF"/>
+          </w:tcPr>
+          <w:p>
+            <w:r>
+              <w:rPr>
+                <w:sz w:val="18"/>
+              </w:rPr>
+              <w:t>desc</w:t>
+            </w:r>
+          </w:p>
+        </w:tc>
+      </w:tr>
+      <w:tr>
+        <w:tc>
+          <w:tcPr>
+            <w:tcW w:type="dxa" w:w="2351"/>
+            <w:shd w:val="clear" w:color="auto" w:fill="F0F4FA"/>
+          </w:tcPr>
+          <w:p>
+            <w:r>
+              <w:rPr>
+                <w:sz w:val="18"/>
+              </w:rPr>
+              <w:t>11</w:t>
+            </w:r>
+          </w:p>
+        </w:tc>
+        <w:tc>
+          <w:tcPr>
+            <w:tcW w:type="dxa" w:w="2351"/>
+            <w:shd w:val="clear" w:color="auto" w:fill="F0F4FA"/>
+          </w:tcPr>
+          <w:p>
+            <w:r>
+              <w:rPr>
+                <w:sz w:val="18"/>
+              </w:rPr>
+              <w:t>Accuracy (%)</w:t>
+            </w:r>
+          </w:p>
+        </w:tc>
+        <w:tc>
+          <w:tcPr>
+            <w:tcW w:type="dxa" w:w="2351"/>
+            <w:shd w:val="clear" w:color="auto" w:fill="F0F4FA"/>
+          </w:tcPr>
+          <w:p>
+            <w:r>
+              <w:rPr>
+                <w:sz w:val="18"/>
+              </w:rPr>
+              <w:t>accuracyFoot</w:t>
+            </w:r>
+          </w:p>
+        </w:tc>
+        <w:tc>
+          <w:tcPr>
+            <w:tcW w:type="dxa" w:w="2351"/>
+            <w:shd w:val="clear" w:color="auto" w:fill="F0F4FA"/>
+          </w:tcPr>
+          <w:p>
+            <w:r>
+              <w:rPr>
+                <w:sz w:val="18"/>
+              </w:rPr>
+              <w:t>desc</w:t>
+            </w:r>
+          </w:p>
+        </w:tc>
+      </w:tr>
+      <w:tr>
+        <w:tc>
+          <w:tcPr>
+            <w:tcW w:type="dxa" w:w="2351"/>
+            <w:shd w:val="clear" w:color="auto" w:fill="FFFFFF"/>
+          </w:tcPr>
+          <w:p>
+            <w:r>
+              <w:rPr>
+                <w:sz w:val="18"/>
+              </w:rPr>
+              <w:t>12</w:t>
+            </w:r>
+          </w:p>
+        </w:tc>
+        <w:tc>
+          <w:tcPr>
+            <w:tcW w:type="dxa" w:w="2351"/>
+            <w:shd w:val="clear" w:color="auto" w:fill="FFFFFF"/>
+          </w:tcPr>
+          <w:p>
+            <w:r>
+              <w:rPr>
+                <w:sz w:val="18"/>
+              </w:rPr>
               <w:t>Shots/Kill</w:t>
             </w:r>
           </w:p>
@@ -8211,7 +8415,7 @@
               <w:rPr>
                 <w:sz w:val="18"/>
               </w:rPr>
-              <w:t>Grid of stat cards: Kills, Deaths, K/D, TK, Shots, Hits Taken, Shots/Kill, Avg Dist, Longest Kill, Missions, Suicides</w:t>
+              <w:t>Grid of stat cards: Kills, Deaths, K/D, TK, Shots, Hits Taken, Hits Dealt, Accuracy, Shots/Kill, Avg Dist, Longest Kill, Missions, Suicides</w:t>
             </w:r>
           </w:p>
         </w:tc>

</xml_diff>

<commit_message>
Deploying to gh-pages from @ loltorres9/TFP_KillTracker@ae579c816623d4225c185cb1182ef50697ae4024 🚀
</commit_message>
<xml_diff>
--- a/TFP_KillTracker_Technical_Documentation.docx
+++ b/TFP_KillTracker_Technical_Documentation.docx
@@ -39,7 +39,7 @@
         <w:rPr>
           <w:sz w:val="22"/>
         </w:rPr>
-        <w:t>Version 1.2  ·  22 March 2026</w:t>
+        <w:t>Version 1.3  ·  30 March 2026</w:t>
       </w:r>
     </w:p>
     <w:p>
@@ -3021,21 +3021,21 @@
               <w:rPr>
                 <w:sz w:val="18"/>
               </w:rPr>
-              <w:t>Shots/Kill (On Foot)</w:t>
-            </w:r>
-          </w:p>
-        </w:tc>
-        <w:tc>
-          <w:tcPr>
-            <w:tcW w:type="dxa" w:w="3135"/>
-            <w:shd w:val="clear" w:color="auto" w:fill="F0F4FA"/>
-          </w:tcPr>
-          <w:p>
-            <w:r>
-              <w:rPr>
-                <w:sz w:val="18"/>
-              </w:rPr>
-              <w:t>Ignored — recomputed</w:t>
+              <w:t>Hits Dealt (On Foot)</w:t>
+            </w:r>
+          </w:p>
+        </w:tc>
+        <w:tc>
+          <w:tcPr>
+            <w:tcW w:type="dxa" w:w="3135"/>
+            <w:shd w:val="clear" w:color="auto" w:fill="F0F4FA"/>
+          </w:tcPr>
+          <w:p>
+            <w:r>
+              <w:rPr>
+                <w:sz w:val="18"/>
+              </w:rPr>
+              <w:t>Outgoing hits registered on any target while on foot</w:t>
             </w:r>
           </w:p>
         </w:tc>
@@ -3065,21 +3065,21 @@
               <w:rPr>
                 <w:sz w:val="18"/>
               </w:rPr>
-              <w:t>Avg Kill Dist On Foot (m)</w:t>
-            </w:r>
-          </w:p>
-        </w:tc>
-        <w:tc>
-          <w:tcPr>
-            <w:tcW w:type="dxa" w:w="3135"/>
-            <w:shd w:val="clear" w:color="auto" w:fill="FFFFFF"/>
-          </w:tcPr>
-          <w:p>
-            <w:r>
-              <w:rPr>
-                <w:sz w:val="18"/>
-              </w:rPr>
-              <w:t>Average kill distance (on foot)</w:t>
+              <w:t>Shots/Kill (On Foot)</w:t>
+            </w:r>
+          </w:p>
+        </w:tc>
+        <w:tc>
+          <w:tcPr>
+            <w:tcW w:type="dxa" w:w="3135"/>
+            <w:shd w:val="clear" w:color="auto" w:fill="FFFFFF"/>
+          </w:tcPr>
+          <w:p>
+            <w:r>
+              <w:rPr>
+                <w:sz w:val="18"/>
+              </w:rPr>
+              <w:t>Ignored — recomputed</w:t>
             </w:r>
           </w:p>
         </w:tc>
@@ -3109,21 +3109,21 @@
               <w:rPr>
                 <w:sz w:val="18"/>
               </w:rPr>
-              <w:t>Longest Kill On Foot (m)</w:t>
-            </w:r>
-          </w:p>
-        </w:tc>
-        <w:tc>
-          <w:tcPr>
-            <w:tcW w:type="dxa" w:w="3135"/>
-            <w:shd w:val="clear" w:color="auto" w:fill="F0F4FA"/>
-          </w:tcPr>
-          <w:p>
-            <w:r>
-              <w:rPr>
-                <w:sz w:val="18"/>
-              </w:rPr>
-              <w:t>Longest single kill distance (on foot)</w:t>
+              <w:t>Avg Kill Dist On Foot (m)</w:t>
+            </w:r>
+          </w:p>
+        </w:tc>
+        <w:tc>
+          <w:tcPr>
+            <w:tcW w:type="dxa" w:w="3135"/>
+            <w:shd w:val="clear" w:color="auto" w:fill="F0F4FA"/>
+          </w:tcPr>
+          <w:p>
+            <w:r>
+              <w:rPr>
+                <w:sz w:val="18"/>
+              </w:rPr>
+              <w:t>Average kill distance (on foot)</w:t>
             </w:r>
           </w:p>
         </w:tc>
@@ -3153,21 +3153,21 @@
               <w:rPr>
                 <w:sz w:val="18"/>
               </w:rPr>
-              <w:t>Kills (In Vehicle)</w:t>
-            </w:r>
-          </w:p>
-        </w:tc>
-        <w:tc>
-          <w:tcPr>
-            <w:tcW w:type="dxa" w:w="3135"/>
-            <w:shd w:val="clear" w:color="auto" w:fill="FFFFFF"/>
-          </w:tcPr>
-          <w:p>
-            <w:r>
-              <w:rPr>
-                <w:sz w:val="18"/>
-              </w:rPr>
-              <w:t>Vehicle kills</w:t>
+              <w:t>Longest Kill On Foot (m)</w:t>
+            </w:r>
+          </w:p>
+        </w:tc>
+        <w:tc>
+          <w:tcPr>
+            <w:tcW w:type="dxa" w:w="3135"/>
+            <w:shd w:val="clear" w:color="auto" w:fill="FFFFFF"/>
+          </w:tcPr>
+          <w:p>
+            <w:r>
+              <w:rPr>
+                <w:sz w:val="18"/>
+              </w:rPr>
+              <w:t>Longest single kill distance (on foot)</w:t>
             </w:r>
           </w:p>
         </w:tc>
@@ -3197,21 +3197,21 @@
               <w:rPr>
                 <w:sz w:val="18"/>
               </w:rPr>
-              <w:t>Deaths (In Vehicle)</w:t>
-            </w:r>
-          </w:p>
-        </w:tc>
-        <w:tc>
-          <w:tcPr>
-            <w:tcW w:type="dxa" w:w="3135"/>
-            <w:shd w:val="clear" w:color="auto" w:fill="F0F4FA"/>
-          </w:tcPr>
-          <w:p>
-            <w:r>
-              <w:rPr>
-                <w:sz w:val="18"/>
-              </w:rPr>
-              <w:t>Deaths while in vehicle</w:t>
+              <w:t>Kills (In Vehicle)</w:t>
+            </w:r>
+          </w:p>
+        </w:tc>
+        <w:tc>
+          <w:tcPr>
+            <w:tcW w:type="dxa" w:w="3135"/>
+            <w:shd w:val="clear" w:color="auto" w:fill="F0F4FA"/>
+          </w:tcPr>
+          <w:p>
+            <w:r>
+              <w:rPr>
+                <w:sz w:val="18"/>
+              </w:rPr>
+              <w:t>Vehicle kills</w:t>
             </w:r>
           </w:p>
         </w:tc>
@@ -3241,21 +3241,21 @@
               <w:rPr>
                 <w:sz w:val="18"/>
               </w:rPr>
-              <w:t>K/D (In Vehicle)</w:t>
-            </w:r>
-          </w:p>
-        </w:tc>
-        <w:tc>
-          <w:tcPr>
-            <w:tcW w:type="dxa" w:w="3135"/>
-            <w:shd w:val="clear" w:color="auto" w:fill="FFFFFF"/>
-          </w:tcPr>
-          <w:p>
-            <w:r>
-              <w:rPr>
-                <w:sz w:val="18"/>
-              </w:rPr>
-              <w:t>Ignored — recomputed</w:t>
+              <w:t>Deaths (In Vehicle)</w:t>
+            </w:r>
+          </w:p>
+        </w:tc>
+        <w:tc>
+          <w:tcPr>
+            <w:tcW w:type="dxa" w:w="3135"/>
+            <w:shd w:val="clear" w:color="auto" w:fill="FFFFFF"/>
+          </w:tcPr>
+          <w:p>
+            <w:r>
+              <w:rPr>
+                <w:sz w:val="18"/>
+              </w:rPr>
+              <w:t>Deaths while in vehicle</w:t>
             </w:r>
           </w:p>
         </w:tc>
@@ -3285,21 +3285,21 @@
               <w:rPr>
                 <w:sz w:val="18"/>
               </w:rPr>
-              <w:t>Teamkills (In Vehicle)</w:t>
-            </w:r>
-          </w:p>
-        </w:tc>
-        <w:tc>
-          <w:tcPr>
-            <w:tcW w:type="dxa" w:w="3135"/>
-            <w:shd w:val="clear" w:color="auto" w:fill="F0F4FA"/>
-          </w:tcPr>
-          <w:p>
-            <w:r>
-              <w:rPr>
-                <w:sz w:val="18"/>
-              </w:rPr>
-              <w:t>Friendly fire from vehicle</w:t>
+              <w:t>K/D (In Vehicle)</w:t>
+            </w:r>
+          </w:p>
+        </w:tc>
+        <w:tc>
+          <w:tcPr>
+            <w:tcW w:type="dxa" w:w="3135"/>
+            <w:shd w:val="clear" w:color="auto" w:fill="F0F4FA"/>
+          </w:tcPr>
+          <w:p>
+            <w:r>
+              <w:rPr>
+                <w:sz w:val="18"/>
+              </w:rPr>
+              <w:t>Ignored — recomputed</w:t>
             </w:r>
           </w:p>
         </w:tc>
@@ -3329,21 +3329,21 @@
               <w:rPr>
                 <w:sz w:val="18"/>
               </w:rPr>
-              <w:t>Vehicle Kills (On Foot)</w:t>
-            </w:r>
-          </w:p>
-        </w:tc>
-        <w:tc>
-          <w:tcPr>
-            <w:tcW w:type="dxa" w:w="3135"/>
-            <w:shd w:val="clear" w:color="auto" w:fill="FFFFFF"/>
-          </w:tcPr>
-          <w:p>
-            <w:r>
-              <w:rPr>
-                <w:sz w:val="18"/>
-              </w:rPr>
-              <w:t>Vehicles destroyed while on foot</w:t>
+              <w:t>Teamkills (In Vehicle)</w:t>
+            </w:r>
+          </w:p>
+        </w:tc>
+        <w:tc>
+          <w:tcPr>
+            <w:tcW w:type="dxa" w:w="3135"/>
+            <w:shd w:val="clear" w:color="auto" w:fill="FFFFFF"/>
+          </w:tcPr>
+          <w:p>
+            <w:r>
+              <w:rPr>
+                <w:sz w:val="18"/>
+              </w:rPr>
+              <w:t>Friendly fire from vehicle</w:t>
             </w:r>
           </w:p>
         </w:tc>
@@ -3373,21 +3373,21 @@
               <w:rPr>
                 <w:sz w:val="18"/>
               </w:rPr>
-              <w:t>Vehicle Kills (In Vehicle)</w:t>
-            </w:r>
-          </w:p>
-        </w:tc>
-        <w:tc>
-          <w:tcPr>
-            <w:tcW w:type="dxa" w:w="3135"/>
-            <w:shd w:val="clear" w:color="auto" w:fill="F0F4FA"/>
-          </w:tcPr>
-          <w:p>
-            <w:r>
-              <w:rPr>
-                <w:sz w:val="18"/>
-              </w:rPr>
-              <w:t>Vehicles destroyed while mounted</w:t>
+              <w:t>Vehicle Kills (On Foot)</w:t>
+            </w:r>
+          </w:p>
+        </w:tc>
+        <w:tc>
+          <w:tcPr>
+            <w:tcW w:type="dxa" w:w="3135"/>
+            <w:shd w:val="clear" w:color="auto" w:fill="F0F4FA"/>
+          </w:tcPr>
+          <w:p>
+            <w:r>
+              <w:rPr>
+                <w:sz w:val="18"/>
+              </w:rPr>
+              <w:t>Vehicles destroyed while on foot</w:t>
             </w:r>
           </w:p>
         </w:tc>
@@ -3417,21 +3417,21 @@
               <w:rPr>
                 <w:sz w:val="18"/>
               </w:rPr>
-              <w:t>Shots (In Vehicle)</w:t>
-            </w:r>
-          </w:p>
-        </w:tc>
-        <w:tc>
-          <w:tcPr>
-            <w:tcW w:type="dxa" w:w="3135"/>
-            <w:shd w:val="clear" w:color="auto" w:fill="FFFFFF"/>
-          </w:tcPr>
-          <w:p>
-            <w:r>
-              <w:rPr>
-                <w:sz w:val="18"/>
-              </w:rPr>
-              <w:t>Rounds fired from vehicle</w:t>
+              <w:t>Vehicle Kills (In Vehicle)</w:t>
+            </w:r>
+          </w:p>
+        </w:tc>
+        <w:tc>
+          <w:tcPr>
+            <w:tcW w:type="dxa" w:w="3135"/>
+            <w:shd w:val="clear" w:color="auto" w:fill="FFFFFF"/>
+          </w:tcPr>
+          <w:p>
+            <w:r>
+              <w:rPr>
+                <w:sz w:val="18"/>
+              </w:rPr>
+              <w:t>Vehicles destroyed while mounted</w:t>
             </w:r>
           </w:p>
         </w:tc>
@@ -3461,21 +3461,21 @@
               <w:rPr>
                 <w:sz w:val="18"/>
               </w:rPr>
-              <w:t>Hits Taken (In Vehicle)</w:t>
-            </w:r>
-          </w:p>
-        </w:tc>
-        <w:tc>
-          <w:tcPr>
-            <w:tcW w:type="dxa" w:w="3135"/>
-            <w:shd w:val="clear" w:color="auto" w:fill="F0F4FA"/>
-          </w:tcPr>
-          <w:p>
-            <w:r>
-              <w:rPr>
-                <w:sz w:val="18"/>
-              </w:rPr>
-              <w:t>Times vehicle was hit</w:t>
+              <w:t>Shots (In Vehicle)</w:t>
+            </w:r>
+          </w:p>
+        </w:tc>
+        <w:tc>
+          <w:tcPr>
+            <w:tcW w:type="dxa" w:w="3135"/>
+            <w:shd w:val="clear" w:color="auto" w:fill="F0F4FA"/>
+          </w:tcPr>
+          <w:p>
+            <w:r>
+              <w:rPr>
+                <w:sz w:val="18"/>
+              </w:rPr>
+              <w:t>Rounds fired from vehicle</w:t>
             </w:r>
           </w:p>
         </w:tc>
@@ -3505,21 +3505,21 @@
               <w:rPr>
                 <w:sz w:val="18"/>
               </w:rPr>
-              <w:t>Shots/Kill (In Vehicle)</w:t>
-            </w:r>
-          </w:p>
-        </w:tc>
-        <w:tc>
-          <w:tcPr>
-            <w:tcW w:type="dxa" w:w="3135"/>
-            <w:shd w:val="clear" w:color="auto" w:fill="FFFFFF"/>
-          </w:tcPr>
-          <w:p>
-            <w:r>
-              <w:rPr>
-                <w:sz w:val="18"/>
-              </w:rPr>
-              <w:t>Ignored — recomputed</w:t>
+              <w:t>Hits Taken (In Vehicle)</w:t>
+            </w:r>
+          </w:p>
+        </w:tc>
+        <w:tc>
+          <w:tcPr>
+            <w:tcW w:type="dxa" w:w="3135"/>
+            <w:shd w:val="clear" w:color="auto" w:fill="FFFFFF"/>
+          </w:tcPr>
+          <w:p>
+            <w:r>
+              <w:rPr>
+                <w:sz w:val="18"/>
+              </w:rPr>
+              <w:t>Times vehicle was hit</w:t>
             </w:r>
           </w:p>
         </w:tc>
@@ -3549,21 +3549,21 @@
               <w:rPr>
                 <w:sz w:val="18"/>
               </w:rPr>
-              <w:t>Avg Kill Dist In Vehicle (m)</w:t>
-            </w:r>
-          </w:p>
-        </w:tc>
-        <w:tc>
-          <w:tcPr>
-            <w:tcW w:type="dxa" w:w="3135"/>
-            <w:shd w:val="clear" w:color="auto" w:fill="F0F4FA"/>
-          </w:tcPr>
-          <w:p>
-            <w:r>
-              <w:rPr>
-                <w:sz w:val="18"/>
-              </w:rPr>
-              <w:t>Average kill distance (vehicle)</w:t>
+              <w:t>Hits Dealt (In Vehicle)</w:t>
+            </w:r>
+          </w:p>
+        </w:tc>
+        <w:tc>
+          <w:tcPr>
+            <w:tcW w:type="dxa" w:w="3135"/>
+            <w:shd w:val="clear" w:color="auto" w:fill="F0F4FA"/>
+          </w:tcPr>
+          <w:p>
+            <w:r>
+              <w:rPr>
+                <w:sz w:val="18"/>
+              </w:rPr>
+              <w:t>Outgoing hits registered on any target while mounted</w:t>
             </w:r>
           </w:p>
         </w:tc>
@@ -3593,21 +3593,21 @@
               <w:rPr>
                 <w:sz w:val="18"/>
               </w:rPr>
-              <w:t>Longest Kill In Vehicle (m)</w:t>
-            </w:r>
-          </w:p>
-        </w:tc>
-        <w:tc>
-          <w:tcPr>
-            <w:tcW w:type="dxa" w:w="3135"/>
-            <w:shd w:val="clear" w:color="auto" w:fill="FFFFFF"/>
-          </w:tcPr>
-          <w:p>
-            <w:r>
-              <w:rPr>
-                <w:sz w:val="18"/>
-              </w:rPr>
-              <w:t>Longest single kill distance (vehicle)</w:t>
+              <w:t>Shots/Kill (In Vehicle)</w:t>
+            </w:r>
+          </w:p>
+        </w:tc>
+        <w:tc>
+          <w:tcPr>
+            <w:tcW w:type="dxa" w:w="3135"/>
+            <w:shd w:val="clear" w:color="auto" w:fill="FFFFFF"/>
+          </w:tcPr>
+          <w:p>
+            <w:r>
+              <w:rPr>
+                <w:sz w:val="18"/>
+              </w:rPr>
+              <w:t>Ignored — recomputed</w:t>
             </w:r>
           </w:p>
         </w:tc>
@@ -3637,21 +3637,21 @@
               <w:rPr>
                 <w:sz w:val="18"/>
               </w:rPr>
-              <w:t>Top Weapon</w:t>
-            </w:r>
-          </w:p>
-        </w:tc>
-        <w:tc>
-          <w:tcPr>
-            <w:tcW w:type="dxa" w:w="3135"/>
-            <w:shd w:val="clear" w:color="auto" w:fill="F0F4FA"/>
-          </w:tcPr>
-          <w:p>
-            <w:r>
-              <w:rPr>
-                <w:sz w:val="18"/>
-              </w:rPr>
-              <w:t>Weapon used for the longest kill; shown on award cards</w:t>
+              <w:t>Avg Kill Dist In Vehicle (m)</w:t>
+            </w:r>
+          </w:p>
+        </w:tc>
+        <w:tc>
+          <w:tcPr>
+            <w:tcW w:type="dxa" w:w="3135"/>
+            <w:shd w:val="clear" w:color="auto" w:fill="F0F4FA"/>
+          </w:tcPr>
+          <w:p>
+            <w:r>
+              <w:rPr>
+                <w:sz w:val="18"/>
+              </w:rPr>
+              <w:t>Average kill distance (vehicle)</w:t>
             </w:r>
           </w:p>
         </w:tc>
@@ -3681,21 +3681,21 @@
               <w:rPr>
                 <w:sz w:val="18"/>
               </w:rPr>
-              <w:t>Weapon Kills (JSON)</w:t>
-            </w:r>
-          </w:p>
-        </w:tc>
-        <w:tc>
-          <w:tcPr>
-            <w:tcW w:type="dxa" w:w="3135"/>
-            <w:shd w:val="clear" w:color="auto" w:fill="FFFFFF"/>
-          </w:tcPr>
-          <w:p>
-            <w:r>
-              <w:rPr>
-                <w:sz w:val="18"/>
-              </w:rPr>
-              <w:t>JSON object: {"WeaponName [MagType]": killCount, ...}; quotes preserved during parse</w:t>
+              <w:t>Longest Kill In Vehicle (m)</w:t>
+            </w:r>
+          </w:p>
+        </w:tc>
+        <w:tc>
+          <w:tcPr>
+            <w:tcW w:type="dxa" w:w="3135"/>
+            <w:shd w:val="clear" w:color="auto" w:fill="FFFFFF"/>
+          </w:tcPr>
+          <w:p>
+            <w:r>
+              <w:rPr>
+                <w:sz w:val="18"/>
+              </w:rPr>
+              <w:t>Longest single kill distance (vehicle)</w:t>
             </w:r>
           </w:p>
         </w:tc>
@@ -3725,21 +3725,21 @@
               <w:rPr>
                 <w:sz w:val="18"/>
               </w:rPr>
-              <w:t>Suicides</w:t>
-            </w:r>
-          </w:p>
-        </w:tc>
-        <w:tc>
-          <w:tcPr>
-            <w:tcW w:type="dxa" w:w="3135"/>
-            <w:shd w:val="clear" w:color="auto" w:fill="F0F4FA"/>
-          </w:tcPr>
-          <w:p>
-            <w:r>
-              <w:rPr>
-                <w:sz w:val="18"/>
-              </w:rPr>
-              <w:t>Self-inflicted deaths</w:t>
+              <w:t>Top Weapon</w:t>
+            </w:r>
+          </w:p>
+        </w:tc>
+        <w:tc>
+          <w:tcPr>
+            <w:tcW w:type="dxa" w:w="3135"/>
+            <w:shd w:val="clear" w:color="auto" w:fill="F0F4FA"/>
+          </w:tcPr>
+          <w:p>
+            <w:r>
+              <w:rPr>
+                <w:sz w:val="18"/>
+              </w:rPr>
+              <w:t>Weapon used for the longest kill; shown on award cards</w:t>
             </w:r>
           </w:p>
         </w:tc>
@@ -3769,21 +3769,21 @@
               <w:rPr>
                 <w:sz w:val="18"/>
               </w:rPr>
-              <w:t>Time Played (s)</w:t>
-            </w:r>
-          </w:p>
-        </w:tc>
-        <w:tc>
-          <w:tcPr>
-            <w:tcW w:type="dxa" w:w="3135"/>
-            <w:shd w:val="clear" w:color="auto" w:fill="FFFFFF"/>
-          </w:tcPr>
-          <w:p>
-            <w:r>
-              <w:rPr>
-                <w:sz w:val="18"/>
-              </w:rPr>
-              <w:t>Seconds present in the mission</w:t>
+              <w:t>Weapon Kills (JSON)</w:t>
+            </w:r>
+          </w:p>
+        </w:tc>
+        <w:tc>
+          <w:tcPr>
+            <w:tcW w:type="dxa" w:w="3135"/>
+            <w:shd w:val="clear" w:color="auto" w:fill="FFFFFF"/>
+          </w:tcPr>
+          <w:p>
+            <w:r>
+              <w:rPr>
+                <w:sz w:val="18"/>
+              </w:rPr>
+              <w:t>JSON object: {"WeaponName [MagType]": killCount, ...}; quotes preserved during parse</w:t>
             </w:r>
           </w:p>
         </w:tc>
@@ -3800,6 +3800,94 @@
                 <w:sz w:val="18"/>
               </w:rPr>
               <w:t>31</w:t>
+            </w:r>
+          </w:p>
+        </w:tc>
+        <w:tc>
+          <w:tcPr>
+            <w:tcW w:type="dxa" w:w="3135"/>
+            <w:shd w:val="clear" w:color="auto" w:fill="F0F4FA"/>
+          </w:tcPr>
+          <w:p>
+            <w:r>
+              <w:rPr>
+                <w:sz w:val="18"/>
+              </w:rPr>
+              <w:t>Suicides</w:t>
+            </w:r>
+          </w:p>
+        </w:tc>
+        <w:tc>
+          <w:tcPr>
+            <w:tcW w:type="dxa" w:w="3135"/>
+            <w:shd w:val="clear" w:color="auto" w:fill="F0F4FA"/>
+          </w:tcPr>
+          <w:p>
+            <w:r>
+              <w:rPr>
+                <w:sz w:val="18"/>
+              </w:rPr>
+              <w:t>Self-inflicted deaths</w:t>
+            </w:r>
+          </w:p>
+        </w:tc>
+      </w:tr>
+      <w:tr>
+        <w:tc>
+          <w:tcPr>
+            <w:tcW w:type="dxa" w:w="3135"/>
+            <w:shd w:val="clear" w:color="auto" w:fill="FFFFFF"/>
+          </w:tcPr>
+          <w:p>
+            <w:r>
+              <w:rPr>
+                <w:sz w:val="18"/>
+              </w:rPr>
+              <w:t>32</w:t>
+            </w:r>
+          </w:p>
+        </w:tc>
+        <w:tc>
+          <w:tcPr>
+            <w:tcW w:type="dxa" w:w="3135"/>
+            <w:shd w:val="clear" w:color="auto" w:fill="FFFFFF"/>
+          </w:tcPr>
+          <w:p>
+            <w:r>
+              <w:rPr>
+                <w:sz w:val="18"/>
+              </w:rPr>
+              <w:t>Time Played (s)</w:t>
+            </w:r>
+          </w:p>
+        </w:tc>
+        <w:tc>
+          <w:tcPr>
+            <w:tcW w:type="dxa" w:w="3135"/>
+            <w:shd w:val="clear" w:color="auto" w:fill="FFFFFF"/>
+          </w:tcPr>
+          <w:p>
+            <w:r>
+              <w:rPr>
+                <w:sz w:val="18"/>
+              </w:rPr>
+              <w:t>Seconds present in the mission</w:t>
+            </w:r>
+          </w:p>
+        </w:tc>
+      </w:tr>
+      <w:tr>
+        <w:tc>
+          <w:tcPr>
+            <w:tcW w:type="dxa" w:w="3135"/>
+            <w:shd w:val="clear" w:color="auto" w:fill="F0F4FA"/>
+          </w:tcPr>
+          <w:p>
+            <w:r>
+              <w:rPr>
+                <w:sz w:val="18"/>
+              </w:rPr>
+              <w:t>33</w:t>
             </w:r>
           </w:p>
         </w:tc>
@@ -7311,6 +7399,122 @@
               <w:rPr>
                 <w:sz w:val="18"/>
               </w:rPr>
+              <w:t>Hits Dealt</w:t>
+            </w:r>
+          </w:p>
+        </w:tc>
+        <w:tc>
+          <w:tcPr>
+            <w:tcW w:type="dxa" w:w="2351"/>
+            <w:shd w:val="clear" w:color="auto" w:fill="FFFFFF"/>
+          </w:tcPr>
+          <w:p>
+            <w:r>
+              <w:rPr>
+                <w:sz w:val="18"/>
+              </w:rPr>
+              <w:t>hitsDealtOnFoot</w:t>
+            </w:r>
+          </w:p>
+        </w:tc>
+        <w:tc>
+          <w:tcPr>
+            <w:tcW w:type="dxa" w:w="2351"/>
+            <w:shd w:val="clear" w:color="auto" w:fill="FFFFFF"/>
+          </w:tcPr>
+          <w:p>
+            <w:r>
+              <w:rPr>
+                <w:sz w:val="18"/>
+              </w:rPr>
+              <w:t>desc</w:t>
+            </w:r>
+          </w:p>
+        </w:tc>
+      </w:tr>
+      <w:tr>
+        <w:tc>
+          <w:tcPr>
+            <w:tcW w:type="dxa" w:w="2351"/>
+            <w:shd w:val="clear" w:color="auto" w:fill="F0F4FA"/>
+          </w:tcPr>
+          <w:p>
+            <w:r>
+              <w:rPr>
+                <w:sz w:val="18"/>
+              </w:rPr>
+              <w:t>11</w:t>
+            </w:r>
+          </w:p>
+        </w:tc>
+        <w:tc>
+          <w:tcPr>
+            <w:tcW w:type="dxa" w:w="2351"/>
+            <w:shd w:val="clear" w:color="auto" w:fill="F0F4FA"/>
+          </w:tcPr>
+          <w:p>
+            <w:r>
+              <w:rPr>
+                <w:sz w:val="18"/>
+              </w:rPr>
+              <w:t>Accuracy (%)</w:t>
+            </w:r>
+          </w:p>
+        </w:tc>
+        <w:tc>
+          <w:tcPr>
+            <w:tcW w:type="dxa" w:w="2351"/>
+            <w:shd w:val="clear" w:color="auto" w:fill="F0F4FA"/>
+          </w:tcPr>
+          <w:p>
+            <w:r>
+              <w:rPr>
+                <w:sz w:val="18"/>
+              </w:rPr>
+              <w:t>accuracyFoot</w:t>
+            </w:r>
+          </w:p>
+        </w:tc>
+        <w:tc>
+          <w:tcPr>
+            <w:tcW w:type="dxa" w:w="2351"/>
+            <w:shd w:val="clear" w:color="auto" w:fill="F0F4FA"/>
+          </w:tcPr>
+          <w:p>
+            <w:r>
+              <w:rPr>
+                <w:sz w:val="18"/>
+              </w:rPr>
+              <w:t>desc</w:t>
+            </w:r>
+          </w:p>
+        </w:tc>
+      </w:tr>
+      <w:tr>
+        <w:tc>
+          <w:tcPr>
+            <w:tcW w:type="dxa" w:w="2351"/>
+            <w:shd w:val="clear" w:color="auto" w:fill="FFFFFF"/>
+          </w:tcPr>
+          <w:p>
+            <w:r>
+              <w:rPr>
+                <w:sz w:val="18"/>
+              </w:rPr>
+              <w:t>12</w:t>
+            </w:r>
+          </w:p>
+        </w:tc>
+        <w:tc>
+          <w:tcPr>
+            <w:tcW w:type="dxa" w:w="2351"/>
+            <w:shd w:val="clear" w:color="auto" w:fill="FFFFFF"/>
+          </w:tcPr>
+          <w:p>
+            <w:r>
+              <w:rPr>
+                <w:sz w:val="18"/>
+              </w:rPr>
               <w:t>Shots/Kill</w:t>
             </w:r>
           </w:p>
@@ -8211,7 +8415,7 @@
               <w:rPr>
                 <w:sz w:val="18"/>
               </w:rPr>
-              <w:t>Grid of stat cards: Kills, Deaths, K/D, TK, Shots, Hits Taken, Shots/Kill, Avg Dist, Longest Kill, Missions, Suicides</w:t>
+              <w:t>Grid of stat cards: Kills, Deaths, K/D, TK, Shots, Hits Taken, Hits Dealt, Accuracy, Shots/Kill, Avg Dist, Longest Kill, Missions, Suicides</w:t>
             </w:r>
           </w:p>
         </w:tc>

</xml_diff>

<commit_message>
v1.022 — Zeus detection fixes + documentation update
Bump version to 1.022, release date 2026-03-30.

CHANGELOG: add v1.022 entry covering all three Zeus fixes.
README: correct EOM thresholds table (5/7/10 min); add Zeus detection
  section documenting all covered role formats.
generate_docs.py: bump to doc v1.4; update Zeus filter description to
  reflect rowIsZeus() Group+Role check; update schema col 5/6 notes;
  update ImportScript Zeus detection bullet.
PDF/DOCX: regenerated.

https://claude.ai/code/session_01LeCW8ZtNT8f2MnVa6wEGBx
</commit_message>
<xml_diff>
--- a/TFP_KillTracker_Technical_Documentation.docx
+++ b/TFP_KillTracker_Technical_Documentation.docx
@@ -39,7 +39,7 @@
         <w:rPr>
           <w:sz w:val="22"/>
         </w:rPr>
-        <w:t>Version 1.3  ·  30 March 2026</w:t>
+        <w:t>Version 1.4  ·  30 March 2026</w:t>
       </w:r>
     </w:p>
     <w:p>
@@ -2683,7 +2683,7 @@
               <w:rPr>
                 <w:sz w:val="18"/>
               </w:rPr>
-              <w:t>Squad/group name; "zeus" group triggers Zeus classification</w:t>
+              <w:t>Squad/group name; contains "zeus" triggers Zeus classification</w:t>
             </w:r>
           </w:p>
         </w:tc>
@@ -2727,7 +2727,7 @@
               <w:rPr>
                 <w:sz w:val="18"/>
               </w:rPr>
-              <w:t>In-game role string; used for role normalisation and top-role detection</w:t>
+              <w:t>In-game role string; also checked for "zeus" (covers Co Zeus, Zeus@Zeus, Command@Zeus, etc.)</w:t>
             </w:r>
           </w:p>
         </w:tc>
@@ -5298,7 +5298,7 @@
               <w:rPr>
                 <w:sz w:val="18"/>
               </w:rPr>
-              <w:t>Applied post-aggregation: checks if player has any Group="zeus" row</w:t>
+              <w:t>Applied post-aggregation: rowIsZeus() checks Group and Role both contain "zeus"</w:t>
             </w:r>
           </w:p>
         </w:tc>
@@ -5783,7 +5783,7 @@
           <w:b w:val="0"/>
           <w:i w:val="0"/>
         </w:rPr>
-        <w:t>The Zeus filter is applied after re-aggregation. For each player in the filtered aggregation, the system checks whether any of their rawRows has Group (lowercased) === "zeus".</w:t>
+        <w:t>The Zeus filter is applied after re-aggregation via the top-level rowIsZeus(r) helper, which returns true when either the Group or Role field of a CSV row contains the word "zeus" (case-insensitive, substring match). This covers all known OCAP role formats: "Zeus", "Co Zeus", "Zeus@Zeus", "Command@Zeus", "Rifleman@Zeus".</w:t>
       </w:r>
     </w:p>
     <w:tbl>
@@ -5928,6 +5928,18 @@
         </w:tc>
       </w:tr>
     </w:tbl>
+    <w:p>
+      <w:pPr>
+        <w:spacing w:after="120"/>
+      </w:pPr>
+      <w:r>
+        <w:rPr>
+          <w:b w:val="0"/>
+          <w:i w:val="0"/>
+        </w:rPr>
+        <w:t>rowIsZeus is also used to exclude Zeus rows from squad co-occurrence analysis and from the Passenger Princess shame card.</w:t>
+      </w:r>
+    </w:p>
     <w:p>
       <w:r>
         <w:br w:type="page"/>
@@ -17276,7 +17288,7 @@
         <w:rPr>
           <w:sz w:val="20"/>
         </w:rPr>
-        <w:t>If a role string contains "@username" (e.g. "Rifleman@Zeus"), the script correctly detects it as a Zeus role.</w:t>
+        <w:t>Zeus detection uses role.includes("zeus") (case-insensitive) covering all compound formats: "Co Zeus", "Zeus@Zeus", "Command@Zeus", "Rifleman@Zeus". A fallback reads the role from positions[i][6] when entity.role is empty, supporting older OCAP captures.</w:t>
       </w:r>
     </w:p>
     <w:p/>

</xml_diff>

<commit_message>
Deploying to gh-pages from @ loltorres9/TFP_KillTracker@10fb64fb8d573e8b0fc5e10de8f23e108ef85426 🚀
</commit_message>
<xml_diff>
--- a/TFP_KillTracker_Technical_Documentation.docx
+++ b/TFP_KillTracker_Technical_Documentation.docx
@@ -39,7 +39,7 @@
         <w:rPr>
           <w:sz w:val="22"/>
         </w:rPr>
-        <w:t>Version 1.3  ·  30 March 2026</w:t>
+        <w:t>Version 1.4  ·  30 March 2026</w:t>
       </w:r>
     </w:p>
     <w:p>
@@ -2683,7 +2683,7 @@
               <w:rPr>
                 <w:sz w:val="18"/>
               </w:rPr>
-              <w:t>Squad/group name; "zeus" group triggers Zeus classification</w:t>
+              <w:t>Squad/group name; contains "zeus" triggers Zeus classification</w:t>
             </w:r>
           </w:p>
         </w:tc>
@@ -2727,7 +2727,7 @@
               <w:rPr>
                 <w:sz w:val="18"/>
               </w:rPr>
-              <w:t>In-game role string; used for role normalisation and top-role detection</w:t>
+              <w:t>In-game role string; also checked for "zeus" (covers Co Zeus, Zeus@Zeus, Command@Zeus, etc.)</w:t>
             </w:r>
           </w:p>
         </w:tc>
@@ -5298,7 +5298,7 @@
               <w:rPr>
                 <w:sz w:val="18"/>
               </w:rPr>
-              <w:t>Applied post-aggregation: checks if player has any Group="zeus" row</w:t>
+              <w:t>Applied post-aggregation: rowIsZeus() checks Group and Role both contain "zeus"</w:t>
             </w:r>
           </w:p>
         </w:tc>
@@ -5783,7 +5783,7 @@
           <w:b w:val="0"/>
           <w:i w:val="0"/>
         </w:rPr>
-        <w:t>The Zeus filter is applied after re-aggregation. For each player in the filtered aggregation, the system checks whether any of their rawRows has Group (lowercased) === "zeus".</w:t>
+        <w:t>The Zeus filter is applied after re-aggregation via the top-level rowIsZeus(r) helper, which returns true when either the Group or Role field of a CSV row contains the word "zeus" (case-insensitive, substring match). This covers all known OCAP role formats: "Zeus", "Co Zeus", "Zeus@Zeus", "Command@Zeus", "Rifleman@Zeus".</w:t>
       </w:r>
     </w:p>
     <w:tbl>
@@ -5928,6 +5928,18 @@
         </w:tc>
       </w:tr>
     </w:tbl>
+    <w:p>
+      <w:pPr>
+        <w:spacing w:after="120"/>
+      </w:pPr>
+      <w:r>
+        <w:rPr>
+          <w:b w:val="0"/>
+          <w:i w:val="0"/>
+        </w:rPr>
+        <w:t>rowIsZeus is also used to exclude Zeus rows from squad co-occurrence analysis and from the Passenger Princess shame card.</w:t>
+      </w:r>
+    </w:p>
     <w:p>
       <w:r>
         <w:br w:type="page"/>
@@ -17276,7 +17288,7 @@
         <w:rPr>
           <w:sz w:val="20"/>
         </w:rPr>
-        <w:t>If a role string contains "@username" (e.g. "Rifleman@Zeus"), the script correctly detects it as a Zeus role.</w:t>
+        <w:t>Zeus detection uses role.includes("zeus") (case-insensitive) covering all compound formats: "Co Zeus", "Zeus@Zeus", "Command@Zeus", "Rifleman@Zeus". A fallback reads the role from positions[i][6] when entity.role is empty, supporting older OCAP captures.</w:t>
       </w:r>
     </w:p>
     <w:p/>

</xml_diff>

<commit_message>
Release v1.023 — player name merging, aliases on career page, unit overrides
- tracker.js: VERSION 1.023, RELEASE_DATE 2026-03-31
- Name merging: three-pass system (normalisation, suffix matching, player_aliases.json)
- Career page shows "Also known as" line for merged aliases
- Players filter deduped to one pill per canonical name
- Unit overrides: Salt/DAN → PXG; 1LT. Evil/WC. Picker/SPC. Jesus Juice → Unknown
- README: player name merging section + player_aliases.json in Files table
- generate_docs.py: v1.5, new §5 Player Name Merging, fixed EOM table values, renumbered §6–13
- Docs regenerated (docx + PDF)

https://claude.ai/code/session_01LeCW8ZtNT8f2MnVa6wEGBx
</commit_message>
<xml_diff>
--- a/TFP_KillTracker_Technical_Documentation.docx
+++ b/TFP_KillTracker_Technical_Documentation.docx
@@ -39,7 +39,7 @@
         <w:rPr>
           <w:sz w:val="22"/>
         </w:rPr>
-        <w:t>Version 1.4  ·  30 March 2026</w:t>
+        <w:t>Version 1.5  ·  31 March 2026</w:t>
       </w:r>
     </w:p>
     <w:p>
@@ -644,7 +644,7 @@
               <w:rPr>
                 <w:sz w:val="18"/>
               </w:rPr>
-              <w:t>ImportScript</w:t>
+              <w:t>player_aliases.json</w:t>
             </w:r>
           </w:p>
         </w:tc>
@@ -658,7 +658,7 @@
               <w:rPr>
                 <w:sz w:val="18"/>
               </w:rPr>
-              <w:t>Google Apps Script that imports OCAP .json.gz mission logs into Google Sheets</w:t>
+              <w:t>Explicit player name aliases for cases the auto-normalisation cannot resolve (rank variants, completely different names)</w:t>
             </w:r>
           </w:p>
         </w:tc>
@@ -674,7 +674,7 @@
               <w:rPr>
                 <w:sz w:val="18"/>
               </w:rPr>
-              <w:t>generate_docs.py</w:t>
+              <w:t>ImportScript</w:t>
             </w:r>
           </w:p>
         </w:tc>
@@ -688,7 +688,7 @@
               <w:rPr>
                 <w:sz w:val="18"/>
               </w:rPr>
-              <w:t>python-docx script that regenerates this documentation file</w:t>
+              <w:t>Google Apps Script that imports OCAP .json.gz mission logs into Google Sheets</w:t>
             </w:r>
           </w:p>
         </w:tc>
@@ -704,7 +704,7 @@
               <w:rPr>
                 <w:sz w:val="18"/>
               </w:rPr>
-              <w:t>README.md</w:t>
+              <w:t>generate_docs.py</w:t>
             </w:r>
           </w:p>
         </w:tc>
@@ -718,7 +718,7 @@
               <w:rPr>
                 <w:sz w:val="18"/>
               </w:rPr>
-              <w:t>User-facing feature overview and deployment guide</w:t>
+              <w:t>python-docx script that regenerates this documentation file</w:t>
             </w:r>
           </w:p>
         </w:tc>
@@ -734,6 +734,36 @@
               <w:rPr>
                 <w:sz w:val="18"/>
               </w:rPr>
+              <w:t>README.md</w:t>
+            </w:r>
+          </w:p>
+        </w:tc>
+        <w:tc>
+          <w:tcPr>
+            <w:tcW w:type="dxa" w:w="4703"/>
+            <w:shd w:val="clear" w:color="auto" w:fill="F0F4FA"/>
+          </w:tcPr>
+          <w:p>
+            <w:r>
+              <w:rPr>
+                <w:sz w:val="18"/>
+              </w:rPr>
+              <w:t>User-facing feature overview and deployment guide</w:t>
+            </w:r>
+          </w:p>
+        </w:tc>
+      </w:tr>
+      <w:tr>
+        <w:tc>
+          <w:tcPr>
+            <w:tcW w:type="dxa" w:w="4703"/>
+            <w:shd w:val="clear" w:color="auto" w:fill="FFFFFF"/>
+          </w:tcPr>
+          <w:p>
+            <w:r>
+              <w:rPr>
+                <w:sz w:val="18"/>
+              </w:rPr>
               <w:t>.github/workflows/</w:t>
             </w:r>
           </w:p>
@@ -741,7 +771,7 @@
         <w:tc>
           <w:tcPr>
             <w:tcW w:type="dxa" w:w="4703"/>
-            <w:shd w:val="clear" w:color="auto" w:fill="F0F4FA"/>
+            <w:shd w:val="clear" w:color="auto" w:fill="FFFFFF"/>
           </w:tcPr>
           <w:p>
             <w:r>
@@ -2295,6 +2325,122 @@
                 <w:sz w:val="18"/>
               </w:rPr>
               <w:t>Hardcoded release date shown in the page footer</w:t>
+            </w:r>
+          </w:p>
+        </w:tc>
+      </w:tr>
+      <w:tr>
+        <w:tc>
+          <w:tcPr>
+            <w:tcW w:type="dxa" w:w="2351"/>
+            <w:shd w:val="clear" w:color="auto" w:fill="F0F4FA"/>
+          </w:tcPr>
+          <w:p>
+            <w:r>
+              <w:rPr>
+                <w:sz w:val="18"/>
+              </w:rPr>
+              <w:t>nameMap</w:t>
+            </w:r>
+          </w:p>
+        </w:tc>
+        <w:tc>
+          <w:tcPr>
+            <w:tcW w:type="dxa" w:w="2351"/>
+            <w:shd w:val="clear" w:color="auto" w:fill="F0F4FA"/>
+          </w:tcPr>
+          <w:p>
+            <w:r>
+              <w:rPr>
+                <w:sz w:val="18"/>
+              </w:rPr>
+              <w:t>Object</w:t>
+            </w:r>
+          </w:p>
+        </w:tc>
+        <w:tc>
+          <w:tcPr>
+            <w:tcW w:type="dxa" w:w="2351"/>
+            <w:shd w:val="clear" w:color="auto" w:fill="F0F4FA"/>
+          </w:tcPr>
+          <w:p>
+            <w:r>
+              <w:rPr>
+                <w:sz w:val="18"/>
+              </w:rPr>
+              <w:t>{}</w:t>
+            </w:r>
+          </w:p>
+        </w:tc>
+        <w:tc>
+          <w:tcPr>
+            <w:tcW w:type="dxa" w:w="2351"/>
+            <w:shd w:val="clear" w:color="auto" w:fill="F0F4FA"/>
+          </w:tcPr>
+          <w:p>
+            <w:r>
+              <w:rPr>
+                <w:sz w:val="18"/>
+              </w:rPr>
+              <w:t>Maps every raw Username value to its canonical display name; built by buildNameMap()</w:t>
+            </w:r>
+          </w:p>
+        </w:tc>
+      </w:tr>
+      <w:tr>
+        <w:tc>
+          <w:tcPr>
+            <w:tcW w:type="dxa" w:w="2351"/>
+            <w:shd w:val="clear" w:color="auto" w:fill="FFFFFF"/>
+          </w:tcPr>
+          <w:p>
+            <w:r>
+              <w:rPr>
+                <w:sz w:val="18"/>
+              </w:rPr>
+              <w:t>nameAliases</w:t>
+            </w:r>
+          </w:p>
+        </w:tc>
+        <w:tc>
+          <w:tcPr>
+            <w:tcW w:type="dxa" w:w="2351"/>
+            <w:shd w:val="clear" w:color="auto" w:fill="FFFFFF"/>
+          </w:tcPr>
+          <w:p>
+            <w:r>
+              <w:rPr>
+                <w:sz w:val="18"/>
+              </w:rPr>
+              <w:t>Object</w:t>
+            </w:r>
+          </w:p>
+        </w:tc>
+        <w:tc>
+          <w:tcPr>
+            <w:tcW w:type="dxa" w:w="2351"/>
+            <w:shd w:val="clear" w:color="auto" w:fill="FFFFFF"/>
+          </w:tcPr>
+          <w:p>
+            <w:r>
+              <w:rPr>
+                <w:sz w:val="18"/>
+              </w:rPr>
+              <w:t>{}</w:t>
+            </w:r>
+          </w:p>
+        </w:tc>
+        <w:tc>
+          <w:tcPr>
+            <w:tcW w:type="dxa" w:w="2351"/>
+            <w:shd w:val="clear" w:color="auto" w:fill="FFFFFF"/>
+          </w:tcPr>
+          <w:p>
+            <w:r>
+              <w:rPr>
+                <w:sz w:val="18"/>
+              </w:rPr>
+              <w:t>Maps canonical name → array of all absorbed alias strings; used to show "Also known as" on career page</w:t>
             </w:r>
           </w:p>
         </w:tc>
@@ -4957,7 +5103,19 @@
         <w:pStyle w:val="Heading1"/>
       </w:pPr>
       <w:r>
-        <w:t>5. Filter System</w:t>
+        <w:t>5. Player Name Merging</w:t>
+      </w:r>
+    </w:p>
+    <w:p>
+      <w:pPr>
+        <w:spacing w:after="120"/>
+      </w:pPr>
+      <w:r>
+        <w:rPr>
+          <w:b w:val="0"/>
+          <w:i w:val="0"/>
+        </w:rPr>
+        <w:t>Because players often appear under slightly different names across missions (squad tags, rank prefixes, punctuation, or entirely different callsigns), tracker.js collapses all variant names into a single canonical entry before aggregation. The system runs at load time as part of the data pipeline.</w:t>
       </w:r>
     </w:p>
     <w:p>
@@ -4965,7 +5123,719 @@
         <w:pStyle w:val="Heading2"/>
       </w:pPr>
       <w:r>
-        <w:t>5.1 Filter Pipeline</w:t>
+        <w:t>5.1 normalizeName(name)</w:t>
+      </w:r>
+    </w:p>
+    <w:p>
+      <w:pPr>
+        <w:spacing w:after="80"/>
+      </w:pPr>
+      <w:r>
+        <w:rPr>
+          <w:b w:val="0"/>
+          <w:i w:val="0"/>
+        </w:rPr>
+        <w:t>A pure string function applied to every raw Username before comparison. Performs the following transformations in order:</w:t>
+      </w:r>
+    </w:p>
+    <w:tbl>
+      <w:tblPr>
+        <w:tblStyle w:val="TableGrid"/>
+        <w:tblW w:type="auto" w:w="0"/>
+        <w:jc w:val="left"/>
+        <w:tblLook w:firstColumn="1" w:firstRow="1" w:lastColumn="0" w:lastRow="0" w:noHBand="0" w:noVBand="1" w:val="04A0"/>
+      </w:tblPr>
+      <w:tblGrid>
+        <w:gridCol w:w="3135"/>
+        <w:gridCol w:w="3135"/>
+        <w:gridCol w:w="3135"/>
+      </w:tblGrid>
+      <w:tr>
+        <w:tc>
+          <w:tcPr>
+            <w:tcW w:type="dxa" w:w="3135"/>
+            <w:shd w:val="clear" w:color="auto" w:fill="2E4057"/>
+          </w:tcPr>
+          <w:p>
+            <w:pPr>
+              <w:jc w:val="center"/>
+            </w:pPr>
+            <w:r>
+              <w:rPr>
+                <w:b/>
+                <w:color w:val="FFFFFF"/>
+                <w:sz w:val="18"/>
+              </w:rPr>
+              <w:t>Step</w:t>
+            </w:r>
+          </w:p>
+        </w:tc>
+        <w:tc>
+          <w:tcPr>
+            <w:tcW w:type="dxa" w:w="3135"/>
+            <w:shd w:val="clear" w:color="auto" w:fill="2E4057"/>
+          </w:tcPr>
+          <w:p>
+            <w:pPr>
+              <w:jc w:val="center"/>
+            </w:pPr>
+            <w:r>
+              <w:rPr>
+                <w:b/>
+                <w:color w:val="FFFFFF"/>
+                <w:sz w:val="18"/>
+              </w:rPr>
+              <w:t>Transform</w:t>
+            </w:r>
+          </w:p>
+        </w:tc>
+        <w:tc>
+          <w:tcPr>
+            <w:tcW w:type="dxa" w:w="3135"/>
+            <w:shd w:val="clear" w:color="auto" w:fill="2E4057"/>
+          </w:tcPr>
+          <w:p>
+            <w:pPr>
+              <w:jc w:val="center"/>
+            </w:pPr>
+            <w:r>
+              <w:rPr>
+                <w:b/>
+                <w:color w:val="FFFFFF"/>
+                <w:sz w:val="18"/>
+              </w:rPr>
+              <w:t>Example</w:t>
+            </w:r>
+          </w:p>
+        </w:tc>
+      </w:tr>
+      <w:tr>
+        <w:tc>
+          <w:tcPr>
+            <w:tcW w:type="dxa" w:w="3135"/>
+            <w:shd w:val="clear" w:color="auto" w:fill="FFFFFF"/>
+          </w:tcPr>
+          <w:p>
+            <w:r>
+              <w:rPr>
+                <w:sz w:val="18"/>
+              </w:rPr>
+              <w:t>1</w:t>
+            </w:r>
+          </w:p>
+        </w:tc>
+        <w:tc>
+          <w:tcPr>
+            <w:tcW w:type="dxa" w:w="3135"/>
+            <w:shd w:val="clear" w:color="auto" w:fill="FFFFFF"/>
+          </w:tcPr>
+          <w:p>
+            <w:r>
+              <w:rPr>
+                <w:sz w:val="18"/>
+              </w:rPr>
+              <w:t>Remove spaces inside [brackets]</w:t>
+            </w:r>
+          </w:p>
+        </w:tc>
+        <w:tc>
+          <w:tcPr>
+            <w:tcW w:type="dxa" w:w="3135"/>
+            <w:shd w:val="clear" w:color="auto" w:fill="FFFFFF"/>
+          </w:tcPr>
+          <w:p>
+            <w:r>
+              <w:rPr>
+                <w:sz w:val="18"/>
+              </w:rPr>
+              <w:t>[2nd USC] → [2ndUSC]</w:t>
+            </w:r>
+          </w:p>
+        </w:tc>
+      </w:tr>
+      <w:tr>
+        <w:tc>
+          <w:tcPr>
+            <w:tcW w:type="dxa" w:w="3135"/>
+            <w:shd w:val="clear" w:color="auto" w:fill="F0F4FA"/>
+          </w:tcPr>
+          <w:p>
+            <w:r>
+              <w:rPr>
+                <w:sz w:val="18"/>
+              </w:rPr>
+              <w:t>2</w:t>
+            </w:r>
+          </w:p>
+        </w:tc>
+        <w:tc>
+          <w:tcPr>
+            <w:tcW w:type="dxa" w:w="3135"/>
+            <w:shd w:val="clear" w:color="auto" w:fill="F0F4FA"/>
+          </w:tcPr>
+          <w:p>
+            <w:r>
+              <w:rPr>
+                <w:sz w:val="18"/>
+              </w:rPr>
+              <w:t>Add space after ] if missing</w:t>
+            </w:r>
+          </w:p>
+        </w:tc>
+        <w:tc>
+          <w:tcPr>
+            <w:tcW w:type="dxa" w:w="3135"/>
+            <w:shd w:val="clear" w:color="auto" w:fill="F0F4FA"/>
+          </w:tcPr>
+          <w:p>
+            <w:r>
+              <w:rPr>
+                <w:sz w:val="18"/>
+              </w:rPr>
+              <w:t>]Name → ] Name</w:t>
+            </w:r>
+          </w:p>
+        </w:tc>
+      </w:tr>
+      <w:tr>
+        <w:tc>
+          <w:tcPr>
+            <w:tcW w:type="dxa" w:w="3135"/>
+            <w:shd w:val="clear" w:color="auto" w:fill="FFFFFF"/>
+          </w:tcPr>
+          <w:p>
+            <w:r>
+              <w:rPr>
+                <w:sz w:val="18"/>
+              </w:rPr>
+              <w:t>3</w:t>
+            </w:r>
+          </w:p>
+        </w:tc>
+        <w:tc>
+          <w:tcPr>
+            <w:tcW w:type="dxa" w:w="3135"/>
+            <w:shd w:val="clear" w:color="auto" w:fill="FFFFFF"/>
+          </w:tcPr>
+          <w:p>
+            <w:r>
+              <w:rPr>
+                <w:sz w:val="18"/>
+              </w:rPr>
+              <w:t>Add space after . if not followed by space or ]</w:t>
+            </w:r>
+          </w:p>
+        </w:tc>
+        <w:tc>
+          <w:tcPr>
+            <w:tcW w:type="dxa" w:w="3135"/>
+            <w:shd w:val="clear" w:color="auto" w:fill="FFFFFF"/>
+          </w:tcPr>
+          <w:p>
+            <w:r>
+              <w:rPr>
+                <w:sz w:val="18"/>
+              </w:rPr>
+              <w:t>S.Fig → S. Fig</w:t>
+            </w:r>
+          </w:p>
+        </w:tc>
+      </w:tr>
+      <w:tr>
+        <w:tc>
+          <w:tcPr>
+            <w:tcW w:type="dxa" w:w="3135"/>
+            <w:shd w:val="clear" w:color="auto" w:fill="F0F4FA"/>
+          </w:tcPr>
+          <w:p>
+            <w:r>
+              <w:rPr>
+                <w:sz w:val="18"/>
+              </w:rPr>
+              <w:t>4</w:t>
+            </w:r>
+          </w:p>
+        </w:tc>
+        <w:tc>
+          <w:tcPr>
+            <w:tcW w:type="dxa" w:w="3135"/>
+            <w:shd w:val="clear" w:color="auto" w:fill="F0F4FA"/>
+          </w:tcPr>
+          <w:p>
+            <w:r>
+              <w:rPr>
+                <w:sz w:val="18"/>
+              </w:rPr>
+              <w:t>Replace _ with space</w:t>
+            </w:r>
+          </w:p>
+        </w:tc>
+        <w:tc>
+          <w:tcPr>
+            <w:tcW w:type="dxa" w:w="3135"/>
+            <w:shd w:val="clear" w:color="auto" w:fill="F0F4FA"/>
+          </w:tcPr>
+          <w:p>
+            <w:r>
+              <w:rPr>
+                <w:sz w:val="18"/>
+              </w:rPr>
+              <w:t>[SR]_Gronk → [SR] Gronk</w:t>
+            </w:r>
+          </w:p>
+        </w:tc>
+      </w:tr>
+      <w:tr>
+        <w:tc>
+          <w:tcPr>
+            <w:tcW w:type="dxa" w:w="3135"/>
+            <w:shd w:val="clear" w:color="auto" w:fill="FFFFFF"/>
+          </w:tcPr>
+          <w:p>
+            <w:r>
+              <w:rPr>
+                <w:sz w:val="18"/>
+              </w:rPr>
+              <w:t>5</w:t>
+            </w:r>
+          </w:p>
+        </w:tc>
+        <w:tc>
+          <w:tcPr>
+            <w:tcW w:type="dxa" w:w="3135"/>
+            <w:shd w:val="clear" w:color="auto" w:fill="FFFFFF"/>
+          </w:tcPr>
+          <w:p>
+            <w:r>
+              <w:rPr>
+                <w:sz w:val="18"/>
+              </w:rPr>
+              <w:t>Collapse multiple spaces</w:t>
+            </w:r>
+          </w:p>
+        </w:tc>
+        <w:tc>
+          <w:tcPr>
+            <w:tcW w:type="dxa" w:w="3135"/>
+            <w:shd w:val="clear" w:color="auto" w:fill="FFFFFF"/>
+          </w:tcPr>
+          <w:p>
+            <w:r>
+              <w:rPr>
+                <w:sz w:val="18"/>
+              </w:rPr>
+              <w:t>foo  bar → foo bar</w:t>
+            </w:r>
+          </w:p>
+        </w:tc>
+      </w:tr>
+      <w:tr>
+        <w:tc>
+          <w:tcPr>
+            <w:tcW w:type="dxa" w:w="3135"/>
+            <w:shd w:val="clear" w:color="auto" w:fill="F0F4FA"/>
+          </w:tcPr>
+          <w:p>
+            <w:r>
+              <w:rPr>
+                <w:sz w:val="18"/>
+              </w:rPr>
+              <w:t>6</w:t>
+            </w:r>
+          </w:p>
+        </w:tc>
+        <w:tc>
+          <w:tcPr>
+            <w:tcW w:type="dxa" w:w="3135"/>
+            <w:shd w:val="clear" w:color="auto" w:fill="F0F4FA"/>
+          </w:tcPr>
+          <w:p>
+            <w:r>
+              <w:rPr>
+                <w:sz w:val="18"/>
+              </w:rPr>
+              <w:t>Trim and lowercase</w:t>
+            </w:r>
+          </w:p>
+        </w:tc>
+        <w:tc>
+          <w:tcPr>
+            <w:tcW w:type="dxa" w:w="3135"/>
+            <w:shd w:val="clear" w:color="auto" w:fill="F0F4FA"/>
+          </w:tcPr>
+          <w:p>
+            <w:r>
+              <w:rPr>
+                <w:sz w:val="18"/>
+              </w:rPr>
+              <w:t>Fre3ky → fre3ky</w:t>
+            </w:r>
+          </w:p>
+        </w:tc>
+      </w:tr>
+    </w:tbl>
+    <w:p/>
+    <w:p>
+      <w:pPr>
+        <w:pStyle w:val="Heading2"/>
+      </w:pPr>
+      <w:r>
+        <w:t>5.2 buildNameMap(rows, aliases)</w:t>
+      </w:r>
+    </w:p>
+    <w:p>
+      <w:pPr>
+        <w:spacing w:after="80"/>
+      </w:pPr>
+      <w:r>
+        <w:rPr>
+          <w:b w:val="0"/>
+          <w:i w:val="0"/>
+        </w:rPr>
+        <w:t>Called once at load with the raw CSV rows and the parsed player_aliases.json object. Populates the module-level nameMap (raw → canonical) and nameAliases (canonical → [aliases]) dictionaries using three passes:</w:t>
+      </w:r>
+    </w:p>
+    <w:tbl>
+      <w:tblPr>
+        <w:tblStyle w:val="TableGrid"/>
+        <w:tblW w:type="auto" w:w="0"/>
+        <w:jc w:val="left"/>
+        <w:tblLook w:firstColumn="1" w:firstRow="1" w:lastColumn="0" w:lastRow="0" w:noHBand="0" w:noVBand="1" w:val="04A0"/>
+      </w:tblPr>
+      <w:tblGrid>
+        <w:gridCol w:w="3135"/>
+        <w:gridCol w:w="3135"/>
+        <w:gridCol w:w="3135"/>
+      </w:tblGrid>
+      <w:tr>
+        <w:tc>
+          <w:tcPr>
+            <w:tcW w:type="dxa" w:w="3135"/>
+            <w:shd w:val="clear" w:color="auto" w:fill="2E4057"/>
+          </w:tcPr>
+          <w:p>
+            <w:pPr>
+              <w:jc w:val="center"/>
+            </w:pPr>
+            <w:r>
+              <w:rPr>
+                <w:b/>
+                <w:color w:val="FFFFFF"/>
+                <w:sz w:val="18"/>
+              </w:rPr>
+              <w:t>Pass</w:t>
+            </w:r>
+          </w:p>
+        </w:tc>
+        <w:tc>
+          <w:tcPr>
+            <w:tcW w:type="dxa" w:w="3135"/>
+            <w:shd w:val="clear" w:color="auto" w:fill="2E4057"/>
+          </w:tcPr>
+          <w:p>
+            <w:pPr>
+              <w:jc w:val="center"/>
+            </w:pPr>
+            <w:r>
+              <w:rPr>
+                <w:b/>
+                <w:color w:val="FFFFFF"/>
+                <w:sz w:val="18"/>
+              </w:rPr>
+              <w:t>Strategy</w:t>
+            </w:r>
+          </w:p>
+        </w:tc>
+        <w:tc>
+          <w:tcPr>
+            <w:tcW w:type="dxa" w:w="3135"/>
+            <w:shd w:val="clear" w:color="auto" w:fill="2E4057"/>
+          </w:tcPr>
+          <w:p>
+            <w:pPr>
+              <w:jc w:val="center"/>
+            </w:pPr>
+            <w:r>
+              <w:rPr>
+                <w:b/>
+                <w:color w:val="FFFFFF"/>
+                <w:sz w:val="18"/>
+              </w:rPr>
+              <w:t>What it resolves</w:t>
+            </w:r>
+          </w:p>
+        </w:tc>
+      </w:tr>
+      <w:tr>
+        <w:tc>
+          <w:tcPr>
+            <w:tcW w:type="dxa" w:w="3135"/>
+            <w:shd w:val="clear" w:color="auto" w:fill="FFFFFF"/>
+          </w:tcPr>
+          <w:p>
+            <w:r>
+              <w:rPr>
+                <w:sz w:val="18"/>
+              </w:rPr>
+              <w:t>1 — Exact normalisation</w:t>
+            </w:r>
+          </w:p>
+        </w:tc>
+        <w:tc>
+          <w:tcPr>
+            <w:tcW w:type="dxa" w:w="3135"/>
+            <w:shd w:val="clear" w:color="auto" w:fill="FFFFFF"/>
+          </w:tcPr>
+          <w:p>
+            <w:r>
+              <w:rPr>
+                <w:sz w:val="18"/>
+              </w:rPr>
+              <w:t>Each unique raw name is normalised; if two normalised forms are identical, the shorter raw name is chosen as canonical.</w:t>
+            </w:r>
+          </w:p>
+        </w:tc>
+        <w:tc>
+          <w:tcPr>
+            <w:tcW w:type="dxa" w:w="3135"/>
+            <w:shd w:val="clear" w:color="auto" w:fill="FFFFFF"/>
+          </w:tcPr>
+          <w:p>
+            <w:r>
+              <w:rPr>
+                <w:sz w:val="18"/>
+              </w:rPr>
+              <w:t>Tag/rank spacing, punctuation, underscore separators: "[SR]_Gronk" = "[SR] Gronk"</w:t>
+            </w:r>
+          </w:p>
+        </w:tc>
+      </w:tr>
+      <w:tr>
+        <w:tc>
+          <w:tcPr>
+            <w:tcW w:type="dxa" w:w="3135"/>
+            <w:shd w:val="clear" w:color="auto" w:fill="F0F4FA"/>
+          </w:tcPr>
+          <w:p>
+            <w:r>
+              <w:rPr>
+                <w:sz w:val="18"/>
+              </w:rPr>
+              <w:t>2 — Suffix matching</w:t>
+            </w:r>
+          </w:p>
+        </w:tc>
+        <w:tc>
+          <w:tcPr>
+            <w:tcW w:type="dxa" w:w="3135"/>
+            <w:shd w:val="clear" w:color="auto" w:fill="F0F4FA"/>
+          </w:tcPr>
+          <w:p>
+            <w:r>
+              <w:rPr>
+                <w:sz w:val="18"/>
+              </w:rPr>
+              <w:t>For each name, extract the trailing word(s) as a callsign (min 4 chars). If any shorter name in the dataset ends with that callsign (preceded by space or ]), the longer name merges into the shorter one.</w:t>
+            </w:r>
+          </w:p>
+        </w:tc>
+        <w:tc>
+          <w:tcPr>
+            <w:tcW w:type="dxa" w:w="3135"/>
+            <w:shd w:val="clear" w:color="auto" w:fill="F0F4FA"/>
+          </w:tcPr>
+          <w:p>
+            <w:r>
+              <w:rPr>
+                <w:sz w:val="18"/>
+              </w:rPr>
+              <w:t>Prefix/tag variants: "[2nd USC]Fre3ky", "HMC.P Fre3ky", "[57th] Fre3ky" → all become "Fre3ky"</w:t>
+            </w:r>
+          </w:p>
+        </w:tc>
+      </w:tr>
+      <w:tr>
+        <w:tc>
+          <w:tcPr>
+            <w:tcW w:type="dxa" w:w="3135"/>
+            <w:shd w:val="clear" w:color="auto" w:fill="FFFFFF"/>
+          </w:tcPr>
+          <w:p>
+            <w:r>
+              <w:rPr>
+                <w:sz w:val="18"/>
+              </w:rPr>
+              <w:t>3 — Explicit aliases</w:t>
+            </w:r>
+          </w:p>
+        </w:tc>
+        <w:tc>
+          <w:tcPr>
+            <w:tcW w:type="dxa" w:w="3135"/>
+            <w:shd w:val="clear" w:color="auto" w:fill="FFFFFF"/>
+          </w:tcPr>
+          <w:p>
+            <w:r>
+              <w:rPr>
+                <w:sz w:val="18"/>
+              </w:rPr>
+              <w:t>Any key in player_aliases.json is mapped to its value. Runs after the auto passes so manual aliases always win.</w:t>
+            </w:r>
+          </w:p>
+        </w:tc>
+        <w:tc>
+          <w:tcPr>
+            <w:tcW w:type="dxa" w:w="3135"/>
+            <w:shd w:val="clear" w:color="auto" w:fill="FFFFFF"/>
+          </w:tcPr>
+          <w:p>
+            <w:r>
+              <w:rPr>
+                <w:sz w:val="18"/>
+              </w:rPr>
+              <w:t>Rank variants, completely different callsigns: "SGT T.Viking" → "The Viking"</w:t>
+            </w:r>
+          </w:p>
+        </w:tc>
+      </w:tr>
+    </w:tbl>
+    <w:p/>
+    <w:p>
+      <w:pPr>
+        <w:pStyle w:val="Heading2"/>
+      </w:pPr>
+      <w:r>
+        <w:t>5.3 player_aliases.json</w:t>
+      </w:r>
+    </w:p>
+    <w:p>
+      <w:pPr>
+        <w:spacing w:after="80"/>
+      </w:pPr>
+      <w:r>
+        <w:rPr>
+          <w:b w:val="0"/>
+          <w:i w:val="0"/>
+        </w:rPr>
+        <w:t>A static JSON file fetched in parallel with the CSV. Maps any raw name variant to a canonical display name. Only required for cases the auto-normalisation cannot handle.</w:t>
+      </w:r>
+    </w:p>
+    <w:p>
+      <w:pPr>
+        <w:pStyle w:val="NoSpacing"/>
+        <w:spacing w:before="40" w:after="40"/>
+        <w:ind w:left="576"/>
+        <w:shd w:val="clear" w:color="auto" w:fill="F3F3F3"/>
+      </w:pPr>
+      <w:r>
+        <w:rPr>
+          <w:rFonts w:ascii="Courier New" w:hAnsi="Courier New"/>
+          <w:color w:val="222222"/>
+          <w:sz w:val="18"/>
+        </w:rPr>
+        <w:t>{</w:t>
+      </w:r>
+    </w:p>
+    <w:p>
+      <w:pPr>
+        <w:pStyle w:val="NoSpacing"/>
+        <w:spacing w:before="40" w:after="40"/>
+        <w:ind w:left="576"/>
+        <w:shd w:val="clear" w:color="auto" w:fill="F3F3F3"/>
+      </w:pPr>
+      <w:r>
+        <w:rPr>
+          <w:rFonts w:ascii="Courier New" w:hAnsi="Courier New"/>
+          <w:color w:val="222222"/>
+          <w:sz w:val="18"/>
+        </w:rPr>
+        <w:t xml:space="preserve">  "PSGT Dusty": "[2nd USC] Trp. Dusty",</w:t>
+      </w:r>
+    </w:p>
+    <w:p>
+      <w:pPr>
+        <w:pStyle w:val="NoSpacing"/>
+        <w:spacing w:before="40" w:after="40"/>
+        <w:ind w:left="576"/>
+        <w:shd w:val="clear" w:color="auto" w:fill="F3F3F3"/>
+      </w:pPr>
+      <w:r>
+        <w:rPr>
+          <w:rFonts w:ascii="Courier New" w:hAnsi="Courier New"/>
+          <w:color w:val="222222"/>
+          <w:sz w:val="18"/>
+        </w:rPr>
+        <w:t xml:space="preserve">  "SGT T.Viking": "The Viking"</w:t>
+      </w:r>
+    </w:p>
+    <w:p>
+      <w:pPr>
+        <w:pStyle w:val="NoSpacing"/>
+        <w:spacing w:before="40" w:after="40"/>
+        <w:ind w:left="576"/>
+        <w:shd w:val="clear" w:color="auto" w:fill="F3F3F3"/>
+      </w:pPr>
+      <w:r>
+        <w:rPr>
+          <w:rFonts w:ascii="Courier New" w:hAnsi="Courier New"/>
+          <w:color w:val="222222"/>
+          <w:sz w:val="18"/>
+        </w:rPr>
+        <w:t>}</w:t>
+      </w:r>
+    </w:p>
+    <w:p/>
+    <w:p>
+      <w:pPr>
+        <w:spacing w:after="120"/>
+      </w:pPr>
+      <w:r>
+        <w:rPr>
+          <w:b w:val="0"/>
+          <w:i w:val="0"/>
+        </w:rPr>
+        <w:t>The value must be the canonical form (the name as it should appear in the UI). Spacing and bracket variants are handled by the normalisation pass automatically — only add an entry here when the names are semantically different.</w:t>
+      </w:r>
+    </w:p>
+    <w:p>
+      <w:pPr>
+        <w:pStyle w:val="Heading2"/>
+      </w:pPr>
+      <w:r>
+        <w:t>5.4 "Also known as" display</w:t>
+      </w:r>
+    </w:p>
+    <w:p>
+      <w:pPr>
+        <w:spacing w:after="120"/>
+      </w:pPr>
+      <w:r>
+        <w:rPr>
+          <w:b w:val="0"/>
+          <w:i w:val="0"/>
+        </w:rPr>
+        <w:t>When a player has one or more absorbed aliases, the full career page displays a dimmed italic "Also known as: alias1, alias2" line below the subtitle. This is populated from nameAliases[canonicalName] by the _setCareerSubtitle() helper.</w:t>
+      </w:r>
+    </w:p>
+    <w:p>
+      <w:r>
+        <w:br w:type="page"/>
+      </w:r>
+    </w:p>
+    <w:p>
+      <w:pPr>
+        <w:pStyle w:val="Heading1"/>
+      </w:pPr>
+      <w:r>
+        <w:t>6. Filter System</w:t>
+      </w:r>
+    </w:p>
+    <w:p>
+      <w:pPr>
+        <w:pStyle w:val="Heading2"/>
+      </w:pPr>
+      <w:r>
+        <w:t>6.1 Filter Pipeline</w:t>
       </w:r>
     </w:p>
     <w:p>
@@ -5310,7 +6180,7 @@
         <w:pStyle w:val="Heading2"/>
       </w:pPr>
       <w:r>
-        <w:t>5.2 Pill Availability Cascade</w:t>
+        <w:t>6.2 Pill Availability Cascade</w:t>
       </w:r>
     </w:p>
     <w:p>
@@ -5382,7 +6252,7 @@
         <w:pStyle w:val="Heading2"/>
       </w:pPr>
       <w:r>
-        <w:t>5.3 Player Pills vs Mission Pills</w:t>
+        <w:t>6.3 Player Pills vs Mission Pills</w:t>
       </w:r>
     </w:p>
     <w:tbl>
@@ -5771,7 +6641,7 @@
         <w:pStyle w:val="Heading2"/>
       </w:pPr>
       <w:r>
-        <w:t>5.4 Zeus Filter</w:t>
+        <w:t>6.4 Zeus Filter</w:t>
       </w:r>
     </w:p>
     <w:p>
@@ -5950,7 +6820,7 @@
         <w:pStyle w:val="Heading1"/>
       </w:pPr>
       <w:r>
-        <w:t>6. Rendering Functions</w:t>
+        <w:t>7. Rendering Functions</w:t>
       </w:r>
     </w:p>
     <w:p>
@@ -5958,7 +6828,7 @@
         <w:pStyle w:val="Heading2"/>
       </w:pPr>
       <w:r>
-        <w:t>6.1 renderStats()</w:t>
+        <w:t>8.1 renderStats()</w:t>
       </w:r>
     </w:p>
     <w:p>
@@ -6271,7 +7141,7 @@
         <w:pStyle w:val="Heading2"/>
       </w:pPr>
       <w:r>
-        <w:t>6.2 renderChart()</w:t>
+        <w:t>8.2 renderChart()</w:t>
       </w:r>
     </w:p>
     <w:p>
@@ -6291,7 +7161,7 @@
         <w:pStyle w:val="Heading2"/>
       </w:pPr>
       <w:r>
-        <w:t>6.3 renderLeader() — Award Cards</w:t>
+        <w:t>8.3 renderLeader() — Award Cards</w:t>
       </w:r>
     </w:p>
     <w:tbl>
@@ -6700,7 +7570,7 @@
         <w:pStyle w:val="Heading2"/>
       </w:pPr>
       <w:r>
-        <w:t>6.4 renderInfantryTable()</w:t>
+        <w:t>8.4 renderInfantryTable()</w:t>
       </w:r>
     </w:p>
     <w:p>
@@ -7753,7 +8623,7 @@
         <w:pStyle w:val="Heading2"/>
       </w:pPr>
       <w:r>
-        <w:t>6.5 renderVehicleTable()</w:t>
+        <w:t>8.5 renderVehicleTable()</w:t>
       </w:r>
     </w:p>
     <w:p>
@@ -7773,7 +8643,7 @@
         <w:pStyle w:val="Heading2"/>
       </w:pPr>
       <w:r>
-        <w:t>6.6 renderTableHead()</w:t>
+        <w:t>8.6 renderTableHead()</w:t>
       </w:r>
     </w:p>
     <w:p>
@@ -7793,7 +8663,7 @@
         <w:pStyle w:val="Heading2"/>
       </w:pPr>
       <w:r>
-        <w:t>6.7 renderUnitLeaderboard()</w:t>
+        <w:t>8.7 renderUnitLeaderboard()</w:t>
       </w:r>
     </w:p>
     <w:p>
@@ -7813,7 +8683,7 @@
         <w:pStyle w:val="Heading2"/>
       </w:pPr>
       <w:r>
-        <w:t>6.8 renderMissionHistory()</w:t>
+        <w:t>8.8 renderMissionHistory()</w:t>
       </w:r>
     </w:p>
     <w:p>
@@ -7833,7 +8703,7 @@
         <w:pStyle w:val="Heading2"/>
       </w:pPr>
       <w:r>
-        <w:t>6.9 renderVehicleKillsSection()</w:t>
+        <w:t>8.9 renderVehicleKillsSection()</w:t>
       </w:r>
     </w:p>
     <w:p>
@@ -7853,7 +8723,7 @@
         <w:pStyle w:val="Heading2"/>
       </w:pPr>
       <w:r>
-        <w:t>6.10 renderWeaponLeaderboard()</w:t>
+        <w:t>8.10 renderWeaponLeaderboard()</w:t>
       </w:r>
     </w:p>
     <w:p>
@@ -7873,7 +8743,7 @@
         <w:pStyle w:val="Heading2"/>
       </w:pPr>
       <w:r>
-        <w:t>6.11 renderMapStats()</w:t>
+        <w:t>8.11 renderMapStats()</w:t>
       </w:r>
     </w:p>
     <w:p>
@@ -7893,7 +8763,7 @@
         <w:pStyle w:val="Heading2"/>
       </w:pPr>
       <w:r>
-        <w:t>6.12 renderRoleLeaderboard()</w:t>
+        <w:t>8.12 renderRoleLeaderboard()</w:t>
       </w:r>
     </w:p>
     <w:p>
@@ -7913,7 +8783,7 @@
         <w:pStyle w:val="Heading2"/>
       </w:pPr>
       <w:r>
-        <w:t>6.13 renderAttendance()</w:t>
+        <w:t>8.13 renderAttendance()</w:t>
       </w:r>
     </w:p>
     <w:p>
@@ -7933,7 +8803,7 @@
         <w:pStyle w:val="Heading2"/>
       </w:pPr>
       <w:r>
-        <w:t>6.14 renderKdTrend()</w:t>
+        <w:t>8.14 renderKdTrend()</w:t>
       </w:r>
     </w:p>
     <w:p>
@@ -7953,7 +8823,7 @@
         <w:pStyle w:val="Heading2"/>
       </w:pPr>
       <w:r>
-        <w:t>6.15 renderComparison()</w:t>
+        <w:t>8.15 renderComparison()</w:t>
       </w:r>
     </w:p>
     <w:p>
@@ -7973,7 +8843,7 @@
         <w:pStyle w:val="Heading2"/>
       </w:pPr>
       <w:r>
-        <w:t>6.16 Section Nav Bar &amp; toggleSection()</w:t>
+        <w:t>8.16 Section Nav Bar &amp; toggleSection()</w:t>
       </w:r>
     </w:p>
     <w:p>
@@ -7998,7 +8868,7 @@
         <w:pStyle w:val="Heading1"/>
       </w:pPr>
       <w:r>
-        <w:t>7. Player Detail Views</w:t>
+        <w:t>8. Player Detail Views</w:t>
       </w:r>
     </w:p>
     <w:p>
@@ -8006,7 +8876,7 @@
         <w:pStyle w:val="Heading2"/>
       </w:pPr>
       <w:r>
-        <w:t>7.1 Player Detail Modal</w:t>
+        <w:t>8.1 Player Detail Modal</w:t>
       </w:r>
     </w:p>
     <w:p>
@@ -8199,7 +9069,7 @@
         <w:pStyle w:val="Heading2"/>
       </w:pPr>
       <w:r>
-        <w:t>7.2 Full Career Page</w:t>
+        <w:t>8.2 Full Career Page</w:t>
       </w:r>
     </w:p>
     <w:p>
@@ -8348,7 +9218,7 @@
         <w:pStyle w:val="Heading2"/>
       </w:pPr>
       <w:r>
-        <w:t>7.3 buildCareerStatsHTML() — Content Sections</w:t>
+        <w:t>8.3 buildCareerStatsHTML() — Content Sections</w:t>
       </w:r>
     </w:p>
     <w:tbl>
@@ -8533,7 +9403,7 @@
         <w:pStyle w:val="Heading1"/>
       </w:pPr>
       <w:r>
-        <w:t>8. Complete Function Reference</w:t>
+        <w:t>9. Complete Function Reference</w:t>
       </w:r>
     </w:p>
     <w:tbl>
@@ -12186,7 +13056,7 @@
         <w:pStyle w:val="Heading1"/>
       </w:pPr>
       <w:r>
-        <w:t>9. CSS Design System</w:t>
+        <w:t>10. CSS Design System</w:t>
       </w:r>
     </w:p>
     <w:p>
@@ -12194,7 +13064,7 @@
         <w:pStyle w:val="Heading2"/>
       </w:pPr>
       <w:r>
-        <w:t>9.1 CSS Custom Properties (Variables)</w:t>
+        <w:t>10.1 CSS Custom Properties (Variables)</w:t>
       </w:r>
     </w:p>
     <w:tbl>
@@ -12803,7 +13673,7 @@
         <w:pStyle w:val="Heading2"/>
       </w:pPr>
       <w:r>
-        <w:t>9.2 Typography</w:t>
+        <w:t>10.2 Typography</w:t>
       </w:r>
     </w:p>
     <w:tbl>
@@ -13016,7 +13886,7 @@
         <w:pStyle w:val="Heading2"/>
       </w:pPr>
       <w:r>
-        <w:t>9.3 Key CSS Classes</w:t>
+        <w:t>10.3 Key CSS Classes</w:t>
       </w:r>
     </w:p>
     <w:tbl>
@@ -13805,7 +14675,7 @@
         <w:pStyle w:val="Heading1"/>
       </w:pPr>
       <w:r>
-        <w:t>10. DOM Structure</w:t>
+        <w:t>11. DOM Structure</w:t>
       </w:r>
     </w:p>
     <w:p>
@@ -13813,7 +14683,7 @@
         <w:pStyle w:val="Heading2"/>
       </w:pPr>
       <w:r>
-        <w:t>10.1 Top-level Elements</w:t>
+        <w:t>11.1 Top-level Elements</w:t>
       </w:r>
     </w:p>
     <w:tbl>
@@ -15174,7 +16044,7 @@
         <w:pStyle w:val="Heading1"/>
       </w:pPr>
       <w:r>
-        <w:t>11. Deployment</w:t>
+        <w:t>12. Deployment</w:t>
       </w:r>
     </w:p>
     <w:p>
@@ -15182,7 +16052,7 @@
         <w:pStyle w:val="Heading2"/>
       </w:pPr>
       <w:r>
-        <w:t>11.1 GitHub Actions Pipeline</w:t>
+        <w:t>12.1 GitHub Actions Pipeline</w:t>
       </w:r>
     </w:p>
     <w:p>
@@ -15363,7 +16233,7 @@
         <w:pStyle w:val="Heading2"/>
       </w:pPr>
       <w:r>
-        <w:t>11.2 GitHub Pages Configuration</w:t>
+        <w:t>12.2 GitHub Pages Configuration</w:t>
       </w:r>
     </w:p>
     <w:p>
@@ -15383,7 +16253,7 @@
         <w:pStyle w:val="Heading2"/>
       </w:pPr>
       <w:r>
-        <w:t>11.3 Publishing a Preview to Production</w:t>
+        <w:t>12.3 Publishing a Preview to Production</w:t>
       </w:r>
     </w:p>
     <w:p>
@@ -15448,7 +16318,7 @@
         <w:pStyle w:val="Heading1"/>
       </w:pPr>
       <w:r>
-        <w:t>12. Extending the Application</w:t>
+        <w:t>13. Extending the Application</w:t>
       </w:r>
     </w:p>
     <w:p>
@@ -15456,7 +16326,7 @@
         <w:pStyle w:val="Heading2"/>
       </w:pPr>
       <w:r>
-        <w:t>12.1 Adding a New Stat Column</w:t>
+        <w:t>13.1 Adding a New Stat Column</w:t>
       </w:r>
     </w:p>
     <w:p>
@@ -15529,7 +16399,7 @@
         <w:pStyle w:val="Heading2"/>
       </w:pPr>
       <w:r>
-        <w:t>12.2 Adding a New Award Card</w:t>
+        <w:t>13.2 Adding a New Award Card</w:t>
       </w:r>
     </w:p>
     <w:p>
@@ -15589,7 +16459,7 @@
         <w:pStyle w:val="Heading2"/>
       </w:pPr>
       <w:r>
-        <w:t>12.3 Pointing to a Different Google Sheet</w:t>
+        <w:t>13.3 Pointing to a Different Google Sheet</w:t>
       </w:r>
     </w:p>
     <w:p>
@@ -15636,7 +16506,7 @@
         <w:pStyle w:val="Heading2"/>
       </w:pPr>
       <w:r>
-        <w:t>12.4 Adding Persistence (localStorage)</w:t>
+        <w:t>13.4 Adding Persistence (localStorage)</w:t>
       </w:r>
     </w:p>
     <w:p>
@@ -15869,7 +16739,7 @@
               <w:rPr>
                 <w:sz w:val="18"/>
               </w:rPr>
-              <w:t>Parallel fetch of CSV_URL and unit_overrides.json.</w:t>
+              <w:t>Parallel fetch of CSV_URL, unit_overrides.json, and player_aliases.json.</w:t>
             </w:r>
           </w:p>
         </w:tc>
@@ -15899,21 +16769,21 @@
               <w:rPr>
                 <w:sz w:val="18"/>
               </w:rPr>
-              <w:t>parseCSVLine() × N</w:t>
-            </w:r>
-          </w:p>
-        </w:tc>
-        <w:tc>
-          <w:tcPr>
-            <w:tcW w:type="dxa" w:w="3135"/>
-            <w:shd w:val="clear" w:color="auto" w:fill="FFFFFF"/>
-          </w:tcPr>
-          <w:p>
-            <w:r>
-              <w:rPr>
-                <w:sz w:val="18"/>
-              </w:rPr>
-              <w:t>Each row parsed; rawRows[] populated.</w:t>
+              <w:t>buildNameMap()</w:t>
+            </w:r>
+          </w:p>
+        </w:tc>
+        <w:tc>
+          <w:tcPr>
+            <w:tcW w:type="dxa" w:w="3135"/>
+            <w:shd w:val="clear" w:color="auto" w:fill="FFFFFF"/>
+          </w:tcPr>
+          <w:p>
+            <w:r>
+              <w:rPr>
+                <w:sz w:val="18"/>
+              </w:rPr>
+              <w:t>nameMap{} and nameAliases{} populated via three-pass name normalisation.</w:t>
             </w:r>
           </w:p>
         </w:tc>
@@ -15943,21 +16813,21 @@
               <w:rPr>
                 <w:sz w:val="18"/>
               </w:rPr>
-              <w:t>buildAggregates()</w:t>
-            </w:r>
-          </w:p>
-        </w:tc>
-        <w:tc>
-          <w:tcPr>
-            <w:tcW w:type="dxa" w:w="3135"/>
-            <w:shd w:val="clear" w:color="auto" w:fill="F0F4FA"/>
-          </w:tcPr>
-          <w:p>
-            <w:r>
-              <w:rPr>
-                <w:sz w:val="18"/>
-              </w:rPr>
-              <w:t>aggPlayers{} populated with career totals.</w:t>
+              <w:t>parseCSVLine() × N</w:t>
+            </w:r>
+          </w:p>
+        </w:tc>
+        <w:tc>
+          <w:tcPr>
+            <w:tcW w:type="dxa" w:w="3135"/>
+            <w:shd w:val="clear" w:color="auto" w:fill="F0F4FA"/>
+          </w:tcPr>
+          <w:p>
+            <w:r>
+              <w:rPr>
+                <w:sz w:val="18"/>
+              </w:rPr>
+              <w:t>Each row parsed; rawRows[] populated.</w:t>
             </w:r>
           </w:p>
         </w:tc>
@@ -15987,21 +16857,21 @@
               <w:rPr>
                 <w:sz w:val="18"/>
               </w:rPr>
-              <w:t>classifyPlayerUnits()</w:t>
-            </w:r>
-          </w:p>
-        </w:tc>
-        <w:tc>
-          <w:tcPr>
-            <w:tcW w:type="dxa" w:w="3135"/>
-            <w:shd w:val="clear" w:color="auto" w:fill="FFFFFF"/>
-          </w:tcPr>
-          <w:p>
-            <w:r>
-              <w:rPr>
-                <w:sz w:val="18"/>
-              </w:rPr>
-              <w:t>playerUnits{} populated via co-occurrence analysis; overrides applied.</w:t>
+              <w:t>buildAggregates()</w:t>
+            </w:r>
+          </w:p>
+        </w:tc>
+        <w:tc>
+          <w:tcPr>
+            <w:tcW w:type="dxa" w:w="3135"/>
+            <w:shd w:val="clear" w:color="auto" w:fill="FFFFFF"/>
+          </w:tcPr>
+          <w:p>
+            <w:r>
+              <w:rPr>
+                <w:sz w:val="18"/>
+              </w:rPr>
+              <w:t>aggPlayers{} populated with career totals.</w:t>
             </w:r>
           </w:p>
         </w:tc>
@@ -16031,21 +16901,21 @@
               <w:rPr>
                 <w:sz w:val="18"/>
               </w:rPr>
-              <w:t>buildUI()</w:t>
-            </w:r>
-          </w:p>
-        </w:tc>
-        <w:tc>
-          <w:tcPr>
-            <w:tcW w:type="dxa" w:w="3135"/>
-            <w:shd w:val="clear" w:color="auto" w:fill="F0F4FA"/>
-          </w:tcPr>
-          <w:p>
-            <w:r>
-              <w:rPr>
-                <w:sz w:val="18"/>
-              </w:rPr>
-              <w:t>Calls buildFilters() and applyFilters(); shows section nav bar.</w:t>
+              <w:t>classifyPlayerUnits()</w:t>
+            </w:r>
+          </w:p>
+        </w:tc>
+        <w:tc>
+          <w:tcPr>
+            <w:tcW w:type="dxa" w:w="3135"/>
+            <w:shd w:val="clear" w:color="auto" w:fill="F0F4FA"/>
+          </w:tcPr>
+          <w:p>
+            <w:r>
+              <w:rPr>
+                <w:sz w:val="18"/>
+              </w:rPr>
+              <w:t>playerUnits{} populated via co-occurrence analysis; overrides applied.</w:t>
             </w:r>
           </w:p>
         </w:tc>
@@ -16075,21 +16945,21 @@
               <w:rPr>
                 <w:sz w:val="18"/>
               </w:rPr>
-              <w:t>buildFilters()</w:t>
-            </w:r>
-          </w:p>
-        </w:tc>
-        <w:tc>
-          <w:tcPr>
-            <w:tcW w:type="dxa" w:w="3135"/>
-            <w:shd w:val="clear" w:color="auto" w:fill="FFFFFF"/>
-          </w:tcPr>
-          <w:p>
-            <w:r>
-              <w:rPr>
-                <w:sz w:val="18"/>
-              </w:rPr>
-              <w:t>Event listeners attached; refreshPills() called.</w:t>
+              <w:t>buildUI()</w:t>
+            </w:r>
+          </w:p>
+        </w:tc>
+        <w:tc>
+          <w:tcPr>
+            <w:tcW w:type="dxa" w:w="3135"/>
+            <w:shd w:val="clear" w:color="auto" w:fill="FFFFFF"/>
+          </w:tcPr>
+          <w:p>
+            <w:r>
+              <w:rPr>
+                <w:sz w:val="18"/>
+              </w:rPr>
+              <w:t>Calls buildFilters() and applyFilters(); shows section nav bar.</w:t>
             </w:r>
           </w:p>
         </w:tc>
@@ -16119,21 +16989,21 @@
               <w:rPr>
                 <w:sz w:val="18"/>
               </w:rPr>
-              <w:t>applyFilters()</w:t>
-            </w:r>
-          </w:p>
-        </w:tc>
-        <w:tc>
-          <w:tcPr>
-            <w:tcW w:type="dxa" w:w="3135"/>
-            <w:shd w:val="clear" w:color="auto" w:fill="F0F4FA"/>
-          </w:tcPr>
-          <w:p>
-            <w:r>
-              <w:rPr>
-                <w:sz w:val="18"/>
-              </w:rPr>
-              <w:t>filteredPlayers[] and filteredRows[] built; all render functions called.</w:t>
+              <w:t>buildFilters()</w:t>
+            </w:r>
+          </w:p>
+        </w:tc>
+        <w:tc>
+          <w:tcPr>
+            <w:tcW w:type="dxa" w:w="3135"/>
+            <w:shd w:val="clear" w:color="auto" w:fill="F0F4FA"/>
+          </w:tcPr>
+          <w:p>
+            <w:r>
+              <w:rPr>
+                <w:sz w:val="18"/>
+              </w:rPr>
+              <w:t>Event listeners attached; refreshPills() called.</w:t>
             </w:r>
           </w:p>
         </w:tc>
@@ -16163,21 +17033,21 @@
               <w:rPr>
                 <w:sz w:val="18"/>
               </w:rPr>
-              <w:t>renderStats()</w:t>
-            </w:r>
-          </w:p>
-        </w:tc>
-        <w:tc>
-          <w:tcPr>
-            <w:tcW w:type="dxa" w:w="3135"/>
-            <w:shd w:val="clear" w:color="auto" w:fill="FFFFFF"/>
-          </w:tcPr>
-          <w:p>
-            <w:r>
-              <w:rPr>
-                <w:sz w:val="18"/>
-              </w:rPr>
-              <w:t>#statsBar populated.</w:t>
+              <w:t>applyFilters()</w:t>
+            </w:r>
+          </w:p>
+        </w:tc>
+        <w:tc>
+          <w:tcPr>
+            <w:tcW w:type="dxa" w:w="3135"/>
+            <w:shd w:val="clear" w:color="auto" w:fill="FFFFFF"/>
+          </w:tcPr>
+          <w:p>
+            <w:r>
+              <w:rPr>
+                <w:sz w:val="18"/>
+              </w:rPr>
+              <w:t>filteredPlayers[] and filteredRows[] built; all render functions called.</w:t>
             </w:r>
           </w:p>
         </w:tc>
@@ -16207,21 +17077,21 @@
               <w:rPr>
                 <w:sz w:val="18"/>
               </w:rPr>
-              <w:t>renderChart()</w:t>
-            </w:r>
-          </w:p>
-        </w:tc>
-        <w:tc>
-          <w:tcPr>
-            <w:tcW w:type="dxa" w:w="3135"/>
-            <w:shd w:val="clear" w:color="auto" w:fill="F0F4FA"/>
-          </w:tcPr>
-          <w:p>
-            <w:r>
-              <w:rPr>
-                <w:sz w:val="18"/>
-              </w:rPr>
-              <w:t>#chartBars populated.</w:t>
+              <w:t>renderStats()</w:t>
+            </w:r>
+          </w:p>
+        </w:tc>
+        <w:tc>
+          <w:tcPr>
+            <w:tcW w:type="dxa" w:w="3135"/>
+            <w:shd w:val="clear" w:color="auto" w:fill="F0F4FA"/>
+          </w:tcPr>
+          <w:p>
+            <w:r>
+              <w:rPr>
+                <w:sz w:val="18"/>
+              </w:rPr>
+              <w:t>#statsBar populated.</w:t>
             </w:r>
           </w:p>
         </w:tc>
@@ -16251,21 +17121,21 @@
               <w:rPr>
                 <w:sz w:val="18"/>
               </w:rPr>
-              <w:t>renderLeader()</w:t>
-            </w:r>
-          </w:p>
-        </w:tc>
-        <w:tc>
-          <w:tcPr>
-            <w:tcW w:type="dxa" w:w="3135"/>
-            <w:shd w:val="clear" w:color="auto" w:fill="FFFFFF"/>
-          </w:tcPr>
-          <w:p>
-            <w:r>
-              <w:rPr>
-                <w:sz w:val="18"/>
-              </w:rPr>
-              <w:t>#awardsRow populated.</w:t>
+              <w:t>renderChart()</w:t>
+            </w:r>
+          </w:p>
+        </w:tc>
+        <w:tc>
+          <w:tcPr>
+            <w:tcW w:type="dxa" w:w="3135"/>
+            <w:shd w:val="clear" w:color="auto" w:fill="FFFFFF"/>
+          </w:tcPr>
+          <w:p>
+            <w:r>
+              <w:rPr>
+                <w:sz w:val="18"/>
+              </w:rPr>
+              <w:t>#chartBars populated.</w:t>
             </w:r>
           </w:p>
         </w:tc>
@@ -16295,21 +17165,21 @@
               <w:rPr>
                 <w:sz w:val="18"/>
               </w:rPr>
-              <w:t>renderInfantryTable()</w:t>
-            </w:r>
-          </w:p>
-        </w:tc>
-        <w:tc>
-          <w:tcPr>
-            <w:tcW w:type="dxa" w:w="3135"/>
-            <w:shd w:val="clear" w:color="auto" w:fill="F0F4FA"/>
-          </w:tcPr>
-          <w:p>
-            <w:r>
-              <w:rPr>
-                <w:sz w:val="18"/>
-              </w:rPr>
-              <w:t>#infantryBody + #infantryHead populated.</w:t>
+              <w:t>renderLeader()</w:t>
+            </w:r>
+          </w:p>
+        </w:tc>
+        <w:tc>
+          <w:tcPr>
+            <w:tcW w:type="dxa" w:w="3135"/>
+            <w:shd w:val="clear" w:color="auto" w:fill="F0F4FA"/>
+          </w:tcPr>
+          <w:p>
+            <w:r>
+              <w:rPr>
+                <w:sz w:val="18"/>
+              </w:rPr>
+              <w:t>#awardsRow populated.</w:t>
             </w:r>
           </w:p>
         </w:tc>
@@ -16339,21 +17209,21 @@
               <w:rPr>
                 <w:sz w:val="18"/>
               </w:rPr>
-              <w:t>renderVehicleTable()</w:t>
-            </w:r>
-          </w:p>
-        </w:tc>
-        <w:tc>
-          <w:tcPr>
-            <w:tcW w:type="dxa" w:w="3135"/>
-            <w:shd w:val="clear" w:color="auto" w:fill="FFFFFF"/>
-          </w:tcPr>
-          <w:p>
-            <w:r>
-              <w:rPr>
-                <w:sz w:val="18"/>
-              </w:rPr>
-              <w:t>#vehicleBody + #vehicleHead populated.</w:t>
+              <w:t>renderInfantryTable()</w:t>
+            </w:r>
+          </w:p>
+        </w:tc>
+        <w:tc>
+          <w:tcPr>
+            <w:tcW w:type="dxa" w:w="3135"/>
+            <w:shd w:val="clear" w:color="auto" w:fill="FFFFFF"/>
+          </w:tcPr>
+          <w:p>
+            <w:r>
+              <w:rPr>
+                <w:sz w:val="18"/>
+              </w:rPr>
+              <w:t>#infantryBody + #infantryHead populated.</w:t>
             </w:r>
           </w:p>
         </w:tc>
@@ -16383,21 +17253,21 @@
               <w:rPr>
                 <w:sz w:val="18"/>
               </w:rPr>
-              <w:t>renderUnitLeaderboard()</w:t>
-            </w:r>
-          </w:p>
-        </w:tc>
-        <w:tc>
-          <w:tcPr>
-            <w:tcW w:type="dxa" w:w="3135"/>
-            <w:shd w:val="clear" w:color="auto" w:fill="F0F4FA"/>
-          </w:tcPr>
-          <w:p>
-            <w:r>
-              <w:rPr>
-                <w:sz w:val="18"/>
-              </w:rPr>
-              <w:t>#unitLbBody populated (section collapsed by default).</w:t>
+              <w:t>renderVehicleTable()</w:t>
+            </w:r>
+          </w:p>
+        </w:tc>
+        <w:tc>
+          <w:tcPr>
+            <w:tcW w:type="dxa" w:w="3135"/>
+            <w:shd w:val="clear" w:color="auto" w:fill="F0F4FA"/>
+          </w:tcPr>
+          <w:p>
+            <w:r>
+              <w:rPr>
+                <w:sz w:val="18"/>
+              </w:rPr>
+              <w:t>#vehicleBody + #vehicleHead populated.</w:t>
             </w:r>
           </w:p>
         </w:tc>
@@ -16427,21 +17297,21 @@
               <w:rPr>
                 <w:sz w:val="18"/>
               </w:rPr>
-              <w:t>renderMissionHistory()</w:t>
-            </w:r>
-          </w:p>
-        </w:tc>
-        <w:tc>
-          <w:tcPr>
-            <w:tcW w:type="dxa" w:w="3135"/>
-            <w:shd w:val="clear" w:color="auto" w:fill="FFFFFF"/>
-          </w:tcPr>
-          <w:p>
-            <w:r>
-              <w:rPr>
-                <w:sz w:val="18"/>
-              </w:rPr>
-              <w:t>#missionHistBody populated (section collapsed by default).</w:t>
+              <w:t>renderUnitLeaderboard()</w:t>
+            </w:r>
+          </w:p>
+        </w:tc>
+        <w:tc>
+          <w:tcPr>
+            <w:tcW w:type="dxa" w:w="3135"/>
+            <w:shd w:val="clear" w:color="auto" w:fill="FFFFFF"/>
+          </w:tcPr>
+          <w:p>
+            <w:r>
+              <w:rPr>
+                <w:sz w:val="18"/>
+              </w:rPr>
+              <w:t>#unitLbBody populated (section collapsed by default).</w:t>
             </w:r>
           </w:p>
         </w:tc>
@@ -16471,21 +17341,21 @@
               <w:rPr>
                 <w:sz w:val="18"/>
               </w:rPr>
-              <w:t>renderVehicleKillsSection()</w:t>
-            </w:r>
-          </w:p>
-        </w:tc>
-        <w:tc>
-          <w:tcPr>
-            <w:tcW w:type="dxa" w:w="3135"/>
-            <w:shd w:val="clear" w:color="auto" w:fill="F0F4FA"/>
-          </w:tcPr>
-          <w:p>
-            <w:r>
-              <w:rPr>
-                <w:sz w:val="18"/>
-              </w:rPr>
-              <w:t>#vehKillsBody populated (section collapsed by default).</w:t>
+              <w:t>renderMissionHistory()</w:t>
+            </w:r>
+          </w:p>
+        </w:tc>
+        <w:tc>
+          <w:tcPr>
+            <w:tcW w:type="dxa" w:w="3135"/>
+            <w:shd w:val="clear" w:color="auto" w:fill="F0F4FA"/>
+          </w:tcPr>
+          <w:p>
+            <w:r>
+              <w:rPr>
+                <w:sz w:val="18"/>
+              </w:rPr>
+              <w:t>#missionHistBody populated (section collapsed by default).</w:t>
             </w:r>
           </w:p>
         </w:tc>
@@ -16515,21 +17385,21 @@
               <w:rPr>
                 <w:sz w:val="18"/>
               </w:rPr>
-              <w:t>renderWeaponLeaderboard()</w:t>
-            </w:r>
-          </w:p>
-        </w:tc>
-        <w:tc>
-          <w:tcPr>
-            <w:tcW w:type="dxa" w:w="3135"/>
-            <w:shd w:val="clear" w:color="auto" w:fill="FFFFFF"/>
-          </w:tcPr>
-          <w:p>
-            <w:r>
-              <w:rPr>
-                <w:sz w:val="18"/>
-              </w:rPr>
-              <w:t>#wpBody populated (section collapsed by default).</w:t>
+              <w:t>renderVehicleKillsSection()</w:t>
+            </w:r>
+          </w:p>
+        </w:tc>
+        <w:tc>
+          <w:tcPr>
+            <w:tcW w:type="dxa" w:w="3135"/>
+            <w:shd w:val="clear" w:color="auto" w:fill="FFFFFF"/>
+          </w:tcPr>
+          <w:p>
+            <w:r>
+              <w:rPr>
+                <w:sz w:val="18"/>
+              </w:rPr>
+              <w:t>#vehKillsBody populated (section collapsed by default).</w:t>
             </w:r>
           </w:p>
         </w:tc>
@@ -16559,21 +17429,21 @@
               <w:rPr>
                 <w:sz w:val="18"/>
               </w:rPr>
-              <w:t>renderMapStats()</w:t>
-            </w:r>
-          </w:p>
-        </w:tc>
-        <w:tc>
-          <w:tcPr>
-            <w:tcW w:type="dxa" w:w="3135"/>
-            <w:shd w:val="clear" w:color="auto" w:fill="F0F4FA"/>
-          </w:tcPr>
-          <w:p>
-            <w:r>
-              <w:rPr>
-                <w:sz w:val="18"/>
-              </w:rPr>
-              <w:t>#mapBody populated (section collapsed by default).</w:t>
+              <w:t>renderWeaponLeaderboard()</w:t>
+            </w:r>
+          </w:p>
+        </w:tc>
+        <w:tc>
+          <w:tcPr>
+            <w:tcW w:type="dxa" w:w="3135"/>
+            <w:shd w:val="clear" w:color="auto" w:fill="F0F4FA"/>
+          </w:tcPr>
+          <w:p>
+            <w:r>
+              <w:rPr>
+                <w:sz w:val="18"/>
+              </w:rPr>
+              <w:t>#wpBody populated (section collapsed by default).</w:t>
             </w:r>
           </w:p>
         </w:tc>
@@ -16603,21 +17473,21 @@
               <w:rPr>
                 <w:sz w:val="18"/>
               </w:rPr>
-              <w:t>renderRoleLeaderboard()</w:t>
-            </w:r>
-          </w:p>
-        </w:tc>
-        <w:tc>
-          <w:tcPr>
-            <w:tcW w:type="dxa" w:w="3135"/>
-            <w:shd w:val="clear" w:color="auto" w:fill="FFFFFF"/>
-          </w:tcPr>
-          <w:p>
-            <w:r>
-              <w:rPr>
-                <w:sz w:val="18"/>
-              </w:rPr>
-              <w:t>#roleBody populated (section collapsed by default).</w:t>
+              <w:t>renderMapStats()</w:t>
+            </w:r>
+          </w:p>
+        </w:tc>
+        <w:tc>
+          <w:tcPr>
+            <w:tcW w:type="dxa" w:w="3135"/>
+            <w:shd w:val="clear" w:color="auto" w:fill="FFFFFF"/>
+          </w:tcPr>
+          <w:p>
+            <w:r>
+              <w:rPr>
+                <w:sz w:val="18"/>
+              </w:rPr>
+              <w:t>#mapBody populated (section collapsed by default).</w:t>
             </w:r>
           </w:p>
         </w:tc>
@@ -16647,21 +17517,21 @@
               <w:rPr>
                 <w:sz w:val="18"/>
               </w:rPr>
-              <w:t>renderAttendance()</w:t>
-            </w:r>
-          </w:p>
-        </w:tc>
-        <w:tc>
-          <w:tcPr>
-            <w:tcW w:type="dxa" w:w="3135"/>
-            <w:shd w:val="clear" w:color="auto" w:fill="F0F4FA"/>
-          </w:tcPr>
-          <w:p>
-            <w:r>
-              <w:rPr>
-                <w:sz w:val="18"/>
-              </w:rPr>
-              <w:t>#attendBody populated (section collapsed by default).</w:t>
+              <w:t>renderRoleLeaderboard()</w:t>
+            </w:r>
+          </w:p>
+        </w:tc>
+        <w:tc>
+          <w:tcPr>
+            <w:tcW w:type="dxa" w:w="3135"/>
+            <w:shd w:val="clear" w:color="auto" w:fill="F0F4FA"/>
+          </w:tcPr>
+          <w:p>
+            <w:r>
+              <w:rPr>
+                <w:sz w:val="18"/>
+              </w:rPr>
+              <w:t>#roleBody populated (section collapsed by default).</w:t>
             </w:r>
           </w:p>
         </w:tc>
@@ -16691,21 +17561,21 @@
               <w:rPr>
                 <w:sz w:val="18"/>
               </w:rPr>
-              <w:t>renderKdTrend()</w:t>
-            </w:r>
-          </w:p>
-        </w:tc>
-        <w:tc>
-          <w:tcPr>
-            <w:tcW w:type="dxa" w:w="3135"/>
-            <w:shd w:val="clear" w:color="auto" w:fill="FFFFFF"/>
-          </w:tcPr>
-          <w:p>
-            <w:r>
-              <w:rPr>
-                <w:sz w:val="18"/>
-              </w:rPr>
-              <w:t>#kdTrendChart populated (section collapsed by default).</w:t>
+              <w:t>renderAttendance()</w:t>
+            </w:r>
+          </w:p>
+        </w:tc>
+        <w:tc>
+          <w:tcPr>
+            <w:tcW w:type="dxa" w:w="3135"/>
+            <w:shd w:val="clear" w:color="auto" w:fill="FFFFFF"/>
+          </w:tcPr>
+          <w:p>
+            <w:r>
+              <w:rPr>
+                <w:sz w:val="18"/>
+              </w:rPr>
+              <w:t>#attendBody populated (section collapsed by default).</w:t>
             </w:r>
           </w:p>
         </w:tc>
@@ -16735,21 +17605,21 @@
               <w:rPr>
                 <w:sz w:val="18"/>
               </w:rPr>
-              <w:t>renderComparison()</w:t>
-            </w:r>
-          </w:p>
-        </w:tc>
-        <w:tc>
-          <w:tcPr>
-            <w:tcW w:type="dxa" w:w="3135"/>
-            <w:shd w:val="clear" w:color="auto" w:fill="F0F4FA"/>
-          </w:tcPr>
-          <w:p>
-            <w:r>
-              <w:rPr>
-                <w:sz w:val="18"/>
-              </w:rPr>
-              <w:t>Comparison dropdowns populated (section collapsed by default).</w:t>
+              <w:t>renderKdTrend()</w:t>
+            </w:r>
+          </w:p>
+        </w:tc>
+        <w:tc>
+          <w:tcPr>
+            <w:tcW w:type="dxa" w:w="3135"/>
+            <w:shd w:val="clear" w:color="auto" w:fill="F0F4FA"/>
+          </w:tcPr>
+          <w:p>
+            <w:r>
+              <w:rPr>
+                <w:sz w:val="18"/>
+              </w:rPr>
+              <w:t>#kdTrendChart populated (section collapsed by default).</w:t>
             </w:r>
           </w:p>
         </w:tc>
@@ -16779,6 +17649,50 @@
               <w:rPr>
                 <w:sz w:val="18"/>
               </w:rPr>
+              <w:t>renderComparison()</w:t>
+            </w:r>
+          </w:p>
+        </w:tc>
+        <w:tc>
+          <w:tcPr>
+            <w:tcW w:type="dxa" w:w="3135"/>
+            <w:shd w:val="clear" w:color="auto" w:fill="FFFFFF"/>
+          </w:tcPr>
+          <w:p>
+            <w:r>
+              <w:rPr>
+                <w:sz w:val="18"/>
+              </w:rPr>
+              <w:t>Comparison dropdowns populated (section collapsed by default).</w:t>
+            </w:r>
+          </w:p>
+        </w:tc>
+      </w:tr>
+      <w:tr>
+        <w:tc>
+          <w:tcPr>
+            <w:tcW w:type="dxa" w:w="3135"/>
+            <w:shd w:val="clear" w:color="auto" w:fill="F0F4FA"/>
+          </w:tcPr>
+          <w:p>
+            <w:r>
+              <w:rPr>
+                <w:sz w:val="18"/>
+              </w:rPr>
+              <w:t>24</w:t>
+            </w:r>
+          </w:p>
+        </w:tc>
+        <w:tc>
+          <w:tcPr>
+            <w:tcW w:type="dxa" w:w="3135"/>
+            <w:shd w:val="clear" w:color="auto" w:fill="F0F4FA"/>
+          </w:tcPr>
+          <w:p>
+            <w:r>
+              <w:rPr>
+                <w:sz w:val="18"/>
+              </w:rPr>
               <w:t>UI Ready</w:t>
             </w:r>
           </w:p>
@@ -16786,7 +17700,7 @@
         <w:tc>
           <w:tcPr>
             <w:tcW w:type="dxa" w:w="3135"/>
-            <w:shd w:val="clear" w:color="auto" w:fill="FFFFFF"/>
+            <w:shd w:val="clear" w:color="auto" w:fill="F0F4FA"/>
           </w:tcPr>
           <w:p>
             <w:r>
@@ -17428,7 +18342,7 @@
               <w:rPr>
                 <w:sz w:val="18"/>
               </w:rPr>
-              <w:t>TK occurs in the last 2 min (120 s) before endMission</w:t>
+              <w:t>TK occurs in the last 5 min (300 s) before endMission</w:t>
             </w:r>
           </w:p>
         </w:tc>
@@ -17472,7 +18386,7 @@
               <w:rPr>
                 <w:sz w:val="18"/>
               </w:rPr>
-              <w:t>Distance ≤ 15 m AND within last 3 min (180 s) of endMission</w:t>
+              <w:t>Distance ≤ 15 m AND within last 7 min (420 s) of endMission</w:t>
             </w:r>
           </w:p>
         </w:tc>
@@ -17516,21 +18430,21 @@
               <w:rPr>
                 <w:sz w:val="18"/>
               </w:rPr>
-              <w:t>3 or more TKs fall within any 60-second rolling window</w:t>
-            </w:r>
-          </w:p>
-        </w:tc>
-        <w:tc>
-          <w:tcPr>
-            <w:tcW w:type="dxa" w:w="3135"/>
-            <w:shd w:val="clear" w:color="auto" w:fill="FFFFFF"/>
-          </w:tcPr>
-          <w:p>
-            <w:r>
-              <w:rPr>
-                <w:sz w:val="18"/>
-              </w:rPr>
-              <w:t>Group grenade throw or celebration volley earlier in the timeline</w:t>
+              <w:t>3 or more TKs fall within any 60-second rolling window, within last 10 min (600 s)</w:t>
+            </w:r>
+          </w:p>
+        </w:tc>
+        <w:tc>
+          <w:tcPr>
+            <w:tcW w:type="dxa" w:w="3135"/>
+            <w:shd w:val="clear" w:color="auto" w:fill="FFFFFF"/>
+          </w:tcPr>
+          <w:p>
+            <w:r>
+              <w:rPr>
+                <w:sz w:val="18"/>
+              </w:rPr>
+              <w:t>Group grenade throw or celebration volley; time-gated to avoid suppressing mid-mission TK clusters</w:t>
             </w:r>
           </w:p>
         </w:tc>

</xml_diff>

<commit_message>
Deploying to gh-pages from @ loltorres9/TFP_KillTracker@87e183fe1dbb26f07c2f43f8f63be38876d1b45e 🚀
</commit_message>
<xml_diff>
--- a/TFP_KillTracker_Technical_Documentation.docx
+++ b/TFP_KillTracker_Technical_Documentation.docx
@@ -39,7 +39,7 @@
         <w:rPr>
           <w:sz w:val="22"/>
         </w:rPr>
-        <w:t>Version 1.4  ·  30 March 2026</w:t>
+        <w:t>Version 1.5  ·  31 March 2026</w:t>
       </w:r>
     </w:p>
     <w:p>
@@ -644,7 +644,7 @@
               <w:rPr>
                 <w:sz w:val="18"/>
               </w:rPr>
-              <w:t>ImportScript</w:t>
+              <w:t>player_aliases.json</w:t>
             </w:r>
           </w:p>
         </w:tc>
@@ -658,7 +658,7 @@
               <w:rPr>
                 <w:sz w:val="18"/>
               </w:rPr>
-              <w:t>Google Apps Script that imports OCAP .json.gz mission logs into Google Sheets</w:t>
+              <w:t>Explicit player name aliases for cases the auto-normalisation cannot resolve (rank variants, completely different names)</w:t>
             </w:r>
           </w:p>
         </w:tc>
@@ -674,7 +674,7 @@
               <w:rPr>
                 <w:sz w:val="18"/>
               </w:rPr>
-              <w:t>generate_docs.py</w:t>
+              <w:t>ImportScript</w:t>
             </w:r>
           </w:p>
         </w:tc>
@@ -688,7 +688,7 @@
               <w:rPr>
                 <w:sz w:val="18"/>
               </w:rPr>
-              <w:t>python-docx script that regenerates this documentation file</w:t>
+              <w:t>Google Apps Script that imports OCAP .json.gz mission logs into Google Sheets</w:t>
             </w:r>
           </w:p>
         </w:tc>
@@ -704,7 +704,7 @@
               <w:rPr>
                 <w:sz w:val="18"/>
               </w:rPr>
-              <w:t>README.md</w:t>
+              <w:t>generate_docs.py</w:t>
             </w:r>
           </w:p>
         </w:tc>
@@ -718,7 +718,7 @@
               <w:rPr>
                 <w:sz w:val="18"/>
               </w:rPr>
-              <w:t>User-facing feature overview and deployment guide</w:t>
+              <w:t>python-docx script that regenerates this documentation file</w:t>
             </w:r>
           </w:p>
         </w:tc>
@@ -734,6 +734,36 @@
               <w:rPr>
                 <w:sz w:val="18"/>
               </w:rPr>
+              <w:t>README.md</w:t>
+            </w:r>
+          </w:p>
+        </w:tc>
+        <w:tc>
+          <w:tcPr>
+            <w:tcW w:type="dxa" w:w="4703"/>
+            <w:shd w:val="clear" w:color="auto" w:fill="F0F4FA"/>
+          </w:tcPr>
+          <w:p>
+            <w:r>
+              <w:rPr>
+                <w:sz w:val="18"/>
+              </w:rPr>
+              <w:t>User-facing feature overview and deployment guide</w:t>
+            </w:r>
+          </w:p>
+        </w:tc>
+      </w:tr>
+      <w:tr>
+        <w:tc>
+          <w:tcPr>
+            <w:tcW w:type="dxa" w:w="4703"/>
+            <w:shd w:val="clear" w:color="auto" w:fill="FFFFFF"/>
+          </w:tcPr>
+          <w:p>
+            <w:r>
+              <w:rPr>
+                <w:sz w:val="18"/>
+              </w:rPr>
               <w:t>.github/workflows/</w:t>
             </w:r>
           </w:p>
@@ -741,7 +771,7 @@
         <w:tc>
           <w:tcPr>
             <w:tcW w:type="dxa" w:w="4703"/>
-            <w:shd w:val="clear" w:color="auto" w:fill="F0F4FA"/>
+            <w:shd w:val="clear" w:color="auto" w:fill="FFFFFF"/>
           </w:tcPr>
           <w:p>
             <w:r>
@@ -2295,6 +2325,122 @@
                 <w:sz w:val="18"/>
               </w:rPr>
               <w:t>Hardcoded release date shown in the page footer</w:t>
+            </w:r>
+          </w:p>
+        </w:tc>
+      </w:tr>
+      <w:tr>
+        <w:tc>
+          <w:tcPr>
+            <w:tcW w:type="dxa" w:w="2351"/>
+            <w:shd w:val="clear" w:color="auto" w:fill="F0F4FA"/>
+          </w:tcPr>
+          <w:p>
+            <w:r>
+              <w:rPr>
+                <w:sz w:val="18"/>
+              </w:rPr>
+              <w:t>nameMap</w:t>
+            </w:r>
+          </w:p>
+        </w:tc>
+        <w:tc>
+          <w:tcPr>
+            <w:tcW w:type="dxa" w:w="2351"/>
+            <w:shd w:val="clear" w:color="auto" w:fill="F0F4FA"/>
+          </w:tcPr>
+          <w:p>
+            <w:r>
+              <w:rPr>
+                <w:sz w:val="18"/>
+              </w:rPr>
+              <w:t>Object</w:t>
+            </w:r>
+          </w:p>
+        </w:tc>
+        <w:tc>
+          <w:tcPr>
+            <w:tcW w:type="dxa" w:w="2351"/>
+            <w:shd w:val="clear" w:color="auto" w:fill="F0F4FA"/>
+          </w:tcPr>
+          <w:p>
+            <w:r>
+              <w:rPr>
+                <w:sz w:val="18"/>
+              </w:rPr>
+              <w:t>{}</w:t>
+            </w:r>
+          </w:p>
+        </w:tc>
+        <w:tc>
+          <w:tcPr>
+            <w:tcW w:type="dxa" w:w="2351"/>
+            <w:shd w:val="clear" w:color="auto" w:fill="F0F4FA"/>
+          </w:tcPr>
+          <w:p>
+            <w:r>
+              <w:rPr>
+                <w:sz w:val="18"/>
+              </w:rPr>
+              <w:t>Maps every raw Username value to its canonical display name; built by buildNameMap()</w:t>
+            </w:r>
+          </w:p>
+        </w:tc>
+      </w:tr>
+      <w:tr>
+        <w:tc>
+          <w:tcPr>
+            <w:tcW w:type="dxa" w:w="2351"/>
+            <w:shd w:val="clear" w:color="auto" w:fill="FFFFFF"/>
+          </w:tcPr>
+          <w:p>
+            <w:r>
+              <w:rPr>
+                <w:sz w:val="18"/>
+              </w:rPr>
+              <w:t>nameAliases</w:t>
+            </w:r>
+          </w:p>
+        </w:tc>
+        <w:tc>
+          <w:tcPr>
+            <w:tcW w:type="dxa" w:w="2351"/>
+            <w:shd w:val="clear" w:color="auto" w:fill="FFFFFF"/>
+          </w:tcPr>
+          <w:p>
+            <w:r>
+              <w:rPr>
+                <w:sz w:val="18"/>
+              </w:rPr>
+              <w:t>Object</w:t>
+            </w:r>
+          </w:p>
+        </w:tc>
+        <w:tc>
+          <w:tcPr>
+            <w:tcW w:type="dxa" w:w="2351"/>
+            <w:shd w:val="clear" w:color="auto" w:fill="FFFFFF"/>
+          </w:tcPr>
+          <w:p>
+            <w:r>
+              <w:rPr>
+                <w:sz w:val="18"/>
+              </w:rPr>
+              <w:t>{}</w:t>
+            </w:r>
+          </w:p>
+        </w:tc>
+        <w:tc>
+          <w:tcPr>
+            <w:tcW w:type="dxa" w:w="2351"/>
+            <w:shd w:val="clear" w:color="auto" w:fill="FFFFFF"/>
+          </w:tcPr>
+          <w:p>
+            <w:r>
+              <w:rPr>
+                <w:sz w:val="18"/>
+              </w:rPr>
+              <w:t>Maps canonical name → array of all absorbed alias strings; used to show "Also known as" on career page</w:t>
             </w:r>
           </w:p>
         </w:tc>
@@ -4957,7 +5103,19 @@
         <w:pStyle w:val="Heading1"/>
       </w:pPr>
       <w:r>
-        <w:t>5. Filter System</w:t>
+        <w:t>5. Player Name Merging</w:t>
+      </w:r>
+    </w:p>
+    <w:p>
+      <w:pPr>
+        <w:spacing w:after="120"/>
+      </w:pPr>
+      <w:r>
+        <w:rPr>
+          <w:b w:val="0"/>
+          <w:i w:val="0"/>
+        </w:rPr>
+        <w:t>Because players often appear under slightly different names across missions (squad tags, rank prefixes, punctuation, or entirely different callsigns), tracker.js collapses all variant names into a single canonical entry before aggregation. The system runs at load time as part of the data pipeline.</w:t>
       </w:r>
     </w:p>
     <w:p>
@@ -4965,7 +5123,719 @@
         <w:pStyle w:val="Heading2"/>
       </w:pPr>
       <w:r>
-        <w:t>5.1 Filter Pipeline</w:t>
+        <w:t>5.1 normalizeName(name)</w:t>
+      </w:r>
+    </w:p>
+    <w:p>
+      <w:pPr>
+        <w:spacing w:after="80"/>
+      </w:pPr>
+      <w:r>
+        <w:rPr>
+          <w:b w:val="0"/>
+          <w:i w:val="0"/>
+        </w:rPr>
+        <w:t>A pure string function applied to every raw Username before comparison. Performs the following transformations in order:</w:t>
+      </w:r>
+    </w:p>
+    <w:tbl>
+      <w:tblPr>
+        <w:tblStyle w:val="TableGrid"/>
+        <w:tblW w:type="auto" w:w="0"/>
+        <w:jc w:val="left"/>
+        <w:tblLook w:firstColumn="1" w:firstRow="1" w:lastColumn="0" w:lastRow="0" w:noHBand="0" w:noVBand="1" w:val="04A0"/>
+      </w:tblPr>
+      <w:tblGrid>
+        <w:gridCol w:w="3135"/>
+        <w:gridCol w:w="3135"/>
+        <w:gridCol w:w="3135"/>
+      </w:tblGrid>
+      <w:tr>
+        <w:tc>
+          <w:tcPr>
+            <w:tcW w:type="dxa" w:w="3135"/>
+            <w:shd w:val="clear" w:color="auto" w:fill="2E4057"/>
+          </w:tcPr>
+          <w:p>
+            <w:pPr>
+              <w:jc w:val="center"/>
+            </w:pPr>
+            <w:r>
+              <w:rPr>
+                <w:b/>
+                <w:color w:val="FFFFFF"/>
+                <w:sz w:val="18"/>
+              </w:rPr>
+              <w:t>Step</w:t>
+            </w:r>
+          </w:p>
+        </w:tc>
+        <w:tc>
+          <w:tcPr>
+            <w:tcW w:type="dxa" w:w="3135"/>
+            <w:shd w:val="clear" w:color="auto" w:fill="2E4057"/>
+          </w:tcPr>
+          <w:p>
+            <w:pPr>
+              <w:jc w:val="center"/>
+            </w:pPr>
+            <w:r>
+              <w:rPr>
+                <w:b/>
+                <w:color w:val="FFFFFF"/>
+                <w:sz w:val="18"/>
+              </w:rPr>
+              <w:t>Transform</w:t>
+            </w:r>
+          </w:p>
+        </w:tc>
+        <w:tc>
+          <w:tcPr>
+            <w:tcW w:type="dxa" w:w="3135"/>
+            <w:shd w:val="clear" w:color="auto" w:fill="2E4057"/>
+          </w:tcPr>
+          <w:p>
+            <w:pPr>
+              <w:jc w:val="center"/>
+            </w:pPr>
+            <w:r>
+              <w:rPr>
+                <w:b/>
+                <w:color w:val="FFFFFF"/>
+                <w:sz w:val="18"/>
+              </w:rPr>
+              <w:t>Example</w:t>
+            </w:r>
+          </w:p>
+        </w:tc>
+      </w:tr>
+      <w:tr>
+        <w:tc>
+          <w:tcPr>
+            <w:tcW w:type="dxa" w:w="3135"/>
+            <w:shd w:val="clear" w:color="auto" w:fill="FFFFFF"/>
+          </w:tcPr>
+          <w:p>
+            <w:r>
+              <w:rPr>
+                <w:sz w:val="18"/>
+              </w:rPr>
+              <w:t>1</w:t>
+            </w:r>
+          </w:p>
+        </w:tc>
+        <w:tc>
+          <w:tcPr>
+            <w:tcW w:type="dxa" w:w="3135"/>
+            <w:shd w:val="clear" w:color="auto" w:fill="FFFFFF"/>
+          </w:tcPr>
+          <w:p>
+            <w:r>
+              <w:rPr>
+                <w:sz w:val="18"/>
+              </w:rPr>
+              <w:t>Remove spaces inside [brackets]</w:t>
+            </w:r>
+          </w:p>
+        </w:tc>
+        <w:tc>
+          <w:tcPr>
+            <w:tcW w:type="dxa" w:w="3135"/>
+            <w:shd w:val="clear" w:color="auto" w:fill="FFFFFF"/>
+          </w:tcPr>
+          <w:p>
+            <w:r>
+              <w:rPr>
+                <w:sz w:val="18"/>
+              </w:rPr>
+              <w:t>[2nd USC] → [2ndUSC]</w:t>
+            </w:r>
+          </w:p>
+        </w:tc>
+      </w:tr>
+      <w:tr>
+        <w:tc>
+          <w:tcPr>
+            <w:tcW w:type="dxa" w:w="3135"/>
+            <w:shd w:val="clear" w:color="auto" w:fill="F0F4FA"/>
+          </w:tcPr>
+          <w:p>
+            <w:r>
+              <w:rPr>
+                <w:sz w:val="18"/>
+              </w:rPr>
+              <w:t>2</w:t>
+            </w:r>
+          </w:p>
+        </w:tc>
+        <w:tc>
+          <w:tcPr>
+            <w:tcW w:type="dxa" w:w="3135"/>
+            <w:shd w:val="clear" w:color="auto" w:fill="F0F4FA"/>
+          </w:tcPr>
+          <w:p>
+            <w:r>
+              <w:rPr>
+                <w:sz w:val="18"/>
+              </w:rPr>
+              <w:t>Add space after ] if missing</w:t>
+            </w:r>
+          </w:p>
+        </w:tc>
+        <w:tc>
+          <w:tcPr>
+            <w:tcW w:type="dxa" w:w="3135"/>
+            <w:shd w:val="clear" w:color="auto" w:fill="F0F4FA"/>
+          </w:tcPr>
+          <w:p>
+            <w:r>
+              <w:rPr>
+                <w:sz w:val="18"/>
+              </w:rPr>
+              <w:t>]Name → ] Name</w:t>
+            </w:r>
+          </w:p>
+        </w:tc>
+      </w:tr>
+      <w:tr>
+        <w:tc>
+          <w:tcPr>
+            <w:tcW w:type="dxa" w:w="3135"/>
+            <w:shd w:val="clear" w:color="auto" w:fill="FFFFFF"/>
+          </w:tcPr>
+          <w:p>
+            <w:r>
+              <w:rPr>
+                <w:sz w:val="18"/>
+              </w:rPr>
+              <w:t>3</w:t>
+            </w:r>
+          </w:p>
+        </w:tc>
+        <w:tc>
+          <w:tcPr>
+            <w:tcW w:type="dxa" w:w="3135"/>
+            <w:shd w:val="clear" w:color="auto" w:fill="FFFFFF"/>
+          </w:tcPr>
+          <w:p>
+            <w:r>
+              <w:rPr>
+                <w:sz w:val="18"/>
+              </w:rPr>
+              <w:t>Add space after . if not followed by space or ]</w:t>
+            </w:r>
+          </w:p>
+        </w:tc>
+        <w:tc>
+          <w:tcPr>
+            <w:tcW w:type="dxa" w:w="3135"/>
+            <w:shd w:val="clear" w:color="auto" w:fill="FFFFFF"/>
+          </w:tcPr>
+          <w:p>
+            <w:r>
+              <w:rPr>
+                <w:sz w:val="18"/>
+              </w:rPr>
+              <w:t>S.Fig → S. Fig</w:t>
+            </w:r>
+          </w:p>
+        </w:tc>
+      </w:tr>
+      <w:tr>
+        <w:tc>
+          <w:tcPr>
+            <w:tcW w:type="dxa" w:w="3135"/>
+            <w:shd w:val="clear" w:color="auto" w:fill="F0F4FA"/>
+          </w:tcPr>
+          <w:p>
+            <w:r>
+              <w:rPr>
+                <w:sz w:val="18"/>
+              </w:rPr>
+              <w:t>4</w:t>
+            </w:r>
+          </w:p>
+        </w:tc>
+        <w:tc>
+          <w:tcPr>
+            <w:tcW w:type="dxa" w:w="3135"/>
+            <w:shd w:val="clear" w:color="auto" w:fill="F0F4FA"/>
+          </w:tcPr>
+          <w:p>
+            <w:r>
+              <w:rPr>
+                <w:sz w:val="18"/>
+              </w:rPr>
+              <w:t>Replace _ with space</w:t>
+            </w:r>
+          </w:p>
+        </w:tc>
+        <w:tc>
+          <w:tcPr>
+            <w:tcW w:type="dxa" w:w="3135"/>
+            <w:shd w:val="clear" w:color="auto" w:fill="F0F4FA"/>
+          </w:tcPr>
+          <w:p>
+            <w:r>
+              <w:rPr>
+                <w:sz w:val="18"/>
+              </w:rPr>
+              <w:t>[SR]_Gronk → [SR] Gronk</w:t>
+            </w:r>
+          </w:p>
+        </w:tc>
+      </w:tr>
+      <w:tr>
+        <w:tc>
+          <w:tcPr>
+            <w:tcW w:type="dxa" w:w="3135"/>
+            <w:shd w:val="clear" w:color="auto" w:fill="FFFFFF"/>
+          </w:tcPr>
+          <w:p>
+            <w:r>
+              <w:rPr>
+                <w:sz w:val="18"/>
+              </w:rPr>
+              <w:t>5</w:t>
+            </w:r>
+          </w:p>
+        </w:tc>
+        <w:tc>
+          <w:tcPr>
+            <w:tcW w:type="dxa" w:w="3135"/>
+            <w:shd w:val="clear" w:color="auto" w:fill="FFFFFF"/>
+          </w:tcPr>
+          <w:p>
+            <w:r>
+              <w:rPr>
+                <w:sz w:val="18"/>
+              </w:rPr>
+              <w:t>Collapse multiple spaces</w:t>
+            </w:r>
+          </w:p>
+        </w:tc>
+        <w:tc>
+          <w:tcPr>
+            <w:tcW w:type="dxa" w:w="3135"/>
+            <w:shd w:val="clear" w:color="auto" w:fill="FFFFFF"/>
+          </w:tcPr>
+          <w:p>
+            <w:r>
+              <w:rPr>
+                <w:sz w:val="18"/>
+              </w:rPr>
+              <w:t>foo  bar → foo bar</w:t>
+            </w:r>
+          </w:p>
+        </w:tc>
+      </w:tr>
+      <w:tr>
+        <w:tc>
+          <w:tcPr>
+            <w:tcW w:type="dxa" w:w="3135"/>
+            <w:shd w:val="clear" w:color="auto" w:fill="F0F4FA"/>
+          </w:tcPr>
+          <w:p>
+            <w:r>
+              <w:rPr>
+                <w:sz w:val="18"/>
+              </w:rPr>
+              <w:t>6</w:t>
+            </w:r>
+          </w:p>
+        </w:tc>
+        <w:tc>
+          <w:tcPr>
+            <w:tcW w:type="dxa" w:w="3135"/>
+            <w:shd w:val="clear" w:color="auto" w:fill="F0F4FA"/>
+          </w:tcPr>
+          <w:p>
+            <w:r>
+              <w:rPr>
+                <w:sz w:val="18"/>
+              </w:rPr>
+              <w:t>Trim and lowercase</w:t>
+            </w:r>
+          </w:p>
+        </w:tc>
+        <w:tc>
+          <w:tcPr>
+            <w:tcW w:type="dxa" w:w="3135"/>
+            <w:shd w:val="clear" w:color="auto" w:fill="F0F4FA"/>
+          </w:tcPr>
+          <w:p>
+            <w:r>
+              <w:rPr>
+                <w:sz w:val="18"/>
+              </w:rPr>
+              <w:t>Fre3ky → fre3ky</w:t>
+            </w:r>
+          </w:p>
+        </w:tc>
+      </w:tr>
+    </w:tbl>
+    <w:p/>
+    <w:p>
+      <w:pPr>
+        <w:pStyle w:val="Heading2"/>
+      </w:pPr>
+      <w:r>
+        <w:t>5.2 buildNameMap(rows, aliases)</w:t>
+      </w:r>
+    </w:p>
+    <w:p>
+      <w:pPr>
+        <w:spacing w:after="80"/>
+      </w:pPr>
+      <w:r>
+        <w:rPr>
+          <w:b w:val="0"/>
+          <w:i w:val="0"/>
+        </w:rPr>
+        <w:t>Called once at load with the raw CSV rows and the parsed player_aliases.json object. Populates the module-level nameMap (raw → canonical) and nameAliases (canonical → [aliases]) dictionaries using three passes:</w:t>
+      </w:r>
+    </w:p>
+    <w:tbl>
+      <w:tblPr>
+        <w:tblStyle w:val="TableGrid"/>
+        <w:tblW w:type="auto" w:w="0"/>
+        <w:jc w:val="left"/>
+        <w:tblLook w:firstColumn="1" w:firstRow="1" w:lastColumn="0" w:lastRow="0" w:noHBand="0" w:noVBand="1" w:val="04A0"/>
+      </w:tblPr>
+      <w:tblGrid>
+        <w:gridCol w:w="3135"/>
+        <w:gridCol w:w="3135"/>
+        <w:gridCol w:w="3135"/>
+      </w:tblGrid>
+      <w:tr>
+        <w:tc>
+          <w:tcPr>
+            <w:tcW w:type="dxa" w:w="3135"/>
+            <w:shd w:val="clear" w:color="auto" w:fill="2E4057"/>
+          </w:tcPr>
+          <w:p>
+            <w:pPr>
+              <w:jc w:val="center"/>
+            </w:pPr>
+            <w:r>
+              <w:rPr>
+                <w:b/>
+                <w:color w:val="FFFFFF"/>
+                <w:sz w:val="18"/>
+              </w:rPr>
+              <w:t>Pass</w:t>
+            </w:r>
+          </w:p>
+        </w:tc>
+        <w:tc>
+          <w:tcPr>
+            <w:tcW w:type="dxa" w:w="3135"/>
+            <w:shd w:val="clear" w:color="auto" w:fill="2E4057"/>
+          </w:tcPr>
+          <w:p>
+            <w:pPr>
+              <w:jc w:val="center"/>
+            </w:pPr>
+            <w:r>
+              <w:rPr>
+                <w:b/>
+                <w:color w:val="FFFFFF"/>
+                <w:sz w:val="18"/>
+              </w:rPr>
+              <w:t>Strategy</w:t>
+            </w:r>
+          </w:p>
+        </w:tc>
+        <w:tc>
+          <w:tcPr>
+            <w:tcW w:type="dxa" w:w="3135"/>
+            <w:shd w:val="clear" w:color="auto" w:fill="2E4057"/>
+          </w:tcPr>
+          <w:p>
+            <w:pPr>
+              <w:jc w:val="center"/>
+            </w:pPr>
+            <w:r>
+              <w:rPr>
+                <w:b/>
+                <w:color w:val="FFFFFF"/>
+                <w:sz w:val="18"/>
+              </w:rPr>
+              <w:t>What it resolves</w:t>
+            </w:r>
+          </w:p>
+        </w:tc>
+      </w:tr>
+      <w:tr>
+        <w:tc>
+          <w:tcPr>
+            <w:tcW w:type="dxa" w:w="3135"/>
+            <w:shd w:val="clear" w:color="auto" w:fill="FFFFFF"/>
+          </w:tcPr>
+          <w:p>
+            <w:r>
+              <w:rPr>
+                <w:sz w:val="18"/>
+              </w:rPr>
+              <w:t>1 — Exact normalisation</w:t>
+            </w:r>
+          </w:p>
+        </w:tc>
+        <w:tc>
+          <w:tcPr>
+            <w:tcW w:type="dxa" w:w="3135"/>
+            <w:shd w:val="clear" w:color="auto" w:fill="FFFFFF"/>
+          </w:tcPr>
+          <w:p>
+            <w:r>
+              <w:rPr>
+                <w:sz w:val="18"/>
+              </w:rPr>
+              <w:t>Each unique raw name is normalised; if two normalised forms are identical, the shorter raw name is chosen as canonical.</w:t>
+            </w:r>
+          </w:p>
+        </w:tc>
+        <w:tc>
+          <w:tcPr>
+            <w:tcW w:type="dxa" w:w="3135"/>
+            <w:shd w:val="clear" w:color="auto" w:fill="FFFFFF"/>
+          </w:tcPr>
+          <w:p>
+            <w:r>
+              <w:rPr>
+                <w:sz w:val="18"/>
+              </w:rPr>
+              <w:t>Tag/rank spacing, punctuation, underscore separators: "[SR]_Gronk" = "[SR] Gronk"</w:t>
+            </w:r>
+          </w:p>
+        </w:tc>
+      </w:tr>
+      <w:tr>
+        <w:tc>
+          <w:tcPr>
+            <w:tcW w:type="dxa" w:w="3135"/>
+            <w:shd w:val="clear" w:color="auto" w:fill="F0F4FA"/>
+          </w:tcPr>
+          <w:p>
+            <w:r>
+              <w:rPr>
+                <w:sz w:val="18"/>
+              </w:rPr>
+              <w:t>2 — Suffix matching</w:t>
+            </w:r>
+          </w:p>
+        </w:tc>
+        <w:tc>
+          <w:tcPr>
+            <w:tcW w:type="dxa" w:w="3135"/>
+            <w:shd w:val="clear" w:color="auto" w:fill="F0F4FA"/>
+          </w:tcPr>
+          <w:p>
+            <w:r>
+              <w:rPr>
+                <w:sz w:val="18"/>
+              </w:rPr>
+              <w:t>For each name, extract the trailing word(s) as a callsign (min 4 chars). If any shorter name in the dataset ends with that callsign (preceded by space or ]), the longer name merges into the shorter one.</w:t>
+            </w:r>
+          </w:p>
+        </w:tc>
+        <w:tc>
+          <w:tcPr>
+            <w:tcW w:type="dxa" w:w="3135"/>
+            <w:shd w:val="clear" w:color="auto" w:fill="F0F4FA"/>
+          </w:tcPr>
+          <w:p>
+            <w:r>
+              <w:rPr>
+                <w:sz w:val="18"/>
+              </w:rPr>
+              <w:t>Prefix/tag variants: "[2nd USC]Fre3ky", "HMC.P Fre3ky", "[57th] Fre3ky" → all become "Fre3ky"</w:t>
+            </w:r>
+          </w:p>
+        </w:tc>
+      </w:tr>
+      <w:tr>
+        <w:tc>
+          <w:tcPr>
+            <w:tcW w:type="dxa" w:w="3135"/>
+            <w:shd w:val="clear" w:color="auto" w:fill="FFFFFF"/>
+          </w:tcPr>
+          <w:p>
+            <w:r>
+              <w:rPr>
+                <w:sz w:val="18"/>
+              </w:rPr>
+              <w:t>3 — Explicit aliases</w:t>
+            </w:r>
+          </w:p>
+        </w:tc>
+        <w:tc>
+          <w:tcPr>
+            <w:tcW w:type="dxa" w:w="3135"/>
+            <w:shd w:val="clear" w:color="auto" w:fill="FFFFFF"/>
+          </w:tcPr>
+          <w:p>
+            <w:r>
+              <w:rPr>
+                <w:sz w:val="18"/>
+              </w:rPr>
+              <w:t>Any key in player_aliases.json is mapped to its value. Runs after the auto passes so manual aliases always win.</w:t>
+            </w:r>
+          </w:p>
+        </w:tc>
+        <w:tc>
+          <w:tcPr>
+            <w:tcW w:type="dxa" w:w="3135"/>
+            <w:shd w:val="clear" w:color="auto" w:fill="FFFFFF"/>
+          </w:tcPr>
+          <w:p>
+            <w:r>
+              <w:rPr>
+                <w:sz w:val="18"/>
+              </w:rPr>
+              <w:t>Rank variants, completely different callsigns: "SGT T.Viking" → "The Viking"</w:t>
+            </w:r>
+          </w:p>
+        </w:tc>
+      </w:tr>
+    </w:tbl>
+    <w:p/>
+    <w:p>
+      <w:pPr>
+        <w:pStyle w:val="Heading2"/>
+      </w:pPr>
+      <w:r>
+        <w:t>5.3 player_aliases.json</w:t>
+      </w:r>
+    </w:p>
+    <w:p>
+      <w:pPr>
+        <w:spacing w:after="80"/>
+      </w:pPr>
+      <w:r>
+        <w:rPr>
+          <w:b w:val="0"/>
+          <w:i w:val="0"/>
+        </w:rPr>
+        <w:t>A static JSON file fetched in parallel with the CSV. Maps any raw name variant to a canonical display name. Only required for cases the auto-normalisation cannot handle.</w:t>
+      </w:r>
+    </w:p>
+    <w:p>
+      <w:pPr>
+        <w:pStyle w:val="NoSpacing"/>
+        <w:spacing w:before="40" w:after="40"/>
+        <w:ind w:left="576"/>
+        <w:shd w:val="clear" w:color="auto" w:fill="F3F3F3"/>
+      </w:pPr>
+      <w:r>
+        <w:rPr>
+          <w:rFonts w:ascii="Courier New" w:hAnsi="Courier New"/>
+          <w:color w:val="222222"/>
+          <w:sz w:val="18"/>
+        </w:rPr>
+        <w:t>{</w:t>
+      </w:r>
+    </w:p>
+    <w:p>
+      <w:pPr>
+        <w:pStyle w:val="NoSpacing"/>
+        <w:spacing w:before="40" w:after="40"/>
+        <w:ind w:left="576"/>
+        <w:shd w:val="clear" w:color="auto" w:fill="F3F3F3"/>
+      </w:pPr>
+      <w:r>
+        <w:rPr>
+          <w:rFonts w:ascii="Courier New" w:hAnsi="Courier New"/>
+          <w:color w:val="222222"/>
+          <w:sz w:val="18"/>
+        </w:rPr>
+        <w:t xml:space="preserve">  "PSGT Dusty": "[2nd USC] Trp. Dusty",</w:t>
+      </w:r>
+    </w:p>
+    <w:p>
+      <w:pPr>
+        <w:pStyle w:val="NoSpacing"/>
+        <w:spacing w:before="40" w:after="40"/>
+        <w:ind w:left="576"/>
+        <w:shd w:val="clear" w:color="auto" w:fill="F3F3F3"/>
+      </w:pPr>
+      <w:r>
+        <w:rPr>
+          <w:rFonts w:ascii="Courier New" w:hAnsi="Courier New"/>
+          <w:color w:val="222222"/>
+          <w:sz w:val="18"/>
+        </w:rPr>
+        <w:t xml:space="preserve">  "SGT T.Viking": "The Viking"</w:t>
+      </w:r>
+    </w:p>
+    <w:p>
+      <w:pPr>
+        <w:pStyle w:val="NoSpacing"/>
+        <w:spacing w:before="40" w:after="40"/>
+        <w:ind w:left="576"/>
+        <w:shd w:val="clear" w:color="auto" w:fill="F3F3F3"/>
+      </w:pPr>
+      <w:r>
+        <w:rPr>
+          <w:rFonts w:ascii="Courier New" w:hAnsi="Courier New"/>
+          <w:color w:val="222222"/>
+          <w:sz w:val="18"/>
+        </w:rPr>
+        <w:t>}</w:t>
+      </w:r>
+    </w:p>
+    <w:p/>
+    <w:p>
+      <w:pPr>
+        <w:spacing w:after="120"/>
+      </w:pPr>
+      <w:r>
+        <w:rPr>
+          <w:b w:val="0"/>
+          <w:i w:val="0"/>
+        </w:rPr>
+        <w:t>The value must be the canonical form (the name as it should appear in the UI). Spacing and bracket variants are handled by the normalisation pass automatically — only add an entry here when the names are semantically different.</w:t>
+      </w:r>
+    </w:p>
+    <w:p>
+      <w:pPr>
+        <w:pStyle w:val="Heading2"/>
+      </w:pPr>
+      <w:r>
+        <w:t>5.4 "Also known as" display</w:t>
+      </w:r>
+    </w:p>
+    <w:p>
+      <w:pPr>
+        <w:spacing w:after="120"/>
+      </w:pPr>
+      <w:r>
+        <w:rPr>
+          <w:b w:val="0"/>
+          <w:i w:val="0"/>
+        </w:rPr>
+        <w:t>When a player has one or more absorbed aliases, the full career page displays a dimmed italic "Also known as: alias1, alias2" line below the subtitle. This is populated from nameAliases[canonicalName] by the _setCareerSubtitle() helper.</w:t>
+      </w:r>
+    </w:p>
+    <w:p>
+      <w:r>
+        <w:br w:type="page"/>
+      </w:r>
+    </w:p>
+    <w:p>
+      <w:pPr>
+        <w:pStyle w:val="Heading1"/>
+      </w:pPr>
+      <w:r>
+        <w:t>6. Filter System</w:t>
+      </w:r>
+    </w:p>
+    <w:p>
+      <w:pPr>
+        <w:pStyle w:val="Heading2"/>
+      </w:pPr>
+      <w:r>
+        <w:t>6.1 Filter Pipeline</w:t>
       </w:r>
     </w:p>
     <w:p>
@@ -5310,7 +6180,7 @@
         <w:pStyle w:val="Heading2"/>
       </w:pPr>
       <w:r>
-        <w:t>5.2 Pill Availability Cascade</w:t>
+        <w:t>6.2 Pill Availability Cascade</w:t>
       </w:r>
     </w:p>
     <w:p>
@@ -5382,7 +6252,7 @@
         <w:pStyle w:val="Heading2"/>
       </w:pPr>
       <w:r>
-        <w:t>5.3 Player Pills vs Mission Pills</w:t>
+        <w:t>6.3 Player Pills vs Mission Pills</w:t>
       </w:r>
     </w:p>
     <w:tbl>
@@ -5771,7 +6641,7 @@
         <w:pStyle w:val="Heading2"/>
       </w:pPr>
       <w:r>
-        <w:t>5.4 Zeus Filter</w:t>
+        <w:t>6.4 Zeus Filter</w:t>
       </w:r>
     </w:p>
     <w:p>
@@ -5950,7 +6820,7 @@
         <w:pStyle w:val="Heading1"/>
       </w:pPr>
       <w:r>
-        <w:t>6. Rendering Functions</w:t>
+        <w:t>7. Rendering Functions</w:t>
       </w:r>
     </w:p>
     <w:p>
@@ -5958,7 +6828,7 @@
         <w:pStyle w:val="Heading2"/>
       </w:pPr>
       <w:r>
-        <w:t>6.1 renderStats()</w:t>
+        <w:t>8.1 renderStats()</w:t>
       </w:r>
     </w:p>
     <w:p>
@@ -6271,7 +7141,7 @@
         <w:pStyle w:val="Heading2"/>
       </w:pPr>
       <w:r>
-        <w:t>6.2 renderChart()</w:t>
+        <w:t>8.2 renderChart()</w:t>
       </w:r>
     </w:p>
     <w:p>
@@ -6291,7 +7161,7 @@
         <w:pStyle w:val="Heading2"/>
       </w:pPr>
       <w:r>
-        <w:t>6.3 renderLeader() — Award Cards</w:t>
+        <w:t>8.3 renderLeader() — Award Cards</w:t>
       </w:r>
     </w:p>
     <w:tbl>
@@ -6700,7 +7570,7 @@
         <w:pStyle w:val="Heading2"/>
       </w:pPr>
       <w:r>
-        <w:t>6.4 renderInfantryTable()</w:t>
+        <w:t>8.4 renderInfantryTable()</w:t>
       </w:r>
     </w:p>
     <w:p>
@@ -7753,7 +8623,7 @@
         <w:pStyle w:val="Heading2"/>
       </w:pPr>
       <w:r>
-        <w:t>6.5 renderVehicleTable()</w:t>
+        <w:t>8.5 renderVehicleTable()</w:t>
       </w:r>
     </w:p>
     <w:p>
@@ -7773,7 +8643,7 @@
         <w:pStyle w:val="Heading2"/>
       </w:pPr>
       <w:r>
-        <w:t>6.6 renderTableHead()</w:t>
+        <w:t>8.6 renderTableHead()</w:t>
       </w:r>
     </w:p>
     <w:p>
@@ -7793,7 +8663,7 @@
         <w:pStyle w:val="Heading2"/>
       </w:pPr>
       <w:r>
-        <w:t>6.7 renderUnitLeaderboard()</w:t>
+        <w:t>8.7 renderUnitLeaderboard()</w:t>
       </w:r>
     </w:p>
     <w:p>
@@ -7813,7 +8683,7 @@
         <w:pStyle w:val="Heading2"/>
       </w:pPr>
       <w:r>
-        <w:t>6.8 renderMissionHistory()</w:t>
+        <w:t>8.8 renderMissionHistory()</w:t>
       </w:r>
     </w:p>
     <w:p>
@@ -7833,7 +8703,7 @@
         <w:pStyle w:val="Heading2"/>
       </w:pPr>
       <w:r>
-        <w:t>6.9 renderVehicleKillsSection()</w:t>
+        <w:t>8.9 renderVehicleKillsSection()</w:t>
       </w:r>
     </w:p>
     <w:p>
@@ -7853,7 +8723,7 @@
         <w:pStyle w:val="Heading2"/>
       </w:pPr>
       <w:r>
-        <w:t>6.10 renderWeaponLeaderboard()</w:t>
+        <w:t>8.10 renderWeaponLeaderboard()</w:t>
       </w:r>
     </w:p>
     <w:p>
@@ -7873,7 +8743,7 @@
         <w:pStyle w:val="Heading2"/>
       </w:pPr>
       <w:r>
-        <w:t>6.11 renderMapStats()</w:t>
+        <w:t>8.11 renderMapStats()</w:t>
       </w:r>
     </w:p>
     <w:p>
@@ -7893,7 +8763,7 @@
         <w:pStyle w:val="Heading2"/>
       </w:pPr>
       <w:r>
-        <w:t>6.12 renderRoleLeaderboard()</w:t>
+        <w:t>8.12 renderRoleLeaderboard()</w:t>
       </w:r>
     </w:p>
     <w:p>
@@ -7913,7 +8783,7 @@
         <w:pStyle w:val="Heading2"/>
       </w:pPr>
       <w:r>
-        <w:t>6.13 renderAttendance()</w:t>
+        <w:t>8.13 renderAttendance()</w:t>
       </w:r>
     </w:p>
     <w:p>
@@ -7933,7 +8803,7 @@
         <w:pStyle w:val="Heading2"/>
       </w:pPr>
       <w:r>
-        <w:t>6.14 renderKdTrend()</w:t>
+        <w:t>8.14 renderKdTrend()</w:t>
       </w:r>
     </w:p>
     <w:p>
@@ -7953,7 +8823,7 @@
         <w:pStyle w:val="Heading2"/>
       </w:pPr>
       <w:r>
-        <w:t>6.15 renderComparison()</w:t>
+        <w:t>8.15 renderComparison()</w:t>
       </w:r>
     </w:p>
     <w:p>
@@ -7973,7 +8843,7 @@
         <w:pStyle w:val="Heading2"/>
       </w:pPr>
       <w:r>
-        <w:t>6.16 Section Nav Bar &amp; toggleSection()</w:t>
+        <w:t>8.16 Section Nav Bar &amp; toggleSection()</w:t>
       </w:r>
     </w:p>
     <w:p>
@@ -7998,7 +8868,7 @@
         <w:pStyle w:val="Heading1"/>
       </w:pPr>
       <w:r>
-        <w:t>7. Player Detail Views</w:t>
+        <w:t>8. Player Detail Views</w:t>
       </w:r>
     </w:p>
     <w:p>
@@ -8006,7 +8876,7 @@
         <w:pStyle w:val="Heading2"/>
       </w:pPr>
       <w:r>
-        <w:t>7.1 Player Detail Modal</w:t>
+        <w:t>8.1 Player Detail Modal</w:t>
       </w:r>
     </w:p>
     <w:p>
@@ -8199,7 +9069,7 @@
         <w:pStyle w:val="Heading2"/>
       </w:pPr>
       <w:r>
-        <w:t>7.2 Full Career Page</w:t>
+        <w:t>8.2 Full Career Page</w:t>
       </w:r>
     </w:p>
     <w:p>
@@ -8348,7 +9218,7 @@
         <w:pStyle w:val="Heading2"/>
       </w:pPr>
       <w:r>
-        <w:t>7.3 buildCareerStatsHTML() — Content Sections</w:t>
+        <w:t>8.3 buildCareerStatsHTML() — Content Sections</w:t>
       </w:r>
     </w:p>
     <w:tbl>
@@ -8533,7 +9403,7 @@
         <w:pStyle w:val="Heading1"/>
       </w:pPr>
       <w:r>
-        <w:t>8. Complete Function Reference</w:t>
+        <w:t>9. Complete Function Reference</w:t>
       </w:r>
     </w:p>
     <w:tbl>
@@ -12186,7 +13056,7 @@
         <w:pStyle w:val="Heading1"/>
       </w:pPr>
       <w:r>
-        <w:t>9. CSS Design System</w:t>
+        <w:t>10. CSS Design System</w:t>
       </w:r>
     </w:p>
     <w:p>
@@ -12194,7 +13064,7 @@
         <w:pStyle w:val="Heading2"/>
       </w:pPr>
       <w:r>
-        <w:t>9.1 CSS Custom Properties (Variables)</w:t>
+        <w:t>10.1 CSS Custom Properties (Variables)</w:t>
       </w:r>
     </w:p>
     <w:tbl>
@@ -12803,7 +13673,7 @@
         <w:pStyle w:val="Heading2"/>
       </w:pPr>
       <w:r>
-        <w:t>9.2 Typography</w:t>
+        <w:t>10.2 Typography</w:t>
       </w:r>
     </w:p>
     <w:tbl>
@@ -13016,7 +13886,7 @@
         <w:pStyle w:val="Heading2"/>
       </w:pPr>
       <w:r>
-        <w:t>9.3 Key CSS Classes</w:t>
+        <w:t>10.3 Key CSS Classes</w:t>
       </w:r>
     </w:p>
     <w:tbl>
@@ -13805,7 +14675,7 @@
         <w:pStyle w:val="Heading1"/>
       </w:pPr>
       <w:r>
-        <w:t>10. DOM Structure</w:t>
+        <w:t>11. DOM Structure</w:t>
       </w:r>
     </w:p>
     <w:p>
@@ -13813,7 +14683,7 @@
         <w:pStyle w:val="Heading2"/>
       </w:pPr>
       <w:r>
-        <w:t>10.1 Top-level Elements</w:t>
+        <w:t>11.1 Top-level Elements</w:t>
       </w:r>
     </w:p>
     <w:tbl>
@@ -15174,7 +16044,7 @@
         <w:pStyle w:val="Heading1"/>
       </w:pPr>
       <w:r>
-        <w:t>11. Deployment</w:t>
+        <w:t>12. Deployment</w:t>
       </w:r>
     </w:p>
     <w:p>
@@ -15182,7 +16052,7 @@
         <w:pStyle w:val="Heading2"/>
       </w:pPr>
       <w:r>
-        <w:t>11.1 GitHub Actions Pipeline</w:t>
+        <w:t>12.1 GitHub Actions Pipeline</w:t>
       </w:r>
     </w:p>
     <w:p>
@@ -15363,7 +16233,7 @@
         <w:pStyle w:val="Heading2"/>
       </w:pPr>
       <w:r>
-        <w:t>11.2 GitHub Pages Configuration</w:t>
+        <w:t>12.2 GitHub Pages Configuration</w:t>
       </w:r>
     </w:p>
     <w:p>
@@ -15383,7 +16253,7 @@
         <w:pStyle w:val="Heading2"/>
       </w:pPr>
       <w:r>
-        <w:t>11.3 Publishing a Preview to Production</w:t>
+        <w:t>12.3 Publishing a Preview to Production</w:t>
       </w:r>
     </w:p>
     <w:p>
@@ -15448,7 +16318,7 @@
         <w:pStyle w:val="Heading1"/>
       </w:pPr>
       <w:r>
-        <w:t>12. Extending the Application</w:t>
+        <w:t>13. Extending the Application</w:t>
       </w:r>
     </w:p>
     <w:p>
@@ -15456,7 +16326,7 @@
         <w:pStyle w:val="Heading2"/>
       </w:pPr>
       <w:r>
-        <w:t>12.1 Adding a New Stat Column</w:t>
+        <w:t>13.1 Adding a New Stat Column</w:t>
       </w:r>
     </w:p>
     <w:p>
@@ -15529,7 +16399,7 @@
         <w:pStyle w:val="Heading2"/>
       </w:pPr>
       <w:r>
-        <w:t>12.2 Adding a New Award Card</w:t>
+        <w:t>13.2 Adding a New Award Card</w:t>
       </w:r>
     </w:p>
     <w:p>
@@ -15589,7 +16459,7 @@
         <w:pStyle w:val="Heading2"/>
       </w:pPr>
       <w:r>
-        <w:t>12.3 Pointing to a Different Google Sheet</w:t>
+        <w:t>13.3 Pointing to a Different Google Sheet</w:t>
       </w:r>
     </w:p>
     <w:p>
@@ -15636,7 +16506,7 @@
         <w:pStyle w:val="Heading2"/>
       </w:pPr>
       <w:r>
-        <w:t>12.4 Adding Persistence (localStorage)</w:t>
+        <w:t>13.4 Adding Persistence (localStorage)</w:t>
       </w:r>
     </w:p>
     <w:p>
@@ -15869,7 +16739,7 @@
               <w:rPr>
                 <w:sz w:val="18"/>
               </w:rPr>
-              <w:t>Parallel fetch of CSV_URL and unit_overrides.json.</w:t>
+              <w:t>Parallel fetch of CSV_URL, unit_overrides.json, and player_aliases.json.</w:t>
             </w:r>
           </w:p>
         </w:tc>
@@ -15899,21 +16769,21 @@
               <w:rPr>
                 <w:sz w:val="18"/>
               </w:rPr>
-              <w:t>parseCSVLine() × N</w:t>
-            </w:r>
-          </w:p>
-        </w:tc>
-        <w:tc>
-          <w:tcPr>
-            <w:tcW w:type="dxa" w:w="3135"/>
-            <w:shd w:val="clear" w:color="auto" w:fill="FFFFFF"/>
-          </w:tcPr>
-          <w:p>
-            <w:r>
-              <w:rPr>
-                <w:sz w:val="18"/>
-              </w:rPr>
-              <w:t>Each row parsed; rawRows[] populated.</w:t>
+              <w:t>buildNameMap()</w:t>
+            </w:r>
+          </w:p>
+        </w:tc>
+        <w:tc>
+          <w:tcPr>
+            <w:tcW w:type="dxa" w:w="3135"/>
+            <w:shd w:val="clear" w:color="auto" w:fill="FFFFFF"/>
+          </w:tcPr>
+          <w:p>
+            <w:r>
+              <w:rPr>
+                <w:sz w:val="18"/>
+              </w:rPr>
+              <w:t>nameMap{} and nameAliases{} populated via three-pass name normalisation.</w:t>
             </w:r>
           </w:p>
         </w:tc>
@@ -15943,21 +16813,21 @@
               <w:rPr>
                 <w:sz w:val="18"/>
               </w:rPr>
-              <w:t>buildAggregates()</w:t>
-            </w:r>
-          </w:p>
-        </w:tc>
-        <w:tc>
-          <w:tcPr>
-            <w:tcW w:type="dxa" w:w="3135"/>
-            <w:shd w:val="clear" w:color="auto" w:fill="F0F4FA"/>
-          </w:tcPr>
-          <w:p>
-            <w:r>
-              <w:rPr>
-                <w:sz w:val="18"/>
-              </w:rPr>
-              <w:t>aggPlayers{} populated with career totals.</w:t>
+              <w:t>parseCSVLine() × N</w:t>
+            </w:r>
+          </w:p>
+        </w:tc>
+        <w:tc>
+          <w:tcPr>
+            <w:tcW w:type="dxa" w:w="3135"/>
+            <w:shd w:val="clear" w:color="auto" w:fill="F0F4FA"/>
+          </w:tcPr>
+          <w:p>
+            <w:r>
+              <w:rPr>
+                <w:sz w:val="18"/>
+              </w:rPr>
+              <w:t>Each row parsed; rawRows[] populated.</w:t>
             </w:r>
           </w:p>
         </w:tc>
@@ -15987,21 +16857,21 @@
               <w:rPr>
                 <w:sz w:val="18"/>
               </w:rPr>
-              <w:t>classifyPlayerUnits()</w:t>
-            </w:r>
-          </w:p>
-        </w:tc>
-        <w:tc>
-          <w:tcPr>
-            <w:tcW w:type="dxa" w:w="3135"/>
-            <w:shd w:val="clear" w:color="auto" w:fill="FFFFFF"/>
-          </w:tcPr>
-          <w:p>
-            <w:r>
-              <w:rPr>
-                <w:sz w:val="18"/>
-              </w:rPr>
-              <w:t>playerUnits{} populated via co-occurrence analysis; overrides applied.</w:t>
+              <w:t>buildAggregates()</w:t>
+            </w:r>
+          </w:p>
+        </w:tc>
+        <w:tc>
+          <w:tcPr>
+            <w:tcW w:type="dxa" w:w="3135"/>
+            <w:shd w:val="clear" w:color="auto" w:fill="FFFFFF"/>
+          </w:tcPr>
+          <w:p>
+            <w:r>
+              <w:rPr>
+                <w:sz w:val="18"/>
+              </w:rPr>
+              <w:t>aggPlayers{} populated with career totals.</w:t>
             </w:r>
           </w:p>
         </w:tc>
@@ -16031,21 +16901,21 @@
               <w:rPr>
                 <w:sz w:val="18"/>
               </w:rPr>
-              <w:t>buildUI()</w:t>
-            </w:r>
-          </w:p>
-        </w:tc>
-        <w:tc>
-          <w:tcPr>
-            <w:tcW w:type="dxa" w:w="3135"/>
-            <w:shd w:val="clear" w:color="auto" w:fill="F0F4FA"/>
-          </w:tcPr>
-          <w:p>
-            <w:r>
-              <w:rPr>
-                <w:sz w:val="18"/>
-              </w:rPr>
-              <w:t>Calls buildFilters() and applyFilters(); shows section nav bar.</w:t>
+              <w:t>classifyPlayerUnits()</w:t>
+            </w:r>
+          </w:p>
+        </w:tc>
+        <w:tc>
+          <w:tcPr>
+            <w:tcW w:type="dxa" w:w="3135"/>
+            <w:shd w:val="clear" w:color="auto" w:fill="F0F4FA"/>
+          </w:tcPr>
+          <w:p>
+            <w:r>
+              <w:rPr>
+                <w:sz w:val="18"/>
+              </w:rPr>
+              <w:t>playerUnits{} populated via co-occurrence analysis; overrides applied.</w:t>
             </w:r>
           </w:p>
         </w:tc>
@@ -16075,21 +16945,21 @@
               <w:rPr>
                 <w:sz w:val="18"/>
               </w:rPr>
-              <w:t>buildFilters()</w:t>
-            </w:r>
-          </w:p>
-        </w:tc>
-        <w:tc>
-          <w:tcPr>
-            <w:tcW w:type="dxa" w:w="3135"/>
-            <w:shd w:val="clear" w:color="auto" w:fill="FFFFFF"/>
-          </w:tcPr>
-          <w:p>
-            <w:r>
-              <w:rPr>
-                <w:sz w:val="18"/>
-              </w:rPr>
-              <w:t>Event listeners attached; refreshPills() called.</w:t>
+              <w:t>buildUI()</w:t>
+            </w:r>
+          </w:p>
+        </w:tc>
+        <w:tc>
+          <w:tcPr>
+            <w:tcW w:type="dxa" w:w="3135"/>
+            <w:shd w:val="clear" w:color="auto" w:fill="FFFFFF"/>
+          </w:tcPr>
+          <w:p>
+            <w:r>
+              <w:rPr>
+                <w:sz w:val="18"/>
+              </w:rPr>
+              <w:t>Calls buildFilters() and applyFilters(); shows section nav bar.</w:t>
             </w:r>
           </w:p>
         </w:tc>
@@ -16119,21 +16989,21 @@
               <w:rPr>
                 <w:sz w:val="18"/>
               </w:rPr>
-              <w:t>applyFilters()</w:t>
-            </w:r>
-          </w:p>
-        </w:tc>
-        <w:tc>
-          <w:tcPr>
-            <w:tcW w:type="dxa" w:w="3135"/>
-            <w:shd w:val="clear" w:color="auto" w:fill="F0F4FA"/>
-          </w:tcPr>
-          <w:p>
-            <w:r>
-              <w:rPr>
-                <w:sz w:val="18"/>
-              </w:rPr>
-              <w:t>filteredPlayers[] and filteredRows[] built; all render functions called.</w:t>
+              <w:t>buildFilters()</w:t>
+            </w:r>
+          </w:p>
+        </w:tc>
+        <w:tc>
+          <w:tcPr>
+            <w:tcW w:type="dxa" w:w="3135"/>
+            <w:shd w:val="clear" w:color="auto" w:fill="F0F4FA"/>
+          </w:tcPr>
+          <w:p>
+            <w:r>
+              <w:rPr>
+                <w:sz w:val="18"/>
+              </w:rPr>
+              <w:t>Event listeners attached; refreshPills() called.</w:t>
             </w:r>
           </w:p>
         </w:tc>
@@ -16163,21 +17033,21 @@
               <w:rPr>
                 <w:sz w:val="18"/>
               </w:rPr>
-              <w:t>renderStats()</w:t>
-            </w:r>
-          </w:p>
-        </w:tc>
-        <w:tc>
-          <w:tcPr>
-            <w:tcW w:type="dxa" w:w="3135"/>
-            <w:shd w:val="clear" w:color="auto" w:fill="FFFFFF"/>
-          </w:tcPr>
-          <w:p>
-            <w:r>
-              <w:rPr>
-                <w:sz w:val="18"/>
-              </w:rPr>
-              <w:t>#statsBar populated.</w:t>
+              <w:t>applyFilters()</w:t>
+            </w:r>
+          </w:p>
+        </w:tc>
+        <w:tc>
+          <w:tcPr>
+            <w:tcW w:type="dxa" w:w="3135"/>
+            <w:shd w:val="clear" w:color="auto" w:fill="FFFFFF"/>
+          </w:tcPr>
+          <w:p>
+            <w:r>
+              <w:rPr>
+                <w:sz w:val="18"/>
+              </w:rPr>
+              <w:t>filteredPlayers[] and filteredRows[] built; all render functions called.</w:t>
             </w:r>
           </w:p>
         </w:tc>
@@ -16207,21 +17077,21 @@
               <w:rPr>
                 <w:sz w:val="18"/>
               </w:rPr>
-              <w:t>renderChart()</w:t>
-            </w:r>
-          </w:p>
-        </w:tc>
-        <w:tc>
-          <w:tcPr>
-            <w:tcW w:type="dxa" w:w="3135"/>
-            <w:shd w:val="clear" w:color="auto" w:fill="F0F4FA"/>
-          </w:tcPr>
-          <w:p>
-            <w:r>
-              <w:rPr>
-                <w:sz w:val="18"/>
-              </w:rPr>
-              <w:t>#chartBars populated.</w:t>
+              <w:t>renderStats()</w:t>
+            </w:r>
+          </w:p>
+        </w:tc>
+        <w:tc>
+          <w:tcPr>
+            <w:tcW w:type="dxa" w:w="3135"/>
+            <w:shd w:val="clear" w:color="auto" w:fill="F0F4FA"/>
+          </w:tcPr>
+          <w:p>
+            <w:r>
+              <w:rPr>
+                <w:sz w:val="18"/>
+              </w:rPr>
+              <w:t>#statsBar populated.</w:t>
             </w:r>
           </w:p>
         </w:tc>
@@ -16251,21 +17121,21 @@
               <w:rPr>
                 <w:sz w:val="18"/>
               </w:rPr>
-              <w:t>renderLeader()</w:t>
-            </w:r>
-          </w:p>
-        </w:tc>
-        <w:tc>
-          <w:tcPr>
-            <w:tcW w:type="dxa" w:w="3135"/>
-            <w:shd w:val="clear" w:color="auto" w:fill="FFFFFF"/>
-          </w:tcPr>
-          <w:p>
-            <w:r>
-              <w:rPr>
-                <w:sz w:val="18"/>
-              </w:rPr>
-              <w:t>#awardsRow populated.</w:t>
+              <w:t>renderChart()</w:t>
+            </w:r>
+          </w:p>
+        </w:tc>
+        <w:tc>
+          <w:tcPr>
+            <w:tcW w:type="dxa" w:w="3135"/>
+            <w:shd w:val="clear" w:color="auto" w:fill="FFFFFF"/>
+          </w:tcPr>
+          <w:p>
+            <w:r>
+              <w:rPr>
+                <w:sz w:val="18"/>
+              </w:rPr>
+              <w:t>#chartBars populated.</w:t>
             </w:r>
           </w:p>
         </w:tc>
@@ -16295,21 +17165,21 @@
               <w:rPr>
                 <w:sz w:val="18"/>
               </w:rPr>
-              <w:t>renderInfantryTable()</w:t>
-            </w:r>
-          </w:p>
-        </w:tc>
-        <w:tc>
-          <w:tcPr>
-            <w:tcW w:type="dxa" w:w="3135"/>
-            <w:shd w:val="clear" w:color="auto" w:fill="F0F4FA"/>
-          </w:tcPr>
-          <w:p>
-            <w:r>
-              <w:rPr>
-                <w:sz w:val="18"/>
-              </w:rPr>
-              <w:t>#infantryBody + #infantryHead populated.</w:t>
+              <w:t>renderLeader()</w:t>
+            </w:r>
+          </w:p>
+        </w:tc>
+        <w:tc>
+          <w:tcPr>
+            <w:tcW w:type="dxa" w:w="3135"/>
+            <w:shd w:val="clear" w:color="auto" w:fill="F0F4FA"/>
+          </w:tcPr>
+          <w:p>
+            <w:r>
+              <w:rPr>
+                <w:sz w:val="18"/>
+              </w:rPr>
+              <w:t>#awardsRow populated.</w:t>
             </w:r>
           </w:p>
         </w:tc>
@@ -16339,21 +17209,21 @@
               <w:rPr>
                 <w:sz w:val="18"/>
               </w:rPr>
-              <w:t>renderVehicleTable()</w:t>
-            </w:r>
-          </w:p>
-        </w:tc>
-        <w:tc>
-          <w:tcPr>
-            <w:tcW w:type="dxa" w:w="3135"/>
-            <w:shd w:val="clear" w:color="auto" w:fill="FFFFFF"/>
-          </w:tcPr>
-          <w:p>
-            <w:r>
-              <w:rPr>
-                <w:sz w:val="18"/>
-              </w:rPr>
-              <w:t>#vehicleBody + #vehicleHead populated.</w:t>
+              <w:t>renderInfantryTable()</w:t>
+            </w:r>
+          </w:p>
+        </w:tc>
+        <w:tc>
+          <w:tcPr>
+            <w:tcW w:type="dxa" w:w="3135"/>
+            <w:shd w:val="clear" w:color="auto" w:fill="FFFFFF"/>
+          </w:tcPr>
+          <w:p>
+            <w:r>
+              <w:rPr>
+                <w:sz w:val="18"/>
+              </w:rPr>
+              <w:t>#infantryBody + #infantryHead populated.</w:t>
             </w:r>
           </w:p>
         </w:tc>
@@ -16383,21 +17253,21 @@
               <w:rPr>
                 <w:sz w:val="18"/>
               </w:rPr>
-              <w:t>renderUnitLeaderboard()</w:t>
-            </w:r>
-          </w:p>
-        </w:tc>
-        <w:tc>
-          <w:tcPr>
-            <w:tcW w:type="dxa" w:w="3135"/>
-            <w:shd w:val="clear" w:color="auto" w:fill="F0F4FA"/>
-          </w:tcPr>
-          <w:p>
-            <w:r>
-              <w:rPr>
-                <w:sz w:val="18"/>
-              </w:rPr>
-              <w:t>#unitLbBody populated (section collapsed by default).</w:t>
+              <w:t>renderVehicleTable()</w:t>
+            </w:r>
+          </w:p>
+        </w:tc>
+        <w:tc>
+          <w:tcPr>
+            <w:tcW w:type="dxa" w:w="3135"/>
+            <w:shd w:val="clear" w:color="auto" w:fill="F0F4FA"/>
+          </w:tcPr>
+          <w:p>
+            <w:r>
+              <w:rPr>
+                <w:sz w:val="18"/>
+              </w:rPr>
+              <w:t>#vehicleBody + #vehicleHead populated.</w:t>
             </w:r>
           </w:p>
         </w:tc>
@@ -16427,21 +17297,21 @@
               <w:rPr>
                 <w:sz w:val="18"/>
               </w:rPr>
-              <w:t>renderMissionHistory()</w:t>
-            </w:r>
-          </w:p>
-        </w:tc>
-        <w:tc>
-          <w:tcPr>
-            <w:tcW w:type="dxa" w:w="3135"/>
-            <w:shd w:val="clear" w:color="auto" w:fill="FFFFFF"/>
-          </w:tcPr>
-          <w:p>
-            <w:r>
-              <w:rPr>
-                <w:sz w:val="18"/>
-              </w:rPr>
-              <w:t>#missionHistBody populated (section collapsed by default).</w:t>
+              <w:t>renderUnitLeaderboard()</w:t>
+            </w:r>
+          </w:p>
+        </w:tc>
+        <w:tc>
+          <w:tcPr>
+            <w:tcW w:type="dxa" w:w="3135"/>
+            <w:shd w:val="clear" w:color="auto" w:fill="FFFFFF"/>
+          </w:tcPr>
+          <w:p>
+            <w:r>
+              <w:rPr>
+                <w:sz w:val="18"/>
+              </w:rPr>
+              <w:t>#unitLbBody populated (section collapsed by default).</w:t>
             </w:r>
           </w:p>
         </w:tc>
@@ -16471,21 +17341,21 @@
               <w:rPr>
                 <w:sz w:val="18"/>
               </w:rPr>
-              <w:t>renderVehicleKillsSection()</w:t>
-            </w:r>
-          </w:p>
-        </w:tc>
-        <w:tc>
-          <w:tcPr>
-            <w:tcW w:type="dxa" w:w="3135"/>
-            <w:shd w:val="clear" w:color="auto" w:fill="F0F4FA"/>
-          </w:tcPr>
-          <w:p>
-            <w:r>
-              <w:rPr>
-                <w:sz w:val="18"/>
-              </w:rPr>
-              <w:t>#vehKillsBody populated (section collapsed by default).</w:t>
+              <w:t>renderMissionHistory()</w:t>
+            </w:r>
+          </w:p>
+        </w:tc>
+        <w:tc>
+          <w:tcPr>
+            <w:tcW w:type="dxa" w:w="3135"/>
+            <w:shd w:val="clear" w:color="auto" w:fill="F0F4FA"/>
+          </w:tcPr>
+          <w:p>
+            <w:r>
+              <w:rPr>
+                <w:sz w:val="18"/>
+              </w:rPr>
+              <w:t>#missionHistBody populated (section collapsed by default).</w:t>
             </w:r>
           </w:p>
         </w:tc>
@@ -16515,21 +17385,21 @@
               <w:rPr>
                 <w:sz w:val="18"/>
               </w:rPr>
-              <w:t>renderWeaponLeaderboard()</w:t>
-            </w:r>
-          </w:p>
-        </w:tc>
-        <w:tc>
-          <w:tcPr>
-            <w:tcW w:type="dxa" w:w="3135"/>
-            <w:shd w:val="clear" w:color="auto" w:fill="FFFFFF"/>
-          </w:tcPr>
-          <w:p>
-            <w:r>
-              <w:rPr>
-                <w:sz w:val="18"/>
-              </w:rPr>
-              <w:t>#wpBody populated (section collapsed by default).</w:t>
+              <w:t>renderVehicleKillsSection()</w:t>
+            </w:r>
+          </w:p>
+        </w:tc>
+        <w:tc>
+          <w:tcPr>
+            <w:tcW w:type="dxa" w:w="3135"/>
+            <w:shd w:val="clear" w:color="auto" w:fill="FFFFFF"/>
+          </w:tcPr>
+          <w:p>
+            <w:r>
+              <w:rPr>
+                <w:sz w:val="18"/>
+              </w:rPr>
+              <w:t>#vehKillsBody populated (section collapsed by default).</w:t>
             </w:r>
           </w:p>
         </w:tc>
@@ -16559,21 +17429,21 @@
               <w:rPr>
                 <w:sz w:val="18"/>
               </w:rPr>
-              <w:t>renderMapStats()</w:t>
-            </w:r>
-          </w:p>
-        </w:tc>
-        <w:tc>
-          <w:tcPr>
-            <w:tcW w:type="dxa" w:w="3135"/>
-            <w:shd w:val="clear" w:color="auto" w:fill="F0F4FA"/>
-          </w:tcPr>
-          <w:p>
-            <w:r>
-              <w:rPr>
-                <w:sz w:val="18"/>
-              </w:rPr>
-              <w:t>#mapBody populated (section collapsed by default).</w:t>
+              <w:t>renderWeaponLeaderboard()</w:t>
+            </w:r>
+          </w:p>
+        </w:tc>
+        <w:tc>
+          <w:tcPr>
+            <w:tcW w:type="dxa" w:w="3135"/>
+            <w:shd w:val="clear" w:color="auto" w:fill="F0F4FA"/>
+          </w:tcPr>
+          <w:p>
+            <w:r>
+              <w:rPr>
+                <w:sz w:val="18"/>
+              </w:rPr>
+              <w:t>#wpBody populated (section collapsed by default).</w:t>
             </w:r>
           </w:p>
         </w:tc>
@@ -16603,21 +17473,21 @@
               <w:rPr>
                 <w:sz w:val="18"/>
               </w:rPr>
-              <w:t>renderRoleLeaderboard()</w:t>
-            </w:r>
-          </w:p>
-        </w:tc>
-        <w:tc>
-          <w:tcPr>
-            <w:tcW w:type="dxa" w:w="3135"/>
-            <w:shd w:val="clear" w:color="auto" w:fill="FFFFFF"/>
-          </w:tcPr>
-          <w:p>
-            <w:r>
-              <w:rPr>
-                <w:sz w:val="18"/>
-              </w:rPr>
-              <w:t>#roleBody populated (section collapsed by default).</w:t>
+              <w:t>renderMapStats()</w:t>
+            </w:r>
+          </w:p>
+        </w:tc>
+        <w:tc>
+          <w:tcPr>
+            <w:tcW w:type="dxa" w:w="3135"/>
+            <w:shd w:val="clear" w:color="auto" w:fill="FFFFFF"/>
+          </w:tcPr>
+          <w:p>
+            <w:r>
+              <w:rPr>
+                <w:sz w:val="18"/>
+              </w:rPr>
+              <w:t>#mapBody populated (section collapsed by default).</w:t>
             </w:r>
           </w:p>
         </w:tc>
@@ -16647,21 +17517,21 @@
               <w:rPr>
                 <w:sz w:val="18"/>
               </w:rPr>
-              <w:t>renderAttendance()</w:t>
-            </w:r>
-          </w:p>
-        </w:tc>
-        <w:tc>
-          <w:tcPr>
-            <w:tcW w:type="dxa" w:w="3135"/>
-            <w:shd w:val="clear" w:color="auto" w:fill="F0F4FA"/>
-          </w:tcPr>
-          <w:p>
-            <w:r>
-              <w:rPr>
-                <w:sz w:val="18"/>
-              </w:rPr>
-              <w:t>#attendBody populated (section collapsed by default).</w:t>
+              <w:t>renderRoleLeaderboard()</w:t>
+            </w:r>
+          </w:p>
+        </w:tc>
+        <w:tc>
+          <w:tcPr>
+            <w:tcW w:type="dxa" w:w="3135"/>
+            <w:shd w:val="clear" w:color="auto" w:fill="F0F4FA"/>
+          </w:tcPr>
+          <w:p>
+            <w:r>
+              <w:rPr>
+                <w:sz w:val="18"/>
+              </w:rPr>
+              <w:t>#roleBody populated (section collapsed by default).</w:t>
             </w:r>
           </w:p>
         </w:tc>
@@ -16691,21 +17561,21 @@
               <w:rPr>
                 <w:sz w:val="18"/>
               </w:rPr>
-              <w:t>renderKdTrend()</w:t>
-            </w:r>
-          </w:p>
-        </w:tc>
-        <w:tc>
-          <w:tcPr>
-            <w:tcW w:type="dxa" w:w="3135"/>
-            <w:shd w:val="clear" w:color="auto" w:fill="FFFFFF"/>
-          </w:tcPr>
-          <w:p>
-            <w:r>
-              <w:rPr>
-                <w:sz w:val="18"/>
-              </w:rPr>
-              <w:t>#kdTrendChart populated (section collapsed by default).</w:t>
+              <w:t>renderAttendance()</w:t>
+            </w:r>
+          </w:p>
+        </w:tc>
+        <w:tc>
+          <w:tcPr>
+            <w:tcW w:type="dxa" w:w="3135"/>
+            <w:shd w:val="clear" w:color="auto" w:fill="FFFFFF"/>
+          </w:tcPr>
+          <w:p>
+            <w:r>
+              <w:rPr>
+                <w:sz w:val="18"/>
+              </w:rPr>
+              <w:t>#attendBody populated (section collapsed by default).</w:t>
             </w:r>
           </w:p>
         </w:tc>
@@ -16735,21 +17605,21 @@
               <w:rPr>
                 <w:sz w:val="18"/>
               </w:rPr>
-              <w:t>renderComparison()</w:t>
-            </w:r>
-          </w:p>
-        </w:tc>
-        <w:tc>
-          <w:tcPr>
-            <w:tcW w:type="dxa" w:w="3135"/>
-            <w:shd w:val="clear" w:color="auto" w:fill="F0F4FA"/>
-          </w:tcPr>
-          <w:p>
-            <w:r>
-              <w:rPr>
-                <w:sz w:val="18"/>
-              </w:rPr>
-              <w:t>Comparison dropdowns populated (section collapsed by default).</w:t>
+              <w:t>renderKdTrend()</w:t>
+            </w:r>
+          </w:p>
+        </w:tc>
+        <w:tc>
+          <w:tcPr>
+            <w:tcW w:type="dxa" w:w="3135"/>
+            <w:shd w:val="clear" w:color="auto" w:fill="F0F4FA"/>
+          </w:tcPr>
+          <w:p>
+            <w:r>
+              <w:rPr>
+                <w:sz w:val="18"/>
+              </w:rPr>
+              <w:t>#kdTrendChart populated (section collapsed by default).</w:t>
             </w:r>
           </w:p>
         </w:tc>
@@ -16779,6 +17649,50 @@
               <w:rPr>
                 <w:sz w:val="18"/>
               </w:rPr>
+              <w:t>renderComparison()</w:t>
+            </w:r>
+          </w:p>
+        </w:tc>
+        <w:tc>
+          <w:tcPr>
+            <w:tcW w:type="dxa" w:w="3135"/>
+            <w:shd w:val="clear" w:color="auto" w:fill="FFFFFF"/>
+          </w:tcPr>
+          <w:p>
+            <w:r>
+              <w:rPr>
+                <w:sz w:val="18"/>
+              </w:rPr>
+              <w:t>Comparison dropdowns populated (section collapsed by default).</w:t>
+            </w:r>
+          </w:p>
+        </w:tc>
+      </w:tr>
+      <w:tr>
+        <w:tc>
+          <w:tcPr>
+            <w:tcW w:type="dxa" w:w="3135"/>
+            <w:shd w:val="clear" w:color="auto" w:fill="F0F4FA"/>
+          </w:tcPr>
+          <w:p>
+            <w:r>
+              <w:rPr>
+                <w:sz w:val="18"/>
+              </w:rPr>
+              <w:t>24</w:t>
+            </w:r>
+          </w:p>
+        </w:tc>
+        <w:tc>
+          <w:tcPr>
+            <w:tcW w:type="dxa" w:w="3135"/>
+            <w:shd w:val="clear" w:color="auto" w:fill="F0F4FA"/>
+          </w:tcPr>
+          <w:p>
+            <w:r>
+              <w:rPr>
+                <w:sz w:val="18"/>
+              </w:rPr>
               <w:t>UI Ready</w:t>
             </w:r>
           </w:p>
@@ -16786,7 +17700,7 @@
         <w:tc>
           <w:tcPr>
             <w:tcW w:type="dxa" w:w="3135"/>
-            <w:shd w:val="clear" w:color="auto" w:fill="FFFFFF"/>
+            <w:shd w:val="clear" w:color="auto" w:fill="F0F4FA"/>
           </w:tcPr>
           <w:p>
             <w:r>
@@ -17428,7 +18342,7 @@
               <w:rPr>
                 <w:sz w:val="18"/>
               </w:rPr>
-              <w:t>TK occurs in the last 2 min (120 s) before endMission</w:t>
+              <w:t>TK occurs in the last 5 min (300 s) before endMission</w:t>
             </w:r>
           </w:p>
         </w:tc>
@@ -17472,7 +18386,7 @@
               <w:rPr>
                 <w:sz w:val="18"/>
               </w:rPr>
-              <w:t>Distance ≤ 15 m AND within last 3 min (180 s) of endMission</w:t>
+              <w:t>Distance ≤ 15 m AND within last 7 min (420 s) of endMission</w:t>
             </w:r>
           </w:p>
         </w:tc>
@@ -17516,21 +18430,21 @@
               <w:rPr>
                 <w:sz w:val="18"/>
               </w:rPr>
-              <w:t>3 or more TKs fall within any 60-second rolling window</w:t>
-            </w:r>
-          </w:p>
-        </w:tc>
-        <w:tc>
-          <w:tcPr>
-            <w:tcW w:type="dxa" w:w="3135"/>
-            <w:shd w:val="clear" w:color="auto" w:fill="FFFFFF"/>
-          </w:tcPr>
-          <w:p>
-            <w:r>
-              <w:rPr>
-                <w:sz w:val="18"/>
-              </w:rPr>
-              <w:t>Group grenade throw or celebration volley earlier in the timeline</w:t>
+              <w:t>3 or more TKs fall within any 60-second rolling window, within last 10 min (600 s)</w:t>
+            </w:r>
+          </w:p>
+        </w:tc>
+        <w:tc>
+          <w:tcPr>
+            <w:tcW w:type="dxa" w:w="3135"/>
+            <w:shd w:val="clear" w:color="auto" w:fill="FFFFFF"/>
+          </w:tcPr>
+          <w:p>
+            <w:r>
+              <w:rPr>
+                <w:sz w:val="18"/>
+              </w:rPr>
+              <w:t>Group grenade throw or celebration volley; time-gated to avoid suppressing mid-mission TK clusters</w:t>
             </w:r>
           </w:p>
         </w:tc>

</xml_diff>

<commit_message>
Release v1.024 — weapon ammo variant merging
Strip trailing [AmmoType] bracket suffix from weapon names at aggregation
time so variants of the same weapon (e.g. M240G [M62 Tracer] / M240G
[M80A1 EPR]) are collapsed into a single entry across the weapon
leaderboard, career weapon breakdown, and award cards.

- tracker.js: VERSION 1.024; ammo strip in both buildAggregates and applyFilters
- CHANGELOG, README, generate_docs updated; docs regenerated (v1.6)

https://claude.ai/code/session_01LeCW8ZtNT8f2MnVa6wEGBx
</commit_message>
<xml_diff>
--- a/TFP_KillTracker_Technical_Documentation.docx
+++ b/TFP_KillTracker_Technical_Documentation.docx
@@ -39,7 +39,7 @@
         <w:rPr>
           <w:sz w:val="22"/>
         </w:rPr>
-        <w:t>Version 1.5  ·  31 March 2026</w:t>
+        <w:t>Version 1.6  ·  31 March 2026</w:t>
       </w:r>
     </w:p>
     <w:p>
@@ -8735,7 +8735,7 @@
           <w:b w:val="0"/>
           <w:i w:val="0"/>
         </w:rPr>
-        <w:t>Merges Weapon Kills (JSON) objects across all filteredRows. Displays top-50 weapons with total kills, user count, top user, and kill share %. Right-clicking the Total Kills header toggles kills/user mode (amber ~/u prefix). A live search input above the table filters rows by weapon name substring.</w:t>
+        <w:t>Merges Weapon Kills (JSON) objects across all filteredRows. Displays top-50 weapons with total kills, user count, top user, and kill share %. Right-clicking the Total Kills header toggles kills/user mode (amber ~/u prefix). A live search input above the table filters rows by weapon name substring. Ammo variants are merged at aggregation time: the trailing [AmmoType] bracket suffix (e.g. "[M62 Tracer]", "[M80A1 EPR]") is stripped from weapon names before accumulation, so M240G [M62 Tracer] and M240G [M80A1 EPR] both count as M240G.</w:t>
       </w:r>
     </w:p>
     <w:p>

</xml_diff>

<commit_message>
Deploying to gh-pages from @ loltorres9/TFP_KillTracker@80ae8ef86edd6651f579e2f6d48618a22a4e4ffc 🚀
</commit_message>
<xml_diff>
--- a/TFP_KillTracker_Technical_Documentation.docx
+++ b/TFP_KillTracker_Technical_Documentation.docx
@@ -39,7 +39,7 @@
         <w:rPr>
           <w:sz w:val="22"/>
         </w:rPr>
-        <w:t>Version 1.5  ·  31 March 2026</w:t>
+        <w:t>Version 1.6  ·  31 March 2026</w:t>
       </w:r>
     </w:p>
     <w:p>
@@ -8735,7 +8735,7 @@
           <w:b w:val="0"/>
           <w:i w:val="0"/>
         </w:rPr>
-        <w:t>Merges Weapon Kills (JSON) objects across all filteredRows. Displays top-50 weapons with total kills, user count, top user, and kill share %. Right-clicking the Total Kills header toggles kills/user mode (amber ~/u prefix). A live search input above the table filters rows by weapon name substring.</w:t>
+        <w:t>Merges Weapon Kills (JSON) objects across all filteredRows. Displays top-50 weapons with total kills, user count, top user, and kill share %. Right-clicking the Total Kills header toggles kills/user mode (amber ~/u prefix). A live search input above the table filters rows by weapon name substring. Ammo variants are merged at aggregation time: the trailing [AmmoType] bracket suffix (e.g. "[M62 Tracer]", "[M80A1 EPR]") is stripped from weapon names before accumulation, so M240G [M62 Tracer] and M240G [M80A1 EPR] both count as M240G.</w:t>
       </w:r>
     </w:p>
     <w:p>

</xml_diff>

<commit_message>
Release v1.025 — campaign grouping, campaign medal ribbons
- tracker.js: VERSION 1.025, RELEASE_DATE 2026-04-20
- Campaign filter: campaigns.json groups missions by name or pattern;
  Campaigns pills below Missions selector select all campaign missions at once
- Campaign medals: procedurally generated ribbon bars (Alea PRNG seeded
  by name, 73-colour military palette) shown on career page and modal;
  eligibility uses aggPlayers so active filters don't affect medal awards
- CHANGELOG, README (new Campaigns section), generate_docs v1.7 updated
- Docs regenerated (docx + PDF)

https://claude.ai/code/session_01LeCW8ZtNT8f2MnVa6wEGBx
</commit_message>
<xml_diff>
--- a/TFP_KillTracker_Technical_Documentation.docx
+++ b/TFP_KillTracker_Technical_Documentation.docx
@@ -39,7 +39,7 @@
         <w:rPr>
           <w:sz w:val="22"/>
         </w:rPr>
-        <w:t>Version 1.6  ·  31 March 2026</w:t>
+        <w:t>Version 1.7  ·  20 April 2026</w:t>
       </w:r>
     </w:p>
     <w:p>
@@ -674,7 +674,7 @@
               <w:rPr>
                 <w:sz w:val="18"/>
               </w:rPr>
-              <w:t>ImportScript</w:t>
+              <w:t>campaigns.json</w:t>
             </w:r>
           </w:p>
         </w:tc>
@@ -688,7 +688,7 @@
               <w:rPr>
                 <w:sz w:val="18"/>
               </w:rPr>
-              <w:t>Google Apps Script that imports OCAP .json.gz mission logs into Google Sheets</w:t>
+              <w:t>Campaign definitions — groups missions into named campaigns for the filter pill and medal awards</w:t>
             </w:r>
           </w:p>
         </w:tc>
@@ -704,7 +704,7 @@
               <w:rPr>
                 <w:sz w:val="18"/>
               </w:rPr>
-              <w:t>generate_docs.py</w:t>
+              <w:t>ImportScript</w:t>
             </w:r>
           </w:p>
         </w:tc>
@@ -718,7 +718,7 @@
               <w:rPr>
                 <w:sz w:val="18"/>
               </w:rPr>
-              <w:t>python-docx script that regenerates this documentation file</w:t>
+              <w:t>Google Apps Script that imports OCAP .json.gz mission logs into Google Sheets</w:t>
             </w:r>
           </w:p>
         </w:tc>
@@ -734,7 +734,7 @@
               <w:rPr>
                 <w:sz w:val="18"/>
               </w:rPr>
-              <w:t>README.md</w:t>
+              <w:t>generate_docs.py</w:t>
             </w:r>
           </w:p>
         </w:tc>
@@ -748,7 +748,7 @@
               <w:rPr>
                 <w:sz w:val="18"/>
               </w:rPr>
-              <w:t>User-facing feature overview and deployment guide</w:t>
+              <w:t>python-docx script that regenerates this documentation file</w:t>
             </w:r>
           </w:p>
         </w:tc>
@@ -764,6 +764,36 @@
               <w:rPr>
                 <w:sz w:val="18"/>
               </w:rPr>
+              <w:t>README.md</w:t>
+            </w:r>
+          </w:p>
+        </w:tc>
+        <w:tc>
+          <w:tcPr>
+            <w:tcW w:type="dxa" w:w="4703"/>
+            <w:shd w:val="clear" w:color="auto" w:fill="FFFFFF"/>
+          </w:tcPr>
+          <w:p>
+            <w:r>
+              <w:rPr>
+                <w:sz w:val="18"/>
+              </w:rPr>
+              <w:t>User-facing feature overview and deployment guide</w:t>
+            </w:r>
+          </w:p>
+        </w:tc>
+      </w:tr>
+      <w:tr>
+        <w:tc>
+          <w:tcPr>
+            <w:tcW w:type="dxa" w:w="4703"/>
+            <w:shd w:val="clear" w:color="auto" w:fill="F0F4FA"/>
+          </w:tcPr>
+          <w:p>
+            <w:r>
+              <w:rPr>
+                <w:sz w:val="18"/>
+              </w:rPr>
               <w:t>.github/workflows/</w:t>
             </w:r>
           </w:p>
@@ -771,7 +801,7 @@
         <w:tc>
           <w:tcPr>
             <w:tcW w:type="dxa" w:w="4703"/>
-            <w:shd w:val="clear" w:color="auto" w:fill="FFFFFF"/>
+            <w:shd w:val="clear" w:color="auto" w:fill="F0F4FA"/>
           </w:tcPr>
           <w:p>
             <w:r>
@@ -2441,6 +2471,122 @@
                 <w:sz w:val="18"/>
               </w:rPr>
               <w:t>Maps canonical name → array of all absorbed alias strings; used to show "Also known as" on career page</w:t>
+            </w:r>
+          </w:p>
+        </w:tc>
+      </w:tr>
+      <w:tr>
+        <w:tc>
+          <w:tcPr>
+            <w:tcW w:type="dxa" w:w="2351"/>
+            <w:shd w:val="clear" w:color="auto" w:fill="F0F4FA"/>
+          </w:tcPr>
+          <w:p>
+            <w:r>
+              <w:rPr>
+                <w:sz w:val="18"/>
+              </w:rPr>
+              <w:t>campaignData</w:t>
+            </w:r>
+          </w:p>
+        </w:tc>
+        <w:tc>
+          <w:tcPr>
+            <w:tcW w:type="dxa" w:w="2351"/>
+            <w:shd w:val="clear" w:color="auto" w:fill="F0F4FA"/>
+          </w:tcPr>
+          <w:p>
+            <w:r>
+              <w:rPr>
+                <w:sz w:val="18"/>
+              </w:rPr>
+              <w:t>Object</w:t>
+            </w:r>
+          </w:p>
+        </w:tc>
+        <w:tc>
+          <w:tcPr>
+            <w:tcW w:type="dxa" w:w="2351"/>
+            <w:shd w:val="clear" w:color="auto" w:fill="F0F4FA"/>
+          </w:tcPr>
+          <w:p>
+            <w:r>
+              <w:rPr>
+                <w:sz w:val="18"/>
+              </w:rPr>
+              <w:t>{}</w:t>
+            </w:r>
+          </w:p>
+        </w:tc>
+        <w:tc>
+          <w:tcPr>
+            <w:tcW w:type="dxa" w:w="2351"/>
+            <w:shd w:val="clear" w:color="auto" w:fill="F0F4FA"/>
+          </w:tcPr>
+          <w:p>
+            <w:r>
+              <w:rPr>
+                <w:sz w:val="18"/>
+              </w:rPr>
+              <w:t>Parsed campaigns.json; keys are campaign names, values have missions[] and/or patterns[]</w:t>
+            </w:r>
+          </w:p>
+        </w:tc>
+      </w:tr>
+      <w:tr>
+        <w:tc>
+          <w:tcPr>
+            <w:tcW w:type="dxa" w:w="2351"/>
+            <w:shd w:val="clear" w:color="auto" w:fill="FFFFFF"/>
+          </w:tcPr>
+          <w:p>
+            <w:r>
+              <w:rPr>
+                <w:sz w:val="18"/>
+              </w:rPr>
+              <w:t>selectedCampaign</w:t>
+            </w:r>
+          </w:p>
+        </w:tc>
+        <w:tc>
+          <w:tcPr>
+            <w:tcW w:type="dxa" w:w="2351"/>
+            <w:shd w:val="clear" w:color="auto" w:fill="FFFFFF"/>
+          </w:tcPr>
+          <w:p>
+            <w:r>
+              <w:rPr>
+                <w:sz w:val="18"/>
+              </w:rPr>
+              <w:t>string | null</w:t>
+            </w:r>
+          </w:p>
+        </w:tc>
+        <w:tc>
+          <w:tcPr>
+            <w:tcW w:type="dxa" w:w="2351"/>
+            <w:shd w:val="clear" w:color="auto" w:fill="FFFFFF"/>
+          </w:tcPr>
+          <w:p>
+            <w:r>
+              <w:rPr>
+                <w:sz w:val="18"/>
+              </w:rPr>
+              <w:t>null</w:t>
+            </w:r>
+          </w:p>
+        </w:tc>
+        <w:tc>
+          <w:tcPr>
+            <w:tcW w:type="dxa" w:w="2351"/>
+            <w:shd w:val="clear" w:color="auto" w:fill="FFFFFF"/>
+          </w:tcPr>
+          <w:p>
+            <w:r>
+              <w:rPr>
+                <w:sz w:val="18"/>
+              </w:rPr>
+              <w:t>Active campaign filter; clicking a campaign pill sets selectedMissions to all missions in that campaign</w:t>
             </w:r>
           </w:p>
         </w:tc>
@@ -6811,6 +6957,386 @@
       </w:r>
     </w:p>
     <w:p>
+      <w:pPr>
+        <w:pStyle w:val="Heading2"/>
+      </w:pPr>
+      <w:r>
+        <w:t>6.5 Campaign Filter</w:t>
+      </w:r>
+    </w:p>
+    <w:p>
+      <w:pPr>
+        <w:spacing w:after="80"/>
+      </w:pPr>
+      <w:r>
+        <w:rPr>
+          <w:b w:val="0"/>
+          <w:i w:val="0"/>
+        </w:rPr>
+        <w:t>Missions can be grouped into named campaigns via campaigns.json. Each campaign is defined by an explicit missions list and/or patterns (substring matches). A Campaigns pill row appears in the filter panel below the Missions pills. Clicking a campaign pill sets selectedMissions to the full set of missions in that campaign. Clicking the active pill again deselects the campaign (selectedMissions → null). Clicking a mission pill manually clears selectedCampaign.</w:t>
+      </w:r>
+    </w:p>
+    <w:tbl>
+      <w:tblPr>
+        <w:tblStyle w:val="TableGrid"/>
+        <w:tblW w:type="auto" w:w="0"/>
+        <w:jc w:val="left"/>
+        <w:tblLook w:firstColumn="1" w:firstRow="1" w:lastColumn="0" w:lastRow="0" w:noHBand="0" w:noVBand="1" w:val="04A0"/>
+      </w:tblPr>
+      <w:tblGrid>
+        <w:gridCol w:w="3135"/>
+        <w:gridCol w:w="3135"/>
+        <w:gridCol w:w="3135"/>
+      </w:tblGrid>
+      <w:tr>
+        <w:tc>
+          <w:tcPr>
+            <w:tcW w:type="dxa" w:w="3135"/>
+            <w:shd w:val="clear" w:color="auto" w:fill="2E4057"/>
+          </w:tcPr>
+          <w:p>
+            <w:pPr>
+              <w:jc w:val="center"/>
+            </w:pPr>
+            <w:r>
+              <w:rPr>
+                <w:b/>
+                <w:color w:val="FFFFFF"/>
+                <w:sz w:val="18"/>
+              </w:rPr>
+              <w:t>Field</w:t>
+            </w:r>
+          </w:p>
+        </w:tc>
+        <w:tc>
+          <w:tcPr>
+            <w:tcW w:type="dxa" w:w="3135"/>
+            <w:shd w:val="clear" w:color="auto" w:fill="2E4057"/>
+          </w:tcPr>
+          <w:p>
+            <w:pPr>
+              <w:jc w:val="center"/>
+            </w:pPr>
+            <w:r>
+              <w:rPr>
+                <w:b/>
+                <w:color w:val="FFFFFF"/>
+                <w:sz w:val="18"/>
+              </w:rPr>
+              <w:t>Type</w:t>
+            </w:r>
+          </w:p>
+        </w:tc>
+        <w:tc>
+          <w:tcPr>
+            <w:tcW w:type="dxa" w:w="3135"/>
+            <w:shd w:val="clear" w:color="auto" w:fill="2E4057"/>
+          </w:tcPr>
+          <w:p>
+            <w:pPr>
+              <w:jc w:val="center"/>
+            </w:pPr>
+            <w:r>
+              <w:rPr>
+                <w:b/>
+                <w:color w:val="FFFFFF"/>
+                <w:sz w:val="18"/>
+              </w:rPr>
+              <w:t>Description</w:t>
+            </w:r>
+          </w:p>
+        </w:tc>
+      </w:tr>
+      <w:tr>
+        <w:tc>
+          <w:tcPr>
+            <w:tcW w:type="dxa" w:w="3135"/>
+            <w:shd w:val="clear" w:color="auto" w:fill="FFFFFF"/>
+          </w:tcPr>
+          <w:p>
+            <w:r>
+              <w:rPr>
+                <w:sz w:val="18"/>
+              </w:rPr>
+              <w:t>missions</w:t>
+            </w:r>
+          </w:p>
+        </w:tc>
+        <w:tc>
+          <w:tcPr>
+            <w:tcW w:type="dxa" w:w="3135"/>
+            <w:shd w:val="clear" w:color="auto" w:fill="FFFFFF"/>
+          </w:tcPr>
+          <w:p>
+            <w:r>
+              <w:rPr>
+                <w:sz w:val="18"/>
+              </w:rPr>
+              <w:t>string[]</w:t>
+            </w:r>
+          </w:p>
+        </w:tc>
+        <w:tc>
+          <w:tcPr>
+            <w:tcW w:type="dxa" w:w="3135"/>
+            <w:shd w:val="clear" w:color="auto" w:fill="FFFFFF"/>
+          </w:tcPr>
+          <w:p>
+            <w:r>
+              <w:rPr>
+                <w:sz w:val="18"/>
+              </w:rPr>
+              <w:t>Exact mission name strings to include in this campaign</w:t>
+            </w:r>
+          </w:p>
+        </w:tc>
+      </w:tr>
+      <w:tr>
+        <w:tc>
+          <w:tcPr>
+            <w:tcW w:type="dxa" w:w="3135"/>
+            <w:shd w:val="clear" w:color="auto" w:fill="F0F4FA"/>
+          </w:tcPr>
+          <w:p>
+            <w:r>
+              <w:rPr>
+                <w:sz w:val="18"/>
+              </w:rPr>
+              <w:t>patterns</w:t>
+            </w:r>
+          </w:p>
+        </w:tc>
+        <w:tc>
+          <w:tcPr>
+            <w:tcW w:type="dxa" w:w="3135"/>
+            <w:shd w:val="clear" w:color="auto" w:fill="F0F4FA"/>
+          </w:tcPr>
+          <w:p>
+            <w:r>
+              <w:rPr>
+                <w:sz w:val="18"/>
+              </w:rPr>
+              <w:t>string[]</w:t>
+            </w:r>
+          </w:p>
+        </w:tc>
+        <w:tc>
+          <w:tcPr>
+            <w:tcW w:type="dxa" w:w="3135"/>
+            <w:shd w:val="clear" w:color="auto" w:fill="F0F4FA"/>
+          </w:tcPr>
+          <w:p>
+            <w:r>
+              <w:rPr>
+                <w:sz w:val="18"/>
+              </w:rPr>
+              <w:t>Substring patterns — any mission name containing the string is included automatically</w:t>
+            </w:r>
+          </w:p>
+        </w:tc>
+      </w:tr>
+    </w:tbl>
+    <w:p/>
+    <w:p>
+      <w:pPr>
+        <w:spacing w:after="40"/>
+      </w:pPr>
+      <w:r>
+        <w:rPr>
+          <w:b w:val="0"/>
+          <w:i w:val="0"/>
+        </w:rPr>
+        <w:t>Example campaigns.json entry:</w:t>
+      </w:r>
+    </w:p>
+    <w:p>
+      <w:pPr>
+        <w:pStyle w:val="NoSpacing"/>
+        <w:spacing w:before="40" w:after="40"/>
+        <w:ind w:left="576"/>
+        <w:shd w:val="clear" w:color="auto" w:fill="F3F3F3"/>
+      </w:pPr>
+      <w:r>
+        <w:rPr>
+          <w:rFonts w:ascii="Courier New" w:hAnsi="Courier New"/>
+          <w:color w:val="222222"/>
+          <w:sz w:val="18"/>
+        </w:rPr>
+        <w:t>"Altis Invasion": {</w:t>
+      </w:r>
+    </w:p>
+    <w:p>
+      <w:pPr>
+        <w:pStyle w:val="NoSpacing"/>
+        <w:spacing w:before="40" w:after="40"/>
+        <w:ind w:left="576"/>
+        <w:shd w:val="clear" w:color="auto" w:fill="F3F3F3"/>
+      </w:pPr>
+      <w:r>
+        <w:rPr>
+          <w:rFonts w:ascii="Courier New" w:hAnsi="Courier New"/>
+          <w:color w:val="222222"/>
+          <w:sz w:val="18"/>
+        </w:rPr>
+        <w:t xml:space="preserve">  "missions": ["LZ Gulf Day 1 (2026-03-21)", "OP Lynx Day 0 (2026-03-07)"],</w:t>
+      </w:r>
+    </w:p>
+    <w:p>
+      <w:pPr>
+        <w:pStyle w:val="NoSpacing"/>
+        <w:spacing w:before="40" w:after="40"/>
+        <w:ind w:left="576"/>
+        <w:shd w:val="clear" w:color="auto" w:fill="F3F3F3"/>
+      </w:pPr>
+      <w:r>
+        <w:rPr>
+          <w:rFonts w:ascii="Courier New" w:hAnsi="Courier New"/>
+          <w:color w:val="222222"/>
+          <w:sz w:val="18"/>
+        </w:rPr>
+        <w:t xml:space="preserve">  "patterns": ["Invasion Day"]</w:t>
+      </w:r>
+    </w:p>
+    <w:p>
+      <w:pPr>
+        <w:pStyle w:val="NoSpacing"/>
+        <w:spacing w:before="40" w:after="40"/>
+        <w:ind w:left="576"/>
+        <w:shd w:val="clear" w:color="auto" w:fill="F3F3F3"/>
+      </w:pPr>
+      <w:r>
+        <w:rPr>
+          <w:rFonts w:ascii="Courier New" w:hAnsi="Courier New"/>
+          <w:color w:val="222222"/>
+          <w:sz w:val="18"/>
+        </w:rPr>
+        <w:t>}</w:t>
+      </w:r>
+    </w:p>
+    <w:p/>
+    <w:p>
+      <w:pPr>
+        <w:spacing w:after="120"/>
+      </w:pPr>
+      <w:r>
+        <w:rPr>
+          <w:b w:val="0"/>
+          <w:i w:val="0"/>
+        </w:rPr>
+        <w:t>Keys starting with "_" (e.g. "_comment") are silently ignored when rendering campaign pills.</w:t>
+      </w:r>
+    </w:p>
+    <w:p>
+      <w:pPr>
+        <w:pStyle w:val="Heading2"/>
+      </w:pPr>
+      <w:r>
+        <w:t>6.6 Campaign Medal Ribbons</w:t>
+      </w:r>
+    </w:p>
+    <w:p>
+      <w:pPr>
+        <w:spacing w:after="80"/>
+      </w:pPr>
+      <w:r>
+        <w:rPr>
+          <w:b w:val="0"/>
+          <w:i w:val="0"/>
+        </w:rPr>
+        <w:t>Players automatically earn a medal ribbon for every campaign they participated in (at least one mission row present in aggPlayers.missionRows). Medals are shown in a Campaign Medals section at the top of the career page and player modal.</w:t>
+      </w:r>
+    </w:p>
+    <w:p>
+      <w:pPr>
+        <w:spacing w:after="40"/>
+      </w:pPr>
+      <w:r>
+        <w:rPr>
+          <w:b w:val="0"/>
+          <w:i w:val="0"/>
+        </w:rPr>
+        <w:t>Ribbon generation (adapted from github.com/Mchl/medal-bar-generator, MIT):</w:t>
+      </w:r>
+    </w:p>
+    <w:p>
+      <w:pPr>
+        <w:pStyle w:val="ListBullet"/>
+        <w:spacing w:after="40"/>
+        <w:ind w:left="360"/>
+      </w:pPr>
+      <w:r>
+        <w:rPr>
+          <w:sz w:val="20"/>
+        </w:rPr>
+        <w:t>Each campaign name is used as a seed for the Alea PRNG, producing a deterministic ribbon.</w:t>
+      </w:r>
+    </w:p>
+    <w:p>
+      <w:pPr>
+        <w:pStyle w:val="ListBullet"/>
+        <w:spacing w:after="40"/>
+        <w:ind w:left="360"/>
+      </w:pPr>
+      <w:r>
+        <w:rPr>
+          <w:sz w:val="20"/>
+        </w:rPr>
+        <w:t>A palette of 3–5 colours is drawn from a 73-colour US military medal palette.</w:t>
+      </w:r>
+    </w:p>
+    <w:p>
+      <w:pPr>
+        <w:pStyle w:val="ListBullet"/>
+        <w:spacing w:after="40"/>
+        <w:ind w:left="360"/>
+      </w:pPr>
+      <w:r>
+        <w:rPr>
+          <w:sz w:val="20"/>
+        </w:rPr>
+        <w:t>Symmetric stripe pattern (even or odd mirrored bands) is drawn on a 140×38 canvas.</w:t>
+      </w:r>
+    </w:p>
+    <w:p>
+      <w:pPr>
+        <w:pStyle w:val="ListBullet"/>
+        <w:spacing w:after="40"/>
+        <w:ind w:left="360"/>
+      </w:pPr>
+      <w:r>
+        <w:rPr>
+          <w:sz w:val="20"/>
+        </w:rPr>
+        <w:t>A horizontal grille (semi-transparent black lines) simulates fabric texture.</w:t>
+      </w:r>
+    </w:p>
+    <w:p>
+      <w:pPr>
+        <w:pStyle w:val="ListBullet"/>
+        <w:spacing w:after="40"/>
+        <w:ind w:left="360"/>
+      </w:pPr>
+      <w:r>
+        <w:rPr>
+          <w:sz w:val="20"/>
+        </w:rPr>
+        <w:t>A thin gold frame is drawn around the ribbon.</w:t>
+      </w:r>
+    </w:p>
+    <w:p/>
+    <w:p>
+      <w:pPr>
+        <w:spacing w:after="120"/>
+      </w:pPr>
+      <w:r>
+        <w:rPr>
+          <w:b w:val="0"/>
+          <w:i w:val="0"/>
+        </w:rPr>
+        <w:t>getEarnedCampaigns(playerMissions) checks each campaign definition against the player's mission set (from aggPlayers, not filteredPlayers, so active filters do not affect medal eligibility). renderMedalRibbons(containerId, playerMissions) draws canvas elements for each earned campaign; the entire Campaign Medals section is hidden if the player has earned no medals.</w:t>
+      </w:r>
+    </w:p>
+    <w:p>
       <w:r>
         <w:br w:type="page"/>
       </w:r>
@@ -16739,7 +17265,7 @@
               <w:rPr>
                 <w:sz w:val="18"/>
               </w:rPr>
-              <w:t>Parallel fetch of CSV_URL, unit_overrides.json, and player_aliases.json.</w:t>
+              <w:t>Parallel fetch of CSV_URL, unit_overrides.json, player_aliases.json, and campaigns.json.</w:t>
             </w:r>
           </w:p>
         </w:tc>

</xml_diff>

<commit_message>
Deploying to gh-pages from @ loltorres9/TFP_KillTracker@36711b56829572a772820a03045f30c5b217f038 🚀
</commit_message>
<xml_diff>
--- a/TFP_KillTracker_Technical_Documentation.docx
+++ b/TFP_KillTracker_Technical_Documentation.docx
@@ -39,7 +39,7 @@
         <w:rPr>
           <w:sz w:val="22"/>
         </w:rPr>
-        <w:t>Version 1.6  ·  31 March 2026</w:t>
+        <w:t>Version 1.7  ·  20 April 2026</w:t>
       </w:r>
     </w:p>
     <w:p>
@@ -674,7 +674,7 @@
               <w:rPr>
                 <w:sz w:val="18"/>
               </w:rPr>
-              <w:t>ImportScript</w:t>
+              <w:t>campaigns.json</w:t>
             </w:r>
           </w:p>
         </w:tc>
@@ -688,7 +688,7 @@
               <w:rPr>
                 <w:sz w:val="18"/>
               </w:rPr>
-              <w:t>Google Apps Script that imports OCAP .json.gz mission logs into Google Sheets</w:t>
+              <w:t>Campaign definitions — groups missions into named campaigns for the filter pill and medal awards</w:t>
             </w:r>
           </w:p>
         </w:tc>
@@ -704,7 +704,7 @@
               <w:rPr>
                 <w:sz w:val="18"/>
               </w:rPr>
-              <w:t>generate_docs.py</w:t>
+              <w:t>ImportScript</w:t>
             </w:r>
           </w:p>
         </w:tc>
@@ -718,7 +718,7 @@
               <w:rPr>
                 <w:sz w:val="18"/>
               </w:rPr>
-              <w:t>python-docx script that regenerates this documentation file</w:t>
+              <w:t>Google Apps Script that imports OCAP .json.gz mission logs into Google Sheets</w:t>
             </w:r>
           </w:p>
         </w:tc>
@@ -734,7 +734,7 @@
               <w:rPr>
                 <w:sz w:val="18"/>
               </w:rPr>
-              <w:t>README.md</w:t>
+              <w:t>generate_docs.py</w:t>
             </w:r>
           </w:p>
         </w:tc>
@@ -748,7 +748,7 @@
               <w:rPr>
                 <w:sz w:val="18"/>
               </w:rPr>
-              <w:t>User-facing feature overview and deployment guide</w:t>
+              <w:t>python-docx script that regenerates this documentation file</w:t>
             </w:r>
           </w:p>
         </w:tc>
@@ -764,6 +764,36 @@
               <w:rPr>
                 <w:sz w:val="18"/>
               </w:rPr>
+              <w:t>README.md</w:t>
+            </w:r>
+          </w:p>
+        </w:tc>
+        <w:tc>
+          <w:tcPr>
+            <w:tcW w:type="dxa" w:w="4703"/>
+            <w:shd w:val="clear" w:color="auto" w:fill="FFFFFF"/>
+          </w:tcPr>
+          <w:p>
+            <w:r>
+              <w:rPr>
+                <w:sz w:val="18"/>
+              </w:rPr>
+              <w:t>User-facing feature overview and deployment guide</w:t>
+            </w:r>
+          </w:p>
+        </w:tc>
+      </w:tr>
+      <w:tr>
+        <w:tc>
+          <w:tcPr>
+            <w:tcW w:type="dxa" w:w="4703"/>
+            <w:shd w:val="clear" w:color="auto" w:fill="F0F4FA"/>
+          </w:tcPr>
+          <w:p>
+            <w:r>
+              <w:rPr>
+                <w:sz w:val="18"/>
+              </w:rPr>
               <w:t>.github/workflows/</w:t>
             </w:r>
           </w:p>
@@ -771,7 +801,7 @@
         <w:tc>
           <w:tcPr>
             <w:tcW w:type="dxa" w:w="4703"/>
-            <w:shd w:val="clear" w:color="auto" w:fill="FFFFFF"/>
+            <w:shd w:val="clear" w:color="auto" w:fill="F0F4FA"/>
           </w:tcPr>
           <w:p>
             <w:r>
@@ -2441,6 +2471,122 @@
                 <w:sz w:val="18"/>
               </w:rPr>
               <w:t>Maps canonical name → array of all absorbed alias strings; used to show "Also known as" on career page</w:t>
+            </w:r>
+          </w:p>
+        </w:tc>
+      </w:tr>
+      <w:tr>
+        <w:tc>
+          <w:tcPr>
+            <w:tcW w:type="dxa" w:w="2351"/>
+            <w:shd w:val="clear" w:color="auto" w:fill="F0F4FA"/>
+          </w:tcPr>
+          <w:p>
+            <w:r>
+              <w:rPr>
+                <w:sz w:val="18"/>
+              </w:rPr>
+              <w:t>campaignData</w:t>
+            </w:r>
+          </w:p>
+        </w:tc>
+        <w:tc>
+          <w:tcPr>
+            <w:tcW w:type="dxa" w:w="2351"/>
+            <w:shd w:val="clear" w:color="auto" w:fill="F0F4FA"/>
+          </w:tcPr>
+          <w:p>
+            <w:r>
+              <w:rPr>
+                <w:sz w:val="18"/>
+              </w:rPr>
+              <w:t>Object</w:t>
+            </w:r>
+          </w:p>
+        </w:tc>
+        <w:tc>
+          <w:tcPr>
+            <w:tcW w:type="dxa" w:w="2351"/>
+            <w:shd w:val="clear" w:color="auto" w:fill="F0F4FA"/>
+          </w:tcPr>
+          <w:p>
+            <w:r>
+              <w:rPr>
+                <w:sz w:val="18"/>
+              </w:rPr>
+              <w:t>{}</w:t>
+            </w:r>
+          </w:p>
+        </w:tc>
+        <w:tc>
+          <w:tcPr>
+            <w:tcW w:type="dxa" w:w="2351"/>
+            <w:shd w:val="clear" w:color="auto" w:fill="F0F4FA"/>
+          </w:tcPr>
+          <w:p>
+            <w:r>
+              <w:rPr>
+                <w:sz w:val="18"/>
+              </w:rPr>
+              <w:t>Parsed campaigns.json; keys are campaign names, values have missions[] and/or patterns[]</w:t>
+            </w:r>
+          </w:p>
+        </w:tc>
+      </w:tr>
+      <w:tr>
+        <w:tc>
+          <w:tcPr>
+            <w:tcW w:type="dxa" w:w="2351"/>
+            <w:shd w:val="clear" w:color="auto" w:fill="FFFFFF"/>
+          </w:tcPr>
+          <w:p>
+            <w:r>
+              <w:rPr>
+                <w:sz w:val="18"/>
+              </w:rPr>
+              <w:t>selectedCampaign</w:t>
+            </w:r>
+          </w:p>
+        </w:tc>
+        <w:tc>
+          <w:tcPr>
+            <w:tcW w:type="dxa" w:w="2351"/>
+            <w:shd w:val="clear" w:color="auto" w:fill="FFFFFF"/>
+          </w:tcPr>
+          <w:p>
+            <w:r>
+              <w:rPr>
+                <w:sz w:val="18"/>
+              </w:rPr>
+              <w:t>string | null</w:t>
+            </w:r>
+          </w:p>
+        </w:tc>
+        <w:tc>
+          <w:tcPr>
+            <w:tcW w:type="dxa" w:w="2351"/>
+            <w:shd w:val="clear" w:color="auto" w:fill="FFFFFF"/>
+          </w:tcPr>
+          <w:p>
+            <w:r>
+              <w:rPr>
+                <w:sz w:val="18"/>
+              </w:rPr>
+              <w:t>null</w:t>
+            </w:r>
+          </w:p>
+        </w:tc>
+        <w:tc>
+          <w:tcPr>
+            <w:tcW w:type="dxa" w:w="2351"/>
+            <w:shd w:val="clear" w:color="auto" w:fill="FFFFFF"/>
+          </w:tcPr>
+          <w:p>
+            <w:r>
+              <w:rPr>
+                <w:sz w:val="18"/>
+              </w:rPr>
+              <w:t>Active campaign filter; clicking a campaign pill sets selectedMissions to all missions in that campaign</w:t>
             </w:r>
           </w:p>
         </w:tc>
@@ -6811,6 +6957,386 @@
       </w:r>
     </w:p>
     <w:p>
+      <w:pPr>
+        <w:pStyle w:val="Heading2"/>
+      </w:pPr>
+      <w:r>
+        <w:t>6.5 Campaign Filter</w:t>
+      </w:r>
+    </w:p>
+    <w:p>
+      <w:pPr>
+        <w:spacing w:after="80"/>
+      </w:pPr>
+      <w:r>
+        <w:rPr>
+          <w:b w:val="0"/>
+          <w:i w:val="0"/>
+        </w:rPr>
+        <w:t>Missions can be grouped into named campaigns via campaigns.json. Each campaign is defined by an explicit missions list and/or patterns (substring matches). A Campaigns pill row appears in the filter panel below the Missions pills. Clicking a campaign pill sets selectedMissions to the full set of missions in that campaign. Clicking the active pill again deselects the campaign (selectedMissions → null). Clicking a mission pill manually clears selectedCampaign.</w:t>
+      </w:r>
+    </w:p>
+    <w:tbl>
+      <w:tblPr>
+        <w:tblStyle w:val="TableGrid"/>
+        <w:tblW w:type="auto" w:w="0"/>
+        <w:jc w:val="left"/>
+        <w:tblLook w:firstColumn="1" w:firstRow="1" w:lastColumn="0" w:lastRow="0" w:noHBand="0" w:noVBand="1" w:val="04A0"/>
+      </w:tblPr>
+      <w:tblGrid>
+        <w:gridCol w:w="3135"/>
+        <w:gridCol w:w="3135"/>
+        <w:gridCol w:w="3135"/>
+      </w:tblGrid>
+      <w:tr>
+        <w:tc>
+          <w:tcPr>
+            <w:tcW w:type="dxa" w:w="3135"/>
+            <w:shd w:val="clear" w:color="auto" w:fill="2E4057"/>
+          </w:tcPr>
+          <w:p>
+            <w:pPr>
+              <w:jc w:val="center"/>
+            </w:pPr>
+            <w:r>
+              <w:rPr>
+                <w:b/>
+                <w:color w:val="FFFFFF"/>
+                <w:sz w:val="18"/>
+              </w:rPr>
+              <w:t>Field</w:t>
+            </w:r>
+          </w:p>
+        </w:tc>
+        <w:tc>
+          <w:tcPr>
+            <w:tcW w:type="dxa" w:w="3135"/>
+            <w:shd w:val="clear" w:color="auto" w:fill="2E4057"/>
+          </w:tcPr>
+          <w:p>
+            <w:pPr>
+              <w:jc w:val="center"/>
+            </w:pPr>
+            <w:r>
+              <w:rPr>
+                <w:b/>
+                <w:color w:val="FFFFFF"/>
+                <w:sz w:val="18"/>
+              </w:rPr>
+              <w:t>Type</w:t>
+            </w:r>
+          </w:p>
+        </w:tc>
+        <w:tc>
+          <w:tcPr>
+            <w:tcW w:type="dxa" w:w="3135"/>
+            <w:shd w:val="clear" w:color="auto" w:fill="2E4057"/>
+          </w:tcPr>
+          <w:p>
+            <w:pPr>
+              <w:jc w:val="center"/>
+            </w:pPr>
+            <w:r>
+              <w:rPr>
+                <w:b/>
+                <w:color w:val="FFFFFF"/>
+                <w:sz w:val="18"/>
+              </w:rPr>
+              <w:t>Description</w:t>
+            </w:r>
+          </w:p>
+        </w:tc>
+      </w:tr>
+      <w:tr>
+        <w:tc>
+          <w:tcPr>
+            <w:tcW w:type="dxa" w:w="3135"/>
+            <w:shd w:val="clear" w:color="auto" w:fill="FFFFFF"/>
+          </w:tcPr>
+          <w:p>
+            <w:r>
+              <w:rPr>
+                <w:sz w:val="18"/>
+              </w:rPr>
+              <w:t>missions</w:t>
+            </w:r>
+          </w:p>
+        </w:tc>
+        <w:tc>
+          <w:tcPr>
+            <w:tcW w:type="dxa" w:w="3135"/>
+            <w:shd w:val="clear" w:color="auto" w:fill="FFFFFF"/>
+          </w:tcPr>
+          <w:p>
+            <w:r>
+              <w:rPr>
+                <w:sz w:val="18"/>
+              </w:rPr>
+              <w:t>string[]</w:t>
+            </w:r>
+          </w:p>
+        </w:tc>
+        <w:tc>
+          <w:tcPr>
+            <w:tcW w:type="dxa" w:w="3135"/>
+            <w:shd w:val="clear" w:color="auto" w:fill="FFFFFF"/>
+          </w:tcPr>
+          <w:p>
+            <w:r>
+              <w:rPr>
+                <w:sz w:val="18"/>
+              </w:rPr>
+              <w:t>Exact mission name strings to include in this campaign</w:t>
+            </w:r>
+          </w:p>
+        </w:tc>
+      </w:tr>
+      <w:tr>
+        <w:tc>
+          <w:tcPr>
+            <w:tcW w:type="dxa" w:w="3135"/>
+            <w:shd w:val="clear" w:color="auto" w:fill="F0F4FA"/>
+          </w:tcPr>
+          <w:p>
+            <w:r>
+              <w:rPr>
+                <w:sz w:val="18"/>
+              </w:rPr>
+              <w:t>patterns</w:t>
+            </w:r>
+          </w:p>
+        </w:tc>
+        <w:tc>
+          <w:tcPr>
+            <w:tcW w:type="dxa" w:w="3135"/>
+            <w:shd w:val="clear" w:color="auto" w:fill="F0F4FA"/>
+          </w:tcPr>
+          <w:p>
+            <w:r>
+              <w:rPr>
+                <w:sz w:val="18"/>
+              </w:rPr>
+              <w:t>string[]</w:t>
+            </w:r>
+          </w:p>
+        </w:tc>
+        <w:tc>
+          <w:tcPr>
+            <w:tcW w:type="dxa" w:w="3135"/>
+            <w:shd w:val="clear" w:color="auto" w:fill="F0F4FA"/>
+          </w:tcPr>
+          <w:p>
+            <w:r>
+              <w:rPr>
+                <w:sz w:val="18"/>
+              </w:rPr>
+              <w:t>Substring patterns — any mission name containing the string is included automatically</w:t>
+            </w:r>
+          </w:p>
+        </w:tc>
+      </w:tr>
+    </w:tbl>
+    <w:p/>
+    <w:p>
+      <w:pPr>
+        <w:spacing w:after="40"/>
+      </w:pPr>
+      <w:r>
+        <w:rPr>
+          <w:b w:val="0"/>
+          <w:i w:val="0"/>
+        </w:rPr>
+        <w:t>Example campaigns.json entry:</w:t>
+      </w:r>
+    </w:p>
+    <w:p>
+      <w:pPr>
+        <w:pStyle w:val="NoSpacing"/>
+        <w:spacing w:before="40" w:after="40"/>
+        <w:ind w:left="576"/>
+        <w:shd w:val="clear" w:color="auto" w:fill="F3F3F3"/>
+      </w:pPr>
+      <w:r>
+        <w:rPr>
+          <w:rFonts w:ascii="Courier New" w:hAnsi="Courier New"/>
+          <w:color w:val="222222"/>
+          <w:sz w:val="18"/>
+        </w:rPr>
+        <w:t>"Altis Invasion": {</w:t>
+      </w:r>
+    </w:p>
+    <w:p>
+      <w:pPr>
+        <w:pStyle w:val="NoSpacing"/>
+        <w:spacing w:before="40" w:after="40"/>
+        <w:ind w:left="576"/>
+        <w:shd w:val="clear" w:color="auto" w:fill="F3F3F3"/>
+      </w:pPr>
+      <w:r>
+        <w:rPr>
+          <w:rFonts w:ascii="Courier New" w:hAnsi="Courier New"/>
+          <w:color w:val="222222"/>
+          <w:sz w:val="18"/>
+        </w:rPr>
+        <w:t xml:space="preserve">  "missions": ["LZ Gulf Day 1 (2026-03-21)", "OP Lynx Day 0 (2026-03-07)"],</w:t>
+      </w:r>
+    </w:p>
+    <w:p>
+      <w:pPr>
+        <w:pStyle w:val="NoSpacing"/>
+        <w:spacing w:before="40" w:after="40"/>
+        <w:ind w:left="576"/>
+        <w:shd w:val="clear" w:color="auto" w:fill="F3F3F3"/>
+      </w:pPr>
+      <w:r>
+        <w:rPr>
+          <w:rFonts w:ascii="Courier New" w:hAnsi="Courier New"/>
+          <w:color w:val="222222"/>
+          <w:sz w:val="18"/>
+        </w:rPr>
+        <w:t xml:space="preserve">  "patterns": ["Invasion Day"]</w:t>
+      </w:r>
+    </w:p>
+    <w:p>
+      <w:pPr>
+        <w:pStyle w:val="NoSpacing"/>
+        <w:spacing w:before="40" w:after="40"/>
+        <w:ind w:left="576"/>
+        <w:shd w:val="clear" w:color="auto" w:fill="F3F3F3"/>
+      </w:pPr>
+      <w:r>
+        <w:rPr>
+          <w:rFonts w:ascii="Courier New" w:hAnsi="Courier New"/>
+          <w:color w:val="222222"/>
+          <w:sz w:val="18"/>
+        </w:rPr>
+        <w:t>}</w:t>
+      </w:r>
+    </w:p>
+    <w:p/>
+    <w:p>
+      <w:pPr>
+        <w:spacing w:after="120"/>
+      </w:pPr>
+      <w:r>
+        <w:rPr>
+          <w:b w:val="0"/>
+          <w:i w:val="0"/>
+        </w:rPr>
+        <w:t>Keys starting with "_" (e.g. "_comment") are silently ignored when rendering campaign pills.</w:t>
+      </w:r>
+    </w:p>
+    <w:p>
+      <w:pPr>
+        <w:pStyle w:val="Heading2"/>
+      </w:pPr>
+      <w:r>
+        <w:t>6.6 Campaign Medal Ribbons</w:t>
+      </w:r>
+    </w:p>
+    <w:p>
+      <w:pPr>
+        <w:spacing w:after="80"/>
+      </w:pPr>
+      <w:r>
+        <w:rPr>
+          <w:b w:val="0"/>
+          <w:i w:val="0"/>
+        </w:rPr>
+        <w:t>Players automatically earn a medal ribbon for every campaign they participated in (at least one mission row present in aggPlayers.missionRows). Medals are shown in a Campaign Medals section at the top of the career page and player modal.</w:t>
+      </w:r>
+    </w:p>
+    <w:p>
+      <w:pPr>
+        <w:spacing w:after="40"/>
+      </w:pPr>
+      <w:r>
+        <w:rPr>
+          <w:b w:val="0"/>
+          <w:i w:val="0"/>
+        </w:rPr>
+        <w:t>Ribbon generation (adapted from github.com/Mchl/medal-bar-generator, MIT):</w:t>
+      </w:r>
+    </w:p>
+    <w:p>
+      <w:pPr>
+        <w:pStyle w:val="ListBullet"/>
+        <w:spacing w:after="40"/>
+        <w:ind w:left="360"/>
+      </w:pPr>
+      <w:r>
+        <w:rPr>
+          <w:sz w:val="20"/>
+        </w:rPr>
+        <w:t>Each campaign name is used as a seed for the Alea PRNG, producing a deterministic ribbon.</w:t>
+      </w:r>
+    </w:p>
+    <w:p>
+      <w:pPr>
+        <w:pStyle w:val="ListBullet"/>
+        <w:spacing w:after="40"/>
+        <w:ind w:left="360"/>
+      </w:pPr>
+      <w:r>
+        <w:rPr>
+          <w:sz w:val="20"/>
+        </w:rPr>
+        <w:t>A palette of 3–5 colours is drawn from a 73-colour US military medal palette.</w:t>
+      </w:r>
+    </w:p>
+    <w:p>
+      <w:pPr>
+        <w:pStyle w:val="ListBullet"/>
+        <w:spacing w:after="40"/>
+        <w:ind w:left="360"/>
+      </w:pPr>
+      <w:r>
+        <w:rPr>
+          <w:sz w:val="20"/>
+        </w:rPr>
+        <w:t>Symmetric stripe pattern (even or odd mirrored bands) is drawn on a 140×38 canvas.</w:t>
+      </w:r>
+    </w:p>
+    <w:p>
+      <w:pPr>
+        <w:pStyle w:val="ListBullet"/>
+        <w:spacing w:after="40"/>
+        <w:ind w:left="360"/>
+      </w:pPr>
+      <w:r>
+        <w:rPr>
+          <w:sz w:val="20"/>
+        </w:rPr>
+        <w:t>A horizontal grille (semi-transparent black lines) simulates fabric texture.</w:t>
+      </w:r>
+    </w:p>
+    <w:p>
+      <w:pPr>
+        <w:pStyle w:val="ListBullet"/>
+        <w:spacing w:after="40"/>
+        <w:ind w:left="360"/>
+      </w:pPr>
+      <w:r>
+        <w:rPr>
+          <w:sz w:val="20"/>
+        </w:rPr>
+        <w:t>A thin gold frame is drawn around the ribbon.</w:t>
+      </w:r>
+    </w:p>
+    <w:p/>
+    <w:p>
+      <w:pPr>
+        <w:spacing w:after="120"/>
+      </w:pPr>
+      <w:r>
+        <w:rPr>
+          <w:b w:val="0"/>
+          <w:i w:val="0"/>
+        </w:rPr>
+        <w:t>getEarnedCampaigns(playerMissions) checks each campaign definition against the player's mission set (from aggPlayers, not filteredPlayers, so active filters do not affect medal eligibility). renderMedalRibbons(containerId, playerMissions) draws canvas elements for each earned campaign; the entire Campaign Medals section is hidden if the player has earned no medals.</w:t>
+      </w:r>
+    </w:p>
+    <w:p>
       <w:r>
         <w:br w:type="page"/>
       </w:r>
@@ -16739,7 +17265,7 @@
               <w:rPr>
                 <w:sz w:val="18"/>
               </w:rPr>
-              <w:t>Parallel fetch of CSV_URL, unit_overrides.json, and player_aliases.json.</w:t>
+              <w:t>Parallel fetch of CSV_URL, unit_overrides.json, player_aliases.json, and campaigns.json.</w:t>
             </w:r>
           </w:p>
         </w:tc>

</xml_diff>